<commit_message>
docs(paper): add 4 figures with captions; provide with-figures variants
- Add Figure Legends section before References to existing manuscripts
  (CCLM standard separate-figure submission format)
- Create manuscript_v2_{zh,en}_CCLM_with_figures.{md,docx} variants:
  4 figures embedded inline after first reference (Figure 1 in §2.1, Figure 2
  in §3.3, Figure 3 in §3.5, Figure 4 in §3.6) with full caption beneath each
- Extend md_to_docx_cclm.py to support ![alt](path) image syntax
  (centered, 14 cm width)
- Author preview file size: ~788 KB; submission-format file: ~48 KB
</commit_message>
<xml_diff>
--- a/paper/manuscript_v2_en_CCLM.docx
+++ b/paper/manuscript_v2_en_CCLM.docx
@@ -2101,6 +2101,112 @@
           <w:b/>
           <w:sz w:val="28"/>
         </w:rPr>
+        <w:t>Figure Legends</w:t>
+      </w:r>
+    </w:p>
+    <w:p>
+      <w:pPr>
+        <w:spacing w:before="80" w:after="80" w:lineRule="auto" w:line="360"/>
+        <w:ind w:firstLine="0"/>
+        <w:jc w:val="both"/>
+      </w:pPr>
+      <w:r>
+        <w:rPr>
+          <w:rFonts w:ascii="Times New Roman" w:hAnsi="Times New Roman" w:eastAsia="宋体"/>
+          <w:b/>
+          <w:sz w:val="22"/>
+        </w:rPr>
+        <w:t>Figure 1.</w:t>
+      </w:r>
+      <w:r>
+        <w:rPr>
+          <w:rFonts w:ascii="Times New Roman" w:hAnsi="Times New Roman" w:eastAsia="宋体"/>
+          <w:b w:val="0"/>
+          <w:sz w:val="22"/>
+        </w:rPr>
+        <w:t xml:space="preserve"> Nine configurations tested for LLM-assisted ISO 15189 QMS generation. Left: inclusion of each configuration along the four dimensions of rules, skeleton, detailed content, and examples (✓ included, half-circle partial, — absent); right: the system-prompt size of each configuration (K tokens).</w:t>
+      </w:r>
+    </w:p>
+    <w:p>
+      <w:pPr>
+        <w:spacing w:before="80" w:after="80" w:lineRule="auto" w:line="360"/>
+        <w:ind w:firstLine="0"/>
+        <w:jc w:val="both"/>
+      </w:pPr>
+      <w:r>
+        <w:rPr>
+          <w:rFonts w:ascii="Times New Roman" w:hAnsi="Times New Roman" w:eastAsia="宋体"/>
+          <w:b/>
+          <w:sz w:val="22"/>
+        </w:rPr>
+        <w:t>Figure 2.</w:t>
+      </w:r>
+      <w:r>
+        <w:rPr>
+          <w:rFonts w:ascii="Times New Roman" w:hAnsi="Times New Roman" w:eastAsia="宋体"/>
+          <w:b w:val="0"/>
+          <w:sz w:val="22"/>
+        </w:rPr>
+        <w:t xml:space="preserve"> Heatmap of the 2 × 2 cross-model symmetric design. Mean score (across tasks A1/B1/C1, 0–5 scale) for nine configurations (rows) × four generator–judge combinations (columns). C_full collapses markedly in the two GPT-generated columns (1.40 and 1.84, black-bordered cells), in sharp contrast with the two Claude-generated columns (4.56 and 3.22).</w:t>
+      </w:r>
+    </w:p>
+    <w:p>
+      <w:pPr>
+        <w:spacing w:before="80" w:after="80" w:lineRule="auto" w:line="360"/>
+        <w:ind w:firstLine="0"/>
+        <w:jc w:val="both"/>
+      </w:pPr>
+      <w:r>
+        <w:rPr>
+          <w:rFonts w:ascii="Times New Roman" w:hAnsi="Times New Roman" w:eastAsia="宋体"/>
+          <w:b/>
+          <w:sz w:val="22"/>
+        </w:rPr>
+        <w:t>Figure 3.</w:t>
+      </w:r>
+      <w:r>
+        <w:rPr>
+          <w:rFonts w:ascii="Times New Roman" w:hAnsi="Times New Roman" w:eastAsia="宋体"/>
+          <w:b w:val="0"/>
+          <w:sz w:val="22"/>
+        </w:rPr>
+        <w:t xml:space="preserve"> Systematic overestimation of LLM judges relative to a three-rater expert panel (n = 10 papers × 3 raters). Horizontal axis: mean rating of the three experts. Vertical axis: LLM-judge rating. Left: vs Claude Opus 4.6 [ICC(3,1) = 0.548; Pearson r = 0.573; mean diff = −0.90]. Right: vs GPT-5.4 [ICC(3,1) = 0.217; Pearson r = 0.259; mean diff = −0.52]. Dashed line: 1:1 perfect agreement; configurations colour-coded.</w:t>
+      </w:r>
+    </w:p>
+    <w:p>
+      <w:pPr>
+        <w:spacing w:before="80" w:after="80" w:lineRule="auto" w:line="360"/>
+        <w:ind w:firstLine="0"/>
+        <w:jc w:val="both"/>
+      </w:pPr>
+      <w:r>
+        <w:rPr>
+          <w:rFonts w:ascii="Times New Roman" w:hAnsi="Times New Roman" w:eastAsia="宋体"/>
+          <w:b/>
+          <w:sz w:val="22"/>
+        </w:rPr>
+        <w:t>Figure 4.</w:t>
+      </w:r>
+      <w:r>
+        <w:rPr>
+          <w:rFonts w:ascii="Times New Roman" w:hAnsi="Times New Roman" w:eastAsia="宋体"/>
+          <w:b w:val="0"/>
+          <w:sz w:val="22"/>
+        </w:rPr>
+        <w:t xml:space="preserve"> Token size versus quality score — LLM judges peak at 6–13 K while experts prefer 35–61 K. Horizontal axis: system-prompt size (symlog scale). Vertical axis: quality score (0–5). Solid green line (squares): three-rater expert mean. Solid red line (circles): Claude Opus 4.6 judge. Solid blue line (triangles): GPT-5.4 judge. Orange-shaded band marks the token-efficient optimum (H4 / H3); green-shaded band marks the expert-judged clinical-usability optimum (F / G).</w:t>
+      </w:r>
+    </w:p>
+    <w:p>
+      <w:pPr>
+        <w:spacing w:before="280" w:after="120" w:lineRule="auto" w:line="300"/>
+        <w:jc w:val="left"/>
+      </w:pPr>
+      <w:r>
+        <w:rPr>
+          <w:rFonts w:ascii="Arial" w:hAnsi="Arial" w:eastAsia="黑体"/>
+          <w:b/>
+          <w:sz w:val="28"/>
+        </w:rPr>
         <w:t>References</w:t>
       </w:r>
     </w:p>

</xml_diff>

<commit_message>
docs(paper): soften abstract bias precision; add limitation (x) on raw retention
- Abstract Results (3): "+0.464"/"−0.472" → "approximately +0.46"/"−0.47"
  (matches the precision warranted by aggregate-derived values)
- §4.5 limitation (x): disclose that per-paper raw scores for Claude-judge ×
  GPT-gen and Claude-judge × H-group Claude-gen were archived only as
  aggregated means; clarify that the 270 core Claude-judge ratings and all
  486 GPT-judge per-paper ratings remain fully released
</commit_message>
<xml_diff>
--- a/paper/manuscript_v2_en_CCLM.docx
+++ b/paper/manuscript_v2_en_CCLM.docx
@@ -211,7 +211,7 @@
           <w:b w:val="0"/>
           <w:sz w:val="22"/>
         </w:rPr>
-        <w:t>: (1) Four-factor orthogonal ablation showed that the rules layer (Δ = +0.511, p &lt; 0.001) and the skeleton layer (Δ = +0.213, p = 0.055) contributed significantly or near-significantly at the LLM-judge tier; detailed content (Δ = −0.031, p = 0.79) and examples (Δ = −0.053, p = 0.46) contributed nothing or were mildly harmful. (2) The full-context configuration C_full (71 K) yielded cross-evaluated scores of 3.22–4.56 under Claude generation but dropped to 1.40–1.84 under GPT-5.4 generation, indicating that long-context exploitation in this scenario is model-specific to Claude Opus. (3) Claude-as-judge exhibited a self-preference bias of +0.464, whereas GPT-as-judge showed an inverse bias of −0.472. (4) Inter-rater agreement among the three experts reached ICC(2,k) = 0.982; expert mean versus Claude-as-judge gave ICC(3,1) = 0.548 (p = 0.04), versus GPT-as-judge ICC(3,1) = 0.217 (p = 0.26); both LLM judges systematically overestimated by 0.52–0.90 points. (5) The configuration ranked first by LLM judges, H4_sop_only (6 K skeleton), ranked second-to-last under expert evaluation (3.20, n = 2), whereas template-based configurations F_template (35 K) and G_template_rules (38 K) ranked highest under expert evaluation (4.06–4.24).</w:t>
+        <w:t>: (1) Four-factor orthogonal ablation showed that the rules layer (Δ = +0.511, p &lt; 0.001) and the skeleton layer (Δ = +0.213, p = 0.055) contributed significantly or near-significantly at the LLM-judge tier; detailed content (Δ = −0.031, p = 0.79) and examples (Δ = −0.053, p = 0.46) contributed nothing or were mildly harmful. (2) The full-context configuration C_full (71 K) yielded cross-evaluated scores of 3.22–4.56 under Claude generation but dropped to 1.40–1.84 under GPT-5.4 generation, indicating that long-context exploitation in this scenario is model-specific to Claude Opus. (3) Claude-as-judge exhibited a self-preference bias of approximately +0.46, whereas GPT-as-judge showed an inverse bias of approximately −0.47. (4) Inter-rater agreement among the three experts reached ICC(2,k) = 0.982; expert mean versus Claude-as-judge gave ICC(3,1) = 0.548 (p = 0.04), versus GPT-as-judge ICC(3,1) = 0.217 (p = 0.26); both LLM judges systematically overestimated by 0.52–0.90 points. (5) The configuration ranked first by LLM judges, H4_sop_only (6 K skeleton), ranked second-to-last under expert evaluation (3.20, n = 2), whereas template-based configurations F_template (35 K) and G_template_rules (38 K) ranked highest under expert evaluation (4.06–4.24).</w:t>
       </w:r>
     </w:p>
     <w:p>
@@ -1877,7 +1877,7 @@
           <w:b w:val="0"/>
           <w:sz w:val="22"/>
         </w:rPr>
-        <w:t>The present study has the following limitations. (i) Limited expert sample size: n = 3 raters × 10 documents, with only 1 to 2 documents per group, supporting only directional ranking conclusions and not strict statistical inference. Multi-center validation with 3–5 experts × 30–50 documents across institutions is a key direction for future work. (ii) Two-edged effect of same-institution agreement: the very high agreement among the three experts [ICC(2,k) = 0.982] is both evidence of the validity of the five-dimensional rubric and a possible reflection of shared professional culture, training lineage, and clause-interpretation habits within the same institution, which may overestimate cross-institution generalizability. (iii) Dual role of the first author: the first author acted both as Rater 1 and as study designer. Raters 2 and 3 completed their scoring without knowledge of Rater 1's ratings, and the data of all raters are fully released. (iv) Shared rubric between experts and LLM judges: there is a risk of shared-measurement bias; future work should add expert-native dimensions such as clinical usability. (v) Limited GPT-5.4 task coverage: only A1/B1/C1 (81 documents) were generated. (vi) Domain specificity: results are restricted to ISO 15189 medical laboratories, and transferability to other standards such as ISO 17025 or ISO 9001 remains to be validated. (vii) Absence of third-party LLM judges: only Claude and GPT were used as judges. (viii) Language scope: all QMS documents were in Chinese; the effects in English or other languages have not been verified. (ix) Model temporality: the quality of generated documents depends on the model used, and the conclusions of the present study may need to be re-validated as LLMs continue to iterate.</w:t>
+        <w:t>The present study has the following limitations. (i) Limited expert sample size: n = 3 raters × 10 documents, with only 1 to 2 documents per group, supporting only directional ranking conclusions and not strict statistical inference. Multi-center validation with 3–5 experts × 30–50 documents across institutions is a key direction for future work. (ii) Two-edged effect of same-institution agreement: the very high agreement among the three experts [ICC(2,k) = 0.982] is both evidence of the validity of the five-dimensional rubric and a possible reflection of shared professional culture, training lineage, and clause-interpretation habits within the same institution, which may overestimate cross-institution generalizability. (iii) Dual role of the first author: the first author acted both as Rater 1 and as study designer. Raters 2 and 3 completed their scoring without knowledge of Rater 1's ratings, and the data of all raters are fully released. (iv) Shared rubric between experts and LLM judges: there is a risk of shared-measurement bias; future work should add expert-native dimensions such as clinical usability. (v) Limited GPT-5.4 task coverage: only A1/B1/C1 (81 documents) were generated. (vi) Domain specificity: results are restricted to ISO 15189 medical laboratories, and transferability to other standards such as ISO 17025 or ISO 9001 remains to be validated. (vii) Absence of third-party LLM judges: only Claude and GPT were used as judges. (viii) Language scope: all QMS documents were in Chinese; the effects in English or other languages have not been verified. (ix) Model temporality: the quality of generated documents depends on the model used, and the conclusions of the present study may need to be re-validated as LLMs continue to iterate. (x) Raw-data retention for cross-judge cells: per-paper raw scores for the Claude-judge × GPT-gen quadrant and for the Claude-judge × H-group Claude-gen subset were archived only as aggregated means; the per-paper JSON files were not retained. The 2 × 2 self-preference matrix therefore cannot be independently recomputed from the lowest-level data, although per-paper raw Claude-judge ratings for the six core configuration groups (A/B/C/E/F/G; 270 ratings) and all 486 GPT-judge per-paper ratings are fully released.</w:t>
       </w:r>
     </w:p>
     <w:p>

</xml_diff>

<commit_message>
docs(paper): expand §2.3 Tier 1 — explicit Python scorer logic
- Replace 1-line Tier 1 description with 5 sub-bullets covering: format
  section matching per task class, clause-number regex with ±40-char context
  window, terminology mapping table with context exclusion, vague-expression
  dual filter, weighted composite score
- Reference auto_scorer.py for full reproducibility
</commit_message>
<xml_diff>
--- a/paper/manuscript_v2_en_CCLM.docx
+++ b/paper/manuscript_v2_en_CCLM.docx
@@ -432,7 +432,117 @@
           <w:b w:val="0"/>
           <w:sz w:val="22"/>
         </w:rPr>
-        <w:t>: A Python automated compliance scorer rated all 486 documents along five indicators—format, clauses, terminology, violations, and vagueness.</w:t>
+        <w:t>: A Python automated compliance scorer (auto_scorer.py, openly released) rated all 486 documents on five dimensions (0–5 integer scale).</w:t>
+      </w:r>
+    </w:p>
+    <w:p>
+      <w:pPr>
+        <w:pStyle w:val="ListBullet"/>
+        <w:spacing w:before="40" w:after="40" w:lineRule="auto" w:line="360"/>
+      </w:pPr>
+      <w:r>
+        <w:rPr>
+          <w:rFonts w:ascii="Times New Roman" w:hAnsi="Times New Roman" w:eastAsia="宋体"/>
+          <w:b/>
+          <w:sz w:val="22"/>
+        </w:rPr>
+        <w:t>Format</w:t>
+      </w:r>
+      <w:r>
+        <w:rPr>
+          <w:rFonts w:ascii="Times New Roman" w:hAnsi="Times New Roman" w:eastAsia="宋体"/>
+          <w:b w:val="0"/>
+          <w:sz w:val="22"/>
+        </w:rPr>
+        <w:t>: required section headings matched per task class (Class A procedure documents: 8 sections; Class B checklists/reports: 6 sections; Class C audit reports: 7 sections; synonyms accepted), combined with numbering-depth and empty-section checks; ≥3 missing sections scored 1, 1 missing section scored 3.</w:t>
+      </w:r>
+    </w:p>
+    <w:p>
+      <w:pPr>
+        <w:pStyle w:val="ListBullet"/>
+        <w:spacing w:before="40" w:after="40" w:lineRule="auto" w:line="360"/>
+      </w:pPr>
+      <w:r>
+        <w:rPr>
+          <w:rFonts w:ascii="Times New Roman" w:hAnsi="Times New Roman" w:eastAsia="宋体"/>
+          <w:b/>
+          <w:sz w:val="22"/>
+        </w:rPr>
+        <w:t>Clause coverage</w:t>
+      </w:r>
+      <w:r>
+        <w:rPr>
+          <w:rFonts w:ascii="Times New Roman" w:hAnsi="Times New Roman" w:eastAsia="宋体"/>
+          <w:b w:val="0"/>
+          <w:sz w:val="22"/>
+        </w:rPr>
+        <w:t>: regular-expression matching of ISO 15189:2022 chapter 4–8 clause identifiers (e.g., 5.4.1), filtered by a ±40-character context window to suppress spurious matches; ≥10 unique clauses with at least one CNAS-CL02 reference scored 5, no reference scored 1.</w:t>
+      </w:r>
+    </w:p>
+    <w:p>
+      <w:pPr>
+        <w:pStyle w:val="ListBullet"/>
+        <w:spacing w:before="40" w:after="40" w:lineRule="auto" w:line="360"/>
+      </w:pPr>
+      <w:r>
+        <w:rPr>
+          <w:rFonts w:ascii="Times New Roman" w:hAnsi="Times New Roman" w:eastAsia="宋体"/>
+          <w:b/>
+          <w:sz w:val="22"/>
+        </w:rPr>
+        <w:t>Terminology compliance</w:t>
+      </w:r>
+      <w:r>
+        <w:rPr>
+          <w:rFonts w:ascii="Times New Roman" w:hAnsi="Times New Roman" w:eastAsia="宋体"/>
+          <w:b w:val="0"/>
+          <w:sz w:val="22"/>
+        </w:rPr>
+        <w:t>: a 14-term mapping table aligned with ISO 15189:2022 / CNAS-CL02:2023 (e.g., 分析前过程 → 检验前过程, 标本 → 样品, 不确定度 → 测量不确定度), with context-exclusion rules to avoid false positives (e.g., 不确定度 inside 测量不确定度 is not flagged).</w:t>
+      </w:r>
+    </w:p>
+    <w:p>
+      <w:pPr>
+        <w:pStyle w:val="ListBullet"/>
+        <w:spacing w:before="40" w:after="40" w:lineRule="auto" w:line="360"/>
+      </w:pPr>
+      <w:r>
+        <w:rPr>
+          <w:rFonts w:ascii="Times New Roman" w:hAnsi="Times New Roman" w:eastAsia="宋体"/>
+          <w:b/>
+          <w:sz w:val="22"/>
+        </w:rPr>
+        <w:t>Vague expressions</w:t>
+      </w:r>
+      <w:r>
+        <w:rPr>
+          <w:rFonts w:ascii="Times New Roman" w:hAnsi="Times New Roman" w:eastAsia="宋体"/>
+          <w:b w:val="0"/>
+          <w:sz w:val="22"/>
+        </w:rPr>
+        <w:t>: detection of expressions such as 及时, 相关人员, 定期, dual-filtered by a compound-word whitelist and a 30-character trailing window for frequency quantifiers (e.g., "weekly" or "annually" suppresses the flag).</w:t>
+      </w:r>
+    </w:p>
+    <w:p>
+      <w:pPr>
+        <w:pStyle w:val="ListBullet"/>
+        <w:spacing w:before="40" w:after="40" w:lineRule="auto" w:line="360"/>
+      </w:pPr>
+      <w:r>
+        <w:rPr>
+          <w:rFonts w:ascii="Times New Roman" w:hAnsi="Times New Roman" w:eastAsia="宋体"/>
+          <w:b/>
+          <w:sz w:val="22"/>
+        </w:rPr>
+        <w:t>Composite score</w:t>
+      </w:r>
+      <w:r>
+        <w:rPr>
+          <w:rFonts w:ascii="Times New Roman" w:hAnsi="Times New Roman" w:eastAsia="宋体"/>
+          <w:b w:val="0"/>
+          <w:sz w:val="22"/>
+        </w:rPr>
+        <w:t>: a weighted aggregate (auto_weighted) of the five dimensions; the exact weights are defined in the WEIGHTS dictionary of auto_scorer.py.</w:t>
       </w:r>
     </w:p>
     <w:p>

</xml_diff>

<commit_message>
docs(paper): expand §2.3 Tier 2/3 reproducibility — prompt, params, rubric table
- Tier 2a: explicit prompt template ref, model params (temp=1.0, max_tokens=4096),
  decompose 378 ratings = 270 (raw) + 81 + 27 (aggregated only)
- Tier 2b: clarify GPT-5.4 via AIHubMix, identical params, 486 = 405+81 raw retained
- New 5-dimension rubric table (5 vs 3 vs 1 anchors) shared by all judges
- Tier 3: explicit reference to shared rubric + ISO/CNAS standard consultation allowed
</commit_message>
<xml_diff>
--- a/paper/manuscript_v2_en_CCLM.docx
+++ b/paper/manuscript_v2_en_CCLM.docx
@@ -565,7 +565,7 @@
           <w:b w:val="0"/>
           <w:sz w:val="22"/>
         </w:rPr>
-        <w:t>: Claude Opus 4.6, acting as a CNAS chief assessor, scored each document on five dimensions (clause coverage, operability, internal consistency, PDCA closure, and professional depth) on a 0–5 scale; 378 documents were rated.</w:t>
+        <w:t>: Claude Opus 4.6 was used as judge under a "CNAS chief assessor" role prompt (the JUDGE_PROMPT_TEMPLATE in gpt_cnas_judge.py, identical to that used in Tier 2b), scoring each document on five dimensions on a 0–5 scale (rubric below). Model parameters: temperature = 1.0, max_tokens = 4 096; one rating per document, single API call. A total of 378 Claude-judge ratings were generated: 270 covered the six core configuration groups (A/B/C/E/F/G) × 15 tasks × 3 replicates (Claude-gen, per-paper raw fully released); 81 covered 9 configurations × A1/B1/C1 × 3 replicates (GPT-gen, archived only as aggregated means; see §4.5 limitation x); and 27 covered the H groups (H2/H3/H4) × A1/B1/C1 × 3 replicates (Claude-gen, archived only as aggregated means).</w:t>
       </w:r>
     </w:p>
     <w:p>
@@ -588,9 +588,683 @@
           <w:b w:val="0"/>
           <w:sz w:val="22"/>
         </w:rPr>
-        <w:t>: GPT-5.4 acted as a judge using the same prompt and covered all 486 documents. Tiers 2a and 2b together formed a 2 × 2 symmetric design (Claude-gen × Claude-judge, Claude-gen × GPT-judge, GPT-gen × Claude-judge, GPT-gen × GPT-judge), enabling orthogonal decomposition of self-preference bias.</w:t>
+        <w:t>: GPT-5.4 (OpenAI, accessed through the AIHubMix API proxy) served as judge using exactly the same prompt, rubric, and 0–5 scale as Tier 2a. Model parameters: temperature = 1.0, max_tokens = 4 096. All 486 generated documents were rated (405 Claude-gen + 81 GPT-gen), one rating per document; per-paper raw JSON files are fully retained and openly released. Tiers 2a and 2b together formed a 2 × 2 symmetric design (Claude-gen × Claude-judge, Claude-gen × GPT-judge, GPT-gen × Claude-judge, GPT-gen × GPT-judge), enabling orthogonal decomposition of self-preference bias.</w:t>
       </w:r>
     </w:p>
+    <w:p>
+      <w:pPr>
+        <w:spacing w:before="80" w:after="80" w:lineRule="auto" w:line="360"/>
+        <w:ind w:firstLine="0"/>
+        <w:jc w:val="both"/>
+      </w:pPr>
+      <w:r>
+        <w:rPr>
+          <w:rFonts w:ascii="Times New Roman" w:hAnsi="Times New Roman" w:eastAsia="宋体"/>
+          <w:b/>
+          <w:sz w:val="22"/>
+        </w:rPr>
+        <w:t>Five-dimensional rating rubric</w:t>
+      </w:r>
+      <w:r>
+        <w:rPr>
+          <w:rFonts w:ascii="Times New Roman" w:hAnsi="Times New Roman" w:eastAsia="宋体"/>
+          <w:b w:val="0"/>
+          <w:sz w:val="22"/>
+        </w:rPr>
+        <w:t xml:space="preserve"> (shared by Tiers 2a/2b and Tier 3):</w:t>
+      </w:r>
+    </w:p>
+    <w:tbl>
+      <w:tblPr>
+        <w:tblW w:type="auto" w:w="0"/>
+        <w:jc w:val="center"/>
+        <w:tblLayout w:type="autofit"/>
+        <w:tblLook w:firstColumn="1" w:firstRow="1" w:lastColumn="0" w:lastRow="0" w:noHBand="0" w:noVBand="1" w:val="04A0"/>
+      </w:tblPr>
+      <w:tblGrid>
+        <w:gridCol w:w="2209"/>
+        <w:gridCol w:w="2209"/>
+        <w:gridCol w:w="2209"/>
+        <w:gridCol w:w="2209"/>
+      </w:tblGrid>
+      <w:tr>
+        <w:tc>
+          <w:tcPr>
+            <w:tcW w:type="dxa" w:w="2209"/>
+            <w:vAlign w:val="center"/>
+            <w:tcBorders>
+              <w:top w:val="single" w:sz="4" w:color="000000"/>
+              <w:left w:val="single" w:sz="4" w:color="000000"/>
+              <w:bottom w:val="single" w:sz="4" w:color="000000"/>
+              <w:right w:val="single" w:sz="4" w:color="000000"/>
+            </w:tcBorders>
+          </w:tcPr>
+          <w:p>
+            <w:pPr>
+              <w:jc w:val="center"/>
+            </w:pPr>
+            <w:r/>
+            <w:r>
+              <w:rPr>
+                <w:rFonts w:ascii="Times New Roman" w:hAnsi="Times New Roman" w:eastAsia="宋体"/>
+                <w:b/>
+                <w:sz w:val="20"/>
+              </w:rPr>
+              <w:t>Dimension</w:t>
+            </w:r>
+          </w:p>
+        </w:tc>
+        <w:tc>
+          <w:tcPr>
+            <w:tcW w:type="dxa" w:w="2209"/>
+            <w:vAlign w:val="center"/>
+            <w:tcBorders>
+              <w:top w:val="single" w:sz="4" w:color="000000"/>
+              <w:left w:val="single" w:sz="4" w:color="000000"/>
+              <w:bottom w:val="single" w:sz="4" w:color="000000"/>
+              <w:right w:val="single" w:sz="4" w:color="000000"/>
+            </w:tcBorders>
+          </w:tcPr>
+          <w:p>
+            <w:pPr>
+              <w:jc w:val="center"/>
+            </w:pPr>
+            <w:r/>
+            <w:r>
+              <w:rPr>
+                <w:rFonts w:ascii="Times New Roman" w:hAnsi="Times New Roman" w:eastAsia="宋体"/>
+                <w:b/>
+                <w:sz w:val="20"/>
+              </w:rPr>
+              <w:t>Anchor at 5</w:t>
+            </w:r>
+          </w:p>
+        </w:tc>
+        <w:tc>
+          <w:tcPr>
+            <w:tcW w:type="dxa" w:w="2209"/>
+            <w:vAlign w:val="center"/>
+            <w:tcBorders>
+              <w:top w:val="single" w:sz="4" w:color="000000"/>
+              <w:left w:val="single" w:sz="4" w:color="000000"/>
+              <w:bottom w:val="single" w:sz="4" w:color="000000"/>
+              <w:right w:val="single" w:sz="4" w:color="000000"/>
+            </w:tcBorders>
+          </w:tcPr>
+          <w:p>
+            <w:pPr>
+              <w:jc w:val="center"/>
+            </w:pPr>
+            <w:r/>
+            <w:r>
+              <w:rPr>
+                <w:rFonts w:ascii="Times New Roman" w:hAnsi="Times New Roman" w:eastAsia="宋体"/>
+                <w:b/>
+                <w:sz w:val="20"/>
+              </w:rPr>
+              <w:t>Anchor at 3</w:t>
+            </w:r>
+          </w:p>
+        </w:tc>
+        <w:tc>
+          <w:tcPr>
+            <w:tcW w:type="dxa" w:w="2209"/>
+            <w:vAlign w:val="center"/>
+            <w:tcBorders>
+              <w:top w:val="single" w:sz="4" w:color="000000"/>
+              <w:left w:val="single" w:sz="4" w:color="000000"/>
+              <w:bottom w:val="single" w:sz="4" w:color="000000"/>
+              <w:right w:val="single" w:sz="4" w:color="000000"/>
+            </w:tcBorders>
+          </w:tcPr>
+          <w:p>
+            <w:pPr>
+              <w:jc w:val="center"/>
+            </w:pPr>
+            <w:r/>
+            <w:r>
+              <w:rPr>
+                <w:rFonts w:ascii="Times New Roman" w:hAnsi="Times New Roman" w:eastAsia="宋体"/>
+                <w:b/>
+                <w:sz w:val="20"/>
+              </w:rPr>
+              <w:t>Anchor at 1</w:t>
+            </w:r>
+          </w:p>
+        </w:tc>
+      </w:tr>
+      <w:tr>
+        <w:tc>
+          <w:tcPr>
+            <w:tcW w:type="dxa" w:w="2209"/>
+            <w:vAlign w:val="center"/>
+            <w:tcBorders>
+              <w:top w:val="single" w:sz="4" w:color="000000"/>
+              <w:left w:val="single" w:sz="4" w:color="000000"/>
+              <w:bottom w:val="single" w:sz="4" w:color="000000"/>
+              <w:right w:val="single" w:sz="4" w:color="000000"/>
+            </w:tcBorders>
+          </w:tcPr>
+          <w:p>
+            <w:pPr>
+              <w:jc w:val="left"/>
+            </w:pPr>
+            <w:r/>
+            <w:r>
+              <w:rPr>
+                <w:rFonts w:ascii="Times New Roman" w:hAnsi="Times New Roman" w:eastAsia="宋体"/>
+                <w:b w:val="0"/>
+                <w:sz w:val="20"/>
+              </w:rPr>
+              <w:t>Clause coverage</w:t>
+            </w:r>
+          </w:p>
+        </w:tc>
+        <w:tc>
+          <w:tcPr>
+            <w:tcW w:type="dxa" w:w="2209"/>
+            <w:vAlign w:val="center"/>
+            <w:tcBorders>
+              <w:top w:val="single" w:sz="4" w:color="000000"/>
+              <w:left w:val="single" w:sz="4" w:color="000000"/>
+              <w:bottom w:val="single" w:sz="4" w:color="000000"/>
+              <w:right w:val="single" w:sz="4" w:color="000000"/>
+            </w:tcBorders>
+          </w:tcPr>
+          <w:p>
+            <w:pPr>
+              <w:jc w:val="left"/>
+            </w:pPr>
+            <w:r/>
+            <w:r>
+              <w:rPr>
+                <w:rFonts w:ascii="Times New Roman" w:hAnsi="Times New Roman" w:eastAsia="宋体"/>
+                <w:b w:val="0"/>
+                <w:sz w:val="20"/>
+              </w:rPr>
+              <w:t>All SHALL requirements of the relevant clauses are operationalised with concrete measures</w:t>
+            </w:r>
+          </w:p>
+        </w:tc>
+        <w:tc>
+          <w:tcPr>
+            <w:tcW w:type="dxa" w:w="2209"/>
+            <w:vAlign w:val="center"/>
+            <w:tcBorders>
+              <w:top w:val="single" w:sz="4" w:color="000000"/>
+              <w:left w:val="single" w:sz="4" w:color="000000"/>
+              <w:bottom w:val="single" w:sz="4" w:color="000000"/>
+              <w:right w:val="single" w:sz="4" w:color="000000"/>
+            </w:tcBorders>
+          </w:tcPr>
+          <w:p>
+            <w:pPr>
+              <w:jc w:val="left"/>
+            </w:pPr>
+            <w:r/>
+            <w:r>
+              <w:rPr>
+                <w:rFonts w:ascii="Times New Roman" w:hAnsi="Times New Roman" w:eastAsia="宋体"/>
+                <w:b w:val="0"/>
+                <w:sz w:val="20"/>
+              </w:rPr>
+              <w:t>Major clauses covered but with omissions or surface-level treatment</w:t>
+            </w:r>
+          </w:p>
+        </w:tc>
+        <w:tc>
+          <w:tcPr>
+            <w:tcW w:type="dxa" w:w="2209"/>
+            <w:vAlign w:val="center"/>
+            <w:tcBorders>
+              <w:top w:val="single" w:sz="4" w:color="000000"/>
+              <w:left w:val="single" w:sz="4" w:color="000000"/>
+              <w:bottom w:val="single" w:sz="4" w:color="000000"/>
+              <w:right w:val="single" w:sz="4" w:color="000000"/>
+            </w:tcBorders>
+          </w:tcPr>
+          <w:p>
+            <w:pPr>
+              <w:jc w:val="left"/>
+            </w:pPr>
+            <w:r/>
+            <w:r>
+              <w:rPr>
+                <w:rFonts w:ascii="Times New Roman" w:hAnsi="Times New Roman" w:eastAsia="宋体"/>
+                <w:b w:val="0"/>
+                <w:sz w:val="20"/>
+              </w:rPr>
+              <w:t>Most clauses merely cited without implementation, or major omissions</w:t>
+            </w:r>
+          </w:p>
+        </w:tc>
+      </w:tr>
+      <w:tr>
+        <w:tc>
+          <w:tcPr>
+            <w:tcW w:type="dxa" w:w="2209"/>
+            <w:vAlign w:val="center"/>
+            <w:tcBorders>
+              <w:top w:val="single" w:sz="4" w:color="000000"/>
+              <w:left w:val="single" w:sz="4" w:color="000000"/>
+              <w:bottom w:val="single" w:sz="4" w:color="000000"/>
+              <w:right w:val="single" w:sz="4" w:color="000000"/>
+            </w:tcBorders>
+          </w:tcPr>
+          <w:p>
+            <w:pPr>
+              <w:jc w:val="left"/>
+            </w:pPr>
+            <w:r/>
+            <w:r>
+              <w:rPr>
+                <w:rFonts w:ascii="Times New Roman" w:hAnsi="Times New Roman" w:eastAsia="宋体"/>
+                <w:b w:val="0"/>
+                <w:sz w:val="20"/>
+              </w:rPr>
+              <w:t>Operability</w:t>
+            </w:r>
+          </w:p>
+        </w:tc>
+        <w:tc>
+          <w:tcPr>
+            <w:tcW w:type="dxa" w:w="2209"/>
+            <w:vAlign w:val="center"/>
+            <w:tcBorders>
+              <w:top w:val="single" w:sz="4" w:color="000000"/>
+              <w:left w:val="single" w:sz="4" w:color="000000"/>
+              <w:bottom w:val="single" w:sz="4" w:color="000000"/>
+              <w:right w:val="single" w:sz="4" w:color="000000"/>
+            </w:tcBorders>
+          </w:tcPr>
+          <w:p>
+            <w:pPr>
+              <w:jc w:val="left"/>
+            </w:pPr>
+            <w:r/>
+            <w:r>
+              <w:rPr>
+                <w:rFonts w:ascii="Times New Roman" w:hAnsi="Times New Roman" w:eastAsia="宋体"/>
+                <w:b w:val="0"/>
+                <w:sz w:val="20"/>
+              </w:rPr>
+              <w:t>Every step has a named role (job title), quantified deadline, and explicit output (form ID)</w:t>
+            </w:r>
+          </w:p>
+        </w:tc>
+        <w:tc>
+          <w:tcPr>
+            <w:tcW w:type="dxa" w:w="2209"/>
+            <w:vAlign w:val="center"/>
+            <w:tcBorders>
+              <w:top w:val="single" w:sz="4" w:color="000000"/>
+              <w:left w:val="single" w:sz="4" w:color="000000"/>
+              <w:bottom w:val="single" w:sz="4" w:color="000000"/>
+              <w:right w:val="single" w:sz="4" w:color="000000"/>
+            </w:tcBorders>
+          </w:tcPr>
+          <w:p>
+            <w:pPr>
+              <w:jc w:val="left"/>
+            </w:pPr>
+            <w:r/>
+            <w:r>
+              <w:rPr>
+                <w:rFonts w:ascii="Times New Roman" w:hAnsi="Times New Roman" w:eastAsia="宋体"/>
+                <w:b w:val="0"/>
+                <w:sz w:val="20"/>
+              </w:rPr>
+              <w:t>Most steps actionable, a few vague</w:t>
+            </w:r>
+          </w:p>
+        </w:tc>
+        <w:tc>
+          <w:tcPr>
+            <w:tcW w:type="dxa" w:w="2209"/>
+            <w:vAlign w:val="center"/>
+            <w:tcBorders>
+              <w:top w:val="single" w:sz="4" w:color="000000"/>
+              <w:left w:val="single" w:sz="4" w:color="000000"/>
+              <w:bottom w:val="single" w:sz="4" w:color="000000"/>
+              <w:right w:val="single" w:sz="4" w:color="000000"/>
+            </w:tcBorders>
+          </w:tcPr>
+          <w:p>
+            <w:pPr>
+              <w:jc w:val="left"/>
+            </w:pPr>
+            <w:r/>
+            <w:r>
+              <w:rPr>
+                <w:rFonts w:ascii="Times New Roman" w:hAnsi="Times New Roman" w:eastAsia="宋体"/>
+                <w:b w:val="0"/>
+                <w:sz w:val="20"/>
+              </w:rPr>
+              <w:t>Pervasive use of "in a timely manner", "relevant personnel", "periodically" without operational detail</w:t>
+            </w:r>
+          </w:p>
+        </w:tc>
+      </w:tr>
+      <w:tr>
+        <w:tc>
+          <w:tcPr>
+            <w:tcW w:type="dxa" w:w="2209"/>
+            <w:vAlign w:val="center"/>
+            <w:tcBorders>
+              <w:top w:val="single" w:sz="4" w:color="000000"/>
+              <w:left w:val="single" w:sz="4" w:color="000000"/>
+              <w:bottom w:val="single" w:sz="4" w:color="000000"/>
+              <w:right w:val="single" w:sz="4" w:color="000000"/>
+            </w:tcBorders>
+          </w:tcPr>
+          <w:p>
+            <w:pPr>
+              <w:jc w:val="left"/>
+            </w:pPr>
+            <w:r/>
+            <w:r>
+              <w:rPr>
+                <w:rFonts w:ascii="Times New Roman" w:hAnsi="Times New Roman" w:eastAsia="宋体"/>
+                <w:b w:val="0"/>
+                <w:sz w:val="20"/>
+              </w:rPr>
+              <w:t>Internal consistency</w:t>
+            </w:r>
+          </w:p>
+        </w:tc>
+        <w:tc>
+          <w:tcPr>
+            <w:tcW w:type="dxa" w:w="2209"/>
+            <w:vAlign w:val="center"/>
+            <w:tcBorders>
+              <w:top w:val="single" w:sz="4" w:color="000000"/>
+              <w:left w:val="single" w:sz="4" w:color="000000"/>
+              <w:bottom w:val="single" w:sz="4" w:color="000000"/>
+              <w:right w:val="single" w:sz="4" w:color="000000"/>
+            </w:tcBorders>
+          </w:tcPr>
+          <w:p>
+            <w:pPr>
+              <w:jc w:val="left"/>
+            </w:pPr>
+            <w:r/>
+            <w:r>
+              <w:rPr>
+                <w:rFonts w:ascii="Times New Roman" w:hAnsi="Times New Roman" w:eastAsia="宋体"/>
+                <w:b w:val="0"/>
+                <w:sz w:val="20"/>
+              </w:rPr>
+              <w:t>All referenced documents and forms appear in the corresponding sections; responsibilities cleanly assigned</w:t>
+            </w:r>
+          </w:p>
+        </w:tc>
+        <w:tc>
+          <w:tcPr>
+            <w:tcW w:type="dxa" w:w="2209"/>
+            <w:vAlign w:val="center"/>
+            <w:tcBorders>
+              <w:top w:val="single" w:sz="4" w:color="000000"/>
+              <w:left w:val="single" w:sz="4" w:color="000000"/>
+              <w:bottom w:val="single" w:sz="4" w:color="000000"/>
+              <w:right w:val="single" w:sz="4" w:color="000000"/>
+            </w:tcBorders>
+          </w:tcPr>
+          <w:p>
+            <w:pPr>
+              <w:jc w:val="left"/>
+            </w:pPr>
+            <w:r/>
+            <w:r>
+              <w:rPr>
+                <w:rFonts w:ascii="Times New Roman" w:hAnsi="Times New Roman" w:eastAsia="宋体"/>
+                <w:b w:val="0"/>
+                <w:sz w:val="20"/>
+              </w:rPr>
+              <w:t>A few dangling references or minor textual contradictions</w:t>
+            </w:r>
+          </w:p>
+        </w:tc>
+        <w:tc>
+          <w:tcPr>
+            <w:tcW w:type="dxa" w:w="2209"/>
+            <w:vAlign w:val="center"/>
+            <w:tcBorders>
+              <w:top w:val="single" w:sz="4" w:color="000000"/>
+              <w:left w:val="single" w:sz="4" w:color="000000"/>
+              <w:bottom w:val="single" w:sz="4" w:color="000000"/>
+              <w:right w:val="single" w:sz="4" w:color="000000"/>
+            </w:tcBorders>
+          </w:tcPr>
+          <w:p>
+            <w:pPr>
+              <w:jc w:val="left"/>
+            </w:pPr>
+            <w:r/>
+            <w:r>
+              <w:rPr>
+                <w:rFonts w:ascii="Times New Roman" w:hAnsi="Times New Roman" w:eastAsia="宋体"/>
+                <w:b w:val="0"/>
+                <w:sz w:val="20"/>
+              </w:rPr>
+              <w:t>Many dangling references or conflicting responsibility assignments</w:t>
+            </w:r>
+          </w:p>
+        </w:tc>
+      </w:tr>
+      <w:tr>
+        <w:tc>
+          <w:tcPr>
+            <w:tcW w:type="dxa" w:w="2209"/>
+            <w:vAlign w:val="center"/>
+            <w:tcBorders>
+              <w:top w:val="single" w:sz="4" w:color="000000"/>
+              <w:left w:val="single" w:sz="4" w:color="000000"/>
+              <w:bottom w:val="single" w:sz="4" w:color="000000"/>
+              <w:right w:val="single" w:sz="4" w:color="000000"/>
+            </w:tcBorders>
+          </w:tcPr>
+          <w:p>
+            <w:pPr>
+              <w:jc w:val="left"/>
+            </w:pPr>
+            <w:r/>
+            <w:r>
+              <w:rPr>
+                <w:rFonts w:ascii="Times New Roman" w:hAnsi="Times New Roman" w:eastAsia="宋体"/>
+                <w:b w:val="0"/>
+                <w:sz w:val="20"/>
+              </w:rPr>
+              <w:t>PDCA closure</w:t>
+            </w:r>
+          </w:p>
+        </w:tc>
+        <w:tc>
+          <w:tcPr>
+            <w:tcW w:type="dxa" w:w="2209"/>
+            <w:vAlign w:val="center"/>
+            <w:tcBorders>
+              <w:top w:val="single" w:sz="4" w:color="000000"/>
+              <w:left w:val="single" w:sz="4" w:color="000000"/>
+              <w:bottom w:val="single" w:sz="4" w:color="000000"/>
+              <w:right w:val="single" w:sz="4" w:color="000000"/>
+            </w:tcBorders>
+          </w:tcPr>
+          <w:p>
+            <w:pPr>
+              <w:jc w:val="left"/>
+            </w:pPr>
+            <w:r/>
+            <w:r>
+              <w:rPr>
+                <w:rFonts w:ascii="Times New Roman" w:hAnsi="Times New Roman" w:eastAsia="宋体"/>
+                <w:b w:val="0"/>
+                <w:sz w:val="20"/>
+              </w:rPr>
+              <w:t>Explicit Plan–Do–Check–Act chain with execution records, effectiveness evaluation, non-conformity handling, and improvement</w:t>
+            </w:r>
+          </w:p>
+        </w:tc>
+        <w:tc>
+          <w:tcPr>
+            <w:tcW w:type="dxa" w:w="2209"/>
+            <w:vAlign w:val="center"/>
+            <w:tcBorders>
+              <w:top w:val="single" w:sz="4" w:color="000000"/>
+              <w:left w:val="single" w:sz="4" w:color="000000"/>
+              <w:bottom w:val="single" w:sz="4" w:color="000000"/>
+              <w:right w:val="single" w:sz="4" w:color="000000"/>
+            </w:tcBorders>
+          </w:tcPr>
+          <w:p>
+            <w:pPr>
+              <w:jc w:val="left"/>
+            </w:pPr>
+            <w:r/>
+            <w:r>
+              <w:rPr>
+                <w:rFonts w:ascii="Times New Roman" w:hAnsi="Times New Roman" w:eastAsia="宋体"/>
+                <w:b w:val="0"/>
+                <w:sz w:val="20"/>
+              </w:rPr>
+              <w:t>P-D-C present but A (improvement/feedback) missing</w:t>
+            </w:r>
+          </w:p>
+        </w:tc>
+        <w:tc>
+          <w:tcPr>
+            <w:tcW w:type="dxa" w:w="2209"/>
+            <w:vAlign w:val="center"/>
+            <w:tcBorders>
+              <w:top w:val="single" w:sz="4" w:color="000000"/>
+              <w:left w:val="single" w:sz="4" w:color="000000"/>
+              <w:bottom w:val="single" w:sz="4" w:color="000000"/>
+              <w:right w:val="single" w:sz="4" w:color="000000"/>
+            </w:tcBorders>
+          </w:tcPr>
+          <w:p>
+            <w:pPr>
+              <w:jc w:val="left"/>
+            </w:pPr>
+            <w:r/>
+            <w:r>
+              <w:rPr>
+                <w:rFonts w:ascii="Times New Roman" w:hAnsi="Times New Roman" w:eastAsia="宋体"/>
+                <w:b w:val="0"/>
+                <w:sz w:val="20"/>
+              </w:rPr>
+              <w:t>Execution steps only; no check or improvement</w:t>
+            </w:r>
+          </w:p>
+        </w:tc>
+      </w:tr>
+      <w:tr>
+        <w:tc>
+          <w:tcPr>
+            <w:tcW w:type="dxa" w:w="2209"/>
+            <w:vAlign w:val="center"/>
+            <w:tcBorders>
+              <w:top w:val="single" w:sz="4" w:color="000000"/>
+              <w:left w:val="single" w:sz="4" w:color="000000"/>
+              <w:bottom w:val="single" w:sz="4" w:color="000000"/>
+              <w:right w:val="single" w:sz="4" w:color="000000"/>
+            </w:tcBorders>
+          </w:tcPr>
+          <w:p>
+            <w:pPr>
+              <w:jc w:val="left"/>
+            </w:pPr>
+            <w:r/>
+            <w:r>
+              <w:rPr>
+                <w:rFonts w:ascii="Times New Roman" w:hAnsi="Times New Roman" w:eastAsia="宋体"/>
+                <w:b w:val="0"/>
+                <w:sz w:val="20"/>
+              </w:rPr>
+              <w:t>Professional depth</w:t>
+            </w:r>
+          </w:p>
+        </w:tc>
+        <w:tc>
+          <w:tcPr>
+            <w:tcW w:type="dxa" w:w="2209"/>
+            <w:vAlign w:val="center"/>
+            <w:tcBorders>
+              <w:top w:val="single" w:sz="4" w:color="000000"/>
+              <w:left w:val="single" w:sz="4" w:color="000000"/>
+              <w:bottom w:val="single" w:sz="4" w:color="000000"/>
+              <w:right w:val="single" w:sz="4" w:color="000000"/>
+            </w:tcBorders>
+          </w:tcPr>
+          <w:p>
+            <w:pPr>
+              <w:jc w:val="left"/>
+            </w:pPr>
+            <w:r/>
+            <w:r>
+              <w:rPr>
+                <w:rFonts w:ascii="Times New Roman" w:hAnsi="Times New Roman" w:eastAsia="宋体"/>
+                <w:b w:val="0"/>
+                <w:sz w:val="20"/>
+              </w:rPr>
+              <w:t>Contains laboratory-specific detail (e.g., Westgard rules, measurement uncertainty, Sigma metrics, HIL indices, blind testing, PCR zoning, cold chain)</w:t>
+            </w:r>
+          </w:p>
+        </w:tc>
+        <w:tc>
+          <w:tcPr>
+            <w:tcW w:type="dxa" w:w="2209"/>
+            <w:vAlign w:val="center"/>
+            <w:tcBorders>
+              <w:top w:val="single" w:sz="4" w:color="000000"/>
+              <w:left w:val="single" w:sz="4" w:color="000000"/>
+              <w:bottom w:val="single" w:sz="4" w:color="000000"/>
+              <w:right w:val="single" w:sz="4" w:color="000000"/>
+            </w:tcBorders>
+          </w:tcPr>
+          <w:p>
+            <w:pPr>
+              <w:jc w:val="left"/>
+            </w:pPr>
+            <w:r/>
+            <w:r>
+              <w:rPr>
+                <w:rFonts w:ascii="Times New Roman" w:hAnsi="Times New Roman" w:eastAsia="宋体"/>
+                <w:b w:val="0"/>
+                <w:sz w:val="20"/>
+              </w:rPr>
+              <w:t>Some professional flavour but largely generic</w:t>
+            </w:r>
+          </w:p>
+        </w:tc>
+        <w:tc>
+          <w:tcPr>
+            <w:tcW w:type="dxa" w:w="2209"/>
+            <w:vAlign w:val="center"/>
+            <w:tcBorders>
+              <w:top w:val="single" w:sz="4" w:color="000000"/>
+              <w:left w:val="single" w:sz="4" w:color="000000"/>
+              <w:bottom w:val="single" w:sz="4" w:color="000000"/>
+              <w:right w:val="single" w:sz="4" w:color="000000"/>
+            </w:tcBorders>
+          </w:tcPr>
+          <w:p>
+            <w:pPr>
+              <w:jc w:val="left"/>
+            </w:pPr>
+            <w:r/>
+            <w:r>
+              <w:rPr>
+                <w:rFonts w:ascii="Times New Roman" w:hAnsi="Times New Roman" w:eastAsia="宋体"/>
+                <w:b w:val="0"/>
+                <w:sz w:val="20"/>
+              </w:rPr>
+              <w:t>Generic content applicable to any laboratory</w:t>
+            </w:r>
+          </w:p>
+        </w:tc>
+      </w:tr>
+    </w:tbl>
+    <w:p/>
     <w:p>
       <w:pPr>
         <w:spacing w:before="80" w:after="80" w:lineRule="auto" w:line="360"/>
@@ -611,7 +1285,7 @@
           <w:b w:val="0"/>
           <w:sz w:val="22"/>
         </w:rPr>
-        <w:t>: Three ISO 15189-qualified experts independently scored 10 blinded, stratified-randomly sampled documents. Rater 1 was the first author, with ISO 15189 accreditation-assessment experience; Raters 2 and 3 were qualified ISO 15189 internal auditors from the same institution. The sampling strategy used a fixed random seed (seed = 42) to draw 10 of the 486 documents stratified across 7 core configuration groups × Class A procedure tasks (A1/A2/A3), with 1 to 2 documents per group. Documents were renumbered as paper_01 to paper_10 in random order, with all group identifiers removed. The three experts scored independently without inspecting each other's ratings or discussing them; Raters 2 and 3 completed their scoring without knowledge of Rater 1's ratings, and only thereafter were the three sets of ratings merged. Written informed consent was obtained from Raters 2 and 3 before scoring. The experts used exactly the same five-dimensional rating rubric as the LLM judges.</w:t>
+        <w:t>: Three ISO 15189-qualified experts independently scored 10 blinded, stratified-randomly sampled documents. Rater 1 was the first author, with ISO 15189 accreditation-assessment experience; Raters 2 and 3 were qualified ISO 15189 internal auditors from the same institution. The sampling strategy used a fixed random seed (seed = 42) to draw 10 of the 486 documents stratified across 7 core configuration groups × Class A procedure tasks (A1/A2/A3), with 1 to 2 documents per group. Documents were renumbered as paper_01 to paper_10 in random order, with all group identifiers removed. The three experts scored independently without inspecting each other's ratings or discussing them; Raters 2 and 3 completed their scoring without knowledge of Rater 1's ratings, and only thereafter were the three sets of ratings merged. Written informed consent was obtained from Raters 2 and 3 before scoring. The experts used exactly the same five-dimensional rubric as the LLM judges (see table above) and were free to consult the full text of ISO 15189:2022 and CNAS-CL02:2023 and their annexes during scoring.</w:t>
       </w:r>
     </w:p>
     <w:p>

</xml_diff>

<commit_message>
fix(paper): make 864 derivation explicit (Abstract + §2.3)
- Abstract Methods (2): "864 ratings" → "864 ratings = 378 Claude-judge + 486 GPT-judge"
- §2.3 Tier 2b end: explicit summary "864 LLM-judge ratings = 378 + 486;
  asymmetry due to Claude-judge not run on full H × 15 tasks and full GPT-gen set
  (see §4.5 limitation x)"
- Resolves reviewer concern: 864 was previously ungrounded since
  2 × 486 = 972 ≠ 864 and no derivation was given inline.
</commit_message>
<xml_diff>
--- a/paper/manuscript_v2_en_CCLM.docx
+++ b/paper/manuscript_v2_en_CCLM.docx
@@ -188,7 +188,7 @@
           <w:b w:val="0"/>
           <w:sz w:val="22"/>
         </w:rPr>
-        <w:t>: An asymmetric two-model design produced 486 QMS documents in total: Claude Opus 4.6 × 9 configurations × 15 tasks × 3 replicates (405 documents), and, for cross-model validation, GPT-5.4 × 9 configurations × 3 tasks (A1/B1/C1) × 3 replicates (81 documents). The nine configurations were obtained by orthogonally combining four dimensions—rules, skeleton, detailed content, and examples—with token sizes ranging from 0 to 71 K. Three evaluation tiers were applied: (1) a Python automated compliance scorer; (2) dual LLM-as-Judge review by Claude and GPT-5.4 (864 ratings in total, including a 2 × 2 symmetric cross-model design); and (3) independent scoring by three ISO 15189-qualified experts on 10 stratified-randomly sampled, blinded documents. Inter-rater agreement was assessed by Pearson correlation, Spearman correlation, and intraclass correlation coefficients [ICC(2,1) and ICC(3,1)].</w:t>
+        <w:t>: An asymmetric two-model design produced 486 QMS documents in total: Claude Opus 4.6 × 9 configurations × 15 tasks × 3 replicates (405 documents), and, for cross-model validation, GPT-5.4 × 9 configurations × 3 tasks (A1/B1/C1) × 3 replicates (81 documents). The nine configurations were obtained by orthogonally combining four dimensions—rules, skeleton, detailed content, and examples—with token sizes ranging from 0 to 71 K. Three evaluation tiers were applied: (1) a Python automated compliance scorer; (2) dual LLM-as-Judge review by Claude and GPT-5.4 (864 ratings = 378 Claude-judge + 486 GPT-judge, including a 2 × 2 symmetric cross-model design); and (3) independent scoring by three ISO 15189-qualified experts on 10 stratified-randomly sampled, blinded documents. Inter-rater agreement was assessed by Pearson correlation, Spearman correlation, and intraclass correlation coefficients [ICC(2,1) and ICC(3,1)].</w:t>
       </w:r>
     </w:p>
     <w:p>
@@ -588,7 +588,23 @@
           <w:b w:val="0"/>
           <w:sz w:val="22"/>
         </w:rPr>
-        <w:t>: GPT-5.4 (OpenAI, accessed through the AIHubMix API proxy) served as judge using exactly the same prompt, rubric, and 0–5 scale as Tier 2a. Model parameters: temperature = 1.0, max_tokens = 4 096. All 486 generated documents were rated (405 Claude-gen + 81 GPT-gen), one rating per document; per-paper raw JSON files are fully retained and openly released. Tiers 2a and 2b together formed a 2 × 2 symmetric design (Claude-gen × Claude-judge, Claude-gen × GPT-judge, GPT-gen × Claude-judge, GPT-gen × GPT-judge), enabling orthogonal decomposition of self-preference bias.</w:t>
+        <w:t xml:space="preserve">: GPT-5.4 (OpenAI, accessed through the AIHubMix API proxy) served as judge using exactly the same prompt, rubric, and 0–5 scale as Tier 2a. Model parameters: temperature = 1.0, max_tokens = 4 096. All 486 generated documents were rated (405 Claude-gen + 81 GPT-gen), one rating per document; per-paper raw JSON files are fully retained and openly released. Combined, Tiers 2a and 2b yielded </w:t>
+      </w:r>
+      <w:r>
+        <w:rPr>
+          <w:rFonts w:ascii="Times New Roman" w:hAnsi="Times New Roman" w:eastAsia="宋体"/>
+          <w:b/>
+          <w:sz w:val="22"/>
+        </w:rPr>
+        <w:t>864 LLM-judge ratings</w:t>
+      </w:r>
+      <w:r>
+        <w:rPr>
+          <w:rFonts w:ascii="Times New Roman" w:hAnsi="Times New Roman" w:eastAsia="宋体"/>
+          <w:b w:val="0"/>
+          <w:sz w:val="22"/>
+        </w:rPr>
+        <w:t xml:space="preserve"> (= 378 from Claude-judge + 486 from GPT-judge); the asymmetry reflects that Claude-judge was not run on H-group × full-15-task or on the complete GPT-gen set (see §4.5 limitation x). Tiers 2a and 2b together formed a 2 × 2 symmetric design (Claude-gen × Claude-judge, Claude-gen × GPT-judge, GPT-gen × Claude-judge, GPT-gen × GPT-judge), enabling orthogonal decomposition of self-preference bias.</w:t>
       </w:r>
     </w:p>
     <w:p>

</xml_diff>

<commit_message>
docs(paper): expand §2.3 Tier 3 with explicit 4-level blinding procedure
Add a new "Blinding procedure" subsection covering:
- File renaming (flat paper_01..10 series, group/rep stripped from filename)
- Content sanitisation (automated grep for model + group tokens, 0 hits)
- Order randomisation (seed=42, identical order across all three raters; only
  task category disclosed)
- Key isolation (key.json sealed until all three rating sheets submitted)
References prepare_blind_review.py for full reproducibility.
</commit_message>
<xml_diff>
--- a/paper/manuscript_v2_en_CCLM.docx
+++ b/paper/manuscript_v2_en_CCLM.docx
@@ -1301,7 +1301,86 @@
           <w:b w:val="0"/>
           <w:sz w:val="22"/>
         </w:rPr>
-        <w:t>: Three ISO 15189-qualified experts independently scored 10 blinded, stratified-randomly sampled documents. Rater 1 was the first author, with ISO 15189 accreditation-assessment experience; Raters 2 and 3 were qualified ISO 15189 internal auditors from the same institution. The sampling strategy used a fixed random seed (seed = 42) to draw 10 of the 486 documents stratified across 7 core configuration groups × Class A procedure tasks (A1/A2/A3), with 1 to 2 documents per group. Documents were renumbered as paper_01 to paper_10 in random order, with all group identifiers removed. The three experts scored independently without inspecting each other's ratings or discussing them; Raters 2 and 3 completed their scoring without knowledge of Rater 1's ratings, and only thereafter were the three sets of ratings merged. Written informed consent was obtained from Raters 2 and 3 before scoring. The experts used exactly the same five-dimensional rubric as the LLM judges (see table above) and were free to consult the full text of ISO 15189:2022 and CNAS-CL02:2023 and their annexes during scoring.</w:t>
+        <w:t>: Three ISO 15189-qualified experts independently scored 10 blinded, stratified-randomly sampled documents. Rater 1 was the first author, with ISO 15189 accreditation-assessment experience; Raters 2 and 3 were qualified ISO 15189 internal auditors from the same institution. The sampling strategy used a fixed random seed (seed = 42) to draw 10 of the 486 documents stratified across 7 core configuration groups × Class A procedure tasks (A1/A2/A3), with 1 to 2 documents per group. The three experts scored independently without inspecting each other's ratings or discussing them; Raters 2 and 3 completed their scoring without knowledge of Rater 1's ratings, and only thereafter were the three sets of ratings merged. Written informed consent was obtained from Raters 2 and 3 before scoring. The experts used exactly the same five-dimensional rubric as the LLM judges (see table above) and were free to consult the full text of ISO 15189:2022 and CNAS-CL02:2023 and their annexes during scoring.</w:t>
+      </w:r>
+    </w:p>
+    <w:p>
+      <w:pPr>
+        <w:spacing w:before="80" w:after="80" w:lineRule="auto" w:line="360"/>
+        <w:ind w:firstLine="0"/>
+        <w:jc w:val="both"/>
+      </w:pPr>
+      <w:r>
+        <w:rPr>
+          <w:rFonts w:ascii="Times New Roman" w:hAnsi="Times New Roman" w:eastAsia="宋体"/>
+          <w:b/>
+          <w:sz w:val="22"/>
+        </w:rPr>
+        <w:t>Blinding procedure.</w:t>
+      </w:r>
+      <w:r>
+        <w:rPr>
+          <w:rFonts w:ascii="Times New Roman" w:hAnsi="Times New Roman" w:eastAsia="宋体"/>
+          <w:b w:val="0"/>
+          <w:sz w:val="22"/>
+        </w:rPr>
+        <w:t xml:space="preserve"> Blinding was implemented at four levels (script: prepare_blind_review.py):</w:t>
+      </w:r>
+    </w:p>
+    <w:p>
+      <w:pPr>
+        <w:pStyle w:val="ListBullet"/>
+        <w:spacing w:before="40" w:after="40" w:lineRule="auto" w:line="360"/>
+      </w:pPr>
+      <w:r>
+        <w:rPr>
+          <w:rFonts w:ascii="Times New Roman" w:hAnsi="Times New Roman" w:eastAsia="宋体"/>
+          <w:b w:val="0"/>
+          <w:sz w:val="22"/>
+        </w:rPr>
+        <w:t>*File renaming.* Each sampled document was copied from its original path outputs/{group}/{group}-{task}-{rep}.md to a flat series paper_01.md … paper_10.md; group and replicate identifiers were thereby removed from the filename and the directory structure presented to experts.</w:t>
+      </w:r>
+    </w:p>
+    <w:p>
+      <w:pPr>
+        <w:pStyle w:val="ListBullet"/>
+        <w:spacing w:before="40" w:after="40" w:lineRule="auto" w:line="360"/>
+      </w:pPr>
+      <w:r>
+        <w:rPr>
+          <w:rFonts w:ascii="Times New Roman" w:hAnsi="Times New Roman" w:eastAsia="宋体"/>
+          <w:b w:val="0"/>
+          <w:sz w:val="22"/>
+        </w:rPr>
+        <w:t>*Content sanitisation.* An automated text scan of all 10 blinded files confirmed zero occurrences of any model identifier ("Claude", "GPT", "Opus") or configuration-group token ("H4", "C_full", "G_template", "F_template", "H2_keep", "E_rules", "A_bare", "H3_skeleton") in the document body, so the model/configuration source could not be inferred from the text.</w:t>
+      </w:r>
+    </w:p>
+    <w:p>
+      <w:pPr>
+        <w:pStyle w:val="ListBullet"/>
+        <w:spacing w:before="40" w:after="40" w:lineRule="auto" w:line="360"/>
+      </w:pPr>
+      <w:r>
+        <w:rPr>
+          <w:rFonts w:ascii="Times New Roman" w:hAnsi="Times New Roman" w:eastAsia="宋体"/>
+          <w:b w:val="0"/>
+          <w:sz w:val="22"/>
+        </w:rPr>
+        <w:t>*Order randomisation.* The assignment of (group, task, rep) triples to paper_01–paper_10 was shuffled with a fixed Python random seed (seed = 42). The resulting order was identical for all three experts; only the task category (e.g., "Personnel training and competence-evaluation control procedure") was disclosed in the rating sheet, because this is intrinsic to the document and necessary for assessment, while the underlying configuration group remained hidden.</w:t>
+      </w:r>
+    </w:p>
+    <w:p>
+      <w:pPr>
+        <w:pStyle w:val="ListBullet"/>
+        <w:spacing w:before="40" w:after="40" w:lineRule="auto" w:line="360"/>
+      </w:pPr>
+      <w:r>
+        <w:rPr>
+          <w:rFonts w:ascii="Times New Roman" w:hAnsi="Times New Roman" w:eastAsia="宋体"/>
+          <w:b w:val="0"/>
+          <w:sz w:val="22"/>
+        </w:rPr>
+        <w:t>*Key isolation.* The (paper_id → group, task, rep) mapping (blind_review/key.json) was sealed before scoring began and was opened only after all three rater sheets had been submitted.</w:t>
       </w:r>
     </w:p>
     <w:p>

</xml_diff>

<commit_message>
docs(paper): §2.3 add explicit 0–5 scoring scale before rubric table
Define semantic labels for all six scale points (0/1/2/3/4/5), clarifying
that the rubric table only specifies 5/3/1 anchors and that intermediate
scores (2, 4) are interpolated. Crucially, define 0 as 'dimension cannot be
evaluated' (used when the document is essentially absent, e.g., a model
returns only a planning enquiry). This addresses a common reviewer query
about how 0/2/4 scores were assigned.
</commit_message>
<xml_diff>
--- a/paper/manuscript_v2_en_CCLM.docx
+++ b/paper/manuscript_v2_en_CCLM.docx
@@ -605,6 +605,125 @@
           <w:sz w:val="22"/>
         </w:rPr>
         <w:t xml:space="preserve"> (= 378 from Claude-judge + 486 from GPT-judge); the asymmetry reflects that Claude-judge was not run on H-group × full-15-task or on the complete GPT-gen set (see §4.5 limitation x). Tiers 2a and 2b together formed a 2 × 2 symmetric design (Claude-gen × Claude-judge, Claude-gen × GPT-judge, GPT-gen × Claude-judge, GPT-gen × GPT-judge), enabling orthogonal decomposition of self-preference bias.</w:t>
+      </w:r>
+    </w:p>
+    <w:p>
+      <w:pPr>
+        <w:spacing w:before="80" w:after="80" w:lineRule="auto" w:line="360"/>
+        <w:ind w:firstLine="0"/>
+        <w:jc w:val="both"/>
+      </w:pPr>
+      <w:r>
+        <w:rPr>
+          <w:rFonts w:ascii="Times New Roman" w:hAnsi="Times New Roman" w:eastAsia="宋体"/>
+          <w:b/>
+          <w:sz w:val="22"/>
+        </w:rPr>
+        <w:t>Scoring scale.</w:t>
+      </w:r>
+      <w:r>
+        <w:rPr>
+          <w:rFonts w:ascii="Times New Roman" w:hAnsi="Times New Roman" w:eastAsia="宋体"/>
+          <w:b w:val="0"/>
+          <w:sz w:val="22"/>
+        </w:rPr>
+        <w:t xml:space="preserve"> Each of the five dimensions was scored on a 0–5 integer scale: </w:t>
+      </w:r>
+      <w:r>
+        <w:rPr>
+          <w:rFonts w:ascii="Times New Roman" w:hAnsi="Times New Roman" w:eastAsia="宋体"/>
+          <w:b/>
+          <w:sz w:val="22"/>
+        </w:rPr>
+        <w:t>5 = fully compliant</w:t>
+      </w:r>
+      <w:r>
+        <w:rPr>
+          <w:rFonts w:ascii="Times New Roman" w:hAnsi="Times New Roman" w:eastAsia="宋体"/>
+          <w:b w:val="0"/>
+          <w:sz w:val="22"/>
+        </w:rPr>
+        <w:t xml:space="preserve"> (5-point anchor below); </w:t>
+      </w:r>
+      <w:r>
+        <w:rPr>
+          <w:rFonts w:ascii="Times New Roman" w:hAnsi="Times New Roman" w:eastAsia="宋体"/>
+          <w:b/>
+          <w:sz w:val="22"/>
+        </w:rPr>
+        <w:t>4 = mostly compliant</w:t>
+      </w:r>
+      <w:r>
+        <w:rPr>
+          <w:rFonts w:ascii="Times New Roman" w:hAnsi="Times New Roman" w:eastAsia="宋体"/>
+          <w:b w:val="0"/>
+          <w:sz w:val="22"/>
+        </w:rPr>
+        <w:t xml:space="preserve"> (between the 5- and 3-point anchors, with minor issues only); </w:t>
+      </w:r>
+      <w:r>
+        <w:rPr>
+          <w:rFonts w:ascii="Times New Roman" w:hAnsi="Times New Roman" w:eastAsia="宋体"/>
+          <w:b/>
+          <w:sz w:val="22"/>
+        </w:rPr>
+        <w:t>3 = partially compliant</w:t>
+      </w:r>
+      <w:r>
+        <w:rPr>
+          <w:rFonts w:ascii="Times New Roman" w:hAnsi="Times New Roman" w:eastAsia="宋体"/>
+          <w:b w:val="0"/>
+          <w:sz w:val="22"/>
+        </w:rPr>
+        <w:t xml:space="preserve"> (3-point anchor); </w:t>
+      </w:r>
+      <w:r>
+        <w:rPr>
+          <w:rFonts w:ascii="Times New Roman" w:hAnsi="Times New Roman" w:eastAsia="宋体"/>
+          <w:b/>
+          <w:sz w:val="22"/>
+        </w:rPr>
+        <w:t>2 = noticeably non-compliant</w:t>
+      </w:r>
+      <w:r>
+        <w:rPr>
+          <w:rFonts w:ascii="Times New Roman" w:hAnsi="Times New Roman" w:eastAsia="宋体"/>
+          <w:b w:val="0"/>
+          <w:sz w:val="22"/>
+        </w:rPr>
+        <w:t xml:space="preserve"> (between the 3- and 1-point anchors); </w:t>
+      </w:r>
+      <w:r>
+        <w:rPr>
+          <w:rFonts w:ascii="Times New Roman" w:hAnsi="Times New Roman" w:eastAsia="宋体"/>
+          <w:b/>
+          <w:sz w:val="22"/>
+        </w:rPr>
+        <w:t>1 = severely non-compliant</w:t>
+      </w:r>
+      <w:r>
+        <w:rPr>
+          <w:rFonts w:ascii="Times New Roman" w:hAnsi="Times New Roman" w:eastAsia="宋体"/>
+          <w:b w:val="0"/>
+          <w:sz w:val="22"/>
+        </w:rPr>
+        <w:t xml:space="preserve"> (1-point anchor); </w:t>
+      </w:r>
+      <w:r>
+        <w:rPr>
+          <w:rFonts w:ascii="Times New Roman" w:hAnsi="Times New Roman" w:eastAsia="宋体"/>
+          <w:b/>
+          <w:sz w:val="22"/>
+        </w:rPr>
+        <w:t>0 = the dimension cannot be evaluated</w:t>
+      </w:r>
+      <w:r>
+        <w:rPr>
+          <w:rFonts w:ascii="Times New Roman" w:hAnsi="Times New Roman" w:eastAsia="宋体"/>
+          <w:b w:val="0"/>
+          <w:sz w:val="22"/>
+        </w:rPr>
+        <w:t xml:space="preserve"> because the document is essentially absent or non-substantive (e.g., the model returned only a planning enquiry rather than the requested document). The 5/3/1 anchor descriptors below were specified to all judges (LLM and expert) in identical wording; intermediate scores (2, 4) were assigned when the document fell between two adjacent anchors.</w:t>
       </w:r>
     </w:p>
     <w:p>

</xml_diff>

<commit_message>
fix(paper): switch ablation MCC to BH FDR; remove 'near-significant' claim
§2.4: Bonferroni → Benjamini-Hochberg FDR (statsmodels fdr_bh, α=0.05),
better suited for the exploratory 4-contrast ablation.

§3.2 + Abstract Results (1): now report both raw and BH-adjusted p-values.
After FDR adjustment, only the rules layer remains significant
(p_adj<0.001); skeleton p_adj=0.11, detailed p_adj=0.79, examples p_adj=0.61.
Removed the 'near-significantly' wording — at p_adj=0.11 it is no longer
defensible. Skeleton is now framed as 'directional, requiring replication'.

§4.1: 'rules and skeleton are necessary' → 'rules necessary; skeleton
directional, did not reach significance after correction'.

§3.2 H4 vs H3 contrast: explicitly noted as descriptive (outside the
4-factor BH set), so its raw p=0.80 is reported uncorrected.
</commit_message>
<xml_diff>
--- a/paper/manuscript_v2_en_CCLM.docx
+++ b/paper/manuscript_v2_en_CCLM.docx
@@ -211,7 +211,7 @@
           <w:b w:val="0"/>
           <w:sz w:val="22"/>
         </w:rPr>
-        <w:t>: (1) Four-factor orthogonal ablation showed that the rules layer (Δ = +0.511, p &lt; 0.001) and the skeleton layer (Δ = +0.213, p = 0.055) contributed significantly or near-significantly at the LLM-judge tier; detailed content (Δ = −0.031, p = 0.79) and examples (Δ = −0.053, p = 0.46) contributed nothing or were mildly harmful. (2) The full-context configuration C_full (71 K) yielded cross-evaluated scores of 3.22–4.56 under Claude generation but dropped to 1.40–1.84 under GPT-5.4 generation, indicating that long-context exploitation in this scenario is model-specific to Claude Opus. (3) Claude-as-judge exhibited a self-preference bias of approximately +0.46, whereas GPT-as-judge showed an inverse bias of approximately −0.47. (4) Inter-rater agreement among the three experts reached ICC(2,k) = 0.982; expert mean versus Claude-as-judge gave ICC(3,1) = 0.548 (p = 0.04), versus GPT-as-judge ICC(3,1) = 0.217 (p = 0.26); both LLM judges systematically overestimated by 0.52–0.90 points. (5) The configuration ranked first by LLM judges, H4_sop_only (6 K skeleton), ranked second-to-last under expert evaluation (3.20, n = 2), whereas template-based configurations F_template (35 K), H2_keep_examples (61 K), and G_template_rules (38 K) ranked highest under expert evaluation (4.06–4.24).</w:t>
+        <w:t>: (1) Four-factor orthogonal ablation (Benjamini–Hochberg FDR-adjusted) showed that, at the LLM-judge tier, only the rules layer reached significance (Δ = +0.511; BH-adjusted p &lt; 0.001); the skeleton layer (Δ = +0.213; BH-adjusted p = 0.11), detailed content (Δ = −0.031; BH-adjusted p = 0.79), and examples (Δ = −0.053; BH-adjusted p = 0.61) did not. (2) The full-context configuration C_full (71 K) yielded cross-evaluated scores of 3.22–4.56 under Claude generation but dropped to 1.40–1.84 under GPT-5.4 generation, indicating that long-context exploitation in this scenario is model-specific to Claude Opus. (3) Claude-as-judge exhibited a self-preference bias of approximately +0.46, whereas GPT-as-judge showed an inverse bias of approximately −0.47. (4) Inter-rater agreement among the three experts reached ICC(2,k) = 0.982; expert mean versus Claude-as-judge gave ICC(3,1) = 0.548 (p = 0.04), versus GPT-as-judge ICC(3,1) = 0.217 (p = 0.26); both LLM judges systematically overestimated by 0.52–0.90 points. (5) The configuration ranked first by LLM judges, H4_sop_only (6 K skeleton), ranked second-to-last under expert evaluation (3.20, n = 2), whereas template-based configurations F_template (35 K), H2_keep_examples (61 K), and G_template_rules (38 K) ranked highest under expert evaluation (4.06–4.24).</w:t>
       </w:r>
     </w:p>
     <w:p>
@@ -1528,7 +1528,7 @@
           <w:b w:val="0"/>
           <w:sz w:val="22"/>
         </w:rPr>
-        <w:t>Pairwise between-group comparisons used the two-sided Mann–Whitney U test (scipy.stats.mannwhitneyu) on per-paper GPT-judge scores (n = 45 per group: 15 tasks × 3 replicates), with Bonferroni correction applied for multiple comparisons within the four-factor ablation. The four configuration-component effects were quantified under an orthogonal substitution scheme using targeted configuration contrasts: rules = E_rules_v2 vs A_bare; skeleton = H4_sop_only vs E_rules_v2; detailed content = G_template_rules vs H3_skeleton; examples = H2_keep_examples vs G_template_rules. Each effect Δ was defined as a *simple arithmetic mean difference*, Δ = mean(group_B) − mean(group_A), where each group mean is the unweighted average of the 45 per-paper GPT-judge scores in that configuration; no covariates, random effects, weighting, or shrinkage were applied. The same 45-per-group sample served as input to the corresponding Mann–Whitney U test reported alongside each Δ. No L9 orthogonal-array decomposition, least-squares-means estimation, or mixed-effects modelling was used. Inter-rater agreement was assessed by Pearson correlation, Spearman correlation, and the ICC(2,1) (absolute agreement) and ICC(3,1) (consistency in ranking) defined by Shrout and Fleiss [13]. ICC computation used the pingouin 0.5 Python library. Self-preference bias was quantified by cross-model differencing as bias = (mean own-own) − (mean cross-own).</w:t>
+        <w:t>Pairwise between-group comparisons used the two-sided Mann–Whitney U test (scipy.stats.mannwhitneyu) on per-paper GPT-judge scores (n = 45 per group: 15 tasks × 3 replicates). Multiple-comparison adjustment within the four-factor ablation used the Benjamini–Hochberg false-discovery-rate (FDR) procedure (statsmodels.stats.multitest.multipletests, method='fdr_bh', α = 0.05); BH was preferred over Bonferroni given the exploratory nature of the four-contrast ablation. The four configuration-component effects were quantified under an orthogonal substitution scheme using targeted configuration contrasts: rules = E_rules_v2 vs A_bare; skeleton = H4_sop_only vs E_rules_v2; detailed content = G_template_rules vs H3_skeleton; examples = H2_keep_examples vs G_template_rules. Each effect Δ was defined as a *simple arithmetic mean difference*, Δ = mean(group_B) − mean(group_A), where each group mean is the unweighted average of the 45 per-paper GPT-judge scores in that configuration; no covariates, random effects, weighting, or shrinkage were applied. The same 45-per-group sample served as input to the corresponding Mann–Whitney U test reported alongside each Δ. No L9 orthogonal-array decomposition, least-squares-means estimation, or mixed-effects modelling was used. Inter-rater agreement was assessed by Pearson correlation, Spearman correlation, and the ICC(2,1) (absolute agreement) and ICC(3,1) (consistency in ranking) defined by Shrout and Fleiss [13]. ICC computation used the pingouin 0.5 Python library. Self-preference bias was quantified by cross-model differencing as bias = (mean own-own) − (mean cross-own).</w:t>
       </w:r>
     </w:p>
     <w:p>
@@ -1600,7 +1600,7 @@
           <w:b w:val="0"/>
           <w:sz w:val="22"/>
         </w:rPr>
-        <w:t>The main effect of the rules layer was +0.511 (p &lt; 0.001) and that of the skeleton layer was +0.213 (p = 0.055), both contributing positively (significantly or near-significantly) at the LLM-judge tier. Detailed content showed no contribution (G vs. H3: Δ = −0.031, p = 0.79), and examples showed a directional harm (H2 vs. G: Δ = −0.053, p = 0.46). H4 and H3 did not differ significantly (Δ = −0.009, p = 0.80), suggesting that the task-specific SOP skeleton (6 K) and the full module skeleton (13 K) are functionally equivalent. This ablation result holds only at the LLM-judge tier; expert-tier analysis is reported in Section 3.5.</w:t>
+        <w:t>All four ablation effects are reported with both raw and Benjamini–Hochberg-adjusted p-values. The rules layer was the only factor reaching significance after correction (Δ = +0.511; raw p &lt; 0.001; BH-adjusted p &lt; 0.001). The skeleton layer (Δ = +0.213; raw p = 0.055; BH-adjusted p = 0.11) showed a directional positive effect that did not reach the conventional 0.05 threshold after multiple-comparison correction; we interpret this as suggestive evidence requiring replication. Detailed content (G vs. H3: Δ = −0.031; raw p = 0.79; BH-adjusted p = 0.79) and examples (H2 vs. G: Δ = −0.053; raw p = 0.46; BH-adjusted p = 0.61) showed no statistical contribution. H4 and H3 did not differ (Δ = −0.009, raw p = 0.80; this contrast is descriptive and lies outside the four-factor BH set, hence reported uncorrected), suggesting that the task-specific SOP skeleton (6 K) and the full module skeleton (13 K) are functionally equivalent. This ablation result holds only at the LLM-judge tier; expert-tier analysis is reported in Section 3.5.</w:t>
       </w:r>
     </w:p>
     <w:p>
@@ -1804,7 +1804,7 @@
           <w:b w:val="0"/>
           <w:sz w:val="22"/>
         </w:rPr>
-        <w:t>Four-factor ablation at the LLM-judge tier yields a parsimonious conclusion: rules and skeleton are necessary, while detailed content and examples contribute nothing or are even harmful. This conclusion is consistent with the lost-in-the-middle theory [3] and with prompt-minimization practice [12]. However, expert-tier analysis overturns this simplification: detailed content (the full template in F and G) substantially improves clinical usability (F 4.24 vs. H4 3.20, a difference of 1.04), because the LLM's internalized knowledge does not cover all sub-scenarios of clinical practice—including emergency-sample handling, patient-self-collected specimens, courier-personnel qualification, and rejection criteria. Such information must be explicitly supplied through the system prompt.</w:t>
+        <w:t>Four-factor ablation at the LLM-judge tier yields a parsimonious conclusion: the rules layer is necessary (BH-adjusted p &lt; 0.001), the skeleton layer shows a directional benefit that did not reach significance after correction (BH-adjusted p = 0.11), while detailed content and examples contribute nothing. This conclusion is consistent with the lost-in-the-middle theory [3] and with prompt-minimization practice [12]. However, expert-tier analysis overturns this simplification: detailed content (the full template in F and G) substantially improves clinical usability (F 4.24 vs. H4 3.20, a difference of 1.04), because the LLM's internalized knowledge does not cover all sub-scenarios of clinical practice—including emergency-sample handling, patient-self-collected specimens, courier-personnel qualification, and rejection criteria. Such information must be explicitly supplied through the system prompt.</w:t>
       </w:r>
     </w:p>
     <w:p>

</xml_diff>

<commit_message>
docs(paper): §2.4 declare all four ICC variants used (1,1/3,1/2,k/3,k)
Methods previously listed only ICC(2,1) and ICC(3,1) but Results report
ICC(2,k) = 0.982 and ICC(3,k) = 0.981 for the three-rater expert panel.
Now Methods explicitly defines all four variants and their roles:
  ICC(2,1) / ICC(3,1) — single-rater, used for pairwise comparisons
  ICC(2,k) / ICC(3,k) — k-rater averaged reliability, used for the panel
Resolves the Methods/Results inconsistency reviewers would flag.
</commit_message>
<xml_diff>
--- a/paper/manuscript_v2_en_CCLM.docx
+++ b/paper/manuscript_v2_en_CCLM.docx
@@ -1528,7 +1528,71 @@
           <w:b w:val="0"/>
           <w:sz w:val="22"/>
         </w:rPr>
-        <w:t>Pairwise between-group comparisons used the two-sided Mann–Whitney U test (scipy.stats.mannwhitneyu) on per-paper GPT-judge scores (n = 45 per group: 15 tasks × 3 replicates). Multiple-comparison adjustment within the four-factor ablation used the Benjamini–Hochberg false-discovery-rate (FDR) procedure (statsmodels.stats.multitest.multipletests, method='fdr_bh', α = 0.05); BH was preferred over Bonferroni given the exploratory nature of the four-contrast ablation. The four configuration-component effects were quantified under an orthogonal substitution scheme using targeted configuration contrasts: rules = E_rules_v2 vs A_bare; skeleton = H4_sop_only vs E_rules_v2; detailed content = G_template_rules vs H3_skeleton; examples = H2_keep_examples vs G_template_rules. Each effect Δ was defined as a *simple arithmetic mean difference*, Δ = mean(group_B) − mean(group_A), where each group mean is the unweighted average of the 45 per-paper GPT-judge scores in that configuration; no covariates, random effects, weighting, or shrinkage were applied. The same 45-per-group sample served as input to the corresponding Mann–Whitney U test reported alongside each Δ. No L9 orthogonal-array decomposition, least-squares-means estimation, or mixed-effects modelling was used. Inter-rater agreement was assessed by Pearson correlation, Spearman correlation, and the ICC(2,1) (absolute agreement) and ICC(3,1) (consistency in ranking) defined by Shrout and Fleiss [13]. ICC computation used the pingouin 0.5 Python library. Self-preference bias was quantified by cross-model differencing as bias = (mean own-own) − (mean cross-own).</w:t>
+        <w:t xml:space="preserve">Pairwise between-group comparisons used the two-sided Mann–Whitney U test (scipy.stats.mannwhitneyu) on per-paper GPT-judge scores (n = 45 per group: 15 tasks × 3 replicates). Multiple-comparison adjustment within the four-factor ablation used the Benjamini–Hochberg false-discovery-rate (FDR) procedure (statsmodels.stats.multitest.multipletests, method='fdr_bh', α = 0.05); BH was preferred over Bonferroni given the exploratory nature of the four-contrast ablation. The four configuration-component effects were quantified under an orthogonal substitution scheme using targeted configuration contrasts: rules = E_rules_v2 vs A_bare; skeleton = H4_sop_only vs E_rules_v2; detailed content = G_template_rules vs H3_skeleton; examples = H2_keep_examples vs G_template_rules. Each effect Δ was defined as a *simple arithmetic mean difference*, Δ = mean(group_B) − mean(group_A), where each group mean is the unweighted average of the 45 per-paper GPT-judge scores in that configuration; no covariates, random effects, weighting, or shrinkage were applied. The same 45-per-group sample served as input to the corresponding Mann–Whitney U test reported alongside each Δ. No L9 orthogonal-array decomposition, least-squares-means estimation, or mixed-effects modelling was used. Inter-rater agreement was assessed by Pearson correlation, Spearman correlation, and four intraclass correlation coefficients defined by Shrout and Fleiss [13]: </w:t>
+      </w:r>
+      <w:r>
+        <w:rPr>
+          <w:rFonts w:ascii="Times New Roman" w:hAnsi="Times New Roman" w:eastAsia="宋体"/>
+          <w:b/>
+          <w:sz w:val="22"/>
+        </w:rPr>
+        <w:t>ICC(2,1)</w:t>
+      </w:r>
+      <w:r>
+        <w:rPr>
+          <w:rFonts w:ascii="Times New Roman" w:hAnsi="Times New Roman" w:eastAsia="宋体"/>
+          <w:b w:val="0"/>
+          <w:sz w:val="22"/>
+        </w:rPr>
+        <w:t xml:space="preserve"> (single-rater absolute agreement, two-way random effects) and </w:t>
+      </w:r>
+      <w:r>
+        <w:rPr>
+          <w:rFonts w:ascii="Times New Roman" w:hAnsi="Times New Roman" w:eastAsia="宋体"/>
+          <w:b/>
+          <w:sz w:val="22"/>
+        </w:rPr>
+        <w:t>ICC(3,1)</w:t>
+      </w:r>
+      <w:r>
+        <w:rPr>
+          <w:rFonts w:ascii="Times New Roman" w:hAnsi="Times New Roman" w:eastAsia="宋体"/>
+          <w:b w:val="0"/>
+          <w:sz w:val="22"/>
+        </w:rPr>
+        <w:t xml:space="preserve"> (single-rater consistency, two-way mixed effects) for pairwise comparisons (e.g., expert mean vs LLM judge, and rater-pair comparisons within the expert panel); and </w:t>
+      </w:r>
+      <w:r>
+        <w:rPr>
+          <w:rFonts w:ascii="Times New Roman" w:hAnsi="Times New Roman" w:eastAsia="宋体"/>
+          <w:b/>
+          <w:sz w:val="22"/>
+        </w:rPr>
+        <w:t>ICC(2,k)</w:t>
+      </w:r>
+      <w:r>
+        <w:rPr>
+          <w:rFonts w:ascii="Times New Roman" w:hAnsi="Times New Roman" w:eastAsia="宋体"/>
+          <w:b w:val="0"/>
+          <w:sz w:val="22"/>
+        </w:rPr>
+        <w:t xml:space="preserve"> and </w:t>
+      </w:r>
+      <w:r>
+        <w:rPr>
+          <w:rFonts w:ascii="Times New Roman" w:hAnsi="Times New Roman" w:eastAsia="宋体"/>
+          <w:b/>
+          <w:sz w:val="22"/>
+        </w:rPr>
+        <w:t>ICC(3,k)</w:t>
+      </w:r>
+      <w:r>
+        <w:rPr>
+          <w:rFonts w:ascii="Times New Roman" w:hAnsi="Times New Roman" w:eastAsia="宋体"/>
+          <w:b w:val="0"/>
+          <w:sz w:val="22"/>
+        </w:rPr>
+        <w:t xml:space="preserve"> — the corresponding *averaged k-rater* reliability variants with k = 3 — for the overall reliability of the three-rater expert panel. ICC computation used the pingouin 0.5 Python library. Self-preference bias was quantified by cross-model differencing as bias = (mean own-own) − (mean cross-own).</w:t>
       </w:r>
     </w:p>
     <w:p>

</xml_diff>

<commit_message>
docs(paper): rater COI declaration, no calibration disclosure, Pearson/Spearman rationale
§2.4: Add rationale for reporting Pearson + Spearman alongside ICCs
  (Pearson = linear with shift tolerance; Spearman = rank-only; ICC = standard
  reliability framework — three together give complete picture).

§2.3 Tier 3:
  - Add explicit Conflict-of-Interest declaration for raters: none of the three
    has any commercial/research/consulting relationship with Anthropic, OpenAI,
    or other LLM providers.
  - Disclose that no formal pre-scoring calibration session was conducted;
    raters scored independently from the published rubric and standards.

§4.5 (xii): New limitation — absence of pre-scoring calibration. Notes that
  the high ICC(2,k)=0.982 indicates the rubric was self-explanatory in the
  same-institution context, but a calibration step would strengthen
  multi-centre replication.
</commit_message>
<xml_diff>
--- a/paper/manuscript_v2_en_CCLM.docx
+++ b/paper/manuscript_v2_en_CCLM.docx
@@ -1420,7 +1420,39 @@
           <w:b w:val="0"/>
           <w:sz w:val="22"/>
         </w:rPr>
-        <w:t>: Three ISO 15189-qualified experts independently scored 10 blinded, stratified-randomly sampled documents. Rater 1 was the first author, with ISO 15189 accreditation-assessment experience; Raters 2 and 3 were qualified ISO 15189 internal auditors from the same institution. The sampling strategy used a fixed random seed (seed = 42) to draw 10 of the 486 documents stratified across 7 core configuration groups × Class A procedure tasks (A1/A2/A3), with 1 to 2 documents per group. The three experts scored independently without inspecting each other's ratings or discussing them; Raters 2 and 3 completed their scoring without knowledge of Rater 1's ratings, and only thereafter were the three sets of ratings merged. Written informed consent was obtained from Raters 2 and 3 before scoring. The experts used exactly the same five-dimensional rubric as the LLM judges (see table above) and were free to consult the full text of ISO 15189:2022 and CNAS-CL02:2023 and their annexes during scoring.</w:t>
+        <w:t xml:space="preserve">: Three ISO 15189-qualified experts independently scored 10 blinded, stratified-randomly sampled documents. Rater 1 was the first author, with ISO 15189 accreditation-assessment experience; Raters 2 and 3 were qualified ISO 15189 internal auditors from the same institution. The sampling strategy used a fixed random seed (seed = 42) to draw 10 of the 486 documents stratified across 7 core configuration groups × Class A procedure tasks (A1/A2/A3), with 1 to 2 documents per group. The three experts scored independently without inspecting each other's ratings or discussing them; Raters 2 and 3 completed their scoring without knowledge of Rater 1's ratings, and only thereafter were the three sets of ratings merged. Written informed consent was obtained from Raters 2 and 3 before scoring. The experts used exactly the same five-dimensional rubric as the LLM judges (see table above) and were free to consult the full text of ISO 15189:2022 and CNAS-CL02:2023 and their annexes during scoring. </w:t>
+      </w:r>
+      <w:r>
+        <w:rPr>
+          <w:rFonts w:ascii="Times New Roman" w:hAnsi="Times New Roman" w:eastAsia="宋体"/>
+          <w:b/>
+          <w:sz w:val="22"/>
+        </w:rPr>
+        <w:t>Conflict-of-interest declaration for raters.</w:t>
+      </w:r>
+      <w:r>
+        <w:rPr>
+          <w:rFonts w:ascii="Times New Roman" w:hAnsi="Times New Roman" w:eastAsia="宋体"/>
+          <w:b w:val="0"/>
+          <w:sz w:val="22"/>
+        </w:rPr>
+        <w:t xml:space="preserve"> None of the three raters has any commercial, research, or consulting relationship with Anthropic, OpenAI, or any other LLM provider, and none received funding or in-kind support from these entities for this study. </w:t>
+      </w:r>
+      <w:r>
+        <w:rPr>
+          <w:rFonts w:ascii="Times New Roman" w:hAnsi="Times New Roman" w:eastAsia="宋体"/>
+          <w:b/>
+          <w:sz w:val="22"/>
+        </w:rPr>
+        <w:t>Pre-scoring calibration.</w:t>
+      </w:r>
+      <w:r>
+        <w:rPr>
+          <w:rFonts w:ascii="Times New Roman" w:hAnsi="Times New Roman" w:eastAsia="宋体"/>
+          <w:b w:val="0"/>
+          <w:sz w:val="22"/>
+        </w:rPr>
+        <w:t xml:space="preserve"> No formal pre-scoring calibration session was conducted; the three raters scored independently using only the published five-dimensional rubric and the ISO/CNAS standards. The absence of formal calibration is acknowledged as a methodological limitation in §4.5 (xii).</w:t>
       </w:r>
     </w:p>
     <w:p>
@@ -1528,7 +1560,7 @@
           <w:b w:val="0"/>
           <w:sz w:val="22"/>
         </w:rPr>
-        <w:t xml:space="preserve">Pairwise between-group comparisons used the two-sided Mann–Whitney U test (scipy.stats.mannwhitneyu) on per-paper GPT-judge scores (n = 45 per group: 15 tasks × 3 replicates). Multiple-comparison adjustment within the four-factor ablation used the Benjamini–Hochberg false-discovery-rate (FDR) procedure (statsmodels.stats.multitest.multipletests, method='fdr_bh', α = 0.05); BH was preferred over Bonferroni given the exploratory nature of the four-contrast ablation. The four configuration-component effects were quantified under an orthogonal substitution scheme using targeted configuration contrasts: rules = E_rules_v2 vs A_bare; skeleton = H4_sop_only vs E_rules_v2; detailed content = G_template_rules vs H3_skeleton; examples = H2_keep_examples vs G_template_rules. Each effect Δ was defined as a *simple arithmetic mean difference*, Δ = mean(group_B) − mean(group_A), where each group mean is the unweighted average of the 45 per-paper GPT-judge scores in that configuration; no covariates, random effects, weighting, or shrinkage were applied. The same 45-per-group sample served as input to the corresponding Mann–Whitney U test reported alongside each Δ. No L9 orthogonal-array decomposition, least-squares-means estimation, or mixed-effects modelling was used. Inter-rater agreement was assessed by Pearson correlation, Spearman correlation, and four intraclass correlation coefficients defined by Shrout and Fleiss [13]: </w:t>
+        <w:t xml:space="preserve">Pairwise between-group comparisons used the two-sided Mann–Whitney U test (scipy.stats.mannwhitneyu) on per-paper GPT-judge scores (n = 45 per group: 15 tasks × 3 replicates). Multiple-comparison adjustment within the four-factor ablation used the Benjamini–Hochberg false-discovery-rate (FDR) procedure (statsmodels.stats.multitest.multipletests, method='fdr_bh', α = 0.05); BH was preferred over Bonferroni given the exploratory nature of the four-contrast ablation. The four configuration-component effects were quantified under an orthogonal substitution scheme using targeted configuration contrasts: rules = E_rules_v2 vs A_bare; skeleton = H4_sop_only vs E_rules_v2; detailed content = G_template_rules vs H3_skeleton; examples = H2_keep_examples vs G_template_rules. Each effect Δ was defined as a *simple arithmetic mean difference*, Δ = mean(group_B) − mean(group_A), where each group mean is the unweighted average of the 45 per-paper GPT-judge scores in that configuration; no covariates, random effects, weighting, or shrinkage were applied. The same 45-per-group sample served as input to the corresponding Mann–Whitney U test reported alongside each Δ. No L9 orthogonal-array decomposition, least-squares-means estimation, or mixed-effects modelling was used. Inter-rater agreement was assessed by three complementary measures: Pearson correlation captures linear association while tolerating systematic shift between raters; Spearman correlation assesses rank-order agreement without assuming linearity; and intraclass correlation coefficients quantify reliability under the standard framework. We report all three to give a complete picture of inter-rater patterns. Four ICC variants defined by Shrout and Fleiss [13] are used: </w:t>
       </w:r>
       <w:r>
         <w:rPr>
@@ -2939,7 +2971,7 @@
           <w:b w:val="0"/>
           <w:sz w:val="22"/>
         </w:rPr>
-        <w:t>The present study has the following limitations. (i) Limited expert sample size: n = 3 raters × 10 documents, with only 1 to 2 documents per group, supporting only directional ranking conclusions and not strict statistical inference. Multi-center validation with 3–5 experts × 30–50 documents across institutions is a key direction for future work. (ii) Two-edged effect of same-institution agreement: the very high agreement among the three experts [ICC(2,k) = 0.982] is both evidence of the validity of the five-dimensional rubric and a possible reflection of shared professional culture, training lineage, and clause-interpretation habits within the same institution, which may overestimate cross-institution generalizability. (iii) Dual role of the first author: the first author acted both as Rater 1 and as study designer. Raters 2 and 3 completed their scoring without knowledge of Rater 1's ratings, and the data of all raters are fully released. (iv) Shared rubric between experts and LLM judges: there is a risk of shared-measurement bias; future work should add expert-native dimensions such as clinical usability. (v) Limited GPT-5.4 task coverage: only A1/B1/C1 (81 documents) were generated. (vi) Domain specificity: results are restricted to ISO 15189 medical laboratories, and transferability to other standards such as ISO 17025 or ISO 9001 remains to be validated. (vii) Absence of third-party LLM judges: only Claude and GPT were used as judges. (viii) Language scope: all QMS documents were in Chinese; the effects in English or other languages have not been verified. (ix) Model temporality: the quality of generated documents depends on the model used, and the conclusions of the present study may need to be re-validated as LLMs continue to iterate. (x) Raw-data retention for cross-judge cells: per-paper raw scores for the Claude-judge × GPT-gen quadrant and for the Claude-judge × H-group Claude-gen subset were archived only as aggregated means; the per-paper JSON files were not retained. The 2 × 2 self-preference matrix therefore cannot be independently recomputed from the lowest-level data, although per-paper raw Claude-judge ratings for the six core configuration groups (A/B/C/E/F/G; 270 ratings) and all 486 GPT-judge per-paper ratings are fully released. (xi) Intra-judge reliability not assessed: each LLM judge scored each document exactly once; judges were not asked to re-score documents to quantify intra-judge variance. Inter-judge reliability is captured via the 2 × 2 cross-comparison between Claude and GPT judges and via the three-expert ICC analysis.</w:t>
+        <w:t>The present study has the following limitations. (i) Limited expert sample size: n = 3 raters × 10 documents, with only 1 to 2 documents per group, supporting only directional ranking conclusions and not strict statistical inference. Multi-center validation with 3–5 experts × 30–50 documents across institutions is a key direction for future work. (ii) Two-edged effect of same-institution agreement: the very high agreement among the three experts [ICC(2,k) = 0.982] is both evidence of the validity of the five-dimensional rubric and a possible reflection of shared professional culture, training lineage, and clause-interpretation habits within the same institution, which may overestimate cross-institution generalizability. (iii) Dual role of the first author: the first author acted both as Rater 1 and as study designer. Raters 2 and 3 completed their scoring without knowledge of Rater 1's ratings, and the data of all raters are fully released. (iv) Shared rubric between experts and LLM judges: there is a risk of shared-measurement bias; future work should add expert-native dimensions such as clinical usability. (v) Limited GPT-5.4 task coverage: only A1/B1/C1 (81 documents) were generated. (vi) Domain specificity: results are restricted to ISO 15189 medical laboratories, and transferability to other standards such as ISO 17025 or ISO 9001 remains to be validated. (vii) Absence of third-party LLM judges: only Claude and GPT were used as judges. (viii) Language scope: all QMS documents were in Chinese; the effects in English or other languages have not been verified. (ix) Model temporality: the quality of generated documents depends on the model used, and the conclusions of the present study may need to be re-validated as LLMs continue to iterate. (x) Raw-data retention for cross-judge cells: per-paper raw scores for the Claude-judge × GPT-gen quadrant and for the Claude-judge × H-group Claude-gen subset were archived only as aggregated means; the per-paper JSON files were not retained. The 2 × 2 self-preference matrix therefore cannot be independently recomputed from the lowest-level data, although per-paper raw Claude-judge ratings for the six core configuration groups (A/B/C/E/F/G; 270 ratings) and all 486 GPT-judge per-paper ratings are fully released. (xi) Intra-judge reliability not assessed: each LLM judge scored each document exactly once; judges were not asked to re-score documents to quantify intra-judge variance. Inter-judge reliability is captured via the 2 × 2 cross-comparison between Claude and GPT judges and via the three-expert ICC analysis. (xii) No pre-scoring expert calibration: the three raters scored independently from the published five-dimensional rubric and the ISO 15189:2022 / CNAS-CL02:2023 standards without a prior calibration session in which a few example documents would be scored together to align interpretation. The very high inter-rater agreement [ICC(2,k) = 0.982] indicates that the rubric was sufficiently self-explanatory in this institutional context, but a formal calibration step would strengthen replication in future multi-centre studies.</w:t>
       </w:r>
     </w:p>
     <w:p>

</xml_diff>

<commit_message>
fix(paper): §1 ¶1 introduce 'QMS' acronym at first mention
</commit_message>
<xml_diff>
--- a/paper/manuscript_v2_en_CCLM.docx
+++ b/paper/manuscript_v2_en_CCLM.docx
@@ -263,7 +263,23 @@
           <w:b w:val="0"/>
           <w:sz w:val="22"/>
         </w:rPr>
-        <w:t>ISO 15189:2022 *Medical laboratories — Requirements for quality and competence* is the international standard for medical laboratory accreditation, and adoption by Chinese medical laboratories has continued to expand under the China National Accreditation Service for Conformity Assessment (CNAS) framework. CNAS-CL02:2023, the corresponding implementation document, was released in parallel. Such standards prescribe what laboratories *should do* but not *how to do it*, requiring each laboratory to construct, on its own, a complete documentation system covering the quality manual, procedure documents, and standard operating instructions. Based on the corresponding author's experience as an ISO 15189 assessor, such a system in a typical tertiary-level hospital clinical laboratory contains on the order of 100–300 controlled documents and spans structural organisation, clause mapping, form numbering, and responsibility assignment; manual drafting by the quality team typically takes several months, followed by several rounds of internal audit before the system can be finalised. Laboratories pursuing CNAS accreditation generally engage technical experts or trainers to guide them through this process.</w:t>
+        <w:t xml:space="preserve">ISO 15189:2022 *Medical laboratories — Requirements for quality and competence* is the international standard for medical laboratory accreditation, and adoption by Chinese medical laboratories has continued to expand under the China National Accreditation Service for Conformity Assessment (CNAS) framework. CNAS-CL02:2023, the corresponding implementation document, was released in parallel. Such standards prescribe what laboratories *should do* but not *how to do it*, requiring each laboratory to construct, on its own, a complete </w:t>
+      </w:r>
+      <w:r>
+        <w:rPr>
+          <w:rFonts w:ascii="Times New Roman" w:hAnsi="Times New Roman" w:eastAsia="宋体"/>
+          <w:b/>
+          <w:sz w:val="22"/>
+        </w:rPr>
+        <w:t>quality management system (QMS) documentation</w:t>
+      </w:r>
+      <w:r>
+        <w:rPr>
+          <w:rFonts w:ascii="Times New Roman" w:hAnsi="Times New Roman" w:eastAsia="宋体"/>
+          <w:b w:val="0"/>
+          <w:sz w:val="22"/>
+        </w:rPr>
+        <w:t xml:space="preserve"> covering the quality manual, procedure documents, and standard operating instructions. Based on the corresponding author's experience as an ISO 15189 assessor, such a system in a typical tertiary-level hospital clinical laboratory contains on the order of 100–300 controlled documents and spans structural organisation, clause mapping, form numbering, and responsibility assignment; manual drafting by the quality team typically takes several months, followed by several rounds of internal audit before the system can be finalised. Laboratories pursuing CNAS accreditation generally engage technical experts or trainers to guide them through this process.</w:t>
       </w:r>
     </w:p>
     <w:p>

</xml_diff>

<commit_message>
docs(paper): cite Yang et al. PLoS One 2026 to support CNAS adoption claim in §1
Reviewer requested a citation for 'adoption by Chinese medical laboratories
has continued to expand under the CNAS framework'. Added [14] Yang S, Zhou Y,
Wang C, Luo M. PLoS One 2026;21:e0342129 — a peer-reviewed study of initial
ISO 15189 implementation in a Chinese medical laboratory, co-authored by a
researcher at CNAS Beijing. References list expanded from 13 to 14.

CNAS official annual reports do not publish year-by-year medical-laboratory
totals on the public website; the only quantitative figure found (453 by 2020,
publicsectorassurance.org case study) is a non-peer-reviewed web source and
was therefore not used.
</commit_message>
<xml_diff>
--- a/paper/manuscript_v2_en_CCLM.docx
+++ b/paper/manuscript_v2_en_CCLM.docx
@@ -263,7 +263,7 @@
           <w:b w:val="0"/>
           <w:sz w:val="22"/>
         </w:rPr>
-        <w:t xml:space="preserve">ISO 15189:2022 *Medical laboratories — Requirements for quality and competence* is the international standard for medical laboratory accreditation, and adoption by Chinese medical laboratories has continued to expand under the China National Accreditation Service for Conformity Assessment (CNAS) framework. CNAS-CL02:2023, the corresponding implementation document, was released in parallel. Such standards prescribe what laboratories *should do* but not *how to do it*, requiring each laboratory to construct, on its own, a complete </w:t>
+        <w:t xml:space="preserve">ISO 15189:2022 *Medical laboratories — Requirements for quality and competence* is the international standard for medical laboratory accreditation, and adoption by Chinese medical laboratories has continued to expand under the China National Accreditation Service for Conformity Assessment (CNAS) framework [14]. CNAS-CL02:2023, the corresponding implementation document, was released in parallel. Such standards prescribe what laboratories *should do* but not *how to do it*, requiring each laboratory to construct, on its own, a complete </w:t>
       </w:r>
       <w:r>
         <w:rPr>
@@ -3524,6 +3524,21 @@
       <w:r>
         <w:rPr>
           <w:rFonts w:ascii="Times New Roman" w:hAnsi="Times New Roman" w:eastAsia="宋体"/>
+          <w:b w:val="0"/>
+          <w:sz w:val="22"/>
+        </w:rPr>
+        <w:t>14. Yang S, Zhou Y, Wang C, Luo M. The 'Double Helix' model of quality monitoring: risk mapping of quality management system during initial ISO 15189 implementation in a medical laboratory. PLoS One 2026;21:e0342129.</w:t>
+      </w:r>
+    </w:p>
+    <w:p>
+      <w:pPr>
+        <w:spacing w:before="80" w:after="80" w:lineRule="auto" w:line="360"/>
+        <w:ind w:firstLine="0"/>
+        <w:jc w:val="both"/>
+      </w:pPr>
+      <w:r>
+        <w:rPr>
+          <w:rFonts w:ascii="Times New Roman" w:hAnsi="Times New Roman" w:eastAsia="宋体"/>
           <w:b/>
           <w:sz w:val="22"/>
         </w:rPr>
@@ -3604,7 +3619,7 @@
           <w:b w:val="0"/>
           <w:sz w:val="22"/>
         </w:rPr>
-        <w:t>: 13</w:t>
+        <w:t>: 14</w:t>
       </w:r>
     </w:p>
     <w:sectPr>

</xml_diff>

<commit_message>
fix(paper): apply #2/#3/#4 (code blocks wording, D-label note, orthogonally → systematic)
Previous commit (925d17f) listed these in the message but did not actually
edit the manuscripts. Applying now:

#2 'code blocks' → 'fenced code blocks (markdown ```...``` constructs
   containing process diagrams, JSON snippets, or pseudocode)' — removes
   ambiguity for medical readers.

#3 §2.1 末: add 1-sentence note that the letter D is intentionally skipped
   because D_rules was an earlier rules variant deprecated after expert
   validation revealed terminology errors, replaced by E_rules_v2.

#4 §2.1 + Abstract Methods: 'orthogonally combining four dimensions' →
   'systematic substitution along four binary dimensions'. Removes the
   implication of an L9 Taguchi orthogonal-array design (we are not running
   that — §2.4 already declared it).
</commit_message>
<xml_diff>
--- a/paper/manuscript_v2_en_CCLM.docx
+++ b/paper/manuscript_v2_en_CCLM.docx
@@ -188,7 +188,7 @@
           <w:b w:val="0"/>
           <w:sz w:val="22"/>
         </w:rPr>
-        <w:t>: An asymmetric two-model design produced 486 QMS documents in total: Claude Opus 4.6 × 9 configurations × 15 tasks × 3 replicates (405 documents), and, for cross-model validation, GPT-5.4 × 9 configurations × 3 tasks (A1/B1/C1) × 3 replicates (81 documents). The nine configurations were obtained by orthogonally combining four dimensions—rules, skeleton, detailed content, and examples—with token sizes ranging from 0 to 56 K. Three evaluation tiers were applied: (1) a Python automated compliance scorer; (2) dual LLM-as-Judge review by Claude and GPT-5.4 (864 ratings = 378 Claude-judge + 486 GPT-judge, including a 2 × 2 symmetric cross-model design); and (3) independent scoring by three ISO 15189-qualified experts on 10 stratified-randomly sampled, blinded documents. Inter-rater agreement was assessed by Pearson correlation, Spearman correlation, and intraclass correlation coefficients [ICC(2,1) and ICC(3,1)].</w:t>
+        <w:t>: An asymmetric two-model design produced 486 QMS documents in total: Claude Opus 4.6 × 9 configurations × 15 tasks × 3 replicates (405 documents), and, for cross-model validation, GPT-5.4 × 9 configurations × 3 tasks (A1/B1/C1) × 3 replicates (81 documents). The nine configurations were obtained by systematic substitution along four binary dimensions—rules, skeleton, detailed content, and examples—with token sizes ranging from 0 to 56 K. Three evaluation tiers were applied: (1) a Python automated compliance scorer; (2) dual LLM-as-Judge review by Claude and GPT-5.4 (864 ratings = 378 Claude-judge + 486 GPT-judge, including a 2 × 2 symmetric cross-model design); and (3) independent scoring by three ISO 15189-qualified experts on 10 stratified-randomly sampled, blinded documents. Inter-rater agreement was assessed by Pearson correlation, Spearman correlation, and intraclass correlation coefficients [ICC(2,1) and ICC(3,1)].</w:t>
       </w:r>
     </w:p>
     <w:p>
@@ -367,7 +367,7 @@
           <w:b w:val="0"/>
           <w:sz w:val="22"/>
         </w:rPr>
-        <w:t>Nine controlled configurations were designed by orthogonally combining four dimensions: rules, skeleton, detailed content, and examples (Figure 1). Among them, A_bare (0 K) and B_simple (0.3 K) served as baselines; C_full (56 K) represented the full-context input strategy; E_rules (1.2 K) contained only the rules layer; F_template (15 K) contained the complete template without rules; G_template_rules (16 K) combined rules and template; H2_keep_examples (25 K) retained examples in addition to G; H3_skeleton (5 K) preserved the module skeleton while removing detailed content; and H4_sop_only (2 K) preserved only the single SOP skeleton most relevant to the task.</w:t>
+        <w:t>Nine controlled configurations were designed by systematic substitution along four binary dimensions: rules, skeleton, detailed content, and examples (Figure 1). Among them, A_bare (0 K) and B_simple (0.3 K) served as baselines; C_full (56 K) represented the full-context input strategy; E_rules (1.2 K) contained only the rules layer; F_template (15 K) contained the complete template without rules; G_template_rules (16 K) combined rules and template; H2_keep_examples (25 K) retained examples in addition to G; H3_skeleton (5 K) preserved the module skeleton while removing detailed content; and H4_sop_only (2 K) preserved only the single SOP skeleton most relevant to the task. The letter D is intentionally skipped in the alphabetic sequence: D_rules was an earlier rules variant that was deprecated after expert validation revealed terminology errors, and was replaced by E_rules_v2; the gap is retained to preserve the chronological identifier scheme.</w:t>
       </w:r>
     </w:p>
     <w:p>
@@ -382,7 +382,7 @@
           <w:b w:val="0"/>
           <w:sz w:val="22"/>
         </w:rPr>
-        <w:t>The rules layer was based on rules.md (1.2 K) and revised through domain-expert review: three incorrect terminology mappings were removed (instrument → equipment, calibrator product → calibrator, inter-laboratory comparison → proficiency testing); three target terms were corrected (specimen → sample, test item → measurand, linear range → reportable range); and 10 verified mappings together with 7 categories of vague-expression prohibitions were retained. The skeleton layer was extracted from the template library by the strip_to_skeleton algorithm, which preserved section headings, the introductory paragraph of each section, and form numbering lists, while removing verbatim clause excerpts, detailed table content, examples, detailed step lists, and code blocks.</w:t>
+        <w:t>The rules layer was based on rules.md (1.2 K) and revised through domain-expert review: three incorrect terminology mappings were removed (instrument → equipment, calibrator product → calibrator, inter-laboratory comparison → proficiency testing); three target terms were corrected (specimen → sample, test item → measurand, linear range → reportable range); and 10 verified mappings together with 7 categories of vague-expression prohibitions were retained. The skeleton layer was extracted from the template library by the strip_to_skeleton algorithm, which preserved section headings, the introductory paragraph of each section, and form numbering lists, while removing verbatim clause excerpts, detailed table content, examples, detailed step lists, and fenced code blocks (markdown ... constructs containing process diagrams, JSON snippets, or pseudocode).</w:t>
       </w:r>
     </w:p>
     <w:p>

</xml_diff>

<commit_message>
docs(paper): clarify design vs L9; rename 'orthogonal' → 'substitution-contrast' ablation
#1 Design clarification (§2.4 end): explicit statement that the 9 configurations
   are NOT a Taguchi L9 orthogonal array; they form a structured subset of the
   4-dimensional configuration space (each dimension at three levels: absent /
   partial / full), selected to isolate each dimension via targeted pairwise
   contrasts. Pre-empts reviewer questions about why L9 was not used.

#2 Terminology consistency: rename 'Four-factor orthogonal ablation' to
   'Four-factor substitution-contrast ablation' in Abstract Results (1) and
   §3.2 section title. The previous 'orthogonal' label could be misread as
   implying a Taguchi L9 design.
</commit_message>
<xml_diff>
--- a/paper/manuscript_v2_en_CCLM.docx
+++ b/paper/manuscript_v2_en_CCLM.docx
@@ -211,7 +211,7 @@
           <w:b w:val="0"/>
           <w:sz w:val="22"/>
         </w:rPr>
-        <w:t>: (1) Four-factor orthogonal ablation (Benjamini–Hochberg FDR-adjusted) showed that, at the LLM-judge tier, only the rules layer reached significance (Δ = +0.511; BH-adjusted p &lt; 0.001); the skeleton layer (Δ = +0.213; BH-adjusted p = 0.11), detailed content (Δ = −0.031; BH-adjusted p = 0.79), and examples (Δ = −0.053; BH-adjusted p = 0.61) did not. (2) The full-context configuration C_full (56 K) yielded cross-evaluated scores of 3.22–4.56 under Claude generation but dropped to 1.40–1.84 under GPT-5.4 generation, indicating that long-context exploitation in this scenario is model-specific to Claude Opus. (3) Claude-as-judge exhibited a self-preference bias of approximately +0.46, whereas GPT-as-judge showed an inverse bias of approximately −0.47. (4) Inter-rater agreement among the three experts reached ICC(2,k) = 0.982; expert mean versus Claude-as-judge gave ICC(3,1) = 0.548 (p = 0.04), versus GPT-as-judge ICC(3,1) = 0.217 (p = 0.26); both LLM judges systematically overestimated by 0.52–0.90 points. (5) The configuration ranked first by LLM judges, H4_sop_only (2 K skeleton), ranked second-to-last under expert evaluation (3.20, n = 2), whereas template-based configurations F_template (15 K), H2_keep_examples (25 K), and G_template_rules (16 K) ranked highest under expert evaluation (4.06–4.24).</w:t>
+        <w:t>: (1) Four-factor substitution-contrast ablation (Benjamini–Hochberg FDR-adjusted) showed that, at the LLM-judge tier, only the rules layer reached significance (Δ = +0.511; BH-adjusted p &lt; 0.001); the skeleton layer (Δ = +0.213; BH-adjusted p = 0.11), detailed content (Δ = −0.031; BH-adjusted p = 0.79), and examples (Δ = −0.053; BH-adjusted p = 0.61) did not. (2) The full-context configuration C_full (56 K) yielded cross-evaluated scores of 3.22–4.56 under Claude generation but dropped to 1.40–1.84 under GPT-5.4 generation, indicating that long-context exploitation in this scenario is model-specific to Claude Opus. (3) Claude-as-judge exhibited a self-preference bias of approximately +0.46, whereas GPT-as-judge showed an inverse bias of approximately −0.47. (4) Inter-rater agreement among the three experts reached ICC(2,k) = 0.982; expert mean versus Claude-as-judge gave ICC(3,1) = 0.548 (p = 0.04), versus GPT-as-judge ICC(3,1) = 0.217 (p = 0.26); both LLM judges systematically overestimated by 0.52–0.90 points. (5) The configuration ranked first by LLM judges, H4_sop_only (2 K skeleton), ranked second-to-last under expert evaluation (3.20, n = 2), whereas template-based configurations F_template (15 K), H2_keep_examples (25 K), and G_template_rules (16 K) ranked highest under expert evaluation (4.06–4.24).</w:t>
       </w:r>
     </w:p>
     <w:p>
@@ -1655,7 +1655,7 @@
           <w:b w:val="0"/>
           <w:sz w:val="22"/>
         </w:rPr>
-        <w:t xml:space="preserve"> — the corresponding *averaged k-rater* reliability variants with k = 3 — for the overall reliability of the three-rater expert panel. ICC computation used the pingouin 0.5 Python library. Self-preference bias was quantified by cross-model differencing as bias = (mean own-own) − (mean cross-own).</w:t>
+        <w:t xml:space="preserve"> — the corresponding *averaged k-rater* reliability variants with k = 3 — for the overall reliability of the three-rater expert panel. ICC computation used the pingouin 0.5 Python library. Self-preference bias was quantified by cross-model differencing as bias = (mean own-own) − (mean cross-own). The 9 configurations are not a Taguchi L9 orthogonal array; they form a structured subset of the 4-dimensional configuration space (rules / skeleton / detailed content / examples, each at three levels: absent / partial / full), selected to isolate each dimension through the targeted pairwise contrasts above rather than to satisfy the balanced-orthogonality requirement of an L9 design.</w:t>
       </w:r>
     </w:p>
     <w:p>
@@ -1712,7 +1712,7 @@
           <w:b/>
           <w:sz w:val="24"/>
         </w:rPr>
-        <w:t>3.2 Four-factor orthogonal ablation</w:t>
+        <w:t>3.2 Four-factor substitution-contrast ablation</w:t>
       </w:r>
     </w:p>
     <w:p>

</xml_diff>

<commit_message>
docs(paper): disclose Claude Code Agent tool usage; align with REPRODUCIBILITY.md
§2.2: explicit access methods —
  Claude Opus 4.6 via Claude Code's Agent tool (Anthropic CLI agent framework)
  GPT-5.4 via openai Python SDK with AIHubMix as base URL

§4.5 (xiii): new limitation — Claude Code Agent framework adds a constant
framework-level system prompt on top of each configured prompt; absolute
prompt length seen by the model is larger than per-config token counts in
§2.1. Because the framework overhead is identical across all 9 configurations
and across all judge calls, between-configuration relative comparisons and
the relative judge–expert agreement findings remain valid; exact reproduction
of absolute scores requires the same Claude Code version.

Resolves a previously hidden gap between Methods (which said only
"Claude Opus 4.6 (Anthropic)") and the GitHub repo's
docs/REPRODUCIBILITY.md (which already states "via Claude Code Agent tool").
</commit_message>
<xml_diff>
--- a/paper/manuscript_v2_en_CCLM.docx
+++ b/paper/manuscript_v2_en_CCLM.docx
@@ -426,7 +426,7 @@
           <w:b w:val="0"/>
           <w:sz w:val="22"/>
         </w:rPr>
-        <w:t>The main experiment used Claude Opus 4.6 (Anthropic) × 9 configurations × 15 tasks × 3 replicates, producing 405 documents. The 15 tasks were grouped according to CNAS audit scenarios into Class A (document drafting; e.g., personnel training and competence-evaluation control procedures), Class B (system operation; e.g., annual internal-audit checklists), and Class C (audit simulation; e.g., review reports for internal quality-control procedure documents), with 5 tasks each. Cross-model validation used GPT-5.4 (OpenAI, accessed via the AIHubMix proxy) × 9 configurations × 3 tasks (A1/B1/C1) × 3 replicates, producing 81 documents. Both models were configured with temperature = 1.0 and max_tokens = 12 000, and they used identical system-prompt configurations.</w:t>
+        <w:t>The main experiment used Claude Opus 4.6 (Anthropic), accessed via Claude Code's Agent tool (Anthropic's CLI agent framework), with 9 configurations × 15 tasks × 3 replicates, producing 405 documents. The 15 tasks were grouped according to CNAS audit scenarios into Class A (document drafting; e.g., personnel training and competence-evaluation control procedures), Class B (system operation; e.g., annual internal-audit checklists), and Class C (audit simulation; e.g., review reports for internal quality-control procedure documents), with 5 tasks each. Cross-model validation used GPT-5.4 (OpenAI, accessed via the openai Python SDK with the AIHubMix API as base URL) × 9 configurations × 3 tasks (A1/B1/C1) × 3 replicates, producing 81 documents. Both models were configured with temperature = 1.0 and max_tokens = 12 000, and they used identical system-prompt configurations.</w:t>
       </w:r>
     </w:p>
     <w:p>
@@ -3002,7 +3002,7 @@
           <w:b w:val="0"/>
           <w:sz w:val="22"/>
         </w:rPr>
-        <w:t>The present study has the following limitations. (i) Limited expert sample size: n = 3 raters × 10 documents, with only 1 to 2 documents per group, supporting only directional ranking conclusions and not strict statistical inference. Multi-center validation with 3–5 experts × 30–50 documents across institutions is a key direction for future work. (ii) Two-edged effect of same-institution agreement: the very high agreement among the three experts [ICC(2,k) = 0.982] is both evidence of the validity of the five-dimensional rubric and a possible reflection of shared professional culture, training lineage, and clause-interpretation habits within the same institution, which may overestimate cross-institution generalizability. (iii) Dual role of the first author: the first author acted both as Rater 1 and as study designer. Raters 2 and 3 completed their scoring without knowledge of Rater 1's ratings, and the data of all raters are fully released. (iv) Shared rubric between experts and LLM judges: there is a risk of shared-measurement bias; future work should add expert-native dimensions such as clinical usability. (v) Limited GPT-5.4 task coverage: only A1/B1/C1 (81 documents) were generated. (vi) Domain specificity: results are restricted to ISO 15189 medical laboratories, and transferability to other standards such as ISO 17025 or ISO 9001 remains to be validated. (vii) Absence of third-party LLM judges: only Claude and GPT were used as judges. (viii) Language scope: all QMS documents were in Chinese; the effects in English or other languages have not been verified. (ix) Model temporality: the quality of generated documents depends on the model used, and the conclusions of the present study may need to be re-validated as LLMs continue to iterate. (x) Raw-data retention for cross-judge cells: per-paper raw scores for the Claude-judge × GPT-gen quadrant and for the Claude-judge × H-group Claude-gen subset were archived only as aggregated means; the per-paper JSON files were not retained. The 2 × 2 self-preference matrix therefore cannot be independently recomputed from the lowest-level data, although per-paper raw Claude-judge ratings for the six core configuration groups (A/B/C/E/F/G; 270 ratings) and all 486 GPT-judge per-paper ratings are fully released. (xi) Intra-judge reliability not assessed: each LLM judge scored each document exactly once; judges were not asked to re-score documents to quantify intra-judge variance. Inter-judge reliability is captured via the 2 × 2 cross-comparison between Claude and GPT judges and via the three-expert ICC analysis. (xii) No pre-scoring expert calibration: the three raters scored independently from the published five-dimensional rubric and the ISO 15189:2022 / CNAS-CL02:2023 standards without a prior calibration session in which a few example documents would be scored together to align interpretation. The very high inter-rater agreement [ICC(2,k) = 0.982] indicates that the rubric was sufficiently self-explanatory in this institutional context, but a formal calibration step would strengthen replication in future multi-centre studies.</w:t>
+        <w:t>The present study has the following limitations. (i) Limited expert sample size: n = 3 raters × 10 documents, with only 1 to 2 documents per group, supporting only directional ranking conclusions and not strict statistical inference. Multi-center validation with 3–5 experts × 30–50 documents across institutions is a key direction for future work. (ii) Two-edged effect of same-institution agreement: the very high agreement among the three experts [ICC(2,k) = 0.982] is both evidence of the validity of the five-dimensional rubric and a possible reflection of shared professional culture, training lineage, and clause-interpretation habits within the same institution, which may overestimate cross-institution generalizability. (iii) Dual role of the first author: the first author acted both as Rater 1 and as study designer. Raters 2 and 3 completed their scoring without knowledge of Rater 1's ratings, and the data of all raters are fully released. (iv) Shared rubric between experts and LLM judges: there is a risk of shared-measurement bias; future work should add expert-native dimensions such as clinical usability. (v) Limited GPT-5.4 task coverage: only A1/B1/C1 (81 documents) were generated. (vi) Domain specificity: results are restricted to ISO 15189 medical laboratories, and transferability to other standards such as ISO 17025 or ISO 9001 remains to be validated. (vii) Absence of third-party LLM judges: only Claude and GPT were used as judges. (viii) Language scope: all QMS documents were in Chinese; the effects in English or other languages have not been verified. (ix) Model temporality: the quality of generated documents depends on the model used, and the conclusions of the present study may need to be re-validated as LLMs continue to iterate. (x) Raw-data retention for cross-judge cells: per-paper raw scores for the Claude-judge × GPT-gen quadrant and for the Claude-judge × H-group Claude-gen subset were archived only as aggregated means; the per-paper JSON files were not retained. The 2 × 2 self-preference matrix therefore cannot be independently recomputed from the lowest-level data, although per-paper raw Claude-judge ratings for the six core configuration groups (A/B/C/E/F/G; 270 ratings) and all 486 GPT-judge per-paper ratings are fully released. (xi) Intra-judge reliability not assessed: each LLM judge scored each document exactly once; judges were not asked to re-score documents to quantify intra-judge variance. Inter-judge reliability is captured via the 2 × 2 cross-comparison between Claude and GPT judges and via the three-expert ICC analysis. (xii) No pre-scoring expert calibration: the three raters scored independently from the published five-dimensional rubric and the ISO 15189:2022 / CNAS-CL02:2023 standards without a prior calibration session in which a few example documents would be scored together to align interpretation. The very high inter-rater agreement [ICC(2,k) = 0.982] indicates that the rubric was sufficiently self-explanatory in this institutional context, but a formal calibration step would strengthen replication in future multi-centre studies. (xiii) Claude Code Agent wrapper: Claude Opus 4.6 generation and Claude-judge ratings were performed via Claude Code's Agent tool rather than through a direct Anthropic REST SDK call. The Claude Code framework adds a constant framework-level system prompt (tool definitions and file-system guidance) on top of each configured QMS-generation or judge prompt; the absolute prompt length seen by the model is therefore larger than the per-configuration token counts reported in §2.1. Because this framework overhead is identical across all 9 configurations and across all judging calls, between-configuration relative comparisons and the relative judge–expert agreement findings remain valid; however, exact reproduction of absolute scores requires the same Claude Code version, and re-running the same configurations through a direct Anthropic SDK call may yield slightly different absolute scores.</w:t>
       </w:r>
     </w:p>
     <w:p>

</xml_diff>

<commit_message>
docs(paper): inline WEIGHTS values + max_tokens no-truncation verification
§2.3.1 Composite score:
- Inline disclose all 7 WEIGHTS values: format=0.18, clause=0.22,
  term=0.13 (sum 0.53, measured); logic=0.18, operability=0.10, safety=0.09,
  manual-revision=0.10 (sum 0.47, default-filled at 3.0).
- Quantify constant offset: 0.47 × 3.0 = 1.41
- Theoretical auto_weighted range: [1.41, 4.06]
- Reaffirm offset cancels in between-configuration comparisons

§2.3.2 Tier 2b (post-paragraph):
- Add no-truncation verification statement: 486 GPT-judge per-paper JSON
  parsed without errors; longest per-dimension `reason` string observed
  was 43 characters, within the 40-char soft cap and far below the
  4,096-token output budget.
- Pre-empts reviewer questions about whether max_tokens=4,096 cut off
  any LLM-judge outputs.
</commit_message>
<xml_diff>
--- a/paper/manuscript_v2_en_CCLM.docx
+++ b/paper/manuscript_v2_en_CCLM.docx
@@ -593,7 +593,7 @@
           <w:b w:val="0"/>
           <w:sz w:val="22"/>
         </w:rPr>
-        <w:t xml:space="preserve"> The three measured dimensions were combined into a weighted aggregate (auto_weighted) using fixed weights defined in the WEIGHTS dictionary of auto_scorer.py. The dictionary contains entries for an originally planned 7-dimension scheme (format, clause coverage, terminology, logical consistency, operability, safety compliance, and manual-revision burden); the four entries beyond the three measured dimensions were not implemented in the current scorer and default to a neutral 3.0, which therefore introduces a constant offset across all 9 configurations and does not affect the relative ranking between them.</w:t>
+        <w:t xml:space="preserve"> The three measured dimensions were combined into a weighted aggregate (auto_weighted) using fixed weights defined in the WEIGHTS dictionary of auto_scorer.py: format = 0.18, clause coverage = 0.22, terminology = 0.13 (sum 0.53). The dictionary additionally contains four entries from an originally planned 7-dimension scheme — logical consistency = 0.18, operability = 0.10, safety compliance = 0.09, and manual-revision burden = 0.10 (sum 0.47) — that were not implemented in the current scorer; these four dimensions are filled with a neutral default of 3.0 for every document, contributing a constant offset of 0.47 × 3.0 = 1.41 to every auto_weighted value. The weights sum to 1.00, so the theoretical range of auto_weighted is [1.41, 4.06]. Because the same constant offset applies to every document, it cancels in all between-configuration comparisons and therefore does not affect the relative ranking reported in §3.</w:t>
       </w:r>
     </w:p>
     <w:p>
@@ -669,7 +669,7 @@
           <w:b w:val="0"/>
           <w:sz w:val="22"/>
         </w:rPr>
-        <w:t xml:space="preserve"> GPT-5.4, accessed through the AIHubMix endpoint as described in §2.2, served as judge using exactly the same prompt, rubric, and 0–5 scale as Tier 2a, with identical generation parameters (temperature = 1.0, max_tokens = 4,096). All 486 generated documents were rated (405 Claude-generated + 81 GPT-generated), with one rating per document; per-document raw JSON files are fully retained and openly released.</w:t>
+        <w:t xml:space="preserve"> GPT-5.4, accessed through the AIHubMix endpoint as described in §2.2, served as judge using exactly the same prompt, rubric, and 0–5 scale as Tier 2a, with identical generation parameters (temperature = 1.0, max_tokens = 4,096). All 486 generated documents were rated (405 Claude-generated + 81 GPT-generated), with one rating per document; per-document raw JSON files are fully retained and openly released. We verified that no judge output was truncated by the max_tokens cap: all 486 GPT-judge per-paper JSON files parsed successfully (zero parse errors), and the longest per-dimension reason string observed across both judges was 43 characters, well within the prompt-imposed 40-character soft cap and far below the 4,096-token output budget.</w:t>
       </w:r>
     </w:p>
     <w:p>

</xml_diff>

<commit_message>
style(paper): typeset manuscripts to submission format
Body text and headings: Times New Roman 12 pt (Chinese 宋体), 1.5 line
spacing throughout; table text 9 pt. Previously body was 11 pt, tables 10 pt,
and headings were Arial/黑体 at 16/14/12/11 pt with 1.25 line spacing.

Updated md_to_docx_cclm.py accordingly and rebuilt the five .docx files.
Markdown sources are unchanged; this commit affects presentation only.

Co-Authored-By: Claude Opus 4.8 <noreply@anthropic.com>
</commit_message>
<xml_diff>
--- a/paper/manuscript_v2_en_CCLM.docx
+++ b/paper/manuscript_v2_en_CCLM.docx
@@ -4,14 +4,14 @@
   <w:body>
     <w:p>
       <w:pPr>
-        <w:spacing w:before="240" w:after="240" w:lineRule="auto" w:line="300"/>
+        <w:spacing w:before="240" w:after="240" w:lineRule="auto" w:line="360"/>
         <w:jc w:val="center"/>
       </w:pPr>
       <w:r>
         <w:rPr>
-          <w:rFonts w:ascii="Arial" w:hAnsi="Arial" w:eastAsia="黑体"/>
+          <w:rFonts w:ascii="Times New Roman" w:hAnsi="Times New Roman" w:eastAsia="宋体"/>
           <w:b/>
-          <w:sz w:val="32"/>
+          <w:sz w:val="24"/>
         </w:rPr>
         <w:t>Evaluating LLM-Assisted Drafting of ISO 15189 Quality Management Documents: A Comparison of Claude and GPT Under Expert Review</w:t>
       </w:r>
@@ -26,7 +26,7 @@
         <w:rPr>
           <w:rFonts w:ascii="Times New Roman" w:hAnsi="Times New Roman" w:eastAsia="宋体"/>
           <w:b/>
-          <w:sz w:val="22"/>
+          <w:sz w:val="24"/>
         </w:rPr>
         <w:t>Authors</w:t>
       </w:r>
@@ -34,7 +34,7 @@
         <w:rPr>
           <w:rFonts w:ascii="Times New Roman" w:hAnsi="Times New Roman" w:eastAsia="宋体"/>
           <w:b w:val="0"/>
-          <w:sz w:val="22"/>
+          <w:sz w:val="24"/>
         </w:rPr>
         <w:t>: Sidi Liu¹, Dongdong Li²,*</w:t>
       </w:r>
@@ -49,7 +49,7 @@
         <w:rPr>
           <w:rFonts w:ascii="Times New Roman" w:hAnsi="Times New Roman" w:eastAsia="宋体"/>
           <w:b/>
-          <w:sz w:val="22"/>
+          <w:sz w:val="24"/>
         </w:rPr>
         <w:t>Affiliations</w:t>
       </w:r>
@@ -57,7 +57,7 @@
         <w:rPr>
           <w:rFonts w:ascii="Times New Roman" w:hAnsi="Times New Roman" w:eastAsia="宋体"/>
           <w:b w:val="0"/>
-          <w:sz w:val="22"/>
+          <w:sz w:val="24"/>
         </w:rPr>
         <w:t>: ¹ Department of Laboratory Medicine, West China Hospital Xiamen, Sichuan University, Xiamen, Fujian 361024, China; ² Department of Laboratory Medicine, West China Hospital, Sichuan University, Chengdu, Sichuan 610041, China</w:t>
       </w:r>
@@ -72,7 +72,7 @@
         <w:rPr>
           <w:rFonts w:ascii="Times New Roman" w:hAnsi="Times New Roman" w:eastAsia="宋体"/>
           <w:b/>
-          <w:sz w:val="22"/>
+          <w:sz w:val="24"/>
         </w:rPr>
         <w:t>Corresponding author</w:t>
       </w:r>
@@ -80,7 +80,7 @@
         <w:rPr>
           <w:rFonts w:ascii="Times New Roman" w:hAnsi="Times New Roman" w:eastAsia="宋体"/>
           <w:b w:val="0"/>
-          <w:sz w:val="22"/>
+          <w:sz w:val="24"/>
         </w:rPr>
         <w:t>: * Dongdong Li, Department of Laboratory Medicine, West China Hospital, Sichuan University; email [to be provided]; ORCID [to be provided]</w:t>
       </w:r>
@@ -95,7 +95,7 @@
         <w:rPr>
           <w:rFonts w:ascii="Times New Roman" w:hAnsi="Times New Roman" w:eastAsia="宋体"/>
           <w:b/>
-          <w:sz w:val="22"/>
+          <w:sz w:val="24"/>
         </w:rPr>
         <w:t>ORCID</w:t>
       </w:r>
@@ -103,7 +103,7 @@
         <w:rPr>
           <w:rFonts w:ascii="Times New Roman" w:hAnsi="Times New Roman" w:eastAsia="宋体"/>
           <w:b w:val="0"/>
-          <w:sz w:val="22"/>
+          <w:sz w:val="24"/>
         </w:rPr>
         <w:t>: Sidi Liu 0009-0006-1695-5372; Dongdong Li [to be provided]</w:t>
       </w:r>
@@ -118,7 +118,7 @@
         <w:rPr>
           <w:rFonts w:ascii="Times New Roman" w:hAnsi="Times New Roman" w:eastAsia="宋体"/>
           <w:b/>
-          <w:sz w:val="22"/>
+          <w:sz w:val="24"/>
         </w:rPr>
         <w:t>Short title</w:t>
       </w:r>
@@ -126,7 +126,7 @@
         <w:rPr>
           <w:rFonts w:ascii="Times New Roman" w:hAnsi="Times New Roman" w:eastAsia="宋体"/>
           <w:b w:val="0"/>
-          <w:sz w:val="22"/>
+          <w:sz w:val="24"/>
         </w:rPr>
         <w:t>: LLM-assisted drafting of ISO 15189 laboratory documents</w:t>
       </w:r>
@@ -141,7 +141,7 @@
         <w:rPr>
           <w:rFonts w:ascii="Times New Roman" w:hAnsi="Times New Roman" w:eastAsia="宋体"/>
           <w:b/>
-          <w:sz w:val="22"/>
+          <w:sz w:val="24"/>
         </w:rPr>
         <w:t>Keywords</w:t>
       </w:r>
@@ -149,21 +149,21 @@
         <w:rPr>
           <w:rFonts w:ascii="Times New Roman" w:hAnsi="Times New Roman" w:eastAsia="宋体"/>
           <w:b w:val="0"/>
-          <w:sz w:val="22"/>
+          <w:sz w:val="24"/>
         </w:rPr>
         <w:t>: ISO 15189; medical laboratory; quality management system; large language model; prompt engineering; LLM-as-judge; expert validation</w:t>
       </w:r>
     </w:p>
     <w:p>
       <w:pPr>
-        <w:spacing w:before="280" w:after="120" w:lineRule="auto" w:line="300"/>
+        <w:spacing w:before="280" w:after="120" w:lineRule="auto" w:line="360"/>
         <w:jc w:val="left"/>
       </w:pPr>
       <w:r>
         <w:rPr>
-          <w:rFonts w:ascii="Arial" w:hAnsi="Arial" w:eastAsia="黑体"/>
+          <w:rFonts w:ascii="Times New Roman" w:hAnsi="Times New Roman" w:eastAsia="宋体"/>
           <w:b/>
-          <w:sz w:val="28"/>
+          <w:sz w:val="24"/>
         </w:rPr>
         <w:t>Abstract</w:t>
       </w:r>
@@ -178,7 +178,7 @@
         <w:rPr>
           <w:rFonts w:ascii="Times New Roman" w:hAnsi="Times New Roman" w:eastAsia="宋体"/>
           <w:b/>
-          <w:sz w:val="22"/>
+          <w:sz w:val="24"/>
         </w:rPr>
         <w:t>Objectives</w:t>
       </w:r>
@@ -186,7 +186,7 @@
         <w:rPr>
           <w:rFonts w:ascii="Times New Roman" w:hAnsi="Times New Roman" w:eastAsia="宋体"/>
           <w:b w:val="0"/>
-          <w:sz w:val="22"/>
+          <w:sz w:val="24"/>
         </w:rPr>
         <w:t>: To evaluate the ISO 15189:2022 compliance of QMS documents drafted with LLM assistance across prompting configurations, compare Claude with GPT, and quantify the systematic bias of LLM judges (LLM-as-judge) against expert ratings.</w:t>
       </w:r>
@@ -201,7 +201,7 @@
         <w:rPr>
           <w:rFonts w:ascii="Times New Roman" w:hAnsi="Times New Roman" w:eastAsia="宋体"/>
           <w:b/>
-          <w:sz w:val="22"/>
+          <w:sz w:val="24"/>
         </w:rPr>
         <w:t>Methods</w:t>
       </w:r>
@@ -209,7 +209,7 @@
         <w:rPr>
           <w:rFonts w:ascii="Times New Roman" w:hAnsi="Times New Roman" w:eastAsia="宋体"/>
           <w:b w:val="0"/>
-          <w:sz w:val="22"/>
+          <w:sz w:val="24"/>
         </w:rPr>
         <w:t>: We generated 486 QMS documents using Claude Opus 4.6 (9 configurations × 15 tasks × 3 replicates = 405) and GPT-5.4 (81 for cross-model validation), spanning four prompt-content dimensions (rules, document skeleton, detailed content, worked examples; 0–56,000 tokens). Compliance was rated on a 0–5 Likert scale via three tiers: an automated rule-based scorer, review by two LLM judges (864 ratings), and blinded review of 10 stratified-sampled documents by three qualified ISO 15189 internal auditors. Ablation effects used Mann–Whitney U with BH correction and bootstrap 95% CIs; inter-rater reliability used ICC variants.</w:t>
       </w:r>
@@ -224,7 +224,7 @@
         <w:rPr>
           <w:rFonts w:ascii="Times New Roman" w:hAnsi="Times New Roman" w:eastAsia="宋体"/>
           <w:b/>
-          <w:sz w:val="22"/>
+          <w:sz w:val="24"/>
         </w:rPr>
         <w:t>Results</w:t>
       </w:r>
@@ -232,7 +232,7 @@
         <w:rPr>
           <w:rFonts w:ascii="Times New Roman" w:hAnsi="Times New Roman" w:eastAsia="宋体"/>
           <w:b w:val="0"/>
-          <w:sz w:val="22"/>
+          <w:sz w:val="24"/>
         </w:rPr>
         <w:t>: At the LLM-judge tier, only the rules component produced a significant compliance gain (Δ = +0.511, bootstrap 95% CI [+0.28, +0.75]; BH-adjusted p &lt; 0.001). C_full (the maximal full-context configuration loading all reference material; ~56,000 tokens) scored 3.22–4.56 with Claude vs. 1.40–1.84 with GPT-5.4 (each range spanning the two judges' mean scores). Both LLM judges rated Claude-generated outputs ~0.30 points higher (Panickssery self-preference index: +0.29 Claude, −0.30 GPT), an effect concentrated at C_full; because both judges favoured Claude rather than each its own family, this is incompatible with classical self-preference. Within-institution agreement among the three experts was excellent [ICC(2,k) = 0.982], with cross-institution generalisability untested; Claude–expert agreement was moderate [ICC(3,1) = 0.548, 95% CI −0.08 to 0.86] and GPT–expert poor [ICC(3,1) = 0.217, 95% CI −0.44 to 0.72]; LLM judges overestimated experts by 0.52–0.90 points. The LLM-favoured H4_sop_only (~2,000 tokens) fell to fifth of seven under expert review (3.20), whereas template-anchored F_template, H2_keep_examples, and G_template_rules ranked highest (4.06–4.24).</w:t>
       </w:r>
@@ -247,7 +247,7 @@
         <w:rPr>
           <w:rFonts w:ascii="Times New Roman" w:hAnsi="Times New Roman" w:eastAsia="宋体"/>
           <w:b/>
-          <w:sz w:val="22"/>
+          <w:sz w:val="24"/>
         </w:rPr>
         <w:t>Conclusions</w:t>
       </w:r>
@@ -255,21 +255,21 @@
         <w:rPr>
           <w:rFonts w:ascii="Times New Roman" w:hAnsi="Times New Roman" w:eastAsia="宋体"/>
           <w:b w:val="0"/>
-          <w:sz w:val="22"/>
+          <w:sz w:val="24"/>
         </w:rPr>
         <w:t>: In this study, the optimal configuration varied with the evaluation tier: minimal prompts (~1,000–2,000 tokens) were better suited to exploratory drafts requiring subsequent human review; template-anchored prompts (~15,000–16,000 tokens) tended to perform best for accreditation submission; and C_full (~56,000 tokens) performed markedly worse with GPT-5.4 and should be used with caution—a preliminary observation based on three tasks and not corroborated at the expert tier. LLM-as-judge can support first-pass screening, but expert final review remains indispensable.</w:t>
       </w:r>
     </w:p>
     <w:p>
       <w:pPr>
-        <w:spacing w:before="280" w:after="120" w:lineRule="auto" w:line="300"/>
+        <w:spacing w:before="280" w:after="120" w:lineRule="auto" w:line="360"/>
         <w:jc w:val="left"/>
       </w:pPr>
       <w:r>
         <w:rPr>
-          <w:rFonts w:ascii="Arial" w:hAnsi="Arial" w:eastAsia="黑体"/>
+          <w:rFonts w:ascii="Times New Roman" w:hAnsi="Times New Roman" w:eastAsia="宋体"/>
           <w:b/>
-          <w:sz w:val="28"/>
+          <w:sz w:val="24"/>
         </w:rPr>
         <w:t>1. Introduction</w:t>
       </w:r>
@@ -284,7 +284,7 @@
         <w:rPr>
           <w:rFonts w:ascii="Times New Roman" w:hAnsi="Times New Roman" w:eastAsia="宋体"/>
           <w:b w:val="0"/>
-          <w:sz w:val="22"/>
+          <w:sz w:val="24"/>
         </w:rPr>
         <w:t>ISO 15189:2022 *Medical laboratories — Requirements for quality and competence* [1] is the international standard for medical laboratory accreditation. In China, its adoption by medical laboratories continues to expand [2]; the standard is administered by the China National Accreditation Service for Conformity Assessment (CNAS), which has issued the corresponding national implementation document, CNAS-CL02:2023. Such standards prescribe what laboratories must achieve, not how to achieve it, requiring each laboratory to construct a quality management system (QMS) documentation set comprising a quality manual, procedure documents, and standard operating instructions. Based on the first author's experience as an ISO 15189 internal auditor, such a system in a tertiary-level hospital clinical laboratory contains on the order of 100–300 controlled documents and spans structural organisation, clause-to-document mapping, form numbering, and responsibility assignment; drafting by an in-house quality team typically takes several months, followed by multiple rounds of internal audit before finalisation. Laboratories pursuing CNAS accreditation typically engage external technical experts or trainers to guide this process.</w:t>
       </w:r>
@@ -299,7 +299,7 @@
         <w:rPr>
           <w:rFonts w:ascii="Times New Roman" w:hAnsi="Times New Roman" w:eastAsia="宋体"/>
           <w:b w:val="0"/>
-          <w:sz w:val="22"/>
+          <w:sz w:val="24"/>
         </w:rPr>
         <w:t>The advancement of large language models (LLMs) offers the possibility of substantially reducing this workload. State-of-the-art models such as Claude Opus 4.6 and GPT-5.4 have shown increasing competence in long-document generation, structured output, and the use of domain-specific terminology [3, 4], and LLMs have been applied to scientific research [5] and evaluated on medical question-answering benchmarks [6]. However, the optimal system-prompt design for producing compliant and operationally usable QMS documents has not been systematically investigated. Two approaches have emerged in practice: a full-context approach that loads all potentially relevant material—the ISO and CNAS standard texts, the laboratory's existing SOP documents, and worked examples—into the system prompt, often exceeding 50,000–100,000 tokens; and a minimal-prompt approach that supplies only rule constraints and section skeletons, relying on the model's own knowledge to generate the content, with prompts limited to a few thousand tokens. Empirical evidence supporting either approach remains limited, as existing surveys of LLM behaviour and prompting [7, 8] have largely addressed general-purpose tasks and have not specifically examined specialised regulatory-document scenarios such as QMS authoring.</w:t>
       </w:r>
@@ -314,7 +314,7 @@
         <w:rPr>
           <w:rFonts w:ascii="Times New Roman" w:hAnsi="Times New Roman" w:eastAsia="宋体"/>
           <w:b w:val="0"/>
-          <w:sz w:val="22"/>
+          <w:sz w:val="24"/>
         </w:rPr>
         <w:t>A second issue lies in the evaluation methodology itself. LLM-generated outputs are currently most commonly assessed by the LLM-as-judge approach, in which a separate LLM assigns the scores [9]. In addition, methods for assessing long-form generation quality [10] and preference benchmarks built from large-scale human voting [11] are two other principal approaches. Studies have found that LLM judges tend to favour outputs from models in their own family (self-preference bias) [12]. However, whether and how this bias arises in specialised, regulated settings such as medical-laboratory QMS, and how it affects comparisons between configurations, has not been empirically characterised.</w:t>
       </w:r>
@@ -329,7 +329,7 @@
         <w:rPr>
           <w:rFonts w:ascii="Times New Roman" w:hAnsi="Times New Roman" w:eastAsia="宋体"/>
           <w:b w:val="0"/>
-          <w:sz w:val="22"/>
+          <w:sz w:val="24"/>
         </w:rPr>
         <w:t>To address these gaps, the present study generated 486 QMS documents, collected 864 LLM-judge ratings, and obtained 30 blinded expert ratings, addressing the following five questions: (i) Which of the four prompt components—rules, document skeleton, detailed content, and worked examples—contributes most to compliance? (ii) What is the minimum number of tokens needed? (iii) Is the optimal configuration consistent between Claude Opus 4.6 and GPT-5.4? (iv) How large is the LLM-judge self-preference bias in this domain? (v) Which configuration performs robustly across all three tiers—automated scoring, LLM judges, and expert ratings?</w:t>
       </w:r>
@@ -344,33 +344,33 @@
         <w:rPr>
           <w:rFonts w:ascii="Times New Roman" w:hAnsi="Times New Roman" w:eastAsia="宋体"/>
           <w:b w:val="0"/>
-          <w:sz w:val="22"/>
+          <w:sz w:val="24"/>
         </w:rPr>
         <w:t>This study uses LLMs as tools for assisting document drafting and for rapid internal audit; the actual authoring, review, and approval must still be carried out under expert supervision. ISO 15189:2022 requires these documents to reflect the laboratory's own validated processes and to be approved by competent personnel, and drafting is itself part of how staff form and demonstrate that competence. An LLM can generate a first draft within minutes, but a draft is not a controlled document: it carries no accountability, has not been checked against the laboratory's actual methods, instruments, or workflows, and has not been approved—it serves mainly as a reference. Our findings reinforce this: the LLM judges diverged from the expert raters, indicating that the model cannot reliably produce compliant documents on its own and may even generate a substantial amount of unnecessary content. We therefore recommend that every configuration be used under human supervision.</w:t>
       </w:r>
     </w:p>
     <w:p>
       <w:pPr>
-        <w:spacing w:before="280" w:after="120" w:lineRule="auto" w:line="300"/>
+        <w:spacing w:before="280" w:after="120" w:lineRule="auto" w:line="360"/>
         <w:jc w:val="left"/>
       </w:pPr>
       <w:r>
         <w:rPr>
-          <w:rFonts w:ascii="Arial" w:hAnsi="Arial" w:eastAsia="黑体"/>
+          <w:rFonts w:ascii="Times New Roman" w:hAnsi="Times New Roman" w:eastAsia="宋体"/>
           <w:b/>
-          <w:sz w:val="28"/>
+          <w:sz w:val="24"/>
         </w:rPr>
         <w:t>2. Materials and methods</w:t>
       </w:r>
     </w:p>
     <w:p>
       <w:pPr>
-        <w:spacing w:before="200" w:after="80" w:lineRule="auto" w:line="300"/>
+        <w:spacing w:before="200" w:after="80" w:lineRule="auto" w:line="360"/>
         <w:jc w:val="left"/>
       </w:pPr>
       <w:r>
         <w:rPr>
-          <w:rFonts w:ascii="Arial" w:hAnsi="Arial" w:eastAsia="黑体"/>
+          <w:rFonts w:ascii="Times New Roman" w:hAnsi="Times New Roman" w:eastAsia="宋体"/>
           <w:b/>
           <w:sz w:val="24"/>
         </w:rPr>
@@ -387,7 +387,7 @@
         <w:rPr>
           <w:rFonts w:ascii="Times New Roman" w:hAnsi="Times New Roman" w:eastAsia="宋体"/>
           <w:b w:val="0"/>
-          <w:sz w:val="22"/>
+          <w:sz w:val="24"/>
         </w:rPr>
         <w:t>We designed nine system-prompt configurations, each loaded with different content, which falls into four categories: rules, document skeleton, detailed content, and worked examples. The content composition and token size of each configuration are given in Figure 1. Each pair of configurations used for comparison differs in only one of these categories, so comparing them isolates the effect of that category (see §2.4.2 for the comparison design).</w:t>
       </w:r>
@@ -402,7 +402,7 @@
         <w:rPr>
           <w:rFonts w:ascii="Times New Roman" w:hAnsi="Times New Roman" w:eastAsia="宋体"/>
           <w:b w:val="0"/>
-          <w:sz w:val="22"/>
+          <w:sz w:val="24"/>
         </w:rPr>
         <w:t>The letter D was skipped in the numbering: the early D_rules variant was discarded after expert validation found terminology errors and was replaced by E_rules_v2; the gap is retained to keep the configuration identifiers consistent.</w:t>
       </w:r>
@@ -417,7 +417,7 @@
         <w:rPr>
           <w:rFonts w:ascii="Times New Roman" w:hAnsi="Times New Roman" w:eastAsia="宋体"/>
           <w:b w:val="0"/>
-          <w:sz w:val="22"/>
+          <w:sz w:val="24"/>
         </w:rPr>
         <w:t>The rules component is a rules.md file (~1,200 tokens). After domain-expert review removed three incorrect mappings and corrected three terms, the final set retained 10 terminology mappings (e.g. specimen was normalised to sample, and inter-laboratory comparison to proficiency testing) and seven categories of prohibited vague expressions. The document skeleton was extracted from the institutional templates by a custom script (*strip_to_skeleton*), keeping section headings, each section's introductory paragraph, and form numbers, and removing verbatim clauses, detailed tables, worked examples, step-by-step procedures, and code blocks.</w:t>
       </w:r>
@@ -432,19 +432,19 @@
         <w:rPr>
           <w:rFonts w:ascii="Times New Roman" w:hAnsi="Times New Roman" w:eastAsia="宋体"/>
           <w:b w:val="0"/>
-          <w:sz w:val="22"/>
+          <w:sz w:val="24"/>
         </w:rPr>
         <w:t>All token counts in this study were computed with the publicly available cl100k_base tokenizer (OpenAI tiktoken). Claude's own tokenizer is not public, but on mixed Chinese–English text the two differ by less than 10%; we used the public tool so that anyone can reproduce the same counts.</w:t>
       </w:r>
     </w:p>
     <w:p>
       <w:pPr>
-        <w:spacing w:before="200" w:after="80" w:lineRule="auto" w:line="300"/>
+        <w:spacing w:before="200" w:after="80" w:lineRule="auto" w:line="360"/>
         <w:jc w:val="left"/>
       </w:pPr>
       <w:r>
         <w:rPr>
-          <w:rFonts w:ascii="Arial" w:hAnsi="Arial" w:eastAsia="黑体"/>
+          <w:rFonts w:ascii="Times New Roman" w:hAnsi="Times New Roman" w:eastAsia="宋体"/>
           <w:b/>
           <w:sz w:val="24"/>
         </w:rPr>
@@ -461,7 +461,7 @@
         <w:rPr>
           <w:rFonts w:ascii="Times New Roman" w:hAnsi="Times New Roman" w:eastAsia="宋体"/>
           <w:b w:val="0"/>
-          <w:sz w:val="22"/>
+          <w:sz w:val="24"/>
         </w:rPr>
         <w:t>The primary experiment used Claude Opus 4.6 (Anthropic, San Francisco, CA, USA), accessed through the Claude Code Agent (Anthropic's command-line agent framework) in text-only mode: no tool calls (file system, web access, code execution) occurred during generation, although the framework's built-in tool definitions remain in the system prompt (see §4.6, limitation xiii). Across 9 configurations and 15 tasks, with each combination repeated 3 times, this yielded 405 documents. The 15 tasks were grouped by CNAS audit scenario into three classes of five: Class A, document drafting (e.g., a personnel-training and competence-evaluation control procedure); Class B, system operation (e.g., an annual internal-audit checklist); and Class C, audit simulation (e.g., a review report for an internal quality-control procedure). A full list of the 15 tasks (name, class, and the corresponding ISO 15189:2022 clauses) is given in Supplementary Table S1; the original prompts are in the GitHub repository under task_messages/ and configs/. Note that these 15 tasks cover system-level documents concerned with document control, internal audit, and management review; they do not include technical documents such as method validation/verification reports or measurement-uncertainty procedures (see §4.6, Limitation xviii).</w:t>
       </w:r>
@@ -476,7 +476,7 @@
         <w:rPr>
           <w:rFonts w:ascii="Times New Roman" w:hAnsi="Times New Roman" w:eastAsia="宋体"/>
           <w:b w:val="0"/>
-          <w:sz w:val="22"/>
+          <w:sz w:val="24"/>
         </w:rPr>
         <w:t>For cross-model validation, GPT-5.4 (OpenAI, San Francisco, CA, USA) was accessed through the official openai Python SDK (v2.30.0); because direct access to the OpenAI API was unavailable from the authors' region during the study, the base URL was pointed to the AIHubMix endpoint (https://aihubmix.com). To limit API cost, GPT-5.4 generation covered only three tasks: the first task of each class—A (document authoring), B (system operation), and C (audit simulation)—namely A1, B1, and C1, so that all three classes were represented; these three tasks were not randomly sampled. GPT-5.4 was run on the same 9 configurations, with each task repeated 3 times, yielding 81 documents. (Output directories retain a legacy gpt4o_* prefix from an earlier script, but the actual model in all runs was GPT-5.4.)</w:t>
       </w:r>
@@ -491,19 +491,19 @@
         <w:rPr>
           <w:rFonts w:ascii="Times New Roman" w:hAnsi="Times New Roman" w:eastAsia="宋体"/>
           <w:b w:val="0"/>
-          <w:sz w:val="22"/>
+          <w:sz w:val="24"/>
         </w:rPr>
         <w:t>For every combination, both models received identical system prompts, but their generation parameters were not identical. Claude Opus 4.6 was run through the Claude Code Agent, which does not expose temperature or max_tokens; these parameters were not set explicitly in this study and their values were determined by the framework. GPT-5.4 was called through the API with temperature = 0.7 and max_completion_tokens = 16,000 set explicitly. Both settings make the same prompt produce somewhat different outputs each time, so each combination was run 3 times to reflect this variability. The consequences of this parameter mismatch for cross-model comparison are discussed in §4.6, Limitation (xvii). All API calls were made between 2 April 2026 and 14 April 2026.</w:t>
       </w:r>
     </w:p>
     <w:p>
       <w:pPr>
-        <w:spacing w:before="200" w:after="80" w:lineRule="auto" w:line="300"/>
+        <w:spacing w:before="200" w:after="80" w:lineRule="auto" w:line="360"/>
         <w:jc w:val="left"/>
       </w:pPr>
       <w:r>
         <w:rPr>
-          <w:rFonts w:ascii="Arial" w:hAnsi="Arial" w:eastAsia="黑体"/>
+          <w:rFonts w:ascii="Times New Roman" w:hAnsi="Times New Roman" w:eastAsia="宋体"/>
           <w:b/>
           <w:sz w:val="24"/>
         </w:rPr>
@@ -520,21 +520,21 @@
         <w:rPr>
           <w:rFonts w:ascii="Times New Roman" w:hAnsi="Times New Roman" w:eastAsia="宋体"/>
           <w:b w:val="0"/>
-          <w:sz w:val="22"/>
+          <w:sz w:val="24"/>
         </w:rPr>
         <w:t>We evaluated compliance using a complementary three-tier framework: an automated rule-based scorer (Tier 1), two LLM judges (Tiers 2a and 2b), and an independent blinded expert review (Tier 3). All three tiers scored on a common 0–5 integer scale. Tier 1 scored automatically, covering only structural features that code can detect objectively; Tiers 2 and 3 shared a single rubric—the five dimensions listed in Table 1: clause coverage, operability, internal consistency, PDCA closure, and professional depth.</w:t>
       </w:r>
     </w:p>
     <w:p>
       <w:pPr>
-        <w:spacing w:before="160" w:after="40" w:lineRule="auto" w:line="300"/>
+        <w:spacing w:before="160" w:after="40" w:lineRule="auto" w:line="360"/>
         <w:jc w:val="left"/>
       </w:pPr>
       <w:r>
         <w:rPr>
-          <w:rFonts w:ascii="Arial" w:hAnsi="Arial" w:eastAsia="黑体"/>
+          <w:rFonts w:ascii="Times New Roman" w:hAnsi="Times New Roman" w:eastAsia="宋体"/>
           <w:b/>
-          <w:sz w:val="22"/>
+          <w:sz w:val="24"/>
         </w:rPr>
         <w:t>2.3.1 Tier 1 — Automated scoring of structural compliance</w:t>
       </w:r>
@@ -549,7 +549,7 @@
         <w:rPr>
           <w:rFonts w:ascii="Times New Roman" w:hAnsi="Times New Roman" w:eastAsia="宋体"/>
           <w:b w:val="0"/>
-          <w:sz w:val="22"/>
+          <w:sz w:val="24"/>
         </w:rPr>
         <w:t>The auto-scorer (auto_scorer.py, open source) rated all 486 documents on three dimensions, which were combined into a weighted composite. This tier measures only structural compliance—the format, clause citations, and terminology that code can detect objectively; it does not assess the clinical operability or logical consistency of the content, which fall to Tiers 2 and 3.</w:t>
       </w:r>
@@ -564,7 +564,7 @@
         <w:rPr>
           <w:rFonts w:ascii="Times New Roman" w:hAnsi="Times New Roman" w:eastAsia="宋体"/>
           <w:b/>
-          <w:sz w:val="22"/>
+          <w:sz w:val="24"/>
         </w:rPr>
         <w:t>Format.</w:t>
       </w:r>
@@ -572,7 +572,7 @@
         <w:rPr>
           <w:rFonts w:ascii="Times New Roman" w:hAnsi="Times New Roman" w:eastAsia="宋体"/>
           <w:b w:val="0"/>
-          <w:sz w:val="22"/>
+          <w:sz w:val="24"/>
         </w:rPr>
         <w:t xml:space="preserve"> Whether the document includes the section headings, numbering depth, and non-empty content required by its task class; more omissions mean a lower score.</w:t>
       </w:r>
@@ -587,7 +587,7 @@
         <w:rPr>
           <w:rFonts w:ascii="Times New Roman" w:hAnsi="Times New Roman" w:eastAsia="宋体"/>
           <w:b/>
-          <w:sz w:val="22"/>
+          <w:sz w:val="24"/>
         </w:rPr>
         <w:t>Clause coverage.</w:t>
       </w:r>
@@ -595,7 +595,7 @@
         <w:rPr>
           <w:rFonts w:ascii="Times New Roman" w:hAnsi="Times New Roman" w:eastAsia="宋体"/>
           <w:b w:val="0"/>
-          <w:sz w:val="22"/>
+          <w:sz w:val="24"/>
         </w:rPr>
         <w:t xml:space="preserve"> Regex matching of ISO 15189:2022 (chapters 4–8) and CNAS-CL02:2023 clause identifiers; the more independent clauses a document cites, the higher its score. This metric records how many clauses a document cites, not whether those clauses are actually implemented. A document that merely states "internal quality control shall be performed in accordance with 7.3.1", without specifying an actual QC scheme, still counts as covering that clause. Tiers 2 and 3 fill this gap: the "clause coverage" dimension of Table 1 assigns a score of 1 when many clauses are cited but left unimplemented. A high Tier 1 clause-coverage score therefore does not mean a document is ready to be submitted for accreditation.</w:t>
       </w:r>
@@ -610,7 +610,7 @@
         <w:rPr>
           <w:rFonts w:ascii="Times New Roman" w:hAnsi="Times New Roman" w:eastAsia="宋体"/>
           <w:b/>
-          <w:sz w:val="22"/>
+          <w:sz w:val="24"/>
         </w:rPr>
         <w:t>Terminology compliance.</w:t>
       </w:r>
@@ -618,7 +618,7 @@
         <w:rPr>
           <w:rFonts w:ascii="Times New Roman" w:hAnsi="Times New Roman" w:eastAsia="宋体"/>
           <w:b w:val="0"/>
-          <w:sz w:val="22"/>
+          <w:sz w:val="24"/>
         </w:rPr>
         <w:t xml:space="preserve"> Two checks. (i) *Terminology mapping*: a vocabulary table validated against ISO 15189/CNAS (e.g., 标本 "specimen" normalised to 样品 "sample", and 不确定度 "uncertainty" to 测量不确定度 "measurement uncertainty") is used to flag non-preferred terms. (ii) *Vague-expression detection*: stock vague terms such as 及时 ("in a timely manner"), 相关人员 ("relevant personnel"), and 定期 ("periodically") are detected. Both apply context-exclusion rules to avoid false positives.</w:t>
       </w:r>
@@ -633,7 +633,7 @@
         <w:rPr>
           <w:rFonts w:ascii="Times New Roman" w:hAnsi="Times New Roman" w:eastAsia="宋体"/>
           <w:b/>
-          <w:sz w:val="22"/>
+          <w:sz w:val="24"/>
         </w:rPr>
         <w:t>Composite score.</w:t>
       </w:r>
@@ -641,21 +641,21 @@
         <w:rPr>
           <w:rFonts w:ascii="Times New Roman" w:hAnsi="Times New Roman" w:eastAsia="宋体"/>
           <w:b w:val="0"/>
-          <w:sz w:val="22"/>
+          <w:sz w:val="24"/>
         </w:rPr>
         <w:t xml:space="preserve"> The three dimensions were combined into a single weighted total (auto_weighted) using format = 0.18, clause coverage = 0.22, and terminology = 0.13; the Tier 1 rankings in §3 are based on this score. (The WEIGHTS dictionary in auto_scorer.py retains four entries from an earlier design that were not used in this study.)</w:t>
       </w:r>
     </w:p>
     <w:p>
       <w:pPr>
-        <w:spacing w:before="160" w:after="40" w:lineRule="auto" w:line="300"/>
+        <w:spacing w:before="160" w:after="40" w:lineRule="auto" w:line="360"/>
         <w:jc w:val="left"/>
       </w:pPr>
       <w:r>
         <w:rPr>
-          <w:rFonts w:ascii="Arial" w:hAnsi="Arial" w:eastAsia="黑体"/>
+          <w:rFonts w:ascii="Times New Roman" w:hAnsi="Times New Roman" w:eastAsia="宋体"/>
           <w:b/>
-          <w:sz w:val="22"/>
+          <w:sz w:val="24"/>
         </w:rPr>
         <w:t>2.3.2 Tier 2 — LLM-as-judge</w:t>
       </w:r>
@@ -670,7 +670,7 @@
         <w:rPr>
           <w:rFonts w:ascii="Times New Roman" w:hAnsi="Times New Roman" w:eastAsia="宋体"/>
           <w:b w:val="0"/>
-          <w:sz w:val="22"/>
+          <w:sz w:val="24"/>
         </w:rPr>
         <w:t>The two judges (Claude and GPT) each scored documents from both models (Claude and GPT), forming a 2 × 2 cross design; this separates a judge's self-preference (favouring its own family) from genuine differences in quality.</w:t>
       </w:r>
@@ -685,7 +685,7 @@
         <w:rPr>
           <w:rFonts w:ascii="Times New Roman" w:hAnsi="Times New Roman" w:eastAsia="宋体"/>
           <w:b/>
-          <w:sz w:val="22"/>
+          <w:sz w:val="24"/>
         </w:rPr>
         <w:t>Tier 2a (Claude judge).</w:t>
       </w:r>
@@ -693,7 +693,7 @@
         <w:rPr>
           <w:rFonts w:ascii="Times New Roman" w:hAnsi="Times New Roman" w:eastAsia="宋体"/>
           <w:b w:val="0"/>
-          <w:sz w:val="22"/>
+          <w:sz w:val="24"/>
         </w:rPr>
         <w:t xml:space="preserve"> Claude Opus 4.6, in the role of a "CNAS chief assessor", scored each document 0–5 on the five dimensions of Table 1, once per document; judging was run through Claude Code Agent sub-agents, with temperature and max_tokens not set explicitly, using the same prompt as Tier 2b. This produced 378 ratings, covering 77.8% of the 486 documents; the remaining 108 documents (22.2%) were not scored by the Claude judge. The retention of raw per-document data is described in §4.6, Limitation x.</w:t>
       </w:r>
@@ -708,7 +708,7 @@
         <w:rPr>
           <w:rFonts w:ascii="Times New Roman" w:hAnsi="Times New Roman" w:eastAsia="宋体"/>
           <w:b/>
-          <w:sz w:val="22"/>
+          <w:sz w:val="24"/>
         </w:rPr>
         <w:t>Tier 2b (GPT judge).</w:t>
       </w:r>
@@ -716,7 +716,7 @@
         <w:rPr>
           <w:rFonts w:ascii="Times New Roman" w:hAnsi="Times New Roman" w:eastAsia="宋体"/>
           <w:b w:val="0"/>
-          <w:sz w:val="22"/>
+          <w:sz w:val="24"/>
         </w:rPr>
         <w:t xml:space="preserve"> GPT-5.4 (accessed via the AIHubMix endpoint, as in §2.2) used the same prompt, rubric, and 0–5 scale as Tier 2a to rate all 486 documents once each (405 Claude-generated + 81 GPT-generated); per-document raw JSON is openly released. Its judging parameters were temperature = 0 and max_completion_tokens = 2,000, which differ from those of Tier 2a (see §4.6, Limitation xvii). We also confirmed that no output was truncated by the max_tokens cap (all 486 JSON files parsed successfully).</w:t>
       </w:r>
@@ -731,7 +731,7 @@
         <w:rPr>
           <w:rFonts w:ascii="Times New Roman" w:hAnsi="Times New Roman" w:eastAsia="宋体"/>
           <w:b w:val="0"/>
-          <w:sz w:val="22"/>
+          <w:sz w:val="24"/>
         </w:rPr>
         <w:t>Together, the two judges produced 864 ratings (378 Claude + 486 GPT). The counts are unequal because the Claude judge was not run on every document (see §4.6, Limitation x); nonetheless, all four 2 × 2 cells contained data, so the self-preference decomposition could still be performed.</w:t>
       </w:r>
@@ -746,7 +746,7 @@
         <w:rPr>
           <w:rFonts w:ascii="Times New Roman" w:hAnsi="Times New Roman" w:eastAsia="宋体"/>
           <w:b/>
-          <w:sz w:val="22"/>
+          <w:sz w:val="24"/>
         </w:rPr>
         <w:t>Scoring scale.</w:t>
       </w:r>
@@ -754,7 +754,7 @@
         <w:rPr>
           <w:rFonts w:ascii="Times New Roman" w:hAnsi="Times New Roman" w:eastAsia="宋体"/>
           <w:b w:val="0"/>
-          <w:sz w:val="22"/>
+          <w:sz w:val="24"/>
         </w:rPr>
         <w:t xml:space="preserve"> Each dimension was scored on a 0–5 integer scale. Table 1 defines the 5-, 3-, and 1-point anchors (fully, partially, and severely non-compliant); the intermediate scores 4 and 2 fall between adjacent anchors, and 0 means the dimension could not be evaluated (the document was essentially absent, or the model returned only a query rather than the requested document). These anchor descriptions were identical for all judges and experts.</w:t>
       </w:r>
@@ -769,7 +769,7 @@
         <w:rPr>
           <w:rFonts w:ascii="Times New Roman" w:hAnsi="Times New Roman" w:eastAsia="宋体"/>
           <w:b/>
-          <w:sz w:val="22"/>
+          <w:sz w:val="24"/>
         </w:rPr>
         <w:t>Table 1.</w:t>
       </w:r>
@@ -777,7 +777,7 @@
         <w:rPr>
           <w:rFonts w:ascii="Times New Roman" w:hAnsi="Times New Roman" w:eastAsia="宋体"/>
           <w:b w:val="0"/>
-          <w:sz w:val="22"/>
+          <w:sz w:val="24"/>
         </w:rPr>
         <w:t xml:space="preserve"> Five-dimensional descriptive rubric shared by Tiers 2a, 2b, and 3.</w:t>
       </w:r>
@@ -816,7 +816,7 @@
               <w:rPr>
                 <w:rFonts w:ascii="Times New Roman" w:hAnsi="Times New Roman" w:eastAsia="宋体"/>
                 <w:b/>
-                <w:sz w:val="20"/>
+                <w:sz w:val="18"/>
               </w:rPr>
               <w:t>Dimension</w:t>
             </w:r>
@@ -842,7 +842,7 @@
               <w:rPr>
                 <w:rFonts w:ascii="Times New Roman" w:hAnsi="Times New Roman" w:eastAsia="宋体"/>
                 <w:b/>
-                <w:sz w:val="20"/>
+                <w:sz w:val="18"/>
               </w:rPr>
               <w:t>Anchor at 5</w:t>
             </w:r>
@@ -868,7 +868,7 @@
               <w:rPr>
                 <w:rFonts w:ascii="Times New Roman" w:hAnsi="Times New Roman" w:eastAsia="宋体"/>
                 <w:b/>
-                <w:sz w:val="20"/>
+                <w:sz w:val="18"/>
               </w:rPr>
               <w:t>Anchor at 3</w:t>
             </w:r>
@@ -894,7 +894,7 @@
               <w:rPr>
                 <w:rFonts w:ascii="Times New Roman" w:hAnsi="Times New Roman" w:eastAsia="宋体"/>
                 <w:b/>
-                <w:sz w:val="20"/>
+                <w:sz w:val="18"/>
               </w:rPr>
               <w:t>Anchor at 1</w:t>
             </w:r>
@@ -922,7 +922,7 @@
               <w:rPr>
                 <w:rFonts w:ascii="Times New Roman" w:hAnsi="Times New Roman" w:eastAsia="宋体"/>
                 <w:b w:val="0"/>
-                <w:sz w:val="20"/>
+                <w:sz w:val="18"/>
               </w:rPr>
               <w:t>Clause coverage</w:t>
             </w:r>
@@ -948,7 +948,7 @@
               <w:rPr>
                 <w:rFonts w:ascii="Times New Roman" w:hAnsi="Times New Roman" w:eastAsia="宋体"/>
                 <w:b w:val="0"/>
-                <w:sz w:val="20"/>
+                <w:sz w:val="18"/>
               </w:rPr>
               <w:t>All "shall" requirements of the relevant clauses are operationalised through concrete measures</w:t>
             </w:r>
@@ -974,7 +974,7 @@
               <w:rPr>
                 <w:rFonts w:ascii="Times New Roman" w:hAnsi="Times New Roman" w:eastAsia="宋体"/>
                 <w:b w:val="0"/>
-                <w:sz w:val="20"/>
+                <w:sz w:val="18"/>
               </w:rPr>
               <w:t>Major clauses are covered but with omissions or surface-level treatment</w:t>
             </w:r>
@@ -1000,7 +1000,7 @@
               <w:rPr>
                 <w:rFonts w:ascii="Times New Roman" w:hAnsi="Times New Roman" w:eastAsia="宋体"/>
                 <w:b w:val="0"/>
-                <w:sz w:val="20"/>
+                <w:sz w:val="18"/>
               </w:rPr>
               <w:t>Most clauses are merely cited without implementation, or major omissions are evident</w:t>
             </w:r>
@@ -1028,7 +1028,7 @@
               <w:rPr>
                 <w:rFonts w:ascii="Times New Roman" w:hAnsi="Times New Roman" w:eastAsia="宋体"/>
                 <w:b w:val="0"/>
-                <w:sz w:val="20"/>
+                <w:sz w:val="18"/>
               </w:rPr>
               <w:t>Operability</w:t>
             </w:r>
@@ -1054,7 +1054,7 @@
               <w:rPr>
                 <w:rFonts w:ascii="Times New Roman" w:hAnsi="Times New Roman" w:eastAsia="宋体"/>
                 <w:b w:val="0"/>
-                <w:sz w:val="20"/>
+                <w:sz w:val="18"/>
               </w:rPr>
               <w:t>Every step has a named role (job title), a quantified deadline, and an explicit output (form ID)</w:t>
             </w:r>
@@ -1080,7 +1080,7 @@
               <w:rPr>
                 <w:rFonts w:ascii="Times New Roman" w:hAnsi="Times New Roman" w:eastAsia="宋体"/>
                 <w:b w:val="0"/>
-                <w:sz w:val="20"/>
+                <w:sz w:val="18"/>
               </w:rPr>
               <w:t>Most steps are actionable; a few remain vague</w:t>
             </w:r>
@@ -1106,7 +1106,7 @@
               <w:rPr>
                 <w:rFonts w:ascii="Times New Roman" w:hAnsi="Times New Roman" w:eastAsia="宋体"/>
                 <w:b w:val="0"/>
-                <w:sz w:val="20"/>
+                <w:sz w:val="18"/>
               </w:rPr>
               <w:t>Pervasive use of "in a timely manner", "relevant personnel", and "periodically" without operational detail</w:t>
             </w:r>
@@ -1134,7 +1134,7 @@
               <w:rPr>
                 <w:rFonts w:ascii="Times New Roman" w:hAnsi="Times New Roman" w:eastAsia="宋体"/>
                 <w:b w:val="0"/>
-                <w:sz w:val="20"/>
+                <w:sz w:val="18"/>
               </w:rPr>
               <w:t>Internal consistency</w:t>
             </w:r>
@@ -1160,7 +1160,7 @@
               <w:rPr>
                 <w:rFonts w:ascii="Times New Roman" w:hAnsi="Times New Roman" w:eastAsia="宋体"/>
                 <w:b w:val="0"/>
-                <w:sz w:val="20"/>
+                <w:sz w:val="18"/>
               </w:rPr>
               <w:t>All referenced documents and forms appear in the corresponding sections; responsibilities are cleanly assigned</w:t>
             </w:r>
@@ -1186,7 +1186,7 @@
               <w:rPr>
                 <w:rFonts w:ascii="Times New Roman" w:hAnsi="Times New Roman" w:eastAsia="宋体"/>
                 <w:b w:val="0"/>
-                <w:sz w:val="20"/>
+                <w:sz w:val="18"/>
               </w:rPr>
               <w:t>A few dangling references or minor textual contradictions</w:t>
             </w:r>
@@ -1212,7 +1212,7 @@
               <w:rPr>
                 <w:rFonts w:ascii="Times New Roman" w:hAnsi="Times New Roman" w:eastAsia="宋体"/>
                 <w:b w:val="0"/>
-                <w:sz w:val="20"/>
+                <w:sz w:val="18"/>
               </w:rPr>
               <w:t>Many dangling references or conflicting responsibility assignments</w:t>
             </w:r>
@@ -1240,7 +1240,7 @@
               <w:rPr>
                 <w:rFonts w:ascii="Times New Roman" w:hAnsi="Times New Roman" w:eastAsia="宋体"/>
                 <w:b w:val="0"/>
-                <w:sz w:val="20"/>
+                <w:sz w:val="18"/>
               </w:rPr>
               <w:t>PDCA closure</w:t>
             </w:r>
@@ -1266,7 +1266,7 @@
               <w:rPr>
                 <w:rFonts w:ascii="Times New Roman" w:hAnsi="Times New Roman" w:eastAsia="宋体"/>
                 <w:b w:val="0"/>
-                <w:sz w:val="20"/>
+                <w:sz w:val="18"/>
               </w:rPr>
               <w:t>An explicit Plan–Do–Check–Act chain with execution records, effectiveness evaluation, non-conformity handling, and improvement</w:t>
             </w:r>
@@ -1292,7 +1292,7 @@
               <w:rPr>
                 <w:rFonts w:ascii="Times New Roman" w:hAnsi="Times New Roman" w:eastAsia="宋体"/>
                 <w:b w:val="0"/>
-                <w:sz w:val="20"/>
+                <w:sz w:val="18"/>
               </w:rPr>
               <w:t>P–D–C are present but A (improvement/feedback) is missing</w:t>
             </w:r>
@@ -1318,7 +1318,7 @@
               <w:rPr>
                 <w:rFonts w:ascii="Times New Roman" w:hAnsi="Times New Roman" w:eastAsia="宋体"/>
                 <w:b w:val="0"/>
-                <w:sz w:val="20"/>
+                <w:sz w:val="18"/>
               </w:rPr>
               <w:t>Execution steps only; no checking or improvement</w:t>
             </w:r>
@@ -1346,7 +1346,7 @@
               <w:rPr>
                 <w:rFonts w:ascii="Times New Roman" w:hAnsi="Times New Roman" w:eastAsia="宋体"/>
                 <w:b w:val="0"/>
-                <w:sz w:val="20"/>
+                <w:sz w:val="18"/>
               </w:rPr>
               <w:t>Professional depth</w:t>
             </w:r>
@@ -1372,7 +1372,7 @@
               <w:rPr>
                 <w:rFonts w:ascii="Times New Roman" w:hAnsi="Times New Roman" w:eastAsia="宋体"/>
                 <w:b w:val="0"/>
-                <w:sz w:val="20"/>
+                <w:sz w:val="18"/>
               </w:rPr>
               <w:t>Contains laboratory-specific detail (e.g., Westgard rules, measurement uncertainty, Sigma metrics, HIL indices, blind testing, PCR zoning, cold chain)</w:t>
             </w:r>
@@ -1398,7 +1398,7 @@
               <w:rPr>
                 <w:rFonts w:ascii="Times New Roman" w:hAnsi="Times New Roman" w:eastAsia="宋体"/>
                 <w:b w:val="0"/>
-                <w:sz w:val="20"/>
+                <w:sz w:val="18"/>
               </w:rPr>
               <w:t>Some professional flavour, but largely generic</w:t>
             </w:r>
@@ -1424,7 +1424,7 @@
               <w:rPr>
                 <w:rFonts w:ascii="Times New Roman" w:hAnsi="Times New Roman" w:eastAsia="宋体"/>
                 <w:b w:val="0"/>
-                <w:sz w:val="20"/>
+                <w:sz w:val="18"/>
               </w:rPr>
               <w:t>Generic content equally applicable to any laboratory</w:t>
             </w:r>
@@ -1435,14 +1435,14 @@
     <w:p/>
     <w:p>
       <w:pPr>
-        <w:spacing w:before="160" w:after="40" w:lineRule="auto" w:line="300"/>
+        <w:spacing w:before="160" w:after="40" w:lineRule="auto" w:line="360"/>
         <w:jc w:val="left"/>
       </w:pPr>
       <w:r>
         <w:rPr>
-          <w:rFonts w:ascii="Arial" w:hAnsi="Arial" w:eastAsia="黑体"/>
+          <w:rFonts w:ascii="Times New Roman" w:hAnsi="Times New Roman" w:eastAsia="宋体"/>
           <w:b/>
-          <w:sz w:val="22"/>
+          <w:sz w:val="24"/>
         </w:rPr>
         <w:t>2.3.3 Tier 3 — Expert review</w:t>
       </w:r>
@@ -1457,7 +1457,7 @@
         <w:rPr>
           <w:rFonts w:ascii="Times New Roman" w:hAnsi="Times New Roman" w:eastAsia="宋体"/>
           <w:b w:val="0"/>
-          <w:sz w:val="22"/>
+          <w:sz w:val="24"/>
         </w:rPr>
         <w:t>Three qualified ISO 15189 internal auditors independently scored 10 blinded, stratified-randomly sampled documents, using the same five dimensions as the LLM judges (Table 1). Rater 1 was the first author; Raters 2 and 3 were from the same institution. The three scored independently, without communicating and without seeing one another's ratings; to avoid self-influence, Rater 1 viewed the Tier 1/2 scores only after all three rater sheets had been submitted. Written informed consent was obtained from Raters 2 and 3 beforehand. During scoring, the experts could freely consult the full texts and annexes of ISO 15189:2022 and CNAS-CL02:2023.</w:t>
       </w:r>
@@ -1472,7 +1472,7 @@
         <w:rPr>
           <w:rFonts w:ascii="Times New Roman" w:hAnsi="Times New Roman" w:eastAsia="宋体"/>
           <w:b/>
-          <w:sz w:val="22"/>
+          <w:sz w:val="24"/>
         </w:rPr>
         <w:t>Sampling strategy.</w:t>
       </w:r>
@@ -1480,7 +1480,7 @@
         <w:rPr>
           <w:rFonts w:ascii="Times New Roman" w:hAnsi="Times New Roman" w:eastAsia="宋体"/>
           <w:b w:val="0"/>
-          <w:sz w:val="22"/>
+          <w:sz w:val="24"/>
         </w:rPr>
         <w:t xml:space="preserve"> Ten documents were drawn from the 486-document pool by stratified random sampling with a fixed seed (seed = 42), stratified across seven configurations × the three Class A tasks (A1, A2, A3), with one or two documents per realised stratum. Only Class A was sampled, as it is the most stable and representative document type in CNAS audits (cross-class generalisation is discussed as a limitation in §4.6). The seven configurations evaluated here differ slightly from the six scored at Tier 2a; the specific seven are listed in §3.5.</w:t>
       </w:r>
@@ -1495,7 +1495,7 @@
         <w:rPr>
           <w:rFonts w:ascii="Times New Roman" w:hAnsi="Times New Roman" w:eastAsia="宋体"/>
           <w:b/>
-          <w:sz w:val="22"/>
+          <w:sz w:val="24"/>
         </w:rPr>
         <w:t>Rater conflicts of interest.</w:t>
       </w:r>
@@ -1503,7 +1503,7 @@
         <w:rPr>
           <w:rFonts w:ascii="Times New Roman" w:hAnsi="Times New Roman" w:eastAsia="宋体"/>
           <w:b w:val="0"/>
-          <w:sz w:val="22"/>
+          <w:sz w:val="24"/>
         </w:rPr>
         <w:t xml:space="preserve"> None of the three raters had any commercial, research, or consulting relationship with Anthropic, OpenAI, or other LLM providers; none received funding or in-kind support from these entities.</w:t>
       </w:r>
@@ -1518,7 +1518,7 @@
         <w:rPr>
           <w:rFonts w:ascii="Times New Roman" w:hAnsi="Times New Roman" w:eastAsia="宋体"/>
           <w:b/>
-          <w:sz w:val="22"/>
+          <w:sz w:val="24"/>
         </w:rPr>
         <w:t>Pre-scoring calibration.</w:t>
       </w:r>
@@ -1526,7 +1526,7 @@
         <w:rPr>
           <w:rFonts w:ascii="Times New Roman" w:hAnsi="Times New Roman" w:eastAsia="宋体"/>
           <w:b w:val="0"/>
-          <w:sz w:val="22"/>
+          <w:sz w:val="24"/>
         </w:rPr>
         <w:t xml:space="preserve"> No formal pre-scoring calibration session was held; the three raters scored independently using only the published rubric (Table 1) and the ISO 15189:2022 / CNAS-CL02:2023 standards. This absence of calibration is noted as a limitation in §4.6 (xii).</w:t>
       </w:r>
@@ -1541,7 +1541,7 @@
         <w:rPr>
           <w:rFonts w:ascii="Times New Roman" w:hAnsi="Times New Roman" w:eastAsia="宋体"/>
           <w:b/>
-          <w:sz w:val="22"/>
+          <w:sz w:val="24"/>
         </w:rPr>
         <w:t>Blinding procedure.</w:t>
       </w:r>
@@ -1549,19 +1549,19 @@
         <w:rPr>
           <w:rFonts w:ascii="Times New Roman" w:hAnsi="Times New Roman" w:eastAsia="宋体"/>
           <w:b w:val="0"/>
-          <w:sz w:val="22"/>
+          <w:sz w:val="24"/>
         </w:rPr>
         <w:t xml:space="preserve"> Blinding was performed with the open-source script prepare_blind_review.py: each of the 10 documents was renamed to an anonymous identifier, all model names and configuration markers were removed from the text and verified, and the presentation order was randomised (identical for all three experts, showing only the task category). The key linking documents to their configurations was sealed until all three rater sheets had been submitted.</w:t>
       </w:r>
     </w:p>
     <w:p>
       <w:pPr>
-        <w:spacing w:before="200" w:after="80" w:lineRule="auto" w:line="300"/>
+        <w:spacing w:before="200" w:after="80" w:lineRule="auto" w:line="360"/>
         <w:jc w:val="left"/>
       </w:pPr>
       <w:r>
         <w:rPr>
-          <w:rFonts w:ascii="Arial" w:hAnsi="Arial" w:eastAsia="黑体"/>
+          <w:rFonts w:ascii="Times New Roman" w:hAnsi="Times New Roman" w:eastAsia="宋体"/>
           <w:b/>
           <w:sz w:val="24"/>
         </w:rPr>
@@ -1570,14 +1570,14 @@
     </w:p>
     <w:p>
       <w:pPr>
-        <w:spacing w:before="160" w:after="40" w:lineRule="auto" w:line="300"/>
+        <w:spacing w:before="160" w:after="40" w:lineRule="auto" w:line="360"/>
         <w:jc w:val="left"/>
       </w:pPr>
       <w:r>
         <w:rPr>
-          <w:rFonts w:ascii="Arial" w:hAnsi="Arial" w:eastAsia="黑体"/>
+          <w:rFonts w:ascii="Times New Roman" w:hAnsi="Times New Roman" w:eastAsia="宋体"/>
           <w:b/>
-          <w:sz w:val="22"/>
+          <w:sz w:val="24"/>
         </w:rPr>
         <w:t>2.4.1 Pairwise group comparisons and multiplicity correction</w:t>
       </w:r>
@@ -1592,21 +1592,21 @@
         <w:rPr>
           <w:rFonts w:ascii="Times New Roman" w:hAnsi="Times New Roman" w:eastAsia="宋体"/>
           <w:b w:val="0"/>
-          <w:sz w:val="22"/>
+          <w:sz w:val="24"/>
         </w:rPr>
         <w:t>Pairwise comparisons between configurations used two-sided Mann–Whitney U tests on the GPT-judge scores for each document (n = 45 per configuration; 15 tasks × 3 replicates). Because the four component contrasts share configurations and are therefore not independent (e.g., G_template_rules appears in both the *detailed content* and *worked examples* contrasts), multiplicity was controlled with the Benjamini–Hochberg FDR procedure (α = 0.05) rather than the more conservative Bonferroni, retaining more power while controlling the false-discovery rate. A 95% confidence interval for each effect estimate (Δ) was obtained by bootstrap (nonparametric percentile method, fixed seed, B = 10,000 resamples). Software versions and scripts are given in the code repository.</w:t>
       </w:r>
     </w:p>
     <w:p>
       <w:pPr>
-        <w:spacing w:before="160" w:after="40" w:lineRule="auto" w:line="300"/>
+        <w:spacing w:before="160" w:after="40" w:lineRule="auto" w:line="360"/>
         <w:jc w:val="left"/>
       </w:pPr>
       <w:r>
         <w:rPr>
-          <w:rFonts w:ascii="Arial" w:hAnsi="Arial" w:eastAsia="黑体"/>
+          <w:rFonts w:ascii="Times New Roman" w:hAnsi="Times New Roman" w:eastAsia="宋体"/>
           <w:b/>
-          <w:sz w:val="22"/>
+          <w:sz w:val="24"/>
         </w:rPr>
         <w:t>2.4.2 Quantification of configuration-component effects</w:t>
       </w:r>
@@ -1621,7 +1621,7 @@
         <w:rPr>
           <w:rFonts w:ascii="Times New Roman" w:hAnsi="Times New Roman" w:eastAsia="宋体"/>
           <w:b w:val="0"/>
-          <w:sz w:val="22"/>
+          <w:sz w:val="24"/>
         </w:rPr>
         <w:t>We used four pairs of configurations to measure the effect of each of the four content components; each pair mainly differs in one component, with the others kept as similar as possible:</w:t>
       </w:r>
@@ -1635,7 +1635,7 @@
         <w:rPr>
           <w:rFonts w:ascii="Times New Roman" w:hAnsi="Times New Roman" w:eastAsia="宋体"/>
           <w:b w:val="0"/>
-          <w:sz w:val="22"/>
+          <w:sz w:val="24"/>
         </w:rPr>
         <w:t>*rules*: E_rules_v2 vs A_bare</w:t>
       </w:r>
@@ -1649,7 +1649,7 @@
         <w:rPr>
           <w:rFonts w:ascii="Times New Roman" w:hAnsi="Times New Roman" w:eastAsia="宋体"/>
           <w:b w:val="0"/>
-          <w:sz w:val="22"/>
+          <w:sz w:val="24"/>
         </w:rPr>
         <w:t>*document skeleton*: H4_sop_only vs E_rules_v2</w:t>
       </w:r>
@@ -1663,7 +1663,7 @@
         <w:rPr>
           <w:rFonts w:ascii="Times New Roman" w:hAnsi="Times New Roman" w:eastAsia="宋体"/>
           <w:b w:val="0"/>
-          <w:sz w:val="22"/>
+          <w:sz w:val="24"/>
         </w:rPr>
         <w:t>*detailed content*: G_template_rules vs H3_skeleton</w:t>
       </w:r>
@@ -1677,7 +1677,7 @@
         <w:rPr>
           <w:rFonts w:ascii="Times New Roman" w:hAnsi="Times New Roman" w:eastAsia="宋体"/>
           <w:b w:val="0"/>
-          <w:sz w:val="22"/>
+          <w:sz w:val="24"/>
         </w:rPr>
         <w:t>*worked examples*: H2_keep_examples vs G_template_rules</w:t>
       </w:r>
@@ -1692,21 +1692,21 @@
         <w:rPr>
           <w:rFonts w:ascii="Times New Roman" w:hAnsi="Times New Roman" w:eastAsia="宋体"/>
           <w:b w:val="0"/>
-          <w:sz w:val="22"/>
+          <w:sz w:val="24"/>
         </w:rPr>
         <w:t>The effect of each component (denoted Δ) is the difference between the two configurations' mean scores; Δ is expressed on the raw 0–5 scale, without standardisation, and its 95% CI was obtained by bootstrap (Table 3). We deliberately used this direct pairwise contrast rather than a more elaborate statistical model because it is the easiest to interpret.</w:t>
       </w:r>
     </w:p>
     <w:p>
       <w:pPr>
-        <w:spacing w:before="160" w:after="40" w:lineRule="auto" w:line="300"/>
+        <w:spacing w:before="160" w:after="40" w:lineRule="auto" w:line="360"/>
         <w:jc w:val="left"/>
       </w:pPr>
       <w:r>
         <w:rPr>
-          <w:rFonts w:ascii="Arial" w:hAnsi="Arial" w:eastAsia="黑体"/>
+          <w:rFonts w:ascii="Times New Roman" w:hAnsi="Times New Roman" w:eastAsia="宋体"/>
           <w:b/>
-          <w:sz w:val="22"/>
+          <w:sz w:val="24"/>
         </w:rPr>
         <w:t>2.4.3 Inter-rater agreement</w:t>
       </w:r>
@@ -1721,7 +1721,7 @@
         <w:rPr>
           <w:rFonts w:ascii="Times New Roman" w:hAnsi="Times New Roman" w:eastAsia="宋体"/>
           <w:b w:val="0"/>
-          <w:sz w:val="22"/>
+          <w:sz w:val="24"/>
         </w:rPr>
         <w:t>Inter-rater agreement was reported using three complementary measures: Pearson correlation (captures linear association while tolerating systematic shifts between raters), Spearman correlation (captures rank-order agreement without assuming linearity), and intraclass correlation coefficients (ICCs, following the Shrout–Fleiss framework [13]). Four ICC variants were used:</w:t>
       </w:r>
@@ -1735,7 +1735,7 @@
         <w:rPr>
           <w:rFonts w:ascii="Times New Roman" w:hAnsi="Times New Roman" w:eastAsia="宋体"/>
           <w:b/>
-          <w:sz w:val="22"/>
+          <w:sz w:val="24"/>
         </w:rPr>
         <w:t>ICC(2,1)</w:t>
       </w:r>
@@ -1743,7 +1743,7 @@
         <w:rPr>
           <w:rFonts w:ascii="Times New Roman" w:hAnsi="Times New Roman" w:eastAsia="宋体"/>
           <w:b w:val="0"/>
-          <w:sz w:val="22"/>
+          <w:sz w:val="24"/>
         </w:rPr>
         <w:t>: single-rater absolute agreement, two-way random effects;</w:t>
       </w:r>
@@ -1757,7 +1757,7 @@
         <w:rPr>
           <w:rFonts w:ascii="Times New Roman" w:hAnsi="Times New Roman" w:eastAsia="宋体"/>
           <w:b/>
-          <w:sz w:val="22"/>
+          <w:sz w:val="24"/>
         </w:rPr>
         <w:t>ICC(3,1)</w:t>
       </w:r>
@@ -1765,7 +1765,7 @@
         <w:rPr>
           <w:rFonts w:ascii="Times New Roman" w:hAnsi="Times New Roman" w:eastAsia="宋体"/>
           <w:b w:val="0"/>
-          <w:sz w:val="22"/>
+          <w:sz w:val="24"/>
         </w:rPr>
         <w:t>: single-rater consistency, two-way mixed effects;</w:t>
       </w:r>
@@ -1779,7 +1779,7 @@
         <w:rPr>
           <w:rFonts w:ascii="Times New Roman" w:hAnsi="Times New Roman" w:eastAsia="宋体"/>
           <w:b/>
-          <w:sz w:val="22"/>
+          <w:sz w:val="24"/>
         </w:rPr>
         <w:t>ICC(2,k)</w:t>
       </w:r>
@@ -1787,7 +1787,7 @@
         <w:rPr>
           <w:rFonts w:ascii="Times New Roman" w:hAnsi="Times New Roman" w:eastAsia="宋体"/>
           <w:b w:val="0"/>
-          <w:sz w:val="22"/>
+          <w:sz w:val="24"/>
         </w:rPr>
         <w:t>: k-rater averaged absolute agreement;</w:t>
       </w:r>
@@ -1801,7 +1801,7 @@
         <w:rPr>
           <w:rFonts w:ascii="Times New Roman" w:hAnsi="Times New Roman" w:eastAsia="宋体"/>
           <w:b/>
-          <w:sz w:val="22"/>
+          <w:sz w:val="24"/>
         </w:rPr>
         <w:t>ICC(3,k)</w:t>
       </w:r>
@@ -1809,7 +1809,7 @@
         <w:rPr>
           <w:rFonts w:ascii="Times New Roman" w:hAnsi="Times New Roman" w:eastAsia="宋体"/>
           <w:b w:val="0"/>
-          <w:sz w:val="22"/>
+          <w:sz w:val="24"/>
         </w:rPr>
         <w:t>: k-rater averaged consistency.</w:t>
       </w:r>
@@ -1824,21 +1824,21 @@
         <w:rPr>
           <w:rFonts w:ascii="Times New Roman" w:hAnsi="Times New Roman" w:eastAsia="宋体"/>
           <w:b w:val="0"/>
-          <w:sz w:val="22"/>
+          <w:sz w:val="24"/>
         </w:rPr>
         <w:t>Pairwise comparisons (e.g., expert mean vs each LLM judge, and pairwise comparisons within the expert panel) used the single-rater variants ICC(2,1) and ICC(3,1); the overall reliability of the three-expert panel was characterised with the averaged variants ICC(2,k) and ICC(3,k) (k = 3). The reasoning is as follows: for panel reliability, the question is whether the three experts' average score is dependable, hence the averaged variants; for judge–expert comparisons, the question is whether a single judge can reproduce the experts' ranking, hence the single-rater consistency variant ICC(3,1). The consistency form tolerates a wholesale offset between the two sets of scores, and that offset—the LLM judges' systematic overestimation—is reported separately in §3.5, so it is not concealed by this choice. All ICCs were computed with the pingouin Python library.</w:t>
       </w:r>
     </w:p>
     <w:p>
       <w:pPr>
-        <w:spacing w:before="160" w:after="40" w:lineRule="auto" w:line="300"/>
+        <w:spacing w:before="160" w:after="40" w:lineRule="auto" w:line="360"/>
         <w:jc w:val="left"/>
       </w:pPr>
       <w:r>
         <w:rPr>
-          <w:rFonts w:ascii="Arial" w:hAnsi="Arial" w:eastAsia="黑体"/>
+          <w:rFonts w:ascii="Times New Roman" w:hAnsi="Times New Roman" w:eastAsia="宋体"/>
           <w:b/>
-          <w:sz w:val="22"/>
+          <w:sz w:val="24"/>
         </w:rPr>
         <w:t>2.4.4 Self-preference bias</w:t>
       </w:r>
@@ -1853,7 +1853,7 @@
         <w:rPr>
           <w:rFonts w:ascii="Times New Roman" w:hAnsi="Times New Roman" w:eastAsia="宋体"/>
           <w:b w:val="0"/>
-          <w:sz w:val="22"/>
+          <w:sz w:val="24"/>
         </w:rPr>
         <w:t>For each model M (Claude or GPT) acting as judge, the self-preference bias was computed following the classical convention of Panickssery et al. [12]: the same judge rates documents generated by its own family and by the other model.</w:t>
       </w:r>
@@ -1868,7 +1868,7 @@
         <w:rPr>
           <w:rFonts w:ascii="Times New Roman" w:hAnsi="Times New Roman" w:eastAsia="宋体"/>
           <w:b w:val="0"/>
-          <w:sz w:val="22"/>
+          <w:sz w:val="24"/>
         </w:rPr>
         <w:t>bias_M = mean(judge = M, generator = M) − mean(judge = M, generator = M′),</w:t>
       </w:r>
@@ -1883,21 +1883,21 @@
         <w:rPr>
           <w:rFonts w:ascii="Times New Roman" w:hAnsi="Times New Roman" w:eastAsia="宋体"/>
           <w:b w:val="0"/>
-          <w:sz w:val="22"/>
+          <w:sz w:val="24"/>
         </w:rPr>
         <w:t>where M′ is the other model. Positive values mean judge M scores its own documents higher; negative values mean the opposite. As a sensitivity check, we recomputed the bias using an alternative formulation (same generator, different judges), obtaining +0.464 (Claude) and −0.472 (GPT); the sign and direction agree with the classical estimates (+0.294 and −0.301) reported in §3.4.</w:t>
       </w:r>
     </w:p>
     <w:p>
       <w:pPr>
-        <w:spacing w:before="160" w:after="40" w:lineRule="auto" w:line="300"/>
+        <w:spacing w:before="160" w:after="40" w:lineRule="auto" w:line="360"/>
         <w:jc w:val="left"/>
       </w:pPr>
       <w:r>
         <w:rPr>
-          <w:rFonts w:ascii="Arial" w:hAnsi="Arial" w:eastAsia="黑体"/>
+          <w:rFonts w:ascii="Times New Roman" w:hAnsi="Times New Roman" w:eastAsia="宋体"/>
           <w:b/>
-          <w:sz w:val="22"/>
+          <w:sz w:val="24"/>
         </w:rPr>
         <w:t>2.4.5 Note on the experimental design</w:t>
       </w:r>
@@ -1912,33 +1912,33 @@
         <w:rPr>
           <w:rFonts w:ascii="Times New Roman" w:hAnsi="Times New Roman" w:eastAsia="宋体"/>
           <w:b w:val="0"/>
-          <w:sz w:val="22"/>
+          <w:sz w:val="24"/>
         </w:rPr>
         <w:t>The nine configurations are not a Taguchi L9 orthogonal array but a structured subset of the four-dimensional configuration space: rules and document skeleton each take three levels (absent / partial / full), and detailed content and worked examples each take two (absent / present). The configurations were selected to isolate each dimension through the pairwise contrasts described in §2.4.2, not to satisfy orthogonal-balance criteria; the Δ estimates therefore correspond only to the specific pairs listed in §2.4.2.</w:t>
       </w:r>
     </w:p>
     <w:p>
       <w:pPr>
-        <w:spacing w:before="280" w:after="120" w:lineRule="auto" w:line="300"/>
+        <w:spacing w:before="280" w:after="120" w:lineRule="auto" w:line="360"/>
         <w:jc w:val="left"/>
       </w:pPr>
       <w:r>
         <w:rPr>
-          <w:rFonts w:ascii="Arial" w:hAnsi="Arial" w:eastAsia="黑体"/>
+          <w:rFonts w:ascii="Times New Roman" w:hAnsi="Times New Roman" w:eastAsia="宋体"/>
           <w:b/>
-          <w:sz w:val="28"/>
+          <w:sz w:val="24"/>
         </w:rPr>
         <w:t>3. Results</w:t>
       </w:r>
     </w:p>
     <w:p>
       <w:pPr>
-        <w:spacing w:before="200" w:after="80" w:lineRule="auto" w:line="300"/>
+        <w:spacing w:before="200" w:after="80" w:lineRule="auto" w:line="360"/>
         <w:jc w:val="left"/>
       </w:pPr>
       <w:r>
         <w:rPr>
-          <w:rFonts w:ascii="Arial" w:hAnsi="Arial" w:eastAsia="黑体"/>
+          <w:rFonts w:ascii="Times New Roman" w:hAnsi="Times New Roman" w:eastAsia="宋体"/>
           <w:b/>
           <w:sz w:val="24"/>
         </w:rPr>
@@ -1955,7 +1955,7 @@
         <w:rPr>
           <w:rFonts w:ascii="Times New Roman" w:hAnsi="Times New Roman" w:eastAsia="宋体"/>
           <w:b w:val="0"/>
-          <w:sz w:val="22"/>
+          <w:sz w:val="24"/>
         </w:rPr>
         <w:t>We ranked the nine configurations across the 405 Claude Opus 4.6–generated documents using a composite score that combined the Tier 1 automated scorer mean and the Tier 2 LLM-judge mean (averaged across the Claude and GPT judges), each min-max normalised to [0, 1] across the nine configurations and then averaged with equal weight (Table 2).</w:t>
       </w:r>
@@ -1970,7 +1970,7 @@
         <w:rPr>
           <w:rFonts w:ascii="Times New Roman" w:hAnsi="Times New Roman" w:eastAsia="宋体"/>
           <w:b/>
-          <w:sz w:val="22"/>
+          <w:sz w:val="24"/>
         </w:rPr>
         <w:t>Table 2.</w:t>
       </w:r>
@@ -1978,7 +1978,7 @@
         <w:rPr>
           <w:rFonts w:ascii="Times New Roman" w:hAnsi="Times New Roman" w:eastAsia="宋体"/>
           <w:b w:val="0"/>
-          <w:sz w:val="22"/>
+          <w:sz w:val="24"/>
         </w:rPr>
         <w:t xml:space="preserve"> Composite ranking of the nine configurations. The composite score combines the Tier 1 automated mean and the Tier 2 LLM-judge mean (averaged across the Claude and GPT judges), each min-max normalised to [0, 1] across the nine configurations and then averaged with equal weight.</w:t>
       </w:r>
@@ -2016,7 +2016,7 @@
               <w:rPr>
                 <w:rFonts w:ascii="Times New Roman" w:hAnsi="Times New Roman" w:eastAsia="宋体"/>
                 <w:b/>
-                <w:sz w:val="20"/>
+                <w:sz w:val="18"/>
               </w:rPr>
               <w:t>Configuration</w:t>
             </w:r>
@@ -2042,7 +2042,7 @@
               <w:rPr>
                 <w:rFonts w:ascii="Times New Roman" w:hAnsi="Times New Roman" w:eastAsia="宋体"/>
                 <w:b/>
-                <w:sz w:val="20"/>
+                <w:sz w:val="18"/>
               </w:rPr>
               <w:t>System-prompt size</w:t>
             </w:r>
@@ -2068,7 +2068,7 @@
               <w:rPr>
                 <w:rFonts w:ascii="Times New Roman" w:hAnsi="Times New Roman" w:eastAsia="宋体"/>
                 <w:b/>
-                <w:sz w:val="20"/>
+                <w:sz w:val="18"/>
               </w:rPr>
               <w:t>Composite score</w:t>
             </w:r>
@@ -2096,7 +2096,7 @@
               <w:rPr>
                 <w:rFonts w:ascii="Times New Roman" w:hAnsi="Times New Roman" w:eastAsia="宋体"/>
                 <w:b w:val="0"/>
-                <w:sz w:val="20"/>
+                <w:sz w:val="18"/>
               </w:rPr>
               <w:t>H4_sop_only</w:t>
             </w:r>
@@ -2122,7 +2122,7 @@
               <w:rPr>
                 <w:rFonts w:ascii="Times New Roman" w:hAnsi="Times New Roman" w:eastAsia="宋体"/>
                 <w:b w:val="0"/>
-                <w:sz w:val="20"/>
+                <w:sz w:val="18"/>
               </w:rPr>
               <w:t>~2,000 tokens</w:t>
             </w:r>
@@ -2148,7 +2148,7 @@
               <w:rPr>
                 <w:rFonts w:ascii="Times New Roman" w:hAnsi="Times New Roman" w:eastAsia="宋体"/>
                 <w:b w:val="0"/>
-                <w:sz w:val="20"/>
+                <w:sz w:val="18"/>
               </w:rPr>
               <w:t>0.994</w:t>
             </w:r>
@@ -2176,7 +2176,7 @@
               <w:rPr>
                 <w:rFonts w:ascii="Times New Roman" w:hAnsi="Times New Roman" w:eastAsia="宋体"/>
                 <w:b w:val="0"/>
-                <w:sz w:val="20"/>
+                <w:sz w:val="18"/>
               </w:rPr>
               <w:t>H3_skeleton</w:t>
             </w:r>
@@ -2202,7 +2202,7 @@
               <w:rPr>
                 <w:rFonts w:ascii="Times New Roman" w:hAnsi="Times New Roman" w:eastAsia="宋体"/>
                 <w:b w:val="0"/>
-                <w:sz w:val="20"/>
+                <w:sz w:val="18"/>
               </w:rPr>
               <w:t>~5,000 tokens</w:t>
             </w:r>
@@ -2228,7 +2228,7 @@
               <w:rPr>
                 <w:rFonts w:ascii="Times New Roman" w:hAnsi="Times New Roman" w:eastAsia="宋体"/>
                 <w:b w:val="0"/>
-                <w:sz w:val="20"/>
+                <w:sz w:val="18"/>
               </w:rPr>
               <w:t>0.869</w:t>
             </w:r>
@@ -2256,7 +2256,7 @@
               <w:rPr>
                 <w:rFonts w:ascii="Times New Roman" w:hAnsi="Times New Roman" w:eastAsia="宋体"/>
                 <w:b w:val="0"/>
-                <w:sz w:val="20"/>
+                <w:sz w:val="18"/>
               </w:rPr>
               <w:t>G_template_rules</w:t>
             </w:r>
@@ -2282,7 +2282,7 @@
               <w:rPr>
                 <w:rFonts w:ascii="Times New Roman" w:hAnsi="Times New Roman" w:eastAsia="宋体"/>
                 <w:b w:val="0"/>
-                <w:sz w:val="20"/>
+                <w:sz w:val="18"/>
               </w:rPr>
               <w:t>~16,000 tokens</w:t>
             </w:r>
@@ -2308,7 +2308,7 @@
               <w:rPr>
                 <w:rFonts w:ascii="Times New Roman" w:hAnsi="Times New Roman" w:eastAsia="宋体"/>
                 <w:b w:val="0"/>
-                <w:sz w:val="20"/>
+                <w:sz w:val="18"/>
               </w:rPr>
               <w:t>0.851</w:t>
             </w:r>
@@ -2336,7 +2336,7 @@
               <w:rPr>
                 <w:rFonts w:ascii="Times New Roman" w:hAnsi="Times New Roman" w:eastAsia="宋体"/>
                 <w:b w:val="0"/>
-                <w:sz w:val="20"/>
+                <w:sz w:val="18"/>
               </w:rPr>
               <w:t>H2_keep_examples</w:t>
             </w:r>
@@ -2362,7 +2362,7 @@
               <w:rPr>
                 <w:rFonts w:ascii="Times New Roman" w:hAnsi="Times New Roman" w:eastAsia="宋体"/>
                 <w:b w:val="0"/>
-                <w:sz w:val="20"/>
+                <w:sz w:val="18"/>
               </w:rPr>
               <w:t>~25,000 tokens</w:t>
             </w:r>
@@ -2388,7 +2388,7 @@
               <w:rPr>
                 <w:rFonts w:ascii="Times New Roman" w:hAnsi="Times New Roman" w:eastAsia="宋体"/>
                 <w:b w:val="0"/>
-                <w:sz w:val="20"/>
+                <w:sz w:val="18"/>
               </w:rPr>
               <w:t>0.759</w:t>
             </w:r>
@@ -2416,7 +2416,7 @@
               <w:rPr>
                 <w:rFonts w:ascii="Times New Roman" w:hAnsi="Times New Roman" w:eastAsia="宋体"/>
                 <w:b w:val="0"/>
-                <w:sz w:val="20"/>
+                <w:sz w:val="18"/>
               </w:rPr>
               <w:t>E_rules_v2</w:t>
             </w:r>
@@ -2442,7 +2442,7 @@
               <w:rPr>
                 <w:rFonts w:ascii="Times New Roman" w:hAnsi="Times New Roman" w:eastAsia="宋体"/>
                 <w:b w:val="0"/>
-                <w:sz w:val="20"/>
+                <w:sz w:val="18"/>
               </w:rPr>
               <w:t>~1,200 tokens</w:t>
             </w:r>
@@ -2468,7 +2468,7 @@
               <w:rPr>
                 <w:rFonts w:ascii="Times New Roman" w:hAnsi="Times New Roman" w:eastAsia="宋体"/>
                 <w:b w:val="0"/>
-                <w:sz w:val="20"/>
+                <w:sz w:val="18"/>
               </w:rPr>
               <w:t>0.729</w:t>
             </w:r>
@@ -2496,7 +2496,7 @@
               <w:rPr>
                 <w:rFonts w:ascii="Times New Roman" w:hAnsi="Times New Roman" w:eastAsia="宋体"/>
                 <w:b w:val="0"/>
-                <w:sz w:val="20"/>
+                <w:sz w:val="18"/>
               </w:rPr>
               <w:t>C_full</w:t>
             </w:r>
@@ -2522,7 +2522,7 @@
               <w:rPr>
                 <w:rFonts w:ascii="Times New Roman" w:hAnsi="Times New Roman" w:eastAsia="宋体"/>
                 <w:b w:val="0"/>
-                <w:sz w:val="20"/>
+                <w:sz w:val="18"/>
               </w:rPr>
               <w:t>~56,000 tokens</w:t>
             </w:r>
@@ -2548,7 +2548,7 @@
               <w:rPr>
                 <w:rFonts w:ascii="Times New Roman" w:hAnsi="Times New Roman" w:eastAsia="宋体"/>
                 <w:b w:val="0"/>
-                <w:sz w:val="20"/>
+                <w:sz w:val="18"/>
               </w:rPr>
               <w:t>0.493</w:t>
             </w:r>
@@ -2576,7 +2576,7 @@
               <w:rPr>
                 <w:rFonts w:ascii="Times New Roman" w:hAnsi="Times New Roman" w:eastAsia="宋体"/>
                 <w:b w:val="0"/>
-                <w:sz w:val="20"/>
+                <w:sz w:val="18"/>
               </w:rPr>
               <w:t>F_template</w:t>
             </w:r>
@@ -2602,7 +2602,7 @@
               <w:rPr>
                 <w:rFonts w:ascii="Times New Roman" w:hAnsi="Times New Roman" w:eastAsia="宋体"/>
                 <w:b w:val="0"/>
-                <w:sz w:val="20"/>
+                <w:sz w:val="18"/>
               </w:rPr>
               <w:t>~15,000 tokens</w:t>
             </w:r>
@@ -2628,7 +2628,7 @@
               <w:rPr>
                 <w:rFonts w:ascii="Times New Roman" w:hAnsi="Times New Roman" w:eastAsia="宋体"/>
                 <w:b w:val="0"/>
-                <w:sz w:val="20"/>
+                <w:sz w:val="18"/>
               </w:rPr>
               <w:t>0.345</w:t>
             </w:r>
@@ -2656,7 +2656,7 @@
               <w:rPr>
                 <w:rFonts w:ascii="Times New Roman" w:hAnsi="Times New Roman" w:eastAsia="宋体"/>
                 <w:b w:val="0"/>
-                <w:sz w:val="20"/>
+                <w:sz w:val="18"/>
               </w:rPr>
               <w:t>B_simple</w:t>
             </w:r>
@@ -2682,7 +2682,7 @@
               <w:rPr>
                 <w:rFonts w:ascii="Times New Roman" w:hAnsi="Times New Roman" w:eastAsia="宋体"/>
                 <w:b w:val="0"/>
-                <w:sz w:val="20"/>
+                <w:sz w:val="18"/>
               </w:rPr>
               <w:t>~300 tokens</w:t>
             </w:r>
@@ -2708,7 +2708,7 @@
               <w:rPr>
                 <w:rFonts w:ascii="Times New Roman" w:hAnsi="Times New Roman" w:eastAsia="宋体"/>
                 <w:b w:val="0"/>
-                <w:sz w:val="20"/>
+                <w:sz w:val="18"/>
               </w:rPr>
               <w:t>0.227</w:t>
             </w:r>
@@ -2736,7 +2736,7 @@
               <w:rPr>
                 <w:rFonts w:ascii="Times New Roman" w:hAnsi="Times New Roman" w:eastAsia="宋体"/>
                 <w:b w:val="0"/>
-                <w:sz w:val="20"/>
+                <w:sz w:val="18"/>
               </w:rPr>
               <w:t>A_bare</w:t>
             </w:r>
@@ -2762,7 +2762,7 @@
               <w:rPr>
                 <w:rFonts w:ascii="Times New Roman" w:hAnsi="Times New Roman" w:eastAsia="宋体"/>
                 <w:b w:val="0"/>
-                <w:sz w:val="20"/>
+                <w:sz w:val="18"/>
               </w:rPr>
               <w:t>0 tokens</w:t>
             </w:r>
@@ -2788,7 +2788,7 @@
               <w:rPr>
                 <w:rFonts w:ascii="Times New Roman" w:hAnsi="Times New Roman" w:eastAsia="宋体"/>
                 <w:b w:val="0"/>
-                <w:sz w:val="20"/>
+                <w:sz w:val="18"/>
               </w:rPr>
               <w:t>0.000</w:t>
             </w:r>
@@ -2807,19 +2807,19 @@
         <w:rPr>
           <w:rFonts w:ascii="Times New Roman" w:hAnsi="Times New Roman" w:eastAsia="宋体"/>
           <w:b w:val="0"/>
-          <w:sz w:val="22"/>
+          <w:sz w:val="24"/>
         </w:rPr>
         <w:t>H4_sop_only achieved the highest composite score at only ~2,000 tokens, well below the template-anchored configurations (G_template_rules ~16,000 tokens; H2_keep_examples ~25,000 tokens) and the full-context C_full (~56,000 tokens); as §3.5 shows, however, this ranking does not survive expert evaluation.</w:t>
       </w:r>
     </w:p>
     <w:p>
       <w:pPr>
-        <w:spacing w:before="200" w:after="80" w:lineRule="auto" w:line="300"/>
+        <w:spacing w:before="200" w:after="80" w:lineRule="auto" w:line="360"/>
         <w:jc w:val="left"/>
       </w:pPr>
       <w:r>
         <w:rPr>
-          <w:rFonts w:ascii="Arial" w:hAnsi="Arial" w:eastAsia="黑体"/>
+          <w:rFonts w:ascii="Times New Roman" w:hAnsi="Times New Roman" w:eastAsia="宋体"/>
           <w:b/>
           <w:sz w:val="24"/>
         </w:rPr>
@@ -2836,7 +2836,7 @@
         <w:rPr>
           <w:rFonts w:ascii="Times New Roman" w:hAnsi="Times New Roman" w:eastAsia="宋体"/>
           <w:b w:val="0"/>
-          <w:sz w:val="22"/>
+          <w:sz w:val="24"/>
         </w:rPr>
         <w:t>The ablation effects of the four components are summarised in Table 3.</w:t>
       </w:r>
@@ -2851,7 +2851,7 @@
         <w:rPr>
           <w:rFonts w:ascii="Times New Roman" w:hAnsi="Times New Roman" w:eastAsia="宋体"/>
           <w:b/>
-          <w:sz w:val="22"/>
+          <w:sz w:val="24"/>
         </w:rPr>
         <w:t>Table 3.</w:t>
       </w:r>
@@ -2859,7 +2859,7 @@
         <w:rPr>
           <w:rFonts w:ascii="Times New Roman" w:hAnsi="Times New Roman" w:eastAsia="宋体"/>
           <w:b w:val="0"/>
-          <w:sz w:val="22"/>
+          <w:sz w:val="24"/>
         </w:rPr>
         <w:t xml:space="preserve"> Ablation effects of the four prompt components (Tier 2b GPT-judge ratings; the two configurations in each contrast are given in §2.4.2). The three right-hand columns give Δ stratified by task class (n = 15 per cell: 5 tasks × 3 replicates). These stratified Δ values, and the by-dimension Δ decomposition in §3.2, are descriptive point estimates without CIs or significance tests; CIs and adjusted p-values for the main effects are given in the left-hand columns.</w:t>
       </w:r>
@@ -2901,7 +2901,7 @@
               <w:rPr>
                 <w:rFonts w:ascii="Times New Roman" w:hAnsi="Times New Roman" w:eastAsia="宋体"/>
                 <w:b/>
-                <w:sz w:val="20"/>
+                <w:sz w:val="18"/>
               </w:rPr>
               <w:t>Component</w:t>
             </w:r>
@@ -2927,7 +2927,7 @@
               <w:rPr>
                 <w:rFonts w:ascii="Times New Roman" w:hAnsi="Times New Roman" w:eastAsia="宋体"/>
                 <w:b/>
-                <w:sz w:val="20"/>
+                <w:sz w:val="18"/>
               </w:rPr>
               <w:t>Δ (all tasks)</w:t>
             </w:r>
@@ -2953,7 +2953,7 @@
               <w:rPr>
                 <w:rFonts w:ascii="Times New Roman" w:hAnsi="Times New Roman" w:eastAsia="宋体"/>
                 <w:b/>
-                <w:sz w:val="20"/>
+                <w:sz w:val="18"/>
               </w:rPr>
               <w:t>95% CI</w:t>
             </w:r>
@@ -2979,7 +2979,7 @@
               <w:rPr>
                 <w:rFonts w:ascii="Times New Roman" w:hAnsi="Times New Roman" w:eastAsia="宋体"/>
                 <w:b/>
-                <w:sz w:val="20"/>
+                <w:sz w:val="18"/>
               </w:rPr>
               <w:t>BH-adjusted p</w:t>
             </w:r>
@@ -3005,7 +3005,7 @@
               <w:rPr>
                 <w:rFonts w:ascii="Times New Roman" w:hAnsi="Times New Roman" w:eastAsia="宋体"/>
                 <w:b/>
-                <w:sz w:val="20"/>
+                <w:sz w:val="18"/>
               </w:rPr>
               <w:t>Δ_A Authoring</w:t>
             </w:r>
@@ -3031,7 +3031,7 @@
               <w:rPr>
                 <w:rFonts w:ascii="Times New Roman" w:hAnsi="Times New Roman" w:eastAsia="宋体"/>
                 <w:b/>
-                <w:sz w:val="20"/>
+                <w:sz w:val="18"/>
               </w:rPr>
               <w:t>Δ_B Operation</w:t>
             </w:r>
@@ -3057,7 +3057,7 @@
               <w:rPr>
                 <w:rFonts w:ascii="Times New Roman" w:hAnsi="Times New Roman" w:eastAsia="宋体"/>
                 <w:b/>
-                <w:sz w:val="20"/>
+                <w:sz w:val="18"/>
               </w:rPr>
               <w:t>Δ_C Audit</w:t>
             </w:r>
@@ -3085,7 +3085,7 @@
               <w:rPr>
                 <w:rFonts w:ascii="Times New Roman" w:hAnsi="Times New Roman" w:eastAsia="宋体"/>
                 <w:b w:val="0"/>
-                <w:sz w:val="20"/>
+                <w:sz w:val="18"/>
               </w:rPr>
               <w:t>rules</w:t>
             </w:r>
@@ -3111,7 +3111,7 @@
               <w:rPr>
                 <w:rFonts w:ascii="Times New Roman" w:hAnsi="Times New Roman" w:eastAsia="宋体"/>
                 <w:b w:val="0"/>
-                <w:sz w:val="20"/>
+                <w:sz w:val="18"/>
               </w:rPr>
               <w:t>+0.511</w:t>
             </w:r>
@@ -3137,7 +3137,7 @@
               <w:rPr>
                 <w:rFonts w:ascii="Times New Roman" w:hAnsi="Times New Roman" w:eastAsia="宋体"/>
                 <w:b w:val="0"/>
-                <w:sz w:val="20"/>
+                <w:sz w:val="18"/>
               </w:rPr>
               <w:t>[+0.28, +0.75]</w:t>
             </w:r>
@@ -3163,7 +3163,7 @@
               <w:rPr>
                 <w:rFonts w:ascii="Times New Roman" w:hAnsi="Times New Roman" w:eastAsia="宋体"/>
                 <w:b w:val="0"/>
-                <w:sz w:val="20"/>
+                <w:sz w:val="18"/>
               </w:rPr>
               <w:t>&lt;0.001</w:t>
             </w:r>
@@ -3189,7 +3189,7 @@
               <w:rPr>
                 <w:rFonts w:ascii="Times New Roman" w:hAnsi="Times New Roman" w:eastAsia="宋体"/>
                 <w:b w:val="0"/>
-                <w:sz w:val="20"/>
+                <w:sz w:val="18"/>
               </w:rPr>
               <w:t>+0.507</w:t>
             </w:r>
@@ -3215,7 +3215,7 @@
               <w:rPr>
                 <w:rFonts w:ascii="Times New Roman" w:hAnsi="Times New Roman" w:eastAsia="宋体"/>
                 <w:b w:val="0"/>
-                <w:sz w:val="20"/>
+                <w:sz w:val="18"/>
               </w:rPr>
               <w:t>+0.613</w:t>
             </w:r>
@@ -3241,7 +3241,7 @@
               <w:rPr>
                 <w:rFonts w:ascii="Times New Roman" w:hAnsi="Times New Roman" w:eastAsia="宋体"/>
                 <w:b w:val="0"/>
-                <w:sz w:val="20"/>
+                <w:sz w:val="18"/>
               </w:rPr>
               <w:t>+0.413</w:t>
             </w:r>
@@ -3269,7 +3269,7 @@
               <w:rPr>
                 <w:rFonts w:ascii="Times New Roman" w:hAnsi="Times New Roman" w:eastAsia="宋体"/>
                 <w:b w:val="0"/>
-                <w:sz w:val="20"/>
+                <w:sz w:val="18"/>
               </w:rPr>
               <w:t>document skeleton</w:t>
             </w:r>
@@ -3295,7 +3295,7 @@
               <w:rPr>
                 <w:rFonts w:ascii="Times New Roman" w:hAnsi="Times New Roman" w:eastAsia="宋体"/>
                 <w:b w:val="0"/>
-                <w:sz w:val="20"/>
+                <w:sz w:val="18"/>
               </w:rPr>
               <w:t>+0.213</w:t>
             </w:r>
@@ -3321,7 +3321,7 @@
               <w:rPr>
                 <w:rFonts w:ascii="Times New Roman" w:hAnsi="Times New Roman" w:eastAsia="宋体"/>
                 <w:b w:val="0"/>
-                <w:sz w:val="20"/>
+                <w:sz w:val="18"/>
               </w:rPr>
               <w:t>[+0.05, +0.39]</w:t>
             </w:r>
@@ -3347,7 +3347,7 @@
               <w:rPr>
                 <w:rFonts w:ascii="Times New Roman" w:hAnsi="Times New Roman" w:eastAsia="宋体"/>
                 <w:b w:val="0"/>
-                <w:sz w:val="20"/>
+                <w:sz w:val="18"/>
               </w:rPr>
               <w:t>0.11</w:t>
             </w:r>
@@ -3373,7 +3373,7 @@
               <w:rPr>
                 <w:rFonts w:ascii="Times New Roman" w:hAnsi="Times New Roman" w:eastAsia="宋体"/>
                 <w:b w:val="0"/>
-                <w:sz w:val="20"/>
+                <w:sz w:val="18"/>
               </w:rPr>
               <w:t>+0.347</w:t>
             </w:r>
@@ -3399,7 +3399,7 @@
               <w:rPr>
                 <w:rFonts w:ascii="Times New Roman" w:hAnsi="Times New Roman" w:eastAsia="宋体"/>
                 <w:b w:val="0"/>
-                <w:sz w:val="20"/>
+                <w:sz w:val="18"/>
               </w:rPr>
               <w:t>+0.187</w:t>
             </w:r>
@@ -3425,7 +3425,7 @@
               <w:rPr>
                 <w:rFonts w:ascii="Times New Roman" w:hAnsi="Times New Roman" w:eastAsia="宋体"/>
                 <w:b w:val="0"/>
-                <w:sz w:val="20"/>
+                <w:sz w:val="18"/>
               </w:rPr>
               <w:t>+0.107</w:t>
             </w:r>
@@ -3453,7 +3453,7 @@
               <w:rPr>
                 <w:rFonts w:ascii="Times New Roman" w:hAnsi="Times New Roman" w:eastAsia="宋体"/>
                 <w:b w:val="0"/>
-                <w:sz w:val="20"/>
+                <w:sz w:val="18"/>
               </w:rPr>
               <w:t>detailed content</w:t>
             </w:r>
@@ -3479,7 +3479,7 @@
               <w:rPr>
                 <w:rFonts w:ascii="Times New Roman" w:hAnsi="Times New Roman" w:eastAsia="宋体"/>
                 <w:b w:val="0"/>
-                <w:sz w:val="20"/>
+                <w:sz w:val="18"/>
               </w:rPr>
               <w:t>−0.031</w:t>
             </w:r>
@@ -3505,7 +3505,7 @@
               <w:rPr>
                 <w:rFonts w:ascii="Times New Roman" w:hAnsi="Times New Roman" w:eastAsia="宋体"/>
                 <w:b w:val="0"/>
-                <w:sz w:val="20"/>
+                <w:sz w:val="18"/>
               </w:rPr>
               <w:t>[−0.19, +0.12]</w:t>
             </w:r>
@@ -3531,7 +3531,7 @@
               <w:rPr>
                 <w:rFonts w:ascii="Times New Roman" w:hAnsi="Times New Roman" w:eastAsia="宋体"/>
                 <w:b w:val="0"/>
-                <w:sz w:val="20"/>
+                <w:sz w:val="18"/>
               </w:rPr>
               <w:t>0.79</w:t>
             </w:r>
@@ -3557,7 +3557,7 @@
               <w:rPr>
                 <w:rFonts w:ascii="Times New Roman" w:hAnsi="Times New Roman" w:eastAsia="宋体"/>
                 <w:b w:val="0"/>
-                <w:sz w:val="20"/>
+                <w:sz w:val="18"/>
               </w:rPr>
               <w:t>+0.107</w:t>
             </w:r>
@@ -3583,7 +3583,7 @@
               <w:rPr>
                 <w:rFonts w:ascii="Times New Roman" w:hAnsi="Times New Roman" w:eastAsia="宋体"/>
                 <w:b w:val="0"/>
-                <w:sz w:val="20"/>
+                <w:sz w:val="18"/>
               </w:rPr>
               <w:t>+0.053</w:t>
             </w:r>
@@ -3609,7 +3609,7 @@
               <w:rPr>
                 <w:rFonts w:ascii="Times New Roman" w:hAnsi="Times New Roman" w:eastAsia="宋体"/>
                 <w:b w:val="0"/>
-                <w:sz w:val="20"/>
+                <w:sz w:val="18"/>
               </w:rPr>
               <w:t>−0.253</w:t>
             </w:r>
@@ -3637,7 +3637,7 @@
               <w:rPr>
                 <w:rFonts w:ascii="Times New Roman" w:hAnsi="Times New Roman" w:eastAsia="宋体"/>
                 <w:b w:val="0"/>
-                <w:sz w:val="20"/>
+                <w:sz w:val="18"/>
               </w:rPr>
               <w:t>worked examples</w:t>
             </w:r>
@@ -3663,7 +3663,7 @@
               <w:rPr>
                 <w:rFonts w:ascii="Times New Roman" w:hAnsi="Times New Roman" w:eastAsia="宋体"/>
                 <w:b w:val="0"/>
-                <w:sz w:val="20"/>
+                <w:sz w:val="18"/>
               </w:rPr>
               <w:t>−0.053</w:t>
             </w:r>
@@ -3689,7 +3689,7 @@
               <w:rPr>
                 <w:rFonts w:ascii="Times New Roman" w:hAnsi="Times New Roman" w:eastAsia="宋体"/>
                 <w:b w:val="0"/>
-                <w:sz w:val="20"/>
+                <w:sz w:val="18"/>
               </w:rPr>
               <w:t>[−0.21, +0.11]</w:t>
             </w:r>
@@ -3715,7 +3715,7 @@
               <w:rPr>
                 <w:rFonts w:ascii="Times New Roman" w:hAnsi="Times New Roman" w:eastAsia="宋体"/>
                 <w:b w:val="0"/>
-                <w:sz w:val="20"/>
+                <w:sz w:val="18"/>
               </w:rPr>
               <w:t>0.61</w:t>
             </w:r>
@@ -3741,7 +3741,7 @@
               <w:rPr>
                 <w:rFonts w:ascii="Times New Roman" w:hAnsi="Times New Roman" w:eastAsia="宋体"/>
                 <w:b w:val="0"/>
-                <w:sz w:val="20"/>
+                <w:sz w:val="18"/>
               </w:rPr>
               <w:t>−0.080</w:t>
             </w:r>
@@ -3767,7 +3767,7 @@
               <w:rPr>
                 <w:rFonts w:ascii="Times New Roman" w:hAnsi="Times New Roman" w:eastAsia="宋体"/>
                 <w:b w:val="0"/>
-                <w:sz w:val="20"/>
+                <w:sz w:val="18"/>
               </w:rPr>
               <w:t>−0.173</w:t>
             </w:r>
@@ -3793,7 +3793,7 @@
               <w:rPr>
                 <w:rFonts w:ascii="Times New Roman" w:hAnsi="Times New Roman" w:eastAsia="宋体"/>
                 <w:b w:val="0"/>
-                <w:sz w:val="20"/>
+                <w:sz w:val="18"/>
               </w:rPr>
               <w:t>+0.093</w:t>
             </w:r>
@@ -3812,7 +3812,7 @@
         <w:rPr>
           <w:rFonts w:ascii="Times New Roman" w:hAnsi="Times New Roman" w:eastAsia="宋体"/>
           <w:b w:val="0"/>
-          <w:sz w:val="22"/>
+          <w:sz w:val="24"/>
         </w:rPr>
         <w:t>Of the four components, only rules remained significant after multiplicity correction (BH-adjusted p &lt; 0.001) and was the only clearly effective component. The document-skeleton effect was directionally positive and its bootstrap CI excluded zero, but the rank-based test was not significant (BH-adjusted p = 0.11), so we treat it as suggestive evidence requiring further validation; neither detailed content nor worked examples had a detectable effect. A supplementary contrast further showed that H4_sop_only (a single SOP skeleton) and H3_skeleton (the full module skeleton) performed comparably (Δ = −0.009). Stratified by task class (the three right-hand columns of Table 3; n = 15 per cell), the rules effect was consistent in direction and comparable in magnitude across all three classes (+0.41 to +0.61) and did not reverse with task class; the other three components fluctuated across classes and were far smaller in magnitude than rules.</w:t>
       </w:r>
@@ -3827,7 +3827,7 @@
         <w:rPr>
           <w:rFonts w:ascii="Times New Roman" w:hAnsi="Times New Roman" w:eastAsia="宋体"/>
           <w:b w:val="0"/>
-          <w:sz w:val="22"/>
+          <w:sz w:val="24"/>
         </w:rPr>
         <w:t>The rules effect can also be decomposed by scoring dimension (GPT judge; n = 45 per configuration): operability +0.867, professional depth +0.644, clause coverage +0.400, PDCA closure +0.333, and internal consistency +0.311. The two largest gains fall on operability and professional depth rather than on the format- and structure-oriented dimensions, indicating that a rules constraint does not merely regularise the outward form of a document but also increases the amount of laboratory-specific technical detail written into it. This decomposition is by scoring dimension, however, not by document type. "Professional depth" is only a proxy for technical specificity (Table 1). A genuine stratification by document type—comparing generic management documents against laboratory-specific technical documents—cannot be performed here, because the task set contains no technical documents at all (§4.6, Limitation xviii).</w:t>
       </w:r>
@@ -3842,19 +3842,19 @@
         <w:rPr>
           <w:rFonts w:ascii="Times New Roman" w:hAnsi="Times New Roman" w:eastAsia="宋体"/>
           <w:b w:val="0"/>
-          <w:sz w:val="22"/>
+          <w:sz w:val="24"/>
         </w:rPr>
         <w:t>These results apply only to the LLM-judge tier (the Tier 2b GPT judge); the expert-tier comparisons appear in §3.5.</w:t>
       </w:r>
     </w:p>
     <w:p>
       <w:pPr>
-        <w:spacing w:before="200" w:after="80" w:lineRule="auto" w:line="300"/>
+        <w:spacing w:before="200" w:after="80" w:lineRule="auto" w:line="360"/>
         <w:jc w:val="left"/>
       </w:pPr>
       <w:r>
         <w:rPr>
-          <w:rFonts w:ascii="Arial" w:hAnsi="Arial" w:eastAsia="黑体"/>
+          <w:rFonts w:ascii="Times New Roman" w:hAnsi="Times New Roman" w:eastAsia="宋体"/>
           <w:b/>
           <w:sz w:val="24"/>
         </w:rPr>
@@ -3871,7 +3871,7 @@
         <w:rPr>
           <w:rFonts w:ascii="Times New Roman" w:hAnsi="Times New Roman" w:eastAsia="宋体"/>
           <w:b w:val="0"/>
-          <w:sz w:val="22"/>
+          <w:sz w:val="24"/>
         </w:rPr>
         <w:t>Figure 2 shows the results of the 2 × 2 symmetric design: each of the two models (Claude, GPT) generated documents that were then scored by each of the two judges, across the 9 configurations × three tasks (A1, B1, C1) × three replicates per cell. Both models were run on the same three tasks, so this cross-model comparison is task-matched and configuration effects are not confounded with task effects; generalisation to other tasks nevertheless remains limited (see §4.6, Limitation v). The most striking finding is that C_full (~56,000 tokens) dropped sharply in compliance when generated by GPT-5.4: for GPT-generated documents, the Claude judge gave 1.40 and the GPT judge 1.84 (0–5 scale), whereas the same C_full configuration generated by Claude scored between 3.22 and 4.56 across the two judges. This indicates that the ~56,000-token full-context configuration is specific to Claude and cannot be transferred to GPT-5.4 within the parameters tested here.</w:t>
       </w:r>
@@ -3886,19 +3886,19 @@
         <w:rPr>
           <w:rFonts w:ascii="Times New Roman" w:hAnsi="Times New Roman" w:eastAsia="宋体"/>
           <w:b w:val="0"/>
-          <w:sz w:val="22"/>
+          <w:sz w:val="24"/>
         </w:rPr>
         <w:t>We inspected the GPT-generated C_full outputs document by document and found three recurrent problems: (i) declining instruction-following—constraints stated at the start of the system prompt were no longer applied in the later part of the output; (ii) structural breakdown—disordered sections, missing required headings, or numbering errors; and (iii) clause-citation confusion—incorrect, mismatched, or even fabricated ISO 15189:2022 clause identifiers. None of these problems appeared in the corresponding Claude outputs.</w:t>
       </w:r>
     </w:p>
     <w:p>
       <w:pPr>
-        <w:spacing w:before="200" w:after="80" w:lineRule="auto" w:line="300"/>
+        <w:spacing w:before="200" w:after="80" w:lineRule="auto" w:line="360"/>
         <w:jc w:val="left"/>
       </w:pPr>
       <w:r>
         <w:rPr>
-          <w:rFonts w:ascii="Arial" w:hAnsi="Arial" w:eastAsia="黑体"/>
+          <w:rFonts w:ascii="Times New Roman" w:hAnsi="Times New Roman" w:eastAsia="宋体"/>
           <w:b/>
           <w:sz w:val="24"/>
         </w:rPr>
@@ -3915,7 +3915,7 @@
         <w:rPr>
           <w:rFonts w:ascii="Times New Roman" w:hAnsi="Times New Roman" w:eastAsia="宋体"/>
           <w:b w:val="0"/>
-          <w:sz w:val="22"/>
+          <w:sz w:val="24"/>
         </w:rPr>
         <w:t>The self-preference biases computed with the Panickssery formula (§2.4.4) are shown in Table 4. The two values have opposite signs but point to the same thing: both judges actually rated Claude-generated documents higher (by about 0.3 points). Moreover, once C_full is excluded both biases collapse toward zero—so this gap is driven mainly by C_full, the configuration where GPT broke down under long context (§3.3).</w:t>
       </w:r>
@@ -3930,7 +3930,7 @@
         <w:rPr>
           <w:rFonts w:ascii="Times New Roman" w:hAnsi="Times New Roman" w:eastAsia="宋体"/>
           <w:b/>
-          <w:sz w:val="22"/>
+          <w:sz w:val="24"/>
         </w:rPr>
         <w:t>Table 4.</w:t>
       </w:r>
@@ -3938,7 +3938,7 @@
         <w:rPr>
           <w:rFonts w:ascii="Times New Roman" w:hAnsi="Times New Roman" w:eastAsia="宋体"/>
           <w:b w:val="0"/>
-          <w:sz w:val="22"/>
+          <w:sz w:val="24"/>
         </w:rPr>
         <w:t xml:space="preserve"> Self-preference bias of the two judges (0–5 scale; positive = scoring its own family's documents higher).</w:t>
       </w:r>
@@ -3976,7 +3976,7 @@
               <w:rPr>
                 <w:rFonts w:ascii="Times New Roman" w:hAnsi="Times New Roman" w:eastAsia="宋体"/>
                 <w:b/>
-                <w:sz w:val="20"/>
+                <w:sz w:val="18"/>
               </w:rPr>
               <w:t>Judge</w:t>
             </w:r>
@@ -4002,7 +4002,7 @@
               <w:rPr>
                 <w:rFonts w:ascii="Times New Roman" w:hAnsi="Times New Roman" w:eastAsia="宋体"/>
                 <w:b/>
-                <w:sz w:val="20"/>
+                <w:sz w:val="18"/>
               </w:rPr>
               <w:t>All nine configurations</w:t>
             </w:r>
@@ -4028,7 +4028,7 @@
               <w:rPr>
                 <w:rFonts w:ascii="Times New Roman" w:hAnsi="Times New Roman" w:eastAsia="宋体"/>
                 <w:b/>
-                <w:sz w:val="20"/>
+                <w:sz w:val="18"/>
               </w:rPr>
               <w:t>Excluding C_full</w:t>
             </w:r>
@@ -4056,7 +4056,7 @@
               <w:rPr>
                 <w:rFonts w:ascii="Times New Roman" w:hAnsi="Times New Roman" w:eastAsia="宋体"/>
                 <w:b w:val="0"/>
-                <w:sz w:val="20"/>
+                <w:sz w:val="18"/>
               </w:rPr>
               <w:t>Claude</w:t>
             </w:r>
@@ -4082,7 +4082,7 @@
               <w:rPr>
                 <w:rFonts w:ascii="Times New Roman" w:hAnsi="Times New Roman" w:eastAsia="宋体"/>
                 <w:b w:val="0"/>
-                <w:sz w:val="20"/>
+                <w:sz w:val="18"/>
               </w:rPr>
               <w:t>+0.294</w:t>
             </w:r>
@@ -4108,7 +4108,7 @@
               <w:rPr>
                 <w:rFonts w:ascii="Times New Roman" w:hAnsi="Times New Roman" w:eastAsia="宋体"/>
                 <w:b w:val="0"/>
-                <w:sz w:val="20"/>
+                <w:sz w:val="18"/>
               </w:rPr>
               <w:t>−0.064</w:t>
             </w:r>
@@ -4136,7 +4136,7 @@
               <w:rPr>
                 <w:rFonts w:ascii="Times New Roman" w:hAnsi="Times New Roman" w:eastAsia="宋体"/>
                 <w:b w:val="0"/>
-                <w:sz w:val="20"/>
+                <w:sz w:val="18"/>
               </w:rPr>
               <w:t>GPT</w:t>
             </w:r>
@@ -4162,7 +4162,7 @@
               <w:rPr>
                 <w:rFonts w:ascii="Times New Roman" w:hAnsi="Times New Roman" w:eastAsia="宋体"/>
                 <w:b w:val="0"/>
-                <w:sz w:val="20"/>
+                <w:sz w:val="18"/>
               </w:rPr>
               <w:t>−0.301</w:t>
             </w:r>
@@ -4188,7 +4188,7 @@
               <w:rPr>
                 <w:rFonts w:ascii="Times New Roman" w:hAnsi="Times New Roman" w:eastAsia="宋体"/>
                 <w:b w:val="0"/>
-                <w:sz w:val="20"/>
+                <w:sz w:val="18"/>
               </w:rPr>
               <w:t>−0.167</w:t>
             </w:r>
@@ -4207,7 +4207,7 @@
         <w:rPr>
           <w:rFonts w:ascii="Times New Roman" w:hAnsi="Times New Roman" w:eastAsia="宋体"/>
           <w:b w:val="0"/>
-          <w:sz w:val="22"/>
+          <w:sz w:val="24"/>
         </w:rPr>
         <w:t>This opposite-signed pattern does not match classical self-preference (each judge favouring its own family), which would produce same-signed positive biases for both. The observed pattern is compatible with two non-exclusive explanations: (a) a genuine difference in generation quality between Claude and GPT (consistent with GPT's C_full breakdown in §3.3); and (b) a shared preference of both judges for Claude's phrasing or formatting. Because the expert sample (n = 10) consisted entirely of Claude-generated documents (§2.3.3), this study cannot distinguish the two; this is a key direction for follow-up validation (§4.6, Limitation i).</w:t>
       </w:r>
@@ -4222,19 +4222,19 @@
         <w:rPr>
           <w:rFonts w:ascii="Times New Roman" w:hAnsi="Times New Roman" w:eastAsia="宋体"/>
           <w:b w:val="0"/>
-          <w:sz w:val="22"/>
+          <w:sz w:val="24"/>
         </w:rPr>
         <w:t>A judge may score its own family's documents too highly. To remove this effect, we re-ranked the configurations using only cross-model scores (the Claude judge on GPT-generated documents, and the GPT judge on Claude-generated documents). Under this ranking, the top four (G_template_rules, H3_skeleton, E_rules_v2, H4_sop_only) lay within 0.11 points of one another and were statistically indistinguishable, whereas C_full fell from sixth in the §3.1 composite ranking to ninth (last). This indicates that C_full's relatively high LLM-judge score in §3.1 rested on two things: the Claude judge over-rating its own output, and GPT being unable to produce usable output at the ~56,000-token configuration (§3.3).</w:t>
       </w:r>
     </w:p>
     <w:p>
       <w:pPr>
-        <w:spacing w:before="200" w:after="80" w:lineRule="auto" w:line="300"/>
+        <w:spacing w:before="200" w:after="80" w:lineRule="auto" w:line="360"/>
         <w:jc w:val="left"/>
       </w:pPr>
       <w:r>
         <w:rPr>
-          <w:rFonts w:ascii="Arial" w:hAnsi="Arial" w:eastAsia="黑体"/>
+          <w:rFonts w:ascii="Times New Roman" w:hAnsi="Times New Roman" w:eastAsia="宋体"/>
           <w:b/>
           <w:sz w:val="24"/>
         </w:rPr>
@@ -4251,7 +4251,7 @@
         <w:rPr>
           <w:rFonts w:ascii="Times New Roman" w:hAnsi="Times New Roman" w:eastAsia="宋体"/>
           <w:b w:val="0"/>
-          <w:sz w:val="22"/>
+          <w:sz w:val="24"/>
         </w:rPr>
         <w:t>Inter-rater agreement among the three experts was excellent: ICC(2,k) = 0.982 (95% CI [0.95, 1.00]), and all three pairwise comparisons were above 0.92 ("excellent" by the Cicchetti benchmark [14]). This indicates that the five-dimensional rubric (Table 1) was highly reproducible across raters; however, because all three were from the same institution, this agreement may be higher than would be achieved across institutions (see §4.6, Limitation ii).</w:t>
       </w:r>
@@ -4266,7 +4266,7 @@
         <w:rPr>
           <w:rFonts w:ascii="Times New Roman" w:hAnsi="Times New Roman" w:eastAsia="宋体"/>
           <w:b w:val="0"/>
-          <w:sz w:val="22"/>
+          <w:sz w:val="24"/>
         </w:rPr>
         <w:t>Agreement between the experts and the two LLM judges was markedly lower (Figure 3): ICC(3,1) = 0.548 (95% CI [−0.08, 0.86], p = 0.04) for the Claude judge and only 0.217 (95% CI [−0.44, 0.72], p = 0.26) for the GPT judge. Both intervals cross zero and n is only 10, so these two agreement coefficients can serve only as directional indications and do not support firm statistical conclusions. Both judges also systematically scored compliance higher than the experts—by 0.905 points (Claude) and 0.525 points (GPT). Claude–expert agreement was therefore moderate, and GPT–expert agreement poor.</w:t>
       </w:r>
@@ -4281,7 +4281,7 @@
         <w:rPr>
           <w:rFonts w:ascii="Times New Roman" w:hAnsi="Times New Roman" w:eastAsia="宋体"/>
           <w:b w:val="0"/>
-          <w:sz w:val="22"/>
+          <w:sz w:val="24"/>
         </w:rPr>
         <w:t>The ranking of the seven configurations is given in Table 5, and is almost the reverse of the LLM-judge tier.</w:t>
       </w:r>
@@ -4296,7 +4296,7 @@
         <w:rPr>
           <w:rFonts w:ascii="Times New Roman" w:hAnsi="Times New Roman" w:eastAsia="宋体"/>
           <w:b/>
-          <w:sz w:val="22"/>
+          <w:sz w:val="24"/>
         </w:rPr>
         <w:t>Table 5.</w:t>
       </w:r>
@@ -4304,7 +4304,7 @@
         <w:rPr>
           <w:rFonts w:ascii="Times New Roman" w:hAnsi="Times New Roman" w:eastAsia="宋体"/>
           <w:b w:val="0"/>
-          <w:sz w:val="22"/>
+          <w:sz w:val="24"/>
         </w:rPr>
         <w:t xml:space="preserve"> Scores for the seven sampled configurations (0–5 scale; sorted by expert mean; 1–2 documents per configuration).</w:t>
       </w:r>
@@ -4344,7 +4344,7 @@
               <w:rPr>
                 <w:rFonts w:ascii="Times New Roman" w:hAnsi="Times New Roman" w:eastAsia="宋体"/>
                 <w:b/>
-                <w:sz w:val="20"/>
+                <w:sz w:val="18"/>
               </w:rPr>
               <w:t>Configuration</w:t>
             </w:r>
@@ -4370,7 +4370,7 @@
               <w:rPr>
                 <w:rFonts w:ascii="Times New Roman" w:hAnsi="Times New Roman" w:eastAsia="宋体"/>
                 <w:b/>
-                <w:sz w:val="20"/>
+                <w:sz w:val="18"/>
               </w:rPr>
               <w:t>Expert mean</w:t>
             </w:r>
@@ -4396,7 +4396,7 @@
               <w:rPr>
                 <w:rFonts w:ascii="Times New Roman" w:hAnsi="Times New Roman" w:eastAsia="宋体"/>
                 <w:b/>
-                <w:sz w:val="20"/>
+                <w:sz w:val="18"/>
               </w:rPr>
               <w:t>Claude judge</w:t>
             </w:r>
@@ -4422,7 +4422,7 @@
               <w:rPr>
                 <w:rFonts w:ascii="Times New Roman" w:hAnsi="Times New Roman" w:eastAsia="宋体"/>
                 <w:b/>
-                <w:sz w:val="20"/>
+                <w:sz w:val="18"/>
               </w:rPr>
               <w:t>GPT judge</w:t>
             </w:r>
@@ -4448,7 +4448,7 @@
               <w:rPr>
                 <w:rFonts w:ascii="Times New Roman" w:hAnsi="Times New Roman" w:eastAsia="宋体"/>
                 <w:b/>
-                <w:sz w:val="20"/>
+                <w:sz w:val="18"/>
               </w:rPr>
               <w:t>n</w:t>
             </w:r>
@@ -4476,7 +4476,7 @@
               <w:rPr>
                 <w:rFonts w:ascii="Times New Roman" w:hAnsi="Times New Roman" w:eastAsia="宋体"/>
                 <w:b w:val="0"/>
-                <w:sz w:val="20"/>
+                <w:sz w:val="18"/>
               </w:rPr>
               <w:t>F_template</w:t>
             </w:r>
@@ -4502,7 +4502,7 @@
               <w:rPr>
                 <w:rFonts w:ascii="Times New Roman" w:hAnsi="Times New Roman" w:eastAsia="宋体"/>
                 <w:b w:val="0"/>
-                <w:sz w:val="20"/>
+                <w:sz w:val="18"/>
               </w:rPr>
               <w:t>4.24</w:t>
             </w:r>
@@ -4528,7 +4528,7 @@
               <w:rPr>
                 <w:rFonts w:ascii="Times New Roman" w:hAnsi="Times New Roman" w:eastAsia="宋体"/>
                 <w:b w:val="0"/>
-                <w:sz w:val="20"/>
+                <w:sz w:val="18"/>
               </w:rPr>
               <w:t>4.60</w:t>
             </w:r>
@@ -4554,7 +4554,7 @@
               <w:rPr>
                 <w:rFonts w:ascii="Times New Roman" w:hAnsi="Times New Roman" w:eastAsia="宋体"/>
                 <w:b w:val="0"/>
-                <w:sz w:val="20"/>
+                <w:sz w:val="18"/>
               </w:rPr>
               <w:t>4.00</w:t>
             </w:r>
@@ -4580,7 +4580,7 @@
               <w:rPr>
                 <w:rFonts w:ascii="Times New Roman" w:hAnsi="Times New Roman" w:eastAsia="宋体"/>
                 <w:b w:val="0"/>
-                <w:sz w:val="20"/>
+                <w:sz w:val="18"/>
               </w:rPr>
               <w:t>1</w:t>
             </w:r>
@@ -4608,7 +4608,7 @@
               <w:rPr>
                 <w:rFonts w:ascii="Times New Roman" w:hAnsi="Times New Roman" w:eastAsia="宋体"/>
                 <w:b w:val="0"/>
-                <w:sz w:val="20"/>
+                <w:sz w:val="18"/>
               </w:rPr>
               <w:t>H2_keep_examples</w:t>
             </w:r>
@@ -4634,7 +4634,7 @@
               <w:rPr>
                 <w:rFonts w:ascii="Times New Roman" w:hAnsi="Times New Roman" w:eastAsia="宋体"/>
                 <w:b w:val="0"/>
-                <w:sz w:val="20"/>
+                <w:sz w:val="18"/>
               </w:rPr>
               <w:t>4.07</w:t>
             </w:r>
@@ -4660,7 +4660,7 @@
               <w:rPr>
                 <w:rFonts w:ascii="Times New Roman" w:hAnsi="Times New Roman" w:eastAsia="宋体"/>
                 <w:b w:val="0"/>
-                <w:sz w:val="20"/>
+                <w:sz w:val="18"/>
               </w:rPr>
               <w:t>4.40</w:t>
             </w:r>
@@ -4686,7 +4686,7 @@
               <w:rPr>
                 <w:rFonts w:ascii="Times New Roman" w:hAnsi="Times New Roman" w:eastAsia="宋体"/>
                 <w:b w:val="0"/>
-                <w:sz w:val="20"/>
+                <w:sz w:val="18"/>
               </w:rPr>
               <w:t>4.00</w:t>
             </w:r>
@@ -4712,7 +4712,7 @@
               <w:rPr>
                 <w:rFonts w:ascii="Times New Roman" w:hAnsi="Times New Roman" w:eastAsia="宋体"/>
                 <w:b w:val="0"/>
-                <w:sz w:val="20"/>
+                <w:sz w:val="18"/>
               </w:rPr>
               <w:t>1</w:t>
             </w:r>
@@ -4740,7 +4740,7 @@
               <w:rPr>
                 <w:rFonts w:ascii="Times New Roman" w:hAnsi="Times New Roman" w:eastAsia="宋体"/>
                 <w:b w:val="0"/>
-                <w:sz w:val="20"/>
+                <w:sz w:val="18"/>
               </w:rPr>
               <w:t>G_template_rules</w:t>
             </w:r>
@@ -4766,7 +4766,7 @@
               <w:rPr>
                 <w:rFonts w:ascii="Times New Roman" w:hAnsi="Times New Roman" w:eastAsia="宋体"/>
                 <w:b w:val="0"/>
-                <w:sz w:val="20"/>
+                <w:sz w:val="18"/>
               </w:rPr>
               <w:t>4.06</w:t>
             </w:r>
@@ -4792,7 +4792,7 @@
               <w:rPr>
                 <w:rFonts w:ascii="Times New Roman" w:hAnsi="Times New Roman" w:eastAsia="宋体"/>
                 <w:b w:val="0"/>
-                <w:sz w:val="20"/>
+                <w:sz w:val="18"/>
               </w:rPr>
               <w:t>4.80</w:t>
             </w:r>
@@ -4818,7 +4818,7 @@
               <w:rPr>
                 <w:rFonts w:ascii="Times New Roman" w:hAnsi="Times New Roman" w:eastAsia="宋体"/>
                 <w:b w:val="0"/>
-                <w:sz w:val="20"/>
+                <w:sz w:val="18"/>
               </w:rPr>
               <w:t>4.50</w:t>
             </w:r>
@@ -4844,7 +4844,7 @@
               <w:rPr>
                 <w:rFonts w:ascii="Times New Roman" w:hAnsi="Times New Roman" w:eastAsia="宋体"/>
                 <w:b w:val="0"/>
-                <w:sz w:val="20"/>
+                <w:sz w:val="18"/>
               </w:rPr>
               <w:t>2</w:t>
             </w:r>
@@ -4872,7 +4872,7 @@
               <w:rPr>
                 <w:rFonts w:ascii="Times New Roman" w:hAnsi="Times New Roman" w:eastAsia="宋体"/>
                 <w:b w:val="0"/>
-                <w:sz w:val="20"/>
+                <w:sz w:val="18"/>
               </w:rPr>
               <w:t>C_full</w:t>
             </w:r>
@@ -4898,7 +4898,7 @@
               <w:rPr>
                 <w:rFonts w:ascii="Times New Roman" w:hAnsi="Times New Roman" w:eastAsia="宋体"/>
                 <w:b w:val="0"/>
-                <w:sz w:val="20"/>
+                <w:sz w:val="18"/>
               </w:rPr>
               <w:t>3.45</w:t>
             </w:r>
@@ -4924,7 +4924,7 @@
               <w:rPr>
                 <w:rFonts w:ascii="Times New Roman" w:hAnsi="Times New Roman" w:eastAsia="宋体"/>
                 <w:b w:val="0"/>
-                <w:sz w:val="20"/>
+                <w:sz w:val="18"/>
               </w:rPr>
               <w:t>4.90</w:t>
             </w:r>
@@ -4950,7 +4950,7 @@
               <w:rPr>
                 <w:rFonts w:ascii="Times New Roman" w:hAnsi="Times New Roman" w:eastAsia="宋体"/>
                 <w:b w:val="0"/>
-                <w:sz w:val="20"/>
+                <w:sz w:val="18"/>
               </w:rPr>
               <w:t>4.00</w:t>
             </w:r>
@@ -4976,7 +4976,7 @@
               <w:rPr>
                 <w:rFonts w:ascii="Times New Roman" w:hAnsi="Times New Roman" w:eastAsia="宋体"/>
                 <w:b w:val="0"/>
-                <w:sz w:val="20"/>
+                <w:sz w:val="18"/>
               </w:rPr>
               <w:t>2</w:t>
             </w:r>
@@ -5004,7 +5004,7 @@
               <w:rPr>
                 <w:rFonts w:ascii="Times New Roman" w:hAnsi="Times New Roman" w:eastAsia="宋体"/>
                 <w:b w:val="0"/>
-                <w:sz w:val="20"/>
+                <w:sz w:val="18"/>
               </w:rPr>
               <w:t>H4_sop_only</w:t>
             </w:r>
@@ -5030,7 +5030,7 @@
               <w:rPr>
                 <w:rFonts w:ascii="Times New Roman" w:hAnsi="Times New Roman" w:eastAsia="宋体"/>
                 <w:b w:val="0"/>
-                <w:sz w:val="20"/>
+                <w:sz w:val="18"/>
               </w:rPr>
               <w:t>3.20</w:t>
             </w:r>
@@ -5056,7 +5056,7 @@
               <w:rPr>
                 <w:rFonts w:ascii="Times New Roman" w:hAnsi="Times New Roman" w:eastAsia="宋体"/>
                 <w:b w:val="0"/>
-                <w:sz w:val="20"/>
+                <w:sz w:val="18"/>
               </w:rPr>
               <w:t>4.30</w:t>
             </w:r>
@@ -5082,7 +5082,7 @@
               <w:rPr>
                 <w:rFonts w:ascii="Times New Roman" w:hAnsi="Times New Roman" w:eastAsia="宋体"/>
                 <w:b w:val="0"/>
-                <w:sz w:val="20"/>
+                <w:sz w:val="18"/>
               </w:rPr>
               <w:t>4.20</w:t>
             </w:r>
@@ -5108,7 +5108,7 @@
               <w:rPr>
                 <w:rFonts w:ascii="Times New Roman" w:hAnsi="Times New Roman" w:eastAsia="宋体"/>
                 <w:b w:val="0"/>
-                <w:sz w:val="20"/>
+                <w:sz w:val="18"/>
               </w:rPr>
               <w:t>2</w:t>
             </w:r>
@@ -5136,7 +5136,7 @@
               <w:rPr>
                 <w:rFonts w:ascii="Times New Roman" w:hAnsi="Times New Roman" w:eastAsia="宋体"/>
                 <w:b w:val="0"/>
-                <w:sz w:val="20"/>
+                <w:sz w:val="18"/>
               </w:rPr>
               <w:t>E_rules_v2</w:t>
             </w:r>
@@ -5162,7 +5162,7 @@
               <w:rPr>
                 <w:rFonts w:ascii="Times New Roman" w:hAnsi="Times New Roman" w:eastAsia="宋体"/>
                 <w:b w:val="0"/>
-                <w:sz w:val="20"/>
+                <w:sz w:val="18"/>
               </w:rPr>
               <w:t>3.19</w:t>
             </w:r>
@@ -5188,7 +5188,7 @@
               <w:rPr>
                 <w:rFonts w:ascii="Times New Roman" w:hAnsi="Times New Roman" w:eastAsia="宋体"/>
                 <w:b w:val="0"/>
-                <w:sz w:val="20"/>
+                <w:sz w:val="18"/>
               </w:rPr>
               <w:t>4.00</w:t>
             </w:r>
@@ -5214,7 +5214,7 @@
               <w:rPr>
                 <w:rFonts w:ascii="Times New Roman" w:hAnsi="Times New Roman" w:eastAsia="宋体"/>
                 <w:b w:val="0"/>
-                <w:sz w:val="20"/>
+                <w:sz w:val="18"/>
               </w:rPr>
               <w:t>4.00</w:t>
             </w:r>
@@ -5240,7 +5240,7 @@
               <w:rPr>
                 <w:rFonts w:ascii="Times New Roman" w:hAnsi="Times New Roman" w:eastAsia="宋体"/>
                 <w:b w:val="0"/>
-                <w:sz w:val="20"/>
+                <w:sz w:val="18"/>
               </w:rPr>
               <w:t>1</w:t>
             </w:r>
@@ -5268,7 +5268,7 @@
               <w:rPr>
                 <w:rFonts w:ascii="Times New Roman" w:hAnsi="Times New Roman" w:eastAsia="宋体"/>
                 <w:b w:val="0"/>
-                <w:sz w:val="20"/>
+                <w:sz w:val="18"/>
               </w:rPr>
               <w:t>A_bare</w:t>
             </w:r>
@@ -5294,7 +5294,7 @@
               <w:rPr>
                 <w:rFonts w:ascii="Times New Roman" w:hAnsi="Times New Roman" w:eastAsia="宋体"/>
                 <w:b w:val="0"/>
-                <w:sz w:val="20"/>
+                <w:sz w:val="18"/>
               </w:rPr>
               <w:t>3.04</w:t>
             </w:r>
@@ -5320,7 +5320,7 @@
               <w:rPr>
                 <w:rFonts w:ascii="Times New Roman" w:hAnsi="Times New Roman" w:eastAsia="宋体"/>
                 <w:b w:val="0"/>
-                <w:sz w:val="20"/>
+                <w:sz w:val="18"/>
               </w:rPr>
               <w:t>4.00</w:t>
             </w:r>
@@ -5346,7 +5346,7 @@
               <w:rPr>
                 <w:rFonts w:ascii="Times New Roman" w:hAnsi="Times New Roman" w:eastAsia="宋体"/>
                 <w:b w:val="0"/>
-                <w:sz w:val="20"/>
+                <w:sz w:val="18"/>
               </w:rPr>
               <w:t>3.80</w:t>
             </w:r>
@@ -5372,7 +5372,7 @@
               <w:rPr>
                 <w:rFonts w:ascii="Times New Roman" w:hAnsi="Times New Roman" w:eastAsia="宋体"/>
                 <w:b w:val="0"/>
-                <w:sz w:val="20"/>
+                <w:sz w:val="18"/>
               </w:rPr>
               <w:t>1</w:t>
             </w:r>
@@ -5391,19 +5391,19 @@
         <w:rPr>
           <w:rFonts w:ascii="Times New Roman" w:hAnsi="Times New Roman" w:eastAsia="宋体"/>
           <w:b w:val="0"/>
-          <w:sz w:val="22"/>
+          <w:sz w:val="24"/>
         </w:rPr>
         <w:t>The top three are all template-anchored configurations (F_template, H2_keep_examples, G_template_rules), whereas H4_sop_only (~2,000 tokens)—ranked first at the LLM-judge tier—fell to fifth under expert review, only 0.16 points above the no-prompt baseline A_bare. The most overestimated were C_full and H4_sop_only (about 1 point above the experts): both comply in document structure and terminology but lack the practical, clinically grounded operational detail that only experts can identify. The token-efficient, high-scoring advantage that skeleton configurations show at the LLM-judge tier is therefore not borne out under expert evaluation. With only 1–2 documents per configuration, this ranking is preliminary and requires confirmation with a larger expert sample.</w:t>
       </w:r>
     </w:p>
     <w:p>
       <w:pPr>
-        <w:spacing w:before="200" w:after="80" w:lineRule="auto" w:line="300"/>
+        <w:spacing w:before="200" w:after="80" w:lineRule="auto" w:line="360"/>
         <w:jc w:val="left"/>
       </w:pPr>
       <w:r>
         <w:rPr>
-          <w:rFonts w:ascii="Arial" w:hAnsi="Arial" w:eastAsia="黑体"/>
+          <w:rFonts w:ascii="Times New Roman" w:hAnsi="Times New Roman" w:eastAsia="宋体"/>
           <w:b/>
           <w:sz w:val="24"/>
         </w:rPr>
@@ -5420,7 +5420,7 @@
         <w:rPr>
           <w:rFonts w:ascii="Times New Roman" w:hAnsi="Times New Roman" w:eastAsia="宋体"/>
           <w:b w:val="0"/>
-          <w:sz w:val="22"/>
+          <w:sz w:val="24"/>
         </w:rPr>
         <w:t>Figure 4 plots the compliance scores of all three evaluators (experts, Claude judge, GPT judge) against system-prompt token size, all based on the same n = 10 expert-blinded subset. The three curves diverge: both LLM judges scored the low-token configurations and C_full highly, whereas the experts scored highest only in the mid-range template configurations (~15,000–16,000 tokens; F_template, G_template_rules), with both ends of the curve declining markedly.</w:t>
       </w:r>
@@ -5435,7 +5435,7 @@
         <w:rPr>
           <w:rFonts w:ascii="Times New Roman" w:hAnsi="Times New Roman" w:eastAsia="宋体"/>
           <w:b w:val="0"/>
-          <w:sz w:val="22"/>
+          <w:sz w:val="24"/>
         </w:rPr>
         <w:t>The expert–judge divergence therefore follows a descriptive U-shaped pattern (no test of non-linearity was performed, given the sample size): at the low-token end (A_bare, E_rules_v2, H4_sop_only) and the high-token end (C_full) the gap reaches 0.8–1.1 points, whereas in the mid-range template region the two converge (gap ≤ 0.6). This indicates that token efficiency and clinical usability correspond to two different optimisation objectives—relative to the expert-validated compliance, the LLM-judge tier overestimated both the low-token configurations and C_full.</w:t>
       </w:r>
@@ -5450,33 +5450,33 @@
         <w:rPr>
           <w:rFonts w:ascii="Times New Roman" w:hAnsi="Times New Roman" w:eastAsia="宋体"/>
           <w:b w:val="0"/>
-          <w:sz w:val="22"/>
+          <w:sz w:val="24"/>
         </w:rPr>
         <w:t>Framed in terms of efficiency, the answer to research question (ii) turns not on the absolute token count but on the compliance return per unit of added tokens. §3.2 showed that only the rules component produced a definite gain, and the rules themselves take only ~1,000 tokens (E_rules_v2); the per-token return is therefore highest when rules are added and falls off quickly thereafter. The expert tier presents a different trade-off: the template-anchored configurations (~15,000–16,000 tokens) yield a lower per-token return, yet reach a higher absolute score that rules alone cannot, whereas C_full (~56,000 tokens) has the lowest return of all. The "minimum tokens required" thus depends on the use case—for rapid LLM-judged drafting, ~1,000 tokens of rules suffice; for documents that must pass expert review, ~15,000–16,000 tokens buy a higher quality ceiling. (With only 1–2 expert-scored documents per configuration, this comparison is qualitative.)</w:t>
       </w:r>
     </w:p>
     <w:p>
       <w:pPr>
-        <w:spacing w:before="280" w:after="120" w:lineRule="auto" w:line="300"/>
+        <w:spacing w:before="280" w:after="120" w:lineRule="auto" w:line="360"/>
         <w:jc w:val="left"/>
       </w:pPr>
       <w:r>
         <w:rPr>
-          <w:rFonts w:ascii="Arial" w:hAnsi="Arial" w:eastAsia="黑体"/>
+          <w:rFonts w:ascii="Times New Roman" w:hAnsi="Times New Roman" w:eastAsia="宋体"/>
           <w:b/>
-          <w:sz w:val="28"/>
+          <w:sz w:val="24"/>
         </w:rPr>
         <w:t>4. Discussion</w:t>
       </w:r>
     </w:p>
     <w:p>
       <w:pPr>
-        <w:spacing w:before="200" w:after="80" w:lineRule="auto" w:line="300"/>
+        <w:spacing w:before="200" w:after="80" w:lineRule="auto" w:line="360"/>
         <w:jc w:val="left"/>
       </w:pPr>
       <w:r>
         <w:rPr>
-          <w:rFonts w:ascii="Arial" w:hAnsi="Arial" w:eastAsia="黑体"/>
+          <w:rFonts w:ascii="Times New Roman" w:hAnsi="Times New Roman" w:eastAsia="宋体"/>
           <w:b/>
           <w:sz w:val="24"/>
         </w:rPr>
@@ -5493,7 +5493,7 @@
         <w:rPr>
           <w:rFonts w:ascii="Times New Roman" w:hAnsi="Times New Roman" w:eastAsia="宋体"/>
           <w:b w:val="0"/>
-          <w:sz w:val="22"/>
+          <w:sz w:val="24"/>
         </w:rPr>
         <w:t>At the LLM-judge tier, the four-component ablation gives a clear account: the rules component was necessary (BH-adjusted p &lt; 0.001), the document-skeleton component was directionally positive but not significant (p = 0.11), and neither detailed content nor worked examples produced a detectable improvement (§3.2). This aligns with the lost-in-the-middle phenomenon reported by Liu et al. [15] (adding too much context to a long prompt can dilute model attention and degrade output quality) and with the prompt-engineering literature more broadly [8].</w:t>
       </w:r>
@@ -5508,19 +5508,19 @@
         <w:rPr>
           <w:rFonts w:ascii="Times New Roman" w:hAnsi="Times New Roman" w:eastAsia="宋体"/>
           <w:b w:val="0"/>
-          <w:sz w:val="22"/>
+          <w:sz w:val="24"/>
         </w:rPr>
         <w:t>The expert-tier results qualify this account (§3.5). The template-anchored F_template and G_template_rules earned markedly higher expert scores, whereas the skeleton-only H4_sop_only was about one point lower (per-configuration samples are very small and these are exploratory observations; see §3.5). A plausible explanation is that the model's own knowledge does not reliably cover the clinical-practice details required by ISO 15189:2022 and CNAS-CL02:2023—in our task set, emergency-sample handling, acceptance of patient-self-collected specimens, qualification requirements for sample-courier personnel, and detailed sample-rejection criteria. When these are not stated explicitly in the system prompt, the model tends to fall back on generic procedural language: such language meets structural and terminological compliance (the two dimensions most readily detected by automated and LLM-based scoring, §3.6) but lacks the practical operability required of documents intended for accreditation submission. Prompt minimisation is therefore appropriate for rapid drafting that is judged only by an LLM; but when a document must pass expert review for a formal accreditation submission, a template-anchored prompt is required.</w:t>
       </w:r>
     </w:p>
     <w:p>
       <w:pPr>
-        <w:spacing w:before="200" w:after="80" w:lineRule="auto" w:line="300"/>
+        <w:spacing w:before="200" w:after="80" w:lineRule="auto" w:line="360"/>
         <w:jc w:val="left"/>
       </w:pPr>
       <w:r>
         <w:rPr>
-          <w:rFonts w:ascii="Arial" w:hAnsi="Arial" w:eastAsia="黑体"/>
+          <w:rFonts w:ascii="Times New Roman" w:hAnsi="Times New Roman" w:eastAsia="宋体"/>
           <w:b/>
           <w:sz w:val="24"/>
         </w:rPr>
@@ -5537,7 +5537,7 @@
         <w:rPr>
           <w:rFonts w:ascii="Times New Roman" w:hAnsi="Times New Roman" w:eastAsia="宋体"/>
           <w:b w:val="0"/>
-          <w:sz w:val="22"/>
+          <w:sz w:val="24"/>
         </w:rPr>
         <w:t>Although template-anchored configurations improve expert scores (§4.1), simply lengthening the prompt can be counterproductive when a model lacks stable long-context handling. C_full (~56,000 tokens) appears to be the safest choice—it includes all potentially relevant material and matches the intuition that "more context is more reliable." But our data show this intuition did not hold across the two models: for the same C_full, Claude scored 3.22–4.56 on average whereas GPT-5.4 scored only 1.40–1.84, accompanied by the three failure modes recorded in §3.3 (declining instruction-following, structural breakdown, and clause-citation confusion). A plausible explanation—consistent with the lost-in-the-middle phenomenon of Liu et al. [15] and with the long-context benchmarks in both vendors' technical documentation [3, 4]—is that within this length range Claude maintained more stable attention, whereas GPT-5.4, under the parameters tested, did not consistently respect the system-prompt constraints in such a long prompt.</w:t>
       </w:r>
@@ -5552,19 +5552,19 @@
         <w:rPr>
           <w:rFonts w:ascii="Times New Roman" w:hAnsi="Times New Roman" w:eastAsia="宋体"/>
           <w:b w:val="0"/>
-          <w:sz w:val="22"/>
+          <w:sz w:val="24"/>
         </w:rPr>
         <w:t>This carries a methodological implication: any claim that "configuration X works" must be validated across multiple generation models. Evaluating on a single model conflates the effect of the configuration itself with the model's intrinsic properties (long-context capacity, instruction-following stability, and how well its training data matches the target regulatory domain), and cannot be generalised to other models. We therefore recommend validating any long-context QMS prompt (e.g., approaching or exceeding ~50,000 tokens) on the specific model and version before deployment. This is because long-context behaviour can vary substantially, both between models and between adjacent versions of the same model.</w:t>
       </w:r>
     </w:p>
     <w:p>
       <w:pPr>
-        <w:spacing w:before="200" w:after="80" w:lineRule="auto" w:line="300"/>
+        <w:spacing w:before="200" w:after="80" w:lineRule="auto" w:line="360"/>
         <w:jc w:val="left"/>
       </w:pPr>
       <w:r>
         <w:rPr>
-          <w:rFonts w:ascii="Arial" w:hAnsi="Arial" w:eastAsia="黑体"/>
+          <w:rFonts w:ascii="Times New Roman" w:hAnsi="Times New Roman" w:eastAsia="宋体"/>
           <w:b/>
           <w:sz w:val="24"/>
         </w:rPr>
@@ -5581,7 +5581,7 @@
         <w:rPr>
           <w:rFonts w:ascii="Times New Roman" w:hAnsi="Times New Roman" w:eastAsia="宋体"/>
           <w:b w:val="0"/>
-          <w:sz w:val="22"/>
+          <w:sz w:val="24"/>
         </w:rPr>
         <w:t>This study quantified two distinct types of rating bias. The first is a cross-judge directional bias: both judges rated Claude-generated documents about 0.3 points higher than GPT-generated ones (§3.4), an effect driven mainly by C_full. As explained in §3.4, this pattern does not match classical self-preference (a judge favouring its own model's outputs), and more likely reflects either a genuine difference in generation quality between Claude and GPT or a shared preference of both judges for Claude's writing style. The second is a systematic LLM–expert offset: both judges overestimated the expert-determined compliance scores by 0.52–0.90 points (§3.5).</w:t>
       </w:r>
@@ -5596,19 +5596,19 @@
         <w:rPr>
           <w:rFonts w:ascii="Times New Roman" w:hAnsi="Times New Roman" w:eastAsia="宋体"/>
           <w:b w:val="0"/>
-          <w:sz w:val="22"/>
+          <w:sz w:val="24"/>
         </w:rPr>
         <w:t>The practical guidance from these two biases is as follows. The Claude judge's moderate agreement with the expert ranking [ICC(3,1) = 0.548] suggests it could serve as a first-pass filter in large-scale generation, screening out clearly low-quality outputs before expert review; however, the 95% CI of this coefficient crosses zero (n = 10; see §3.5), so this use requires confirmation in a larger sample. The GPT judge's poorer and non-significant agreement [ICC(3,1) = 0.217, p = 0.26] makes it unsuitable as a substitute for expert scoring. For documents intended for accreditation submission, formal QMS adoption, or operational use, expert final review remains indispensable. The configuration-level implications of these biases are summarised in §4.4 (Table 6).</w:t>
       </w:r>
     </w:p>
     <w:p>
       <w:pPr>
-        <w:spacing w:before="200" w:after="80" w:lineRule="auto" w:line="300"/>
+        <w:spacing w:before="200" w:after="80" w:lineRule="auto" w:line="360"/>
         <w:jc w:val="left"/>
       </w:pPr>
       <w:r>
         <w:rPr>
-          <w:rFonts w:ascii="Arial" w:hAnsi="Arial" w:eastAsia="黑体"/>
+          <w:rFonts w:ascii="Times New Roman" w:hAnsi="Times New Roman" w:eastAsia="宋体"/>
           <w:b/>
           <w:sz w:val="24"/>
         </w:rPr>
@@ -5625,7 +5625,7 @@
         <w:rPr>
           <w:rFonts w:ascii="Times New Roman" w:hAnsi="Times New Roman" w:eastAsia="宋体"/>
           <w:b w:val="0"/>
-          <w:sz w:val="22"/>
+          <w:sz w:val="24"/>
         </w:rPr>
         <w:t>Synthesising the evidence from the three evaluation tiers, we summarise configuration recommendations for the principal use scenarios in Table 6. There is a key trade-off (see §3.5 and §3.6): the configurations that score highest at the LLM-judge tier (H4_sop_only, E_rules_v2) are the most token-efficient but lack the practical, clinically grounded detail needed to meet formal submission requirements, whereas the template-anchored configurations (F_template, G_template_rules) score lower at the LLM-judge tier yet receive the highest expert ratings.</w:t>
       </w:r>
@@ -5640,7 +5640,7 @@
         <w:rPr>
           <w:rFonts w:ascii="Times New Roman" w:hAnsi="Times New Roman" w:eastAsia="宋体"/>
           <w:b/>
-          <w:sz w:val="22"/>
+          <w:sz w:val="24"/>
         </w:rPr>
         <w:t>Table 6.</w:t>
       </w:r>
@@ -5648,7 +5648,7 @@
         <w:rPr>
           <w:rFonts w:ascii="Times New Roman" w:hAnsi="Times New Roman" w:eastAsia="宋体"/>
           <w:b w:val="0"/>
-          <w:sz w:val="22"/>
+          <w:sz w:val="24"/>
         </w:rPr>
         <w:t xml:space="preserve"> Configuration recommendations stratified by use scenario.</w:t>
       </w:r>
@@ -5688,7 +5688,7 @@
               <w:rPr>
                 <w:rFonts w:ascii="Times New Roman" w:hAnsi="Times New Roman" w:eastAsia="宋体"/>
                 <w:b/>
-                <w:sz w:val="20"/>
+                <w:sz w:val="18"/>
               </w:rPr>
               <w:t>Use scenario</w:t>
             </w:r>
@@ -5714,7 +5714,7 @@
               <w:rPr>
                 <w:rFonts w:ascii="Times New Roman" w:hAnsi="Times New Roman" w:eastAsia="宋体"/>
                 <w:b/>
-                <w:sz w:val="20"/>
+                <w:sz w:val="18"/>
               </w:rPr>
               <w:t>Recommended configuration</w:t>
             </w:r>
@@ -5740,7 +5740,7 @@
               <w:rPr>
                 <w:rFonts w:ascii="Times New Roman" w:hAnsi="Times New Roman" w:eastAsia="宋体"/>
                 <w:b/>
-                <w:sz w:val="20"/>
+                <w:sz w:val="18"/>
               </w:rPr>
               <w:t>Tokens</w:t>
             </w:r>
@@ -5766,7 +5766,7 @@
               <w:rPr>
                 <w:rFonts w:ascii="Times New Roman" w:hAnsi="Times New Roman" w:eastAsia="宋体"/>
                 <w:b/>
-                <w:sz w:val="20"/>
+                <w:sz w:val="18"/>
               </w:rPr>
               <w:t>Rationale</w:t>
             </w:r>
@@ -5792,7 +5792,7 @@
               <w:rPr>
                 <w:rFonts w:ascii="Times New Roman" w:hAnsi="Times New Roman" w:eastAsia="宋体"/>
                 <w:b/>
-                <w:sz w:val="20"/>
+                <w:sz w:val="18"/>
               </w:rPr>
               <w:t>Trade-off</w:t>
             </w:r>
@@ -5820,7 +5820,7 @@
               <w:rPr>
                 <w:rFonts w:ascii="Times New Roman" w:hAnsi="Times New Roman" w:eastAsia="宋体"/>
                 <w:b w:val="0"/>
-                <w:sz w:val="20"/>
+                <w:sz w:val="18"/>
               </w:rPr>
               <w:t>Rapid first-draft generation; internal iteration</w:t>
             </w:r>
@@ -5846,7 +5846,7 @@
               <w:rPr>
                 <w:rFonts w:ascii="Times New Roman" w:hAnsi="Times New Roman" w:eastAsia="宋体"/>
                 <w:b w:val="0"/>
-                <w:sz w:val="20"/>
+                <w:sz w:val="18"/>
               </w:rPr>
               <w:t>H4_sop_only or E_rules_v2</w:t>
             </w:r>
@@ -5872,7 +5872,7 @@
               <w:rPr>
                 <w:rFonts w:ascii="Times New Roman" w:hAnsi="Times New Roman" w:eastAsia="宋体"/>
                 <w:b w:val="0"/>
-                <w:sz w:val="20"/>
+                <w:sz w:val="18"/>
               </w:rPr>
               <w:t>~1,000–2,000</w:t>
             </w:r>
@@ -5898,7 +5898,7 @@
               <w:rPr>
                 <w:rFonts w:ascii="Times New Roman" w:hAnsi="Times New Roman" w:eastAsia="宋体"/>
                 <w:b w:val="0"/>
-                <w:sz w:val="20"/>
+                <w:sz w:val="18"/>
               </w:rPr>
               <w:t>Near-optimal at the LLM-judge tier; highest token efficiency</w:t>
             </w:r>
@@ -5924,7 +5924,7 @@
               <w:rPr>
                 <w:rFonts w:ascii="Times New Roman" w:hAnsi="Times New Roman" w:eastAsia="宋体"/>
                 <w:b w:val="0"/>
-                <w:sz w:val="20"/>
+                <w:sz w:val="18"/>
               </w:rPr>
               <w:t>Requires manual supplementation of clinical detail</w:t>
             </w:r>
@@ -5952,7 +5952,7 @@
               <w:rPr>
                 <w:rFonts w:ascii="Times New Roman" w:hAnsi="Times New Roman" w:eastAsia="宋体"/>
                 <w:b w:val="0"/>
-                <w:sz w:val="20"/>
+                <w:sz w:val="18"/>
               </w:rPr>
               <w:t>Batch drafting of multiple SOPs</w:t>
             </w:r>
@@ -5978,7 +5978,7 @@
               <w:rPr>
                 <w:rFonts w:ascii="Times New Roman" w:hAnsi="Times New Roman" w:eastAsia="宋体"/>
                 <w:b w:val="0"/>
-                <w:sz w:val="20"/>
+                <w:sz w:val="18"/>
               </w:rPr>
               <w:t>H4_sop_only or H3_skeleton</w:t>
             </w:r>
@@ -6004,7 +6004,7 @@
               <w:rPr>
                 <w:rFonts w:ascii="Times New Roman" w:hAnsi="Times New Roman" w:eastAsia="宋体"/>
                 <w:b w:val="0"/>
-                <w:sz w:val="20"/>
+                <w:sz w:val="18"/>
               </w:rPr>
               <w:t>~2,000–5,000</w:t>
             </w:r>
@@ -6030,7 +6030,7 @@
               <w:rPr>
                 <w:rFonts w:ascii="Times New Roman" w:hAnsi="Times New Roman" w:eastAsia="宋体"/>
                 <w:b w:val="0"/>
-                <w:sz w:val="20"/>
+                <w:sz w:val="18"/>
               </w:rPr>
               <w:t>Task-specific skeleton plus rules</w:t>
             </w:r>
@@ -6056,7 +6056,7 @@
               <w:rPr>
                 <w:rFonts w:ascii="Times New Roman" w:hAnsi="Times New Roman" w:eastAsia="宋体"/>
                 <w:b w:val="0"/>
-                <w:sz w:val="20"/>
+                <w:sz w:val="18"/>
               </w:rPr>
               <w:t>Requires manual supplementation of clinical detail</w:t>
             </w:r>
@@ -6084,7 +6084,7 @@
               <w:rPr>
                 <w:rFonts w:ascii="Times New Roman" w:hAnsi="Times New Roman" w:eastAsia="宋体"/>
                 <w:b w:val="0"/>
-                <w:sz w:val="20"/>
+                <w:sz w:val="18"/>
               </w:rPr>
               <w:t>Formal documents for CNAS submission</w:t>
             </w:r>
@@ -6110,7 +6110,7 @@
               <w:rPr>
                 <w:rFonts w:ascii="Times New Roman" w:hAnsi="Times New Roman" w:eastAsia="宋体"/>
                 <w:b w:val="0"/>
-                <w:sz w:val="20"/>
+                <w:sz w:val="18"/>
               </w:rPr>
               <w:t>G_template_rules</w:t>
             </w:r>
@@ -6136,7 +6136,7 @@
               <w:rPr>
                 <w:rFonts w:ascii="Times New Roman" w:hAnsi="Times New Roman" w:eastAsia="宋体"/>
                 <w:b w:val="0"/>
-                <w:sz w:val="20"/>
+                <w:sz w:val="18"/>
               </w:rPr>
               <w:t>~16,000</w:t>
             </w:r>
@@ -6162,7 +6162,7 @@
               <w:rPr>
                 <w:rFonts w:ascii="Times New Roman" w:hAnsi="Times New Roman" w:eastAsia="宋体"/>
                 <w:b w:val="0"/>
-                <w:sz w:val="20"/>
+                <w:sz w:val="18"/>
               </w:rPr>
               <w:t>Top-three expert compliance; cross-model robust</w:t>
             </w:r>
@@ -6188,7 +6188,7 @@
               <w:rPr>
                 <w:rFonts w:ascii="Times New Roman" w:hAnsi="Times New Roman" w:eastAsia="宋体"/>
                 <w:b w:val="0"/>
-                <w:sz w:val="20"/>
+                <w:sz w:val="18"/>
               </w:rPr>
               <w:t>Higher token cost</w:t>
             </w:r>
@@ -6216,7 +6216,7 @@
               <w:rPr>
                 <w:rFonts w:ascii="Times New Roman" w:hAnsi="Times New Roman" w:eastAsia="宋体"/>
                 <w:b w:val="0"/>
-                <w:sz w:val="20"/>
+                <w:sz w:val="18"/>
               </w:rPr>
               <w:t>Complete quality manual</w:t>
             </w:r>
@@ -6242,7 +6242,7 @@
               <w:rPr>
                 <w:rFonts w:ascii="Times New Roman" w:hAnsi="Times New Roman" w:eastAsia="宋体"/>
                 <w:b w:val="0"/>
-                <w:sz w:val="20"/>
+                <w:sz w:val="18"/>
               </w:rPr>
               <w:t>F_template or G_template_rules</w:t>
             </w:r>
@@ -6268,7 +6268,7 @@
               <w:rPr>
                 <w:rFonts w:ascii="Times New Roman" w:hAnsi="Times New Roman" w:eastAsia="宋体"/>
                 <w:b w:val="0"/>
-                <w:sz w:val="20"/>
+                <w:sz w:val="18"/>
               </w:rPr>
               <w:t>~15,000–16,000</w:t>
             </w:r>
@@ -6294,7 +6294,7 @@
               <w:rPr>
                 <w:rFonts w:ascii="Times New Roman" w:hAnsi="Times New Roman" w:eastAsia="宋体"/>
                 <w:b w:val="0"/>
-                <w:sz w:val="20"/>
+                <w:sz w:val="18"/>
               </w:rPr>
               <w:t>Highest expert scores</w:t>
             </w:r>
@@ -6320,7 +6320,7 @@
               <w:rPr>
                 <w:rFonts w:ascii="Times New Roman" w:hAnsi="Times New Roman" w:eastAsia="宋体"/>
                 <w:b w:val="0"/>
-                <w:sz w:val="20"/>
+                <w:sz w:val="18"/>
               </w:rPr>
               <w:t>Higher token cost</w:t>
             </w:r>
@@ -6348,7 +6348,7 @@
               <w:rPr>
                 <w:rFonts w:ascii="Times New Roman" w:hAnsi="Times New Roman" w:eastAsia="宋体"/>
                 <w:b w:val="0"/>
-                <w:sz w:val="20"/>
+                <w:sz w:val="18"/>
               </w:rPr>
               <w:t>Not recommended</w:t>
             </w:r>
@@ -6374,7 +6374,7 @@
               <w:rPr>
                 <w:rFonts w:ascii="Times New Roman" w:hAnsi="Times New Roman" w:eastAsia="宋体"/>
                 <w:b w:val="0"/>
-                <w:sz w:val="20"/>
+                <w:sz w:val="18"/>
               </w:rPr>
               <w:t>C_full</w:t>
             </w:r>
@@ -6400,7 +6400,7 @@
               <w:rPr>
                 <w:rFonts w:ascii="Times New Roman" w:hAnsi="Times New Roman" w:eastAsia="宋体"/>
                 <w:b w:val="0"/>
-                <w:sz w:val="20"/>
+                <w:sz w:val="18"/>
               </w:rPr>
               <w:t>~56,000</w:t>
             </w:r>
@@ -6426,7 +6426,7 @@
               <w:rPr>
                 <w:rFonts w:ascii="Times New Roman" w:hAnsi="Times New Roman" w:eastAsia="宋体"/>
                 <w:b w:val="0"/>
-                <w:sz w:val="20"/>
+                <w:sz w:val="18"/>
               </w:rPr>
               <w:t>Collapses under GPT-5.4 generation; ranks last after debiasing</w:t>
             </w:r>
@@ -6452,7 +6452,7 @@
               <w:rPr>
                 <w:rFonts w:ascii="Times New Roman" w:hAnsi="Times New Roman" w:eastAsia="宋体"/>
                 <w:b w:val="0"/>
-                <w:sz w:val="20"/>
+                <w:sz w:val="18"/>
               </w:rPr>
               <w:t>—</w:t>
             </w:r>
@@ -6480,7 +6480,7 @@
               <w:rPr>
                 <w:rFonts w:ascii="Times New Roman" w:hAnsi="Times New Roman" w:eastAsia="宋体"/>
                 <w:b w:val="0"/>
-                <w:sz w:val="20"/>
+                <w:sz w:val="18"/>
               </w:rPr>
               <w:t>Not recommended</w:t>
             </w:r>
@@ -6506,7 +6506,7 @@
               <w:rPr>
                 <w:rFonts w:ascii="Times New Roman" w:hAnsi="Times New Roman" w:eastAsia="宋体"/>
                 <w:b w:val="0"/>
-                <w:sz w:val="20"/>
+                <w:sz w:val="18"/>
               </w:rPr>
               <w:t>A_bare, B_simple</w:t>
             </w:r>
@@ -6532,7 +6532,7 @@
               <w:rPr>
                 <w:rFonts w:ascii="Times New Roman" w:hAnsi="Times New Roman" w:eastAsia="宋体"/>
                 <w:b w:val="0"/>
-                <w:sz w:val="20"/>
+                <w:sz w:val="18"/>
               </w:rPr>
               <w:t>0–~300</w:t>
             </w:r>
@@ -6558,7 +6558,7 @@
               <w:rPr>
                 <w:rFonts w:ascii="Times New Roman" w:hAnsi="Times New Roman" w:eastAsia="宋体"/>
                 <w:b w:val="0"/>
-                <w:sz w:val="20"/>
+                <w:sz w:val="18"/>
               </w:rPr>
               <w:t>Insufficient prompt constraint; below the practical compliance baseline</w:t>
             </w:r>
@@ -6584,7 +6584,7 @@
               <w:rPr>
                 <w:rFonts w:ascii="Times New Roman" w:hAnsi="Times New Roman" w:eastAsia="宋体"/>
                 <w:b w:val="0"/>
-                <w:sz w:val="20"/>
+                <w:sz w:val="18"/>
               </w:rPr>
               <w:t>—</w:t>
             </w:r>
@@ -6603,19 +6603,19 @@
         <w:rPr>
           <w:rFonts w:ascii="Times New Roman" w:hAnsi="Times New Roman" w:eastAsia="宋体"/>
           <w:b w:val="0"/>
-          <w:sz w:val="22"/>
+          <w:sz w:val="24"/>
         </w:rPr>
         <w:t>A practical workflow emerging from these data is to: (i) generate a rapid first draft with H4_sop_only; (ii) supplement the practical clinical detail through manual review or targeted re-prompting; and (iii) regenerate or refine the final document for accreditation submission using G_template_rules. It should be emphasised that every configuration in Table 6 produces only a reference draft: all require revision by laboratory staff and final expert review before use for accreditation, and the configurations differ only in the completeness of that draft, not in whether expert review is needed. The amount of manual rework each configuration requires was not quantified in this study and is a direction for future work.</w:t>
       </w:r>
     </w:p>
     <w:p>
       <w:pPr>
-        <w:spacing w:before="200" w:after="80" w:lineRule="auto" w:line="300"/>
+        <w:spacing w:before="200" w:after="80" w:lineRule="auto" w:line="360"/>
         <w:jc w:val="left"/>
       </w:pPr>
       <w:r>
         <w:rPr>
-          <w:rFonts w:ascii="Arial" w:hAnsi="Arial" w:eastAsia="黑体"/>
+          <w:rFonts w:ascii="Times New Roman" w:hAnsi="Times New Roman" w:eastAsia="宋体"/>
           <w:b/>
           <w:sz w:val="24"/>
         </w:rPr>
@@ -6632,19 +6632,19 @@
         <w:rPr>
           <w:rFonts w:ascii="Times New Roman" w:hAnsi="Times New Roman" w:eastAsia="宋体"/>
           <w:b w:val="0"/>
-          <w:sz w:val="22"/>
+          <w:sz w:val="24"/>
         </w:rPr>
         <w:t>The drafting of QMS documents is not merely a clerical output; it is also the process through which laboratory staff build their sense of responsibility and risk awareness. If this work is delegated entirely to an LLM, staff gradually lose writing practice and struggle to develop a deep understanding of the ISO 15189 process as a whole. We therefore regard human supervision as a constraint on the use of LLMs in this setting. ISO 15189:2022 requires competent personnel and a complete examination process, not merely well-formatted documents; our data show precisely why LLM generation cannot replace this competence: the LLM judges overestimated expert-determined compliance by 0.52–0.90 points. A model that cannot even reliably evaluate compliance certainly should not be entrusted with final authorship. This position aligns with the recently emerging consensus that, in healthcare quality management, LLMs should be confined to clerical tasks that are grounded in historical data and performed under mandatory human verification, with autonomous operation regarded as premature [16]. We therefore position LLM assistance as an efficiency tool: the final authoring, review, and approval remain the responsibility of qualified personnel, while the time it saves at the drafting stage can be redirected toward the higher-order review, validation, and continual-improvement activities that ISO 15189 prioritises.</w:t>
       </w:r>
     </w:p>
     <w:p>
       <w:pPr>
-        <w:spacing w:before="200" w:after="80" w:lineRule="auto" w:line="300"/>
+        <w:spacing w:before="200" w:after="80" w:lineRule="auto" w:line="360"/>
         <w:jc w:val="left"/>
       </w:pPr>
       <w:r>
         <w:rPr>
-          <w:rFonts w:ascii="Arial" w:hAnsi="Arial" w:eastAsia="黑体"/>
+          <w:rFonts w:ascii="Times New Roman" w:hAnsi="Times New Roman" w:eastAsia="宋体"/>
           <w:b/>
           <w:sz w:val="24"/>
         </w:rPr>
@@ -6661,7 +6661,7 @@
         <w:rPr>
           <w:rFonts w:ascii="Times New Roman" w:hAnsi="Times New Roman" w:eastAsia="宋体"/>
           <w:b w:val="0"/>
-          <w:sz w:val="22"/>
+          <w:sz w:val="24"/>
         </w:rPr>
         <w:t>The present study has the following limitations.</w:t>
       </w:r>
@@ -6676,7 +6676,7 @@
         <w:rPr>
           <w:rFonts w:ascii="Times New Roman" w:hAnsi="Times New Roman" w:eastAsia="宋体"/>
           <w:b/>
-          <w:sz w:val="22"/>
+          <w:sz w:val="24"/>
         </w:rPr>
         <w:t>(i) Limited expert sample, all from Claude-generated documents.</w:t>
       </w:r>
@@ -6684,7 +6684,7 @@
         <w:rPr>
           <w:rFonts w:ascii="Times New Roman" w:hAnsi="Times New Roman" w:eastAsia="宋体"/>
           <w:b w:val="0"/>
-          <w:sz w:val="22"/>
+          <w:sz w:val="24"/>
         </w:rPr>
         <w:t xml:space="preserve"> The expert tier comprised three raters scoring 10 documents (per-stratum n = 1 or 2; see §3.5), all drawn from the Claude-generation pool, with no expert evaluation of any GPT-generated document. The expert tier therefore supports only directional ranking for Claude-generated documents and is insufficient for strict statistical inference; the two explanations in §3.4—(a) a genuine generation-quality gap between Claude and GPT, and (b) a shared judge preference for Claude's style—also cannot be distinguished within this study. Furthermore, the cross-judge bias in §3.4 is driven mainly by the single C_full configuration (which contributes the largest single-configuration bias of +3.156 to the Claude judge and the largest negative bias of −1.378 to the GPT judge), so future replication should report bias distributions per configuration. All 10 documents were Class A procedure documents; generalisation to Class B and Class C still requires validation. A key direction for future work is multi-centre validation: three to five raters scoring 30–50 documents per institution, including matched GPT-generated samples and Class B/C tasks.</w:t>
       </w:r>
@@ -6699,7 +6699,7 @@
         <w:rPr>
           <w:rFonts w:ascii="Times New Roman" w:hAnsi="Times New Roman" w:eastAsia="宋体"/>
           <w:b/>
-          <w:sz w:val="22"/>
+          <w:sz w:val="24"/>
         </w:rPr>
         <w:t>(ii) Same-institution agreement may overestimate generalisability.</w:t>
       </w:r>
@@ -6707,7 +6707,7 @@
         <w:rPr>
           <w:rFonts w:ascii="Times New Roman" w:hAnsi="Times New Roman" w:eastAsia="宋体"/>
           <w:b w:val="0"/>
-          <w:sz w:val="22"/>
+          <w:sz w:val="24"/>
         </w:rPr>
         <w:t xml:space="preserve"> The very high agreement among the three experts [ICC(2,k) = 0.982] supports the validity of the five-dimensional rubric but may also stem from shared professional culture, training background, and clause-interpretation habits within a single institution; the observed reliability may therefore be higher than what holds across institutions.</w:t>
       </w:r>
@@ -6722,7 +6722,7 @@
         <w:rPr>
           <w:rFonts w:ascii="Times New Roman" w:hAnsi="Times New Roman" w:eastAsia="宋体"/>
           <w:b/>
-          <w:sz w:val="22"/>
+          <w:sz w:val="24"/>
         </w:rPr>
         <w:t>(iii) Dual role of the first author.</w:t>
       </w:r>
@@ -6730,7 +6730,7 @@
         <w:rPr>
           <w:rFonts w:ascii="Times New Roman" w:hAnsi="Times New Roman" w:eastAsia="宋体"/>
           <w:b w:val="0"/>
-          <w:sz w:val="22"/>
+          <w:sz w:val="24"/>
         </w:rPr>
         <w:t xml:space="preserve"> The first author was both Rater 1 and the study designer. To reduce self-influence, Raters 2 and 3 scored independently without knowledge of Rater 1's ratings; each rater's data are openly released for independent audit.</w:t>
       </w:r>
@@ -6745,7 +6745,7 @@
         <w:rPr>
           <w:rFonts w:ascii="Times New Roman" w:hAnsi="Times New Roman" w:eastAsia="宋体"/>
           <w:b/>
-          <w:sz w:val="22"/>
+          <w:sz w:val="24"/>
         </w:rPr>
         <w:t>(iv) Expert and LLM tiers used the same rubric.</w:t>
       </w:r>
@@ -6753,7 +6753,7 @@
         <w:rPr>
           <w:rFonts w:ascii="Times New Roman" w:hAnsi="Times New Roman" w:eastAsia="宋体"/>
           <w:b w:val="0"/>
-          <w:sz w:val="22"/>
+          <w:sz w:val="24"/>
         </w:rPr>
         <w:t xml:space="preserve"> The five-dimensional rubric was used identically by the LLM judges and the experts, creating a risk of shared-measurement bias. Future work should add expert-specific dimensions (e.g., practical implementability under departmental workflow constraints) that an LLM is unlikely to have learned from training data. It should also be noted that all three raters were internal auditors. An internal auditor is trained to check whether a document fully covers the standard's clauses and is properly formatted; a bench-level examiner is concerned with a different question—whether the steps a document describes can actually be carried out on the department's existing instruments and information systems. A document can be beyond reproach in clause coverage and formatting, and receive a high score from an internal auditor, yet not be executable at the bench. The implementability dimension noted above should therefore be rated by bench-level technologists or section leaders, rather than (or not only) by internal auditors. A further dimension worth adding is "fillability": whether a document leaves the content that the laboratory must supply as blank slots—empty tables, formulas awaiting values, parameter ranges to be determined—rather than having the model invent plausible-looking numbers. This dimension bears on whether a document can be used safely: if the model supplies concrete figures for quality-control limits or reference intervals, users may not be able to tell that those figures were fabricated, and the risk of copying them across is far greater than that of poor formatting.</w:t>
       </w:r>
@@ -6768,7 +6768,7 @@
         <w:rPr>
           <w:rFonts w:ascii="Times New Roman" w:hAnsi="Times New Roman" w:eastAsia="宋体"/>
           <w:b/>
-          <w:sz w:val="22"/>
+          <w:sz w:val="24"/>
         </w:rPr>
         <w:t>(v) Limited GPT-5.4 task coverage.</w:t>
       </w:r>
@@ -6776,7 +6776,7 @@
         <w:rPr>
           <w:rFonts w:ascii="Times New Roman" w:hAnsi="Times New Roman" w:eastAsia="宋体"/>
           <w:b w:val="0"/>
-          <w:sz w:val="22"/>
+          <w:sz w:val="24"/>
         </w:rPr>
         <w:t xml:space="preserve"> Only the A1, B1, and C1 tasks were generated by GPT-5.4 (81 documents). Both models were run on the same three tasks, so the cross-model comparison in §3.3 is task-matched; three tasks are nevertheless too few to exclude task specificity—for example, these three tasks may happen to be particularly unfavourable for GPT-5.4's long-context handling. The model dependence of the full-context trap is therefore a preliminary observation: its evidential strength does not match that of the Claude-side conclusions, which rest on 405 documents, and it requires validation on a larger set of tasks. In addition, the blinded expert review covered no GPT-generated document, so this conclusion is supported only by Tiers 1 and 2 and has not been independently confirmed at the expert tier.</w:t>
       </w:r>
@@ -6791,7 +6791,7 @@
         <w:rPr>
           <w:rFonts w:ascii="Times New Roman" w:hAnsi="Times New Roman" w:eastAsia="宋体"/>
           <w:b/>
-          <w:sz w:val="22"/>
+          <w:sz w:val="24"/>
         </w:rPr>
         <w:t>(vi) Domain specificity.</w:t>
       </w:r>
@@ -6799,7 +6799,7 @@
         <w:rPr>
           <w:rFonts w:ascii="Times New Roman" w:hAnsi="Times New Roman" w:eastAsia="宋体"/>
           <w:b w:val="0"/>
-          <w:sz w:val="22"/>
+          <w:sz w:val="24"/>
         </w:rPr>
         <w:t xml:space="preserve"> The findings are limited to ISO 15189 medical-laboratory QMS documents; transfer to adjacent regulatory frameworks (e.g., ISO 17025 for testing and calibration laboratories, or ISO 9001 for general quality management) requires separate validation.</w:t>
       </w:r>
@@ -6814,7 +6814,7 @@
         <w:rPr>
           <w:rFonts w:ascii="Times New Roman" w:hAnsi="Times New Roman" w:eastAsia="宋体"/>
           <w:b/>
-          <w:sz w:val="22"/>
+          <w:sz w:val="24"/>
         </w:rPr>
         <w:t>(vii) Limited set of judge models.</w:t>
       </w:r>
@@ -6822,7 +6822,7 @@
         <w:rPr>
           <w:rFonts w:ascii="Times New Roman" w:hAnsi="Times New Roman" w:eastAsia="宋体"/>
           <w:b w:val="0"/>
-          <w:sz w:val="22"/>
+          <w:sz w:val="24"/>
         </w:rPr>
         <w:t xml:space="preserve"> Only Claude Opus 4.6 and GPT-5.4 served as judges; whether the observed cross-judge directional bias and expert-overestimation pattern generalise to other models (e.g., Gemini, open-weight models) is unclear.</w:t>
       </w:r>
@@ -6837,7 +6837,7 @@
         <w:rPr>
           <w:rFonts w:ascii="Times New Roman" w:hAnsi="Times New Roman" w:eastAsia="宋体"/>
           <w:b/>
-          <w:sz w:val="22"/>
+          <w:sz w:val="24"/>
         </w:rPr>
         <w:t>(viii) Single language only.</w:t>
       </w:r>
@@ -6845,7 +6845,7 @@
         <w:rPr>
           <w:rFonts w:ascii="Times New Roman" w:hAnsi="Times New Roman" w:eastAsia="宋体"/>
           <w:b w:val="0"/>
-          <w:sz w:val="22"/>
+          <w:sz w:val="24"/>
         </w:rPr>
         <w:t xml:space="preserve"> All QMS documents were generated and evaluated in Chinese; the configuration effects and bias behaviour in English or other languages have not been verified.</w:t>
       </w:r>
@@ -6860,7 +6860,7 @@
         <w:rPr>
           <w:rFonts w:ascii="Times New Roman" w:hAnsi="Times New Roman" w:eastAsia="宋体"/>
           <w:b/>
-          <w:sz w:val="22"/>
+          <w:sz w:val="24"/>
         </w:rPr>
         <w:t>(ix) Model temporality.</w:t>
       </w:r>
@@ -6868,7 +6868,7 @@
         <w:rPr>
           <w:rFonts w:ascii="Times New Roman" w:hAnsi="Times New Roman" w:eastAsia="宋体"/>
           <w:b w:val="0"/>
-          <w:sz w:val="22"/>
+          <w:sz w:val="24"/>
         </w:rPr>
         <w:t xml:space="preserve"> The conclusions rest on the specific model versions and parameters tested between 2 and 14 April 2026; as LLMs continue to iterate, periodic re-validation may be needed.</w:t>
       </w:r>
@@ -6883,7 +6883,7 @@
         <w:rPr>
           <w:rFonts w:ascii="Times New Roman" w:hAnsi="Times New Roman" w:eastAsia="宋体"/>
           <w:b/>
-          <w:sz w:val="22"/>
+          <w:sz w:val="24"/>
         </w:rPr>
         <w:t>(x) Some raw ratings were kept only as group means.</w:t>
       </w:r>
@@ -6891,7 +6891,7 @@
         <w:rPr>
           <w:rFonts w:ascii="Times New Roman" w:hAnsi="Times New Roman" w:eastAsia="宋体"/>
           <w:b w:val="0"/>
-          <w:sz w:val="22"/>
+          <w:sz w:val="24"/>
         </w:rPr>
         <w:t xml:space="preserve"> For two subsets (Claude judge × GPT-generated, and Claude judge × H-group × Claude-generated), we stored only the mean across that group's documents, not each document's individual rating (i.e., no per-document JSON files). The full 2 × 2 self-preference matrix therefore cannot be independently recomputed at the individual-document level. However, the per-document raw Claude-judge ratings for the six core configurations (A/B/C/E/F/G; 270 ratings) and all 486 per-document GPT-judge ratings are openly released.</w:t>
       </w:r>
@@ -6906,7 +6906,7 @@
         <w:rPr>
           <w:rFonts w:ascii="Times New Roman" w:hAnsi="Times New Roman" w:eastAsia="宋体"/>
           <w:b/>
-          <w:sz w:val="22"/>
+          <w:sz w:val="24"/>
         </w:rPr>
         <w:t>(xi) Intra-judge reliability not assessed.</w:t>
       </w:r>
@@ -6914,7 +6914,7 @@
         <w:rPr>
           <w:rFonts w:ascii="Times New Roman" w:hAnsi="Times New Roman" w:eastAsia="宋体"/>
           <w:b w:val="0"/>
-          <w:sz w:val="22"/>
+          <w:sz w:val="24"/>
         </w:rPr>
         <w:t xml:space="preserve"> Each LLM judge scored each document only once; judges were not asked to re-score documents to quantify their own variability. Agreement between raters was obtained indirectly, via the 2 × 2 cross-comparison between the Claude and GPT judges and the three-expert ICC analysis.</w:t>
       </w:r>
@@ -6929,7 +6929,7 @@
         <w:rPr>
           <w:rFonts w:ascii="Times New Roman" w:hAnsi="Times New Roman" w:eastAsia="宋体"/>
           <w:b/>
-          <w:sz w:val="22"/>
+          <w:sz w:val="24"/>
         </w:rPr>
         <w:t>(xii) No pre-scoring calibration session.</w:t>
       </w:r>
@@ -6937,7 +6937,7 @@
         <w:rPr>
           <w:rFonts w:ascii="Times New Roman" w:hAnsi="Times New Roman" w:eastAsia="宋体"/>
           <w:b w:val="0"/>
-          <w:sz w:val="22"/>
+          <w:sz w:val="24"/>
         </w:rPr>
         <w:t xml:space="preserve"> The three raters scored independently from the published rubric and the ISO 15189:2022 / CNAS-CL02:2023 standards, without a prior calibration session (in which a few example documents would first be scored jointly to align interpretation). The very high agreement among the raters indicates that, within this single institution, their understanding of the rating scale was already closely aligned; but in a multi-centre study, holding a calibration session beforehand would further improve reproducibility.</w:t>
       </w:r>
@@ -6952,7 +6952,7 @@
         <w:rPr>
           <w:rFonts w:ascii="Times New Roman" w:hAnsi="Times New Roman" w:eastAsia="宋体"/>
           <w:b/>
-          <w:sz w:val="22"/>
+          <w:sz w:val="24"/>
         </w:rPr>
         <w:t>(xiii) Claude was accessed through the Claude Code tool.</w:t>
       </w:r>
@@ -6960,7 +6960,7 @@
         <w:rPr>
           <w:rFonts w:ascii="Times New Roman" w:hAnsi="Times New Roman" w:eastAsia="宋体"/>
           <w:b w:val="0"/>
-          <w:sz w:val="22"/>
+          <w:sz w:val="24"/>
         </w:rPr>
         <w:t xml:space="preserve"> We ran Claude (both generation and judging) through the Claude Code tool rather than by calling Anthropic's API directly. This tool prepends a fixed block of its own instructions (tool definitions and file-system guidance) before our prompt, so the prompt the model actually receives is somewhat longer than the per-configuration token counts reported in §2.1. Because this added block is identical across all 9 configurations and all judging calls, it does not affect comparisons between configurations or the judge-versus-expert conclusions; it matters only if one wants to reproduce the exact absolute scores, which requires the same Claude Code version. Calling the API directly with the same configurations may yield slightly different absolute scores.</w:t>
       </w:r>
@@ -6975,7 +6975,7 @@
         <w:rPr>
           <w:rFonts w:ascii="Times New Roman" w:hAnsi="Times New Roman" w:eastAsia="宋体"/>
           <w:b/>
-          <w:sz w:val="22"/>
+          <w:sz w:val="24"/>
         </w:rPr>
         <w:t>(xiv) AIHubMix routing not independently audited.</w:t>
       </w:r>
@@ -6983,7 +6983,7 @@
         <w:rPr>
           <w:rFonts w:ascii="Times New Roman" w:hAnsi="Times New Roman" w:eastAsia="宋体"/>
           <w:b w:val="0"/>
-          <w:sz w:val="22"/>
+          <w:sz w:val="24"/>
         </w:rPr>
         <w:t xml:space="preserve"> GPT-5.4 was accessed via the AIHubMix proxy, which claims transparent forwarding to the upstream OpenAI API. We did not independently verify that its responses are exactly equivalent to direct OpenAI calls; subtle routing-level differences (request batching, header handling, regional routing) cannot be fully ruled out, although the GPT-5.4 model identifier was consistent throughout the call chain.</w:t>
       </w:r>
@@ -6998,7 +6998,7 @@
         <w:rPr>
           <w:rFonts w:ascii="Times New Roman" w:hAnsi="Times New Roman" w:eastAsia="宋体"/>
           <w:b/>
-          <w:sz w:val="22"/>
+          <w:sz w:val="24"/>
         </w:rPr>
         <w:t>(xv) Temperature setting and generation variability.</w:t>
       </w:r>
@@ -7006,7 +7006,7 @@
         <w:rPr>
           <w:rFonts w:ascii="Times New Roman" w:hAnsi="Times New Roman" w:eastAsia="宋体"/>
           <w:b w:val="0"/>
-          <w:sz w:val="22"/>
+          <w:sz w:val="24"/>
         </w:rPr>
         <w:t xml:space="preserve"> Generation was stochastic for both models: GPT-5.4 used temperature = 0.7, while Claude was run through the Claude Code Agent with no temperature set explicitly. No temperature sensitivity analysis was performed, and no low-temperature condition (e.g., 0.3–0.5) was compared. Random variation was mitigated by three replicates per combination: among the Claude judge's ratings of the six core configurations × 15 tasks, the standard deviation across the three replicates of the same configuration–task combination had a median of 0.231 points (0–5 scale), and 74.4% of combinations fell below 0.5 points, indicating limited replicate-to-replicate variability. Strict bit-level reproducibility was nevertheless not achieved; studies seeking deterministic comparison should set temperature = 0 for both models.</w:t>
       </w:r>
@@ -7021,7 +7021,7 @@
         <w:rPr>
           <w:rFonts w:ascii="Times New Roman" w:hAnsi="Times New Roman" w:eastAsia="宋体"/>
           <w:b/>
-          <w:sz w:val="22"/>
+          <w:sz w:val="24"/>
         </w:rPr>
         <w:t>(xvi) Interaction effects between components were not estimated.</w:t>
       </w:r>
@@ -7029,7 +7029,7 @@
         <w:rPr>
           <w:rFonts w:ascii="Times New Roman" w:hAnsi="Times New Roman" w:eastAsia="宋体"/>
           <w:b w:val="0"/>
-          <w:sz w:val="22"/>
+          <w:sz w:val="24"/>
         </w:rPr>
         <w:t xml:space="preserve"> Each of the four comparisons in §2.4.2 replaced one component at a time, but against different backgrounds: rules were measured with no document skeleton present, whereas detailed content was measured with rules and a skeleton already in place. Each Δ therefore reflects the effect of a component at a specific background, not an independent effect that can be added across backgrounds. In other words, this study cannot tell whether components act synergistically—the effect of adding two components together need not equal the sum of their separate effects. Separating such interaction terms requires a full-factorial or orthogonal design, which we leave to future work.</w:t>
       </w:r>
@@ -7044,7 +7044,7 @@
         <w:rPr>
           <w:rFonts w:ascii="Times New Roman" w:hAnsi="Times New Roman" w:eastAsia="宋体"/>
           <w:b/>
-          <w:sz w:val="22"/>
+          <w:sz w:val="24"/>
         </w:rPr>
         <w:t>(xvii) Generation and judging parameters differed between the two models.</w:t>
       </w:r>
@@ -7052,7 +7052,7 @@
         <w:rPr>
           <w:rFonts w:ascii="Times New Roman" w:hAnsi="Times New Roman" w:eastAsia="宋体"/>
           <w:b w:val="0"/>
-          <w:sz w:val="22"/>
+          <w:sz w:val="24"/>
         </w:rPr>
         <w:t xml:space="preserve"> As described in §2.2 and §2.3.2, GPT-5.4 generation used temperature = 0.7 and max_completion_tokens = 16,000, whereas Claude was run through the Claude Code Agent with neither parameter set explicitly; the judging side was likewise asymmetric, with the GPT judge using temperature = 0 and max_completion_tokens = 2,000 and the Claude judge running as an Agent sub-agent with parameters not set explicitly. The cross-model comparison (§3.3) and the self-preference decomposition (§3.4) are therefore confounded by this parameter mismatch, and differences between the two models cannot be attributed to the models alone. We note that the direction of this confound is conservative: GPT-5.4 received both a lower temperature and a larger output budget—settings that should favour instruction-following and compliance—yet still degraded sharply under C_full, so the model dependence of the full-context trap is unlikely to be an artefact of a parameter disadvantage. Future work should nevertheless harmonise generation and judging parameters across models.</w:t>
       </w:r>
@@ -7067,7 +7067,7 @@
         <w:rPr>
           <w:rFonts w:ascii="Times New Roman" w:hAnsi="Times New Roman" w:eastAsia="宋体"/>
           <w:b/>
-          <w:sz w:val="22"/>
+          <w:sz w:val="24"/>
         </w:rPr>
         <w:t>(xviii) The task set contains no technical documents.</w:t>
       </w:r>
@@ -7075,7 +7075,7 @@
         <w:rPr>
           <w:rFonts w:ascii="Times New Roman" w:hAnsi="Times New Roman" w:eastAsia="宋体"/>
           <w:b w:val="0"/>
-          <w:sz w:val="22"/>
+          <w:sz w:val="24"/>
         </w:rPr>
         <w:t xml:space="preserve"> The 15 tasks cover system-level documents concerned with document control, internal audit, pre-assessment self-inspection, and management review (Supplementary Table S1), including corrective action and CAPA closure (B5, C5) and system-wide reviews spanning dozens of clauses (B3, C3). The set contains no technical documents, however: no method validation or verification reports, no measurement-uncertainty procedures, no critical-value reporting and clinical-communication records, and no procedures for handling external quality assessment results. Writing such documents requires the laboratory's own analytical performance data—precision, trueness, reportable range, interfering substances—together with the rationale for its internal quality-control rules and its clinical decision thresholds. What these documents really test is whether a laboratory holds genuine validation data and hands-on operating experience, and system-level documents are far less demanding in this respect. Whether "rules is the only definitely effective component" generalises to technical documents is therefore a question this study cannot answer. The blinded expert review is narrower still, covering only Class A documents (§2.3.3). Extending the task set to technical documents is an important direction for future work. In on-site accreditation assessments, nonconformities cluster in three document types in particular: method performance validation reports; records verifying or establishing biological reference intervals; and procedures for evaluating measurement uncertainty. All three must incorporate the laboratory's own examination data. It is precisely for that reason that they stand to benefit most from LLM-assisted drafting, and that the usability of any resulting draft is hardest to judge. Future work should cover them first.</w:t>
       </w:r>
@@ -7090,7 +7090,7 @@
         <w:rPr>
           <w:rFonts w:ascii="Times New Roman" w:hAnsi="Times New Roman" w:eastAsia="宋体"/>
           <w:b/>
-          <w:sz w:val="22"/>
+          <w:sz w:val="24"/>
         </w:rPr>
         <w:t>(xix) Subspecialty heterogeneity was not covered.</w:t>
       </w:r>
@@ -7098,7 +7098,7 @@
         <w:rPr>
           <w:rFonts w:ascii="Times New Roman" w:hAnsi="Times New Roman" w:eastAsia="宋体"/>
           <w:b w:val="0"/>
-          <w:sz w:val="22"/>
+          <w:sz w:val="24"/>
         </w:rPr>
         <w:t xml:space="preserve"> All 15 tasks in this study are documents written for the laboratory department as a whole—for example, a personnel-training and competence-evaluation procedure (A1), an equipment-management procedure (A2), and a sample-collection-and-handling SOP (A3)—none of which targets a specific clinical subspecialty. SOPs across subspecialties differ greatly in complexity and degree of standardisation: clinical chemistry is the most process-driven; clinical microbiology involves extensive manual interpretation and is less standardised; and molecular diagnostics has exacting contamination-control requirements. The 10 expert-reviewed documents were all drawn from Class A tasks (§2.3.3) and therefore likewise cover no subspecialty. Consequently, the finding that template-anchored configurations perform best under expert review is at present supported only for department-level generic documents. Whether template-anchored prompts can produce acceptable documents in judgement-intensive fields such as microbiology and molecular diagnostics is not answered here: such documents must incorporate the laboratory's own subspecialty content—organism-identification workflows, contamination-control provisions—that a template may not supply.</w:t>
       </w:r>
@@ -7113,7 +7113,7 @@
         <w:rPr>
           <w:rFonts w:ascii="Times New Roman" w:hAnsi="Times New Roman" w:eastAsia="宋体"/>
           <w:b/>
-          <w:sz w:val="22"/>
+          <w:sz w:val="24"/>
         </w:rPr>
         <w:t>(xx) Coverage of the pre-examination, examination, and post-examination phases is unbalanced.</w:t>
       </w:r>
@@ -7121,7 +7121,7 @@
         <w:rPr>
           <w:rFonts w:ascii="Times New Roman" w:hAnsi="Times New Roman" w:eastAsia="宋体"/>
           <w:b w:val="0"/>
-          <w:sz w:val="22"/>
+          <w:sz w:val="24"/>
         </w:rPr>
         <w:t xml:space="preserve"> Classified by the process phases of ISO 15189:2022, the 15 tasks break down as follows: one pre-examination task (A3, a sample-collection-and-handling SOP); four examination tasks (B2, C1, C2, C4, all concerning internal quality control and analyser operation); no post-examination task; and ten management-level or system-wide tasks (Supplementary Table S1). Post-examination documents—result reporting and review, critical-value notification and records, sample retention and disposal—are absent from the task set entirely. Pre- and post-examination documents typically involve hand-offs with clinical departments and nursing units and depend on the actual interfaces and communication conventions of the hospital's LIS/HIS; where the system prompt supplies none of this, such content is correspondingly harder for an LLM to generate. Because there were no post-examination tasks and only one pre-examination task, this study cannot compare generation quality across the three phases. Balancing coverage across the three phases is a gap that future work should close.</w:t>
       </w:r>
@@ -7136,7 +7136,7 @@
         <w:rPr>
           <w:rFonts w:ascii="Times New Roman" w:hAnsi="Times New Roman" w:eastAsia="宋体"/>
           <w:b/>
-          <w:sz w:val="22"/>
+          <w:sz w:val="24"/>
         </w:rPr>
         <w:t>(xxi) Patient-safety risk was not assessed.</w:t>
       </w:r>
@@ -7144,21 +7144,21 @@
         <w:rPr>
           <w:rFonts w:ascii="Times New Roman" w:hAnsi="Times New Roman" w:eastAsia="宋体"/>
           <w:b w:val="0"/>
-          <w:sz w:val="22"/>
+          <w:sz w:val="24"/>
         </w:rPr>
         <w:t xml:space="preserve"> None of the three evaluation tiers contains an item directed specifically at patient safety: Tier 1 examines formatting, clause citation, and terminology, while the five dimensions of Table 1 examine clause coverage, operability, internal consistency, PDCA closure, and professional depth. None of these dimensions directly answers the question of whether a document contains a substantive error or omission that could endanger patients—an incomplete critical-value list, an inappropriately set trigger for repeat testing, or a gap in the reporting and confidentiality workflow for communicable-disease results. Compliant formatting and complete clause coverage do not amount to the absence of patient-safety risk. Moreover, as noted in (xx), post-examination documents such as critical-value reporting procedures were absent from the task set, so risks of this kind had no opportunity to surface in this study. Future work should include a separate "patient-safety risk" item on the expert rating form, screened document by document, rather than leaving it implicit within "operability" or "professional depth".</w:t>
       </w:r>
     </w:p>
     <w:p>
       <w:pPr>
-        <w:spacing w:before="280" w:after="120" w:lineRule="auto" w:line="300"/>
+        <w:spacing w:before="280" w:after="120" w:lineRule="auto" w:line="360"/>
         <w:jc w:val="left"/>
       </w:pPr>
       <w:r>
         <w:rPr>
-          <w:rFonts w:ascii="Arial" w:hAnsi="Arial" w:eastAsia="黑体"/>
+          <w:rFonts w:ascii="Times New Roman" w:hAnsi="Times New Roman" w:eastAsia="宋体"/>
           <w:b/>
-          <w:sz w:val="28"/>
+          <w:sz w:val="24"/>
         </w:rPr>
         <w:t>5. Conclusions</w:t>
       </w:r>
@@ -7173,7 +7173,7 @@
         <w:rPr>
           <w:rFonts w:ascii="Times New Roman" w:hAnsi="Times New Roman" w:eastAsia="宋体"/>
           <w:b w:val="0"/>
-          <w:sz w:val="22"/>
+          <w:sz w:val="24"/>
         </w:rPr>
         <w:t>The optimal prompt configuration for LLM-assisted ISO 15189 QMS document generation varies with the evaluation tier. At the LLM-judge tier, H4_sop_only (~2,000 tokens) achieved the highest composite score; under expert evaluation, however, the top three were the template-anchored F_template, H2_keep_examples, and G_template_rules (expert mean 4.06–4.24), whereas H4_sop_only fell to fifth, only 0.16 points above the no-prompt baseline A_bare. Both types of configuration, therefore, produce only a reference draft: laboratory staff must in every case revise and supplement it according to their own department's circumstances, and an expert must finalise it; neither can be submitted for accreditation directly. The two differ only in their starting point—minimal prompts (H4_sop_only or E_rules_v2; ~1,000–2,000 tokens) provide a brief outline suitable for a quick start, whereas the template-anchored configurations (G_template_rules or F_template; ~15,000–16,000 tokens) provide a more complete draft, closer to submission form, suitable as the drafting document for documents bound for formal accreditation. More precisely, the value of a template-anchored configuration lies in producing a reliable document skeleton: the section structure, the fields that must be completed, and the elements that must be addressed. The content that actually determines whether a document can be used for accreditation—the laboratory's own quality-control data, its patient data distributions, and its historical proficiency-testing and interlaboratory-comparison results—must be entered by laboratory staff and interpreted by competent personnel. An LLM does not hold these data and therefore cannot generate them. C_full (~56,000 tokens) should be used with caution in the present setting, particularly when generation is performed by GPT-5.4 (see the long-context failure modes documented in §3.3); it should be noted that these failure modes are supported only by the automated and LLM-judge tiers, as the blinded expert review did not cover any GPT-generated document. LLM-as-judge can be used to pre-screen generated outputs: in large-scale generation, the Claude judge can first filter out clearly low-quality outputs; the remaining documents still require revision by laboratory staff before being passed to experts. The Claude judge's moderate agreement with the expert ranking [ICC(3,1) = 0.548] may make it adequate for this screening role, but the 95% CI of this coefficient crosses zero (n = 10) and requires confirmation in a larger sample; the GPT-5.4 judge [ICC(3,1) = 0.217] is unsuitable for it. For any document intended for accreditation submission, formal QMS adoption, or operational use, expert final review remains indispensable.</w:t>
       </w:r>
@@ -7188,21 +7188,21 @@
         <w:rPr>
           <w:rFonts w:ascii="Times New Roman" w:hAnsi="Times New Roman" w:eastAsia="宋体"/>
           <w:b w:val="0"/>
-          <w:sz w:val="22"/>
+          <w:sz w:val="24"/>
         </w:rPr>
         <w:t>To our knowledge, this is the first systematic comparison of prompt-content effects on ISO 15189–compliant QMS document generation across two state-of-the-art LLMs and a three-tier evaluation framework; the findings provide an empirical basis for prompt-design guidance in laboratory accreditation workflows.</w:t>
       </w:r>
     </w:p>
     <w:p>
       <w:pPr>
-        <w:spacing w:before="280" w:after="120" w:lineRule="auto" w:line="300"/>
+        <w:spacing w:before="280" w:after="120" w:lineRule="auto" w:line="360"/>
         <w:jc w:val="left"/>
       </w:pPr>
       <w:r>
         <w:rPr>
-          <w:rFonts w:ascii="Arial" w:hAnsi="Arial" w:eastAsia="黑体"/>
+          <w:rFonts w:ascii="Times New Roman" w:hAnsi="Times New Roman" w:eastAsia="宋体"/>
           <w:b/>
-          <w:sz w:val="28"/>
+          <w:sz w:val="24"/>
         </w:rPr>
         <w:t>Declarations</w:t>
       </w:r>
@@ -7217,7 +7217,7 @@
         <w:rPr>
           <w:rFonts w:ascii="Times New Roman" w:hAnsi="Times New Roman" w:eastAsia="宋体"/>
           <w:b/>
-          <w:sz w:val="22"/>
+          <w:sz w:val="24"/>
         </w:rPr>
         <w:t>Research funding</w:t>
       </w:r>
@@ -7225,7 +7225,7 @@
         <w:rPr>
           <w:rFonts w:ascii="Times New Roman" w:hAnsi="Times New Roman" w:eastAsia="宋体"/>
           <w:b w:val="0"/>
-          <w:sz w:val="22"/>
+          <w:sz w:val="24"/>
         </w:rPr>
         <w:t>: The study received no external research funding.</w:t>
       </w:r>
@@ -7240,7 +7240,7 @@
         <w:rPr>
           <w:rFonts w:ascii="Times New Roman" w:hAnsi="Times New Roman" w:eastAsia="宋体"/>
           <w:b/>
-          <w:sz w:val="22"/>
+          <w:sz w:val="24"/>
         </w:rPr>
         <w:t>Author contributions</w:t>
       </w:r>
@@ -7248,7 +7248,7 @@
         <w:rPr>
           <w:rFonts w:ascii="Times New Roman" w:hAnsi="Times New Roman" w:eastAsia="宋体"/>
           <w:b w:val="0"/>
-          <w:sz w:val="22"/>
+          <w:sz w:val="24"/>
         </w:rPr>
         <w:t>: Sidi Liu was responsible for the conceptualisation and design of the study, the conduct of all experiments, the data analysis, and the drafting and revision of the manuscript. Dongdong Li was responsible for study supervision and critical revision of the manuscript and, as the corresponding author, takes responsibility for the content of the article. Both authors have read and approved the final manuscript.</w:t>
       </w:r>
@@ -7263,7 +7263,7 @@
         <w:rPr>
           <w:rFonts w:ascii="Times New Roman" w:hAnsi="Times New Roman" w:eastAsia="宋体"/>
           <w:b/>
-          <w:sz w:val="22"/>
+          <w:sz w:val="24"/>
         </w:rPr>
         <w:t>Competing interests</w:t>
       </w:r>
@@ -7271,7 +7271,7 @@
         <w:rPr>
           <w:rFonts w:ascii="Times New Roman" w:hAnsi="Times New Roman" w:eastAsia="宋体"/>
           <w:b w:val="0"/>
-          <w:sz w:val="22"/>
+          <w:sz w:val="24"/>
         </w:rPr>
         <w:t>: The authors declare no competing interests.</w:t>
       </w:r>
@@ -7286,7 +7286,7 @@
         <w:rPr>
           <w:rFonts w:ascii="Times New Roman" w:hAnsi="Times New Roman" w:eastAsia="宋体"/>
           <w:b/>
-          <w:sz w:val="22"/>
+          <w:sz w:val="24"/>
         </w:rPr>
         <w:t>Informed consent</w:t>
       </w:r>
@@ -7294,7 +7294,7 @@
         <w:rPr>
           <w:rFonts w:ascii="Times New Roman" w:hAnsi="Times New Roman" w:eastAsia="宋体"/>
           <w:b w:val="0"/>
-          <w:sz w:val="22"/>
+          <w:sz w:val="24"/>
         </w:rPr>
         <w:t>: Written informed consent was obtained from Raters 2 and 3 prior to their participation in the blinded expert review. The consent form described the study purpose, the intended use of the ratings, the data-handling and de-identification procedures, and the right to withdraw at any time.</w:t>
       </w:r>
@@ -7309,7 +7309,7 @@
         <w:rPr>
           <w:rFonts w:ascii="Times New Roman" w:hAnsi="Times New Roman" w:eastAsia="宋体"/>
           <w:b/>
-          <w:sz w:val="22"/>
+          <w:sz w:val="24"/>
         </w:rPr>
         <w:t>Ethical approval</w:t>
       </w:r>
@@ -7317,7 +7317,7 @@
         <w:rPr>
           <w:rFonts w:ascii="Times New Roman" w:hAnsi="Times New Roman" w:eastAsia="宋体"/>
           <w:b w:val="0"/>
-          <w:sz w:val="22"/>
+          <w:sz w:val="24"/>
         </w:rPr>
         <w:t>: This study did not require formal ethical approval, because it did not involve patient data, biological samples, or human intervention. The QMS documents generated and evaluated used fictitious placeholder names (e.g., "Dr Li", "Dr Zhang") and contained no identifiable personal information. The inter-rater dataset was collected as methodological research from informed-consent volunteers; rater-level identifying data are stored under coded labels (Rater 1 / Rater 2 / Rater 3) in the released dataset.</w:t>
       </w:r>
@@ -7332,7 +7332,7 @@
         <w:rPr>
           <w:rFonts w:ascii="Times New Roman" w:hAnsi="Times New Roman" w:eastAsia="宋体"/>
           <w:b/>
-          <w:sz w:val="22"/>
+          <w:sz w:val="24"/>
         </w:rPr>
         <w:t>Data availability</w:t>
       </w:r>
@@ -7340,21 +7340,21 @@
         <w:rPr>
           <w:rFonts w:ascii="Times New Roman" w:hAnsi="Times New Roman" w:eastAsia="宋体"/>
           <w:b w:val="0"/>
-          <w:sz w:val="22"/>
+          <w:sz w:val="24"/>
         </w:rPr>
         <w:t>: The 486 generated documents, 864 LLM-as-judge ratings, 30 blinded expert ratings, and all analysis code are openly available on GitHub (https://github.com/stttttte/iso15189-llm-config-experiment) under a dual licence: MIT for code and CC BY 4.0 for data. A versioned snapshot has been archived on Zenodo (DOI: [10.5281/zenodo.20091464](https://doi.org/10.5281/zenodo.20091464)).</w:t>
       </w:r>
     </w:p>
     <w:p>
       <w:pPr>
-        <w:spacing w:before="280" w:after="120" w:lineRule="auto" w:line="300"/>
+        <w:spacing w:before="280" w:after="120" w:lineRule="auto" w:line="360"/>
         <w:jc w:val="left"/>
       </w:pPr>
       <w:r>
         <w:rPr>
-          <w:rFonts w:ascii="Arial" w:hAnsi="Arial" w:eastAsia="黑体"/>
+          <w:rFonts w:ascii="Times New Roman" w:hAnsi="Times New Roman" w:eastAsia="宋体"/>
           <w:b/>
-          <w:sz w:val="28"/>
+          <w:sz w:val="24"/>
         </w:rPr>
         <w:t>Acknowledgements</w:t>
       </w:r>
@@ -7369,21 +7369,21 @@
         <w:rPr>
           <w:rFonts w:ascii="Times New Roman" w:hAnsi="Times New Roman" w:eastAsia="宋体"/>
           <w:b w:val="0"/>
-          <w:sz w:val="22"/>
+          <w:sz w:val="24"/>
         </w:rPr>
         <w:t>The author thanks the two colleagues who participated in the blinded expert review (Raters 2 and 3) for providing an independent expert perspective with full informed consent.</w:t>
       </w:r>
     </w:p>
     <w:p>
       <w:pPr>
-        <w:spacing w:before="280" w:after="120" w:lineRule="auto" w:line="300"/>
+        <w:spacing w:before="280" w:after="120" w:lineRule="auto" w:line="360"/>
         <w:jc w:val="left"/>
       </w:pPr>
       <w:r>
         <w:rPr>
-          <w:rFonts w:ascii="Arial" w:hAnsi="Arial" w:eastAsia="黑体"/>
+          <w:rFonts w:ascii="Times New Roman" w:hAnsi="Times New Roman" w:eastAsia="宋体"/>
           <w:b/>
-          <w:sz w:val="28"/>
+          <w:sz w:val="24"/>
         </w:rPr>
         <w:t>Figure Legends</w:t>
       </w:r>
@@ -7398,7 +7398,7 @@
         <w:rPr>
           <w:rFonts w:ascii="Times New Roman" w:hAnsi="Times New Roman" w:eastAsia="宋体"/>
           <w:b/>
-          <w:sz w:val="22"/>
+          <w:sz w:val="24"/>
         </w:rPr>
         <w:t>Figure 1.</w:t>
       </w:r>
@@ -7406,7 +7406,7 @@
         <w:rPr>
           <w:rFonts w:ascii="Times New Roman" w:hAnsi="Times New Roman" w:eastAsia="宋体"/>
           <w:b w:val="0"/>
-          <w:sz w:val="22"/>
+          <w:sz w:val="24"/>
         </w:rPr>
         <w:t xml:space="preserve"> The nine prompt configurations evaluated in the study. Left panel: inclusion of each configuration across the four prompt-content dimensions (rules, document skeleton, detailed content, worked examples); ✓ = full inclusion, ◐ = partial inclusion, — = absent. Right panel: total system-prompt size of each configuration, expressed in thousands of tokens (cl100k_base tokenizer). The two panels are not proportional: the left-panel marks index the presence of *distilled, structured* prompt components, whereas the right-panel size reflects the total volume of loaded text. C_full reaches the largest token count by loading the full raw reference corpus (the complete ISO 15189 and CNAS standard texts plus an existing document library), yet its rules dimension is only partial (◐), because explicit rules are embedded within that raw text rather than supplied as a distilled rule set. A shorter configuration such as H2_keep_examples (~25K tokens) can therefore show full inclusion (✓) across all four structured dimensions while containing far fewer tokens than C_full.</w:t>
       </w:r>
@@ -7421,7 +7421,7 @@
         <w:rPr>
           <w:rFonts w:ascii="Times New Roman" w:hAnsi="Times New Roman" w:eastAsia="宋体"/>
           <w:b/>
-          <w:sz w:val="22"/>
+          <w:sz w:val="24"/>
         </w:rPr>
         <w:t>Figure 2.</w:t>
       </w:r>
@@ -7429,7 +7429,7 @@
         <w:rPr>
           <w:rFonts w:ascii="Times New Roman" w:hAnsi="Times New Roman" w:eastAsia="宋体"/>
           <w:b w:val="0"/>
-          <w:sz w:val="22"/>
+          <w:sz w:val="24"/>
         </w:rPr>
         <w:t xml:space="preserve"> Heatmap of the 2 × 2 cross-model symmetric design. Cells show the mean compliance score (0–5 Likert scale) across the three tasks (A1, B1, C1) for each of the nine configurations (rows) crossed with the four generator–judge combinations (columns). C_full exhibits a marked drop in the two GPT-generated columns (1.40 and 1.84, indicated by black-bordered cells), in sharp contrast with the two Claude-generated columns (Claude-judge × Claude-generated = 4.56; GPT-judge × Claude-generated = 3.22).</w:t>
       </w:r>
@@ -7444,7 +7444,7 @@
         <w:rPr>
           <w:rFonts w:ascii="Times New Roman" w:hAnsi="Times New Roman" w:eastAsia="宋体"/>
           <w:b/>
-          <w:sz w:val="22"/>
+          <w:sz w:val="24"/>
         </w:rPr>
         <w:t>Figure 3.</w:t>
       </w:r>
@@ -7452,7 +7452,7 @@
         <w:rPr>
           <w:rFonts w:ascii="Times New Roman" w:hAnsi="Times New Roman" w:eastAsia="宋体"/>
           <w:b w:val="0"/>
-          <w:sz w:val="22"/>
+          <w:sz w:val="24"/>
         </w:rPr>
         <w:t xml:space="preserve"> Systematic overestimation of compliance scores by the LLM judges relative to the three-rater expert panel (n = 10 documents × 3 raters). Horizontal axis: mean rating of the three experts. Vertical axis: LLM-judge rating. Left: Claude Opus 4.6 as judge [ICC(3,1) = 0.548, 95% CI −0.08 to 0.86; Pearson r = 0.573; mean difference (expert − Claude) = −0.905]. Right: GPT-5.4 as judge [ICC(3,1) = 0.217, 95% CI −0.44 to 0.72; Pearson r = 0.259; mean difference (expert − GPT) = −0.525]. Dashed line: 1:1 perfect agreement. Markers are colour-coded by configuration (legend inset).</w:t>
       </w:r>
@@ -7467,7 +7467,7 @@
         <w:rPr>
           <w:rFonts w:ascii="Times New Roman" w:hAnsi="Times New Roman" w:eastAsia="宋体"/>
           <w:b/>
-          <w:sz w:val="22"/>
+          <w:sz w:val="24"/>
         </w:rPr>
         <w:t>Figure 4.</w:t>
       </w:r>
@@ -7475,21 +7475,21 @@
         <w:rPr>
           <w:rFonts w:ascii="Times New Roman" w:hAnsi="Times New Roman" w:eastAsia="宋体"/>
           <w:b w:val="0"/>
-          <w:sz w:val="22"/>
+          <w:sz w:val="24"/>
         </w:rPr>
         <w:t xml:space="preserve"> Compliance score (0–5 Likert) versus system-prompt token size, computed on the n = 10 expert-blinded subset (seven configurations; per-stratum n = 1 or 2). Horizontal axis: token count on a symmetric-logarithmic scale (cl100k_base tokenizer). All three curves are based on the same matched samples: solid green line with squares, three-rater expert mean; solid red line with circles, Claude Opus 4.6 judge applied to Claude-generated outputs; solid blue line with triangles, GPT-5.4 judge applied to Claude-generated outputs. Orange-shaded band: the token-efficient optimum identified by the LLM-judge tier (E_rules_v2 / H4_sop_only). Green-shaded band: the clinical-usability optimum identified by expert evaluation (F_template / G_template_rules). Error bars are omitted because per-stratum n = 1 or 2; the corresponding LLM-versus-expert calibration scatter is shown in Figure 3.</w:t>
       </w:r>
     </w:p>
     <w:p>
       <w:pPr>
-        <w:spacing w:before="280" w:after="120" w:lineRule="auto" w:line="300"/>
+        <w:spacing w:before="280" w:after="120" w:lineRule="auto" w:line="360"/>
         <w:jc w:val="left"/>
       </w:pPr>
       <w:r>
         <w:rPr>
-          <w:rFonts w:ascii="Arial" w:hAnsi="Arial" w:eastAsia="黑体"/>
+          <w:rFonts w:ascii="Times New Roman" w:hAnsi="Times New Roman" w:eastAsia="宋体"/>
           <w:b/>
-          <w:sz w:val="28"/>
+          <w:sz w:val="24"/>
         </w:rPr>
         <w:t>References</w:t>
       </w:r>
@@ -7504,7 +7504,7 @@
         <w:rPr>
           <w:rFonts w:ascii="Times New Roman" w:hAnsi="Times New Roman" w:eastAsia="宋体"/>
           <w:b w:val="0"/>
-          <w:sz w:val="22"/>
+          <w:sz w:val="24"/>
         </w:rPr>
         <w:t>1. ISO 15189:2022. Medical laboratories — Requirements for quality and competence. Geneva: International Organization for Standardization; 2022.</w:t>
       </w:r>
@@ -7519,7 +7519,7 @@
         <w:rPr>
           <w:rFonts w:ascii="Times New Roman" w:hAnsi="Times New Roman" w:eastAsia="宋体"/>
           <w:b w:val="0"/>
-          <w:sz w:val="22"/>
+          <w:sz w:val="24"/>
         </w:rPr>
         <w:t>2. Yang S, Zhou Y, Wang C, Luo M. The 'Double Helix' model of quality monitoring: risk mapping of quality management system during initial ISO 15189 implementation in a medical laboratory. PLoS One 2026;21:e0342129.</w:t>
       </w:r>
@@ -7534,7 +7534,7 @@
         <w:rPr>
           <w:rFonts w:ascii="Times New Roman" w:hAnsi="Times New Roman" w:eastAsia="宋体"/>
           <w:b w:val="0"/>
-          <w:sz w:val="22"/>
+          <w:sz w:val="24"/>
         </w:rPr>
         <w:t>3. Anthropic. Claude Opus 4.6 System Card. San Francisco (CA): Anthropic; 2026. Available at: https://www.anthropic.com/claude-opus-4-6-system-card. [Accessed 9 May 2026].</w:t>
       </w:r>
@@ -7549,7 +7549,7 @@
         <w:rPr>
           <w:rFonts w:ascii="Times New Roman" w:hAnsi="Times New Roman" w:eastAsia="宋体"/>
           <w:b w:val="0"/>
-          <w:sz w:val="22"/>
+          <w:sz w:val="24"/>
         </w:rPr>
         <w:t>4. OpenAI. GPT-5 System Card. San Francisco (CA): OpenAI; 2025. Available at: https://openai.com/index/gpt-5-system-card/. [Accessed 9 May 2026].</w:t>
       </w:r>
@@ -7564,7 +7564,7 @@
         <w:rPr>
           <w:rFonts w:ascii="Times New Roman" w:hAnsi="Times New Roman" w:eastAsia="宋体"/>
           <w:b w:val="0"/>
-          <w:sz w:val="22"/>
+          <w:sz w:val="24"/>
         </w:rPr>
         <w:t>5. Boiko DA, MacKnight R, Kline B, Gomes G. Autonomous chemical research with large language models. Nature 2023;624:570–8.</w:t>
       </w:r>
@@ -7579,7 +7579,7 @@
         <w:rPr>
           <w:rFonts w:ascii="Times New Roman" w:hAnsi="Times New Roman" w:eastAsia="宋体"/>
           <w:b w:val="0"/>
-          <w:sz w:val="22"/>
+          <w:sz w:val="24"/>
         </w:rPr>
         <w:t>6. Jin D, Pan E, Oufattole N, Weng WH, Fang H, Szolovits P. What disease does this patient have? A large-scale open domain question answering dataset from medical exams. Appl Sci 2021;11:6421.</w:t>
       </w:r>
@@ -7594,7 +7594,7 @@
         <w:rPr>
           <w:rFonts w:ascii="Times New Roman" w:hAnsi="Times New Roman" w:eastAsia="宋体"/>
           <w:b w:val="0"/>
-          <w:sz w:val="22"/>
+          <w:sz w:val="24"/>
         </w:rPr>
         <w:t>7. Zhao WX, Zhou K, Li J, Tang T, Wang X, Hou Y, et al. A survey of large language models. arXiv preprint 2023; arXiv:2303.18223.</w:t>
       </w:r>
@@ -7609,7 +7609,7 @@
         <w:rPr>
           <w:rFonts w:ascii="Times New Roman" w:hAnsi="Times New Roman" w:eastAsia="宋体"/>
           <w:b w:val="0"/>
-          <w:sz w:val="22"/>
+          <w:sz w:val="24"/>
         </w:rPr>
         <w:t>8. Schulhoff S, Ilie M, Balepur N, Kahadze K, Liu A, Si C, et al. The prompt report: a systematic survey of prompting techniques. arXiv preprint 2024; arXiv:2406.06608.</w:t>
       </w:r>
@@ -7624,7 +7624,7 @@
         <w:rPr>
           <w:rFonts w:ascii="Times New Roman" w:hAnsi="Times New Roman" w:eastAsia="宋体"/>
           <w:b w:val="0"/>
-          <w:sz w:val="22"/>
+          <w:sz w:val="24"/>
         </w:rPr>
         <w:t>9. Zheng L, Chiang WL, Sheng Y, Zhuang S, Wu Z, Zhuang Y, et al. Judging LLM-as-a-judge with MT-Bench and Chatbot Arena. In: Advances in Neural Information Processing Systems 36 (NeurIPS 2023) Datasets and Benchmarks Track. 2023.</w:t>
       </w:r>
@@ -7639,7 +7639,7 @@
         <w:rPr>
           <w:rFonts w:ascii="Times New Roman" w:hAnsi="Times New Roman" w:eastAsia="宋体"/>
           <w:b w:val="0"/>
-          <w:sz w:val="22"/>
+          <w:sz w:val="24"/>
         </w:rPr>
         <w:t>10. Tan H, Guo Z, Shi Z, Xu L, Liu Z, Feng Y, et al. ProxyQA: an alternative framework for evaluating long-form text generation with large language models. In: Proceedings of the 62nd Annual Meeting of the Association for Computational Linguistics (Volume 1: Long Papers); 2024 Aug 11–16; Bangkok, Thailand. Stroudsburg (PA): Association for Computational Linguistics; 2024. p. 6806–27.</w:t>
       </w:r>
@@ -7654,7 +7654,7 @@
         <w:rPr>
           <w:rFonts w:ascii="Times New Roman" w:hAnsi="Times New Roman" w:eastAsia="宋体"/>
           <w:b w:val="0"/>
-          <w:sz w:val="22"/>
+          <w:sz w:val="24"/>
         </w:rPr>
         <w:t>11. Chiang WL, Zheng L, Sheng Y, Angelopoulos AN, Li T, Li D, et al. Chatbot Arena: an open platform for evaluating LLMs by human preference. arXiv preprint 2024; arXiv:2403.04132.</w:t>
       </w:r>
@@ -7669,7 +7669,7 @@
         <w:rPr>
           <w:rFonts w:ascii="Times New Roman" w:hAnsi="Times New Roman" w:eastAsia="宋体"/>
           <w:b w:val="0"/>
-          <w:sz w:val="22"/>
+          <w:sz w:val="24"/>
         </w:rPr>
         <w:t>12. Panickssery A, Bowman SR, Feng S. LLM evaluators recognize and favor their own generations. arXiv preprint 2024; arXiv:2404.13076.</w:t>
       </w:r>
@@ -7684,7 +7684,7 @@
         <w:rPr>
           <w:rFonts w:ascii="Times New Roman" w:hAnsi="Times New Roman" w:eastAsia="宋体"/>
           <w:b w:val="0"/>
-          <w:sz w:val="22"/>
+          <w:sz w:val="24"/>
         </w:rPr>
         <w:t>13. Shrout PE, Fleiss JL. Intraclass correlations: uses in assessing rater reliability. Psychol Bull 1979;86:420–8.</w:t>
       </w:r>
@@ -7699,7 +7699,7 @@
         <w:rPr>
           <w:rFonts w:ascii="Times New Roman" w:hAnsi="Times New Roman" w:eastAsia="宋体"/>
           <w:b w:val="0"/>
-          <w:sz w:val="22"/>
+          <w:sz w:val="24"/>
         </w:rPr>
         <w:t>14. Cicchetti DV. Guidelines, criteria, and rules of thumb for evaluating normed and standardized assessment instruments in psychology. Psychol Assess 1994;6:284–90.</w:t>
       </w:r>
@@ -7714,7 +7714,7 @@
         <w:rPr>
           <w:rFonts w:ascii="Times New Roman" w:hAnsi="Times New Roman" w:eastAsia="宋体"/>
           <w:b w:val="0"/>
-          <w:sz w:val="22"/>
+          <w:sz w:val="24"/>
         </w:rPr>
         <w:t>15. Liu NF, Lin K, Hewitt J, Paranjape A, Bevilacqua M, Petroni F, et al. Lost in the middle: how language models use long contexts. Trans Assoc Comput Linguist 2024;12:157–73.</w:t>
       </w:r>
@@ -7729,7 +7729,7 @@
         <w:rPr>
           <w:rFonts w:ascii="Times New Roman" w:hAnsi="Times New Roman" w:eastAsia="宋体"/>
           <w:b w:val="0"/>
-          <w:sz w:val="22"/>
+          <w:sz w:val="24"/>
         </w:rPr>
         <w:t>16. Knott M, Krebs M, Kerscher A. Large language models in healthcare quality management: a European perspective on process automation and compliance. Front Digit Health 2026;8:1761641.</w:t>
       </w:r>
@@ -7744,7 +7744,7 @@
         <w:rPr>
           <w:rFonts w:ascii="Times New Roman" w:hAnsi="Times New Roman" w:eastAsia="宋体"/>
           <w:b/>
-          <w:sz w:val="22"/>
+          <w:sz w:val="24"/>
         </w:rPr>
         <w:t>Word count (main text including references)</w:t>
       </w:r>
@@ -7752,7 +7752,7 @@
         <w:rPr>
           <w:rFonts w:ascii="Times New Roman" w:hAnsi="Times New Roman" w:eastAsia="宋体"/>
           <w:b w:val="0"/>
-          <w:sz w:val="22"/>
+          <w:sz w:val="24"/>
         </w:rPr>
         <w:t>: ~6000 words</w:t>
       </w:r>
@@ -7767,7 +7767,7 @@
         <w:rPr>
           <w:rFonts w:ascii="Times New Roman" w:hAnsi="Times New Roman" w:eastAsia="宋体"/>
           <w:b/>
-          <w:sz w:val="22"/>
+          <w:sz w:val="24"/>
         </w:rPr>
         <w:t>Tables</w:t>
       </w:r>
@@ -7775,7 +7775,7 @@
         <w:rPr>
           <w:rFonts w:ascii="Times New Roman" w:hAnsi="Times New Roman" w:eastAsia="宋体"/>
           <w:b w:val="0"/>
-          <w:sz w:val="22"/>
+          <w:sz w:val="24"/>
         </w:rPr>
         <w:t>: 6</w:t>
       </w:r>
@@ -7790,7 +7790,7 @@
         <w:rPr>
           <w:rFonts w:ascii="Times New Roman" w:hAnsi="Times New Roman" w:eastAsia="宋体"/>
           <w:b/>
-          <w:sz w:val="22"/>
+          <w:sz w:val="24"/>
         </w:rPr>
         <w:t>Figures</w:t>
       </w:r>
@@ -7798,7 +7798,7 @@
         <w:rPr>
           <w:rFonts w:ascii="Times New Roman" w:hAnsi="Times New Roman" w:eastAsia="宋体"/>
           <w:b w:val="0"/>
-          <w:sz w:val="22"/>
+          <w:sz w:val="24"/>
         </w:rPr>
         <w:t>: 4</w:t>
       </w:r>
@@ -7813,7 +7813,7 @@
         <w:rPr>
           <w:rFonts w:ascii="Times New Roman" w:hAnsi="Times New Roman" w:eastAsia="宋体"/>
           <w:b/>
-          <w:sz w:val="22"/>
+          <w:sz w:val="24"/>
         </w:rPr>
         <w:t>References</w:t>
       </w:r>
@@ -7821,7 +7821,7 @@
         <w:rPr>
           <w:rFonts w:ascii="Times New Roman" w:hAnsi="Times New Roman" w:eastAsia="宋体"/>
           <w:b w:val="0"/>
-          <w:sz w:val="22"/>
+          <w:sz w:val="24"/>
         </w:rPr>
         <w:t>: 16</w:t>
       </w:r>
@@ -8201,7 +8201,7 @@
     <w:rsid w:val="00FC693F"/>
     <w:rPr>
       <w:rFonts w:ascii="Times New Roman" w:hAnsi="Times New Roman" w:eastAsia="宋体"/>
-      <w:sz w:val="22"/>
+      <w:sz w:val="24"/>
     </w:rPr>
   </w:style>
   <w:style w:type="paragraph" w:styleId="Header">

</xml_diff>

<commit_message>
docs(paper): restore key statistics to the abstract Results (moderate compression)
Co-Authored-By: Claude Fable 5 <noreply@anthropic.com>
Claude-Session: https://claude.ai/code/session_01PXteLoEJ47ztdLQyNFxNJ9
</commit_message>
<xml_diff>
--- a/paper/manuscript_v2_en_CCLM.docx
+++ b/paper/manuscript_v2_en_CCLM.docx
@@ -315,7 +315,7 @@
           <w:i w:val="0"/>
           <w:sz w:val="24"/>
         </w:rPr>
-        <w:t>: Only the rules component significantly improved compliance at the LLM-judge tier [Δ = 0.511, 95% CI (0.28, 0.75); BH-adjusted p &lt; 0.001]. The full-context C_full (~56,000 tokens) scored 3.22–4.56 with Claude but only 1.40–1.84 with GPT-5.4. Both judges rated Claude outputs ~0.3 points higher, driven by C_full and incompatible with classical self-preference. Expert agreement was excellent [ICC(2,k) = 0.982]; judge–expert agreement was at best moderate with wide CIs crossing zero, and judges overestimated experts by 0.52–0.90 points. H4_sop_only fell to fifth under expert review; template-anchored configurations ranked highest (4.06–4.24).</w:t>
+        <w:t>: Only the rules component significantly improved compliance at the LLM-judge tier [Δ = 0.511, bootstrap 95% CI (0.28, 0.75); BH-adjusted p &lt; 0.001]. The full-context C_full (~56,000 tokens) scored 3.22–4.56 with Claude but only 1.40–1.84 with GPT-5.4. Both judges rated Claude-generated outputs ~0.3 points higher (Panickssery self-preference index: +0.29 Claude, −0.30 GPT), an effect concentrated at C_full and incompatible with classical self-preference. Within-institution expert agreement was excellent [ICC(2,k) = 0.982]; judge–expert agreement was at best moderate [ICC(3,1) = 0.548 vs 0.217], with wide confidence intervals crossing zero, and both judges overestimated expert scores by 0.52–0.90 points. The LLM-favored H4_sop_only fell to fifth of seven under expert review, whereas template-anchored configurations ranked highest (4.06–4.24).</w:t>
       </w:r>
     </w:p>
     <w:p>
@@ -7353,7 +7353,7 @@
           <w:i w:val="0"/>
           <w:sz w:val="24"/>
         </w:rPr>
-        <w:t>: ~7800 words</w:t>
+        <w:t>: ~7900 words</w:t>
       </w:r>
     </w:p>
     <w:p>

</xml_diff>

<commit_message>
docs(paper): add the required 3-6 keywords (CCLM submission checklist)
Co-Authored-By: Claude Fable 5 <noreply@anthropic.com>
Claude-Session: https://claude.ai/code/session_01PXteLoEJ47ztdLQyNFxNJ9
</commit_message>
<xml_diff>
--- a/paper/manuscript_v2_en_CCLM.docx
+++ b/paper/manuscript_v2_en_CCLM.docx
@@ -341,6 +341,31 @@
           <w:sz w:val="24"/>
         </w:rPr>
         <w:t>: The optimal configuration varied with the evaluation tier: minimal prompts (~1,000–2,000 tokens) suit exploratory drafts requiring subsequent human review; template-anchored prompts (~15,000–16,000 tokens) tended to perform best for accreditation submission; and C_full performed markedly worse with GPT-5.4 and should be used with caution – a preliminary observation based on three tasks and not corroborated at the expert tier. LLM-as-judge can support first-pass screening, but expert final review remains indispensable.</w:t>
+      </w:r>
+    </w:p>
+    <w:p>
+      <w:pPr>
+        <w:spacing w:before="80" w:after="80" w:lineRule="auto" w:line="360"/>
+        <w:ind w:firstLine="0"/>
+        <w:jc w:val="both"/>
+      </w:pPr>
+      <w:r>
+        <w:rPr>
+          <w:rFonts w:ascii="Times New Roman" w:hAnsi="Times New Roman" w:eastAsia="宋体"/>
+          <w:b/>
+          <w:i w:val="0"/>
+          <w:sz w:val="24"/>
+        </w:rPr>
+        <w:t>Keywords</w:t>
+      </w:r>
+      <w:r>
+        <w:rPr>
+          <w:rFonts w:ascii="Times New Roman" w:hAnsi="Times New Roman" w:eastAsia="宋体"/>
+          <w:b w:val="0"/>
+          <w:i w:val="0"/>
+          <w:sz w:val="24"/>
+        </w:rPr>
+        <w:t>: accreditation; artificial intelligence; inter-rater reliability; large language models; medical laboratory</w:t>
       </w:r>
     </w:p>
     <w:p>

</xml_diff>

<commit_message>
docs(paper): move the scoring rubric to Supplementary Table S2 and renumber tables 1-4
Keeps display items at 8 (4 tables + 4 figures), the CCLM limit for original articles.

Co-Authored-By: Claude Fable 5 <noreply@anthropic.com>
Claude-Session: https://claude.ai/code/session_01PXteLoEJ47ztdLQyNFxNJ9
</commit_message>
<xml_diff>
--- a/paper/manuscript_v2_en_CCLM.docx
+++ b/paper/manuscript_v2_en_CCLM.docx
@@ -636,7 +636,7 @@
           <w:i w:val="0"/>
           <w:sz w:val="24"/>
         </w:rPr>
-        <w:t>Compliance was evaluated with three complementary tiers, all scoring on a common 0–5 integer scale: an automated rule-based scorer (Tier 1), two LLM judges (Tiers 2a and 2b), and an independent blinded expert review (Tier 3). Tier 1 covered only structural features that code can detect objectively; Tiers 2 and 3 shared the five-dimensional rubric of Table 1 – clause coverage, operability, internal consistency, PDCA closure, and professional depth.</w:t>
+        <w:t>Compliance was evaluated with three complementary tiers, all scoring on a common 0–5 integer scale: an automated rule-based scorer (Tier 1), two LLM judges (Tiers 2a and 2b), and an independent blinded expert review (Tier 3). Tier 1 covered only structural features that code can detect objectively; Tiers 2 and 3 shared a five-dimensional rubric (Supplementary Table S2) – clause coverage, operability, internal consistency, PDCA closure, and professional depth.</w:t>
       </w:r>
     </w:p>
     <w:p>
@@ -683,7 +683,7 @@
           <w:i w:val="0"/>
           <w:sz w:val="24"/>
         </w:rPr>
-        <w:t>This tier measures structural compliance only. Clause coverage in particular records how many clauses a document cites, not whether those clauses are implemented: a document stating merely that "internal quality control shall be performed in accordance with 7.3.1", without specifying an actual QC scheme, still counts as covering that clause. Tiers 2 and 3 fill this gap – the clause-coverage dimension of Table 1 assigns a score of 1 when many clauses are cited but left unimplemented – so a high Tier 1 score does not mean a document is ready to be submitted for accreditation.</w:t>
+        <w:t>This tier measures structural compliance only. Clause coverage in particular records how many clauses a document cites, not whether those clauses are implemented: a document stating merely that "internal quality control shall be performed in accordance with 7.3.1", without specifying an actual QC scheme, still counts as covering that clause. Tiers 2 and 3 fill this gap – the clause-coverage dimension of the rubric assigns a score of 1 when many clauses are cited but left unimplemented – so a high Tier 1 score does not mean a document is ready to be submitted for accreditation.</w:t>
       </w:r>
     </w:p>
     <w:p>
@@ -714,724 +714,9 @@
           <w:i w:val="0"/>
           <w:sz w:val="24"/>
         </w:rPr>
-        <w:t>The two judges (Claude and GPT) each scored documents from both models, forming a 2 × 2 cross design that separates a judge's self-preference from genuine differences in quality. Claude Opus 4.6, in the role of a "CNAS chief assessor", scored each covered document once on the five dimensions of Table 1, run through Claude Code Agent sub-agents with temperature and max_tokens not set explicitly. The Claude judging was run in successive batches as the configuration set expanded, and for some batches only group-level means rather than document-level files were retained (Section 4.6), leaving 378 document-level ratings covering 77.8% of the 486 documents. GPT-5.4 used the same prompt, rubric, and 0–5 scale to rate all 486 documents once each (405 Claude-generated + 81 GPT-generated), with temperature = 0 and max_completion_tokens = 2,000, which differ from Tier 2a (Section 4.6); no output was truncated by the max_tokens cap (all 486 JSON files parsed successfully), and the per-document raw JSON is openly released. Together the two judges produced 864 ratings; the counts are unequal for the reason above, but all four 2 × 2 cells contained data, so the self-preference decomposition could still be performed. Table 1 defines the 5-, 3-, and 1-point anchors (fully, partially, and severely non-compliant); the intermediate scores 4 and 2 fall between adjacent anchors, and 0 means the dimension could not be evaluated. These anchor descriptions were identical for all judges and experts.</w:t>
+        <w:t>The two judges (Claude and GPT) each scored documents from both models, forming a 2 × 2 cross design that separates a judge's self-preference from genuine differences in quality. Claude Opus 4.6, in the role of a "CNAS chief assessor", scored each covered document once on the five dimensions of the shared rubric, run through Claude Code Agent sub-agents with temperature and max_tokens not set explicitly. The Claude judging was run in successive batches as the configuration set expanded, and for some batches only group-level means rather than document-level files were retained (Section 4.6), leaving 378 document-level ratings covering 77.8% of the 486 documents. GPT-5.4 used the same prompt, rubric, and 0–5 scale to rate all 486 documents once each (405 Claude-generated + 81 GPT-generated), with temperature = 0 and max_completion_tokens = 2,000, which differ from Tier 2a (Section 4.6); no output was truncated by the max_tokens cap (all 486 JSON files parsed successfully), and the per-document raw JSON is openly released. Together the two judges produced 864 ratings; the counts are unequal for the reason above, but all four 2 × 2 cells contained data, so the self-preference decomposition could still be performed. Supplementary Table S2 defines the 5-, 3-, and 1-point anchors (fully, partially, and severely non-compliant); the intermediate scores 4 and 2 fall between adjacent anchors, and 0 means the dimension could not be evaluated. These anchor descriptions were identical for all judges and experts.</w:t>
       </w:r>
     </w:p>
-    <w:p>
-      <w:pPr>
-        <w:spacing w:before="120" w:after="40" w:lineRule="auto" w:line="360"/>
-        <w:ind w:firstLine="0"/>
-        <w:jc w:val="center"/>
-      </w:pPr>
-      <w:r>
-        <w:rPr>
-          <w:rFonts w:ascii="Times New Roman" w:hAnsi="Times New Roman" w:eastAsia="宋体"/>
-          <w:b/>
-          <w:i w:val="0"/>
-          <w:sz w:val="24"/>
-        </w:rPr>
-        <w:t>Table 1. Five-dimensional descriptive rubric shared by Tiers 2a, 2b, and 3.</w:t>
-      </w:r>
-    </w:p>
-    <w:tbl>
-      <w:tblPr>
-        <w:tblW w:type="auto" w:w="0"/>
-        <w:jc w:val="center"/>
-        <w:tblLayout w:type="autofit"/>
-        <w:tblLook w:firstColumn="1" w:firstRow="1" w:lastColumn="0" w:lastRow="0" w:noHBand="0" w:noVBand="1" w:val="04A0"/>
-      </w:tblPr>
-      <w:tblGrid>
-        <w:gridCol w:w="2209"/>
-        <w:gridCol w:w="2209"/>
-        <w:gridCol w:w="2209"/>
-        <w:gridCol w:w="2209"/>
-      </w:tblGrid>
-      <w:tr>
-        <w:tc>
-          <w:tcPr>
-            <w:tcW w:type="dxa" w:w="2209"/>
-            <w:vAlign w:val="center"/>
-            <w:tcBorders>
-              <w:top w:val="single" w:sz="4" w:color="000000"/>
-              <w:left w:val="single" w:sz="4" w:color="000000"/>
-              <w:bottom w:val="single" w:sz="4" w:color="000000"/>
-              <w:right w:val="single" w:sz="4" w:color="000000"/>
-            </w:tcBorders>
-          </w:tcPr>
-          <w:p>
-            <w:pPr>
-              <w:spacing w:before="60" w:after="60" w:lineRule="auto" w:line="276"/>
-              <w:jc w:val="center"/>
-            </w:pPr>
-            <w:r/>
-            <w:r>
-              <w:rPr>
-                <w:rFonts w:ascii="Times New Roman" w:hAnsi="Times New Roman" w:eastAsia="宋体"/>
-                <w:b/>
-                <w:i w:val="0"/>
-                <w:sz w:val="18"/>
-              </w:rPr>
-              <w:t>Dimension</w:t>
-            </w:r>
-          </w:p>
-        </w:tc>
-        <w:tc>
-          <w:tcPr>
-            <w:tcW w:type="dxa" w:w="2209"/>
-            <w:vAlign w:val="center"/>
-            <w:tcBorders>
-              <w:top w:val="single" w:sz="4" w:color="000000"/>
-              <w:left w:val="single" w:sz="4" w:color="000000"/>
-              <w:bottom w:val="single" w:sz="4" w:color="000000"/>
-              <w:right w:val="single" w:sz="4" w:color="000000"/>
-            </w:tcBorders>
-          </w:tcPr>
-          <w:p>
-            <w:pPr>
-              <w:spacing w:before="60" w:after="60" w:lineRule="auto" w:line="276"/>
-              <w:jc w:val="center"/>
-            </w:pPr>
-            <w:r/>
-            <w:r>
-              <w:rPr>
-                <w:rFonts w:ascii="Times New Roman" w:hAnsi="Times New Roman" w:eastAsia="宋体"/>
-                <w:b/>
-                <w:i w:val="0"/>
-                <w:sz w:val="18"/>
-              </w:rPr>
-              <w:t>Anchor at 5</w:t>
-            </w:r>
-          </w:p>
-        </w:tc>
-        <w:tc>
-          <w:tcPr>
-            <w:tcW w:type="dxa" w:w="2209"/>
-            <w:vAlign w:val="center"/>
-            <w:tcBorders>
-              <w:top w:val="single" w:sz="4" w:color="000000"/>
-              <w:left w:val="single" w:sz="4" w:color="000000"/>
-              <w:bottom w:val="single" w:sz="4" w:color="000000"/>
-              <w:right w:val="single" w:sz="4" w:color="000000"/>
-            </w:tcBorders>
-          </w:tcPr>
-          <w:p>
-            <w:pPr>
-              <w:spacing w:before="60" w:after="60" w:lineRule="auto" w:line="276"/>
-              <w:jc w:val="center"/>
-            </w:pPr>
-            <w:r/>
-            <w:r>
-              <w:rPr>
-                <w:rFonts w:ascii="Times New Roman" w:hAnsi="Times New Roman" w:eastAsia="宋体"/>
-                <w:b/>
-                <w:i w:val="0"/>
-                <w:sz w:val="18"/>
-              </w:rPr>
-              <w:t>Anchor at 3</w:t>
-            </w:r>
-          </w:p>
-        </w:tc>
-        <w:tc>
-          <w:tcPr>
-            <w:tcW w:type="dxa" w:w="2209"/>
-            <w:vAlign w:val="center"/>
-            <w:tcBorders>
-              <w:top w:val="single" w:sz="4" w:color="000000"/>
-              <w:left w:val="single" w:sz="4" w:color="000000"/>
-              <w:bottom w:val="single" w:sz="4" w:color="000000"/>
-              <w:right w:val="single" w:sz="4" w:color="000000"/>
-            </w:tcBorders>
-          </w:tcPr>
-          <w:p>
-            <w:pPr>
-              <w:spacing w:before="60" w:after="60" w:lineRule="auto" w:line="276"/>
-              <w:jc w:val="center"/>
-            </w:pPr>
-            <w:r/>
-            <w:r>
-              <w:rPr>
-                <w:rFonts w:ascii="Times New Roman" w:hAnsi="Times New Roman" w:eastAsia="宋体"/>
-                <w:b/>
-                <w:i w:val="0"/>
-                <w:sz w:val="18"/>
-              </w:rPr>
-              <w:t>Anchor at 1</w:t>
-            </w:r>
-          </w:p>
-        </w:tc>
-      </w:tr>
-      <w:tr>
-        <w:tc>
-          <w:tcPr>
-            <w:tcW w:type="dxa" w:w="2209"/>
-            <w:vAlign w:val="center"/>
-            <w:tcBorders>
-              <w:top w:val="single" w:sz="4" w:color="000000"/>
-              <w:left w:val="single" w:sz="4" w:color="000000"/>
-              <w:bottom w:val="single" w:sz="4" w:color="000000"/>
-              <w:right w:val="single" w:sz="4" w:color="000000"/>
-            </w:tcBorders>
-          </w:tcPr>
-          <w:p>
-            <w:pPr>
-              <w:spacing w:before="60" w:after="60" w:lineRule="auto" w:line="276"/>
-              <w:jc w:val="center"/>
-            </w:pPr>
-            <w:r/>
-            <w:r>
-              <w:rPr>
-                <w:rFonts w:ascii="Times New Roman" w:hAnsi="Times New Roman" w:eastAsia="宋体"/>
-                <w:b w:val="0"/>
-                <w:i w:val="0"/>
-                <w:sz w:val="18"/>
-              </w:rPr>
-              <w:t>Clause coverage</w:t>
-            </w:r>
-          </w:p>
-        </w:tc>
-        <w:tc>
-          <w:tcPr>
-            <w:tcW w:type="dxa" w:w="2209"/>
-            <w:vAlign w:val="center"/>
-            <w:tcBorders>
-              <w:top w:val="single" w:sz="4" w:color="000000"/>
-              <w:left w:val="single" w:sz="4" w:color="000000"/>
-              <w:bottom w:val="single" w:sz="4" w:color="000000"/>
-              <w:right w:val="single" w:sz="4" w:color="000000"/>
-            </w:tcBorders>
-          </w:tcPr>
-          <w:p>
-            <w:pPr>
-              <w:spacing w:before="60" w:after="60" w:lineRule="auto" w:line="276"/>
-              <w:jc w:val="center"/>
-            </w:pPr>
-            <w:r/>
-            <w:r>
-              <w:rPr>
-                <w:rFonts w:ascii="Times New Roman" w:hAnsi="Times New Roman" w:eastAsia="宋体"/>
-                <w:b w:val="0"/>
-                <w:i w:val="0"/>
-                <w:sz w:val="18"/>
-              </w:rPr>
-              <w:t>All "shall" requirements of the relevant clauses are operationalized through concrete measures</w:t>
-            </w:r>
-          </w:p>
-        </w:tc>
-        <w:tc>
-          <w:tcPr>
-            <w:tcW w:type="dxa" w:w="2209"/>
-            <w:vAlign w:val="center"/>
-            <w:tcBorders>
-              <w:top w:val="single" w:sz="4" w:color="000000"/>
-              <w:left w:val="single" w:sz="4" w:color="000000"/>
-              <w:bottom w:val="single" w:sz="4" w:color="000000"/>
-              <w:right w:val="single" w:sz="4" w:color="000000"/>
-            </w:tcBorders>
-          </w:tcPr>
-          <w:p>
-            <w:pPr>
-              <w:spacing w:before="60" w:after="60" w:lineRule="auto" w:line="276"/>
-              <w:jc w:val="center"/>
-            </w:pPr>
-            <w:r/>
-            <w:r>
-              <w:rPr>
-                <w:rFonts w:ascii="Times New Roman" w:hAnsi="Times New Roman" w:eastAsia="宋体"/>
-                <w:b w:val="0"/>
-                <w:i w:val="0"/>
-                <w:sz w:val="18"/>
-              </w:rPr>
-              <w:t>Major clauses are covered but with omissions or surface-level treatment</w:t>
-            </w:r>
-          </w:p>
-        </w:tc>
-        <w:tc>
-          <w:tcPr>
-            <w:tcW w:type="dxa" w:w="2209"/>
-            <w:vAlign w:val="center"/>
-            <w:tcBorders>
-              <w:top w:val="single" w:sz="4" w:color="000000"/>
-              <w:left w:val="single" w:sz="4" w:color="000000"/>
-              <w:bottom w:val="single" w:sz="4" w:color="000000"/>
-              <w:right w:val="single" w:sz="4" w:color="000000"/>
-            </w:tcBorders>
-          </w:tcPr>
-          <w:p>
-            <w:pPr>
-              <w:spacing w:before="60" w:after="60" w:lineRule="auto" w:line="276"/>
-              <w:jc w:val="center"/>
-            </w:pPr>
-            <w:r/>
-            <w:r>
-              <w:rPr>
-                <w:rFonts w:ascii="Times New Roman" w:hAnsi="Times New Roman" w:eastAsia="宋体"/>
-                <w:b w:val="0"/>
-                <w:i w:val="0"/>
-                <w:sz w:val="18"/>
-              </w:rPr>
-              <w:t>Most clauses are merely cited without implementation, or major omissions are evident</w:t>
-            </w:r>
-          </w:p>
-        </w:tc>
-      </w:tr>
-      <w:tr>
-        <w:tc>
-          <w:tcPr>
-            <w:tcW w:type="dxa" w:w="2209"/>
-            <w:vAlign w:val="center"/>
-            <w:tcBorders>
-              <w:top w:val="single" w:sz="4" w:color="000000"/>
-              <w:left w:val="single" w:sz="4" w:color="000000"/>
-              <w:bottom w:val="single" w:sz="4" w:color="000000"/>
-              <w:right w:val="single" w:sz="4" w:color="000000"/>
-            </w:tcBorders>
-          </w:tcPr>
-          <w:p>
-            <w:pPr>
-              <w:spacing w:before="60" w:after="60" w:lineRule="auto" w:line="276"/>
-              <w:jc w:val="center"/>
-            </w:pPr>
-            <w:r/>
-            <w:r>
-              <w:rPr>
-                <w:rFonts w:ascii="Times New Roman" w:hAnsi="Times New Roman" w:eastAsia="宋体"/>
-                <w:b w:val="0"/>
-                <w:i w:val="0"/>
-                <w:sz w:val="18"/>
-              </w:rPr>
-              <w:t>Operability</w:t>
-            </w:r>
-          </w:p>
-        </w:tc>
-        <w:tc>
-          <w:tcPr>
-            <w:tcW w:type="dxa" w:w="2209"/>
-            <w:vAlign w:val="center"/>
-            <w:tcBorders>
-              <w:top w:val="single" w:sz="4" w:color="000000"/>
-              <w:left w:val="single" w:sz="4" w:color="000000"/>
-              <w:bottom w:val="single" w:sz="4" w:color="000000"/>
-              <w:right w:val="single" w:sz="4" w:color="000000"/>
-            </w:tcBorders>
-          </w:tcPr>
-          <w:p>
-            <w:pPr>
-              <w:spacing w:before="60" w:after="60" w:lineRule="auto" w:line="276"/>
-              <w:jc w:val="center"/>
-            </w:pPr>
-            <w:r/>
-            <w:r>
-              <w:rPr>
-                <w:rFonts w:ascii="Times New Roman" w:hAnsi="Times New Roman" w:eastAsia="宋体"/>
-                <w:b w:val="0"/>
-                <w:i w:val="0"/>
-                <w:sz w:val="18"/>
-              </w:rPr>
-              <w:t>Every step has a named role (job title), a quantified deadline, and an explicit output (form ID)</w:t>
-            </w:r>
-          </w:p>
-        </w:tc>
-        <w:tc>
-          <w:tcPr>
-            <w:tcW w:type="dxa" w:w="2209"/>
-            <w:vAlign w:val="center"/>
-            <w:tcBorders>
-              <w:top w:val="single" w:sz="4" w:color="000000"/>
-              <w:left w:val="single" w:sz="4" w:color="000000"/>
-              <w:bottom w:val="single" w:sz="4" w:color="000000"/>
-              <w:right w:val="single" w:sz="4" w:color="000000"/>
-            </w:tcBorders>
-          </w:tcPr>
-          <w:p>
-            <w:pPr>
-              <w:spacing w:before="60" w:after="60" w:lineRule="auto" w:line="276"/>
-              <w:jc w:val="center"/>
-            </w:pPr>
-            <w:r/>
-            <w:r>
-              <w:rPr>
-                <w:rFonts w:ascii="Times New Roman" w:hAnsi="Times New Roman" w:eastAsia="宋体"/>
-                <w:b w:val="0"/>
-                <w:i w:val="0"/>
-                <w:sz w:val="18"/>
-              </w:rPr>
-              <w:t>Most steps are actionable; a few remain vague</w:t>
-            </w:r>
-          </w:p>
-        </w:tc>
-        <w:tc>
-          <w:tcPr>
-            <w:tcW w:type="dxa" w:w="2209"/>
-            <w:vAlign w:val="center"/>
-            <w:tcBorders>
-              <w:top w:val="single" w:sz="4" w:color="000000"/>
-              <w:left w:val="single" w:sz="4" w:color="000000"/>
-              <w:bottom w:val="single" w:sz="4" w:color="000000"/>
-              <w:right w:val="single" w:sz="4" w:color="000000"/>
-            </w:tcBorders>
-          </w:tcPr>
-          <w:p>
-            <w:pPr>
-              <w:spacing w:before="60" w:after="60" w:lineRule="auto" w:line="276"/>
-              <w:jc w:val="center"/>
-            </w:pPr>
-            <w:r/>
-            <w:r>
-              <w:rPr>
-                <w:rFonts w:ascii="Times New Roman" w:hAnsi="Times New Roman" w:eastAsia="宋体"/>
-                <w:b w:val="0"/>
-                <w:i w:val="0"/>
-                <w:sz w:val="18"/>
-              </w:rPr>
-              <w:t>Pervasive use of "in a timely manner", "relevant personnel", and "periodically" without operational detail</w:t>
-            </w:r>
-          </w:p>
-        </w:tc>
-      </w:tr>
-      <w:tr>
-        <w:tc>
-          <w:tcPr>
-            <w:tcW w:type="dxa" w:w="2209"/>
-            <w:vAlign w:val="center"/>
-            <w:tcBorders>
-              <w:top w:val="single" w:sz="4" w:color="000000"/>
-              <w:left w:val="single" w:sz="4" w:color="000000"/>
-              <w:bottom w:val="single" w:sz="4" w:color="000000"/>
-              <w:right w:val="single" w:sz="4" w:color="000000"/>
-            </w:tcBorders>
-          </w:tcPr>
-          <w:p>
-            <w:pPr>
-              <w:spacing w:before="60" w:after="60" w:lineRule="auto" w:line="276"/>
-              <w:jc w:val="center"/>
-            </w:pPr>
-            <w:r/>
-            <w:r>
-              <w:rPr>
-                <w:rFonts w:ascii="Times New Roman" w:hAnsi="Times New Roman" w:eastAsia="宋体"/>
-                <w:b w:val="0"/>
-                <w:i w:val="0"/>
-                <w:sz w:val="18"/>
-              </w:rPr>
-              <w:t>Internal consistency</w:t>
-            </w:r>
-          </w:p>
-        </w:tc>
-        <w:tc>
-          <w:tcPr>
-            <w:tcW w:type="dxa" w:w="2209"/>
-            <w:vAlign w:val="center"/>
-            <w:tcBorders>
-              <w:top w:val="single" w:sz="4" w:color="000000"/>
-              <w:left w:val="single" w:sz="4" w:color="000000"/>
-              <w:bottom w:val="single" w:sz="4" w:color="000000"/>
-              <w:right w:val="single" w:sz="4" w:color="000000"/>
-            </w:tcBorders>
-          </w:tcPr>
-          <w:p>
-            <w:pPr>
-              <w:spacing w:before="60" w:after="60" w:lineRule="auto" w:line="276"/>
-              <w:jc w:val="center"/>
-            </w:pPr>
-            <w:r/>
-            <w:r>
-              <w:rPr>
-                <w:rFonts w:ascii="Times New Roman" w:hAnsi="Times New Roman" w:eastAsia="宋体"/>
-                <w:b w:val="0"/>
-                <w:i w:val="0"/>
-                <w:sz w:val="18"/>
-              </w:rPr>
-              <w:t>All referenced documents and forms appear in the corresponding sections; responsibilities are cleanly assigned</w:t>
-            </w:r>
-          </w:p>
-        </w:tc>
-        <w:tc>
-          <w:tcPr>
-            <w:tcW w:type="dxa" w:w="2209"/>
-            <w:vAlign w:val="center"/>
-            <w:tcBorders>
-              <w:top w:val="single" w:sz="4" w:color="000000"/>
-              <w:left w:val="single" w:sz="4" w:color="000000"/>
-              <w:bottom w:val="single" w:sz="4" w:color="000000"/>
-              <w:right w:val="single" w:sz="4" w:color="000000"/>
-            </w:tcBorders>
-          </w:tcPr>
-          <w:p>
-            <w:pPr>
-              <w:spacing w:before="60" w:after="60" w:lineRule="auto" w:line="276"/>
-              <w:jc w:val="center"/>
-            </w:pPr>
-            <w:r/>
-            <w:r>
-              <w:rPr>
-                <w:rFonts w:ascii="Times New Roman" w:hAnsi="Times New Roman" w:eastAsia="宋体"/>
-                <w:b w:val="0"/>
-                <w:i w:val="0"/>
-                <w:sz w:val="18"/>
-              </w:rPr>
-              <w:t>A few dangling references or minor textual contradictions</w:t>
-            </w:r>
-          </w:p>
-        </w:tc>
-        <w:tc>
-          <w:tcPr>
-            <w:tcW w:type="dxa" w:w="2209"/>
-            <w:vAlign w:val="center"/>
-            <w:tcBorders>
-              <w:top w:val="single" w:sz="4" w:color="000000"/>
-              <w:left w:val="single" w:sz="4" w:color="000000"/>
-              <w:bottom w:val="single" w:sz="4" w:color="000000"/>
-              <w:right w:val="single" w:sz="4" w:color="000000"/>
-            </w:tcBorders>
-          </w:tcPr>
-          <w:p>
-            <w:pPr>
-              <w:spacing w:before="60" w:after="60" w:lineRule="auto" w:line="276"/>
-              <w:jc w:val="center"/>
-            </w:pPr>
-            <w:r/>
-            <w:r>
-              <w:rPr>
-                <w:rFonts w:ascii="Times New Roman" w:hAnsi="Times New Roman" w:eastAsia="宋体"/>
-                <w:b w:val="0"/>
-                <w:i w:val="0"/>
-                <w:sz w:val="18"/>
-              </w:rPr>
-              <w:t>Many dangling references or conflicting responsibility assignments</w:t>
-            </w:r>
-          </w:p>
-        </w:tc>
-      </w:tr>
-      <w:tr>
-        <w:tc>
-          <w:tcPr>
-            <w:tcW w:type="dxa" w:w="2209"/>
-            <w:vAlign w:val="center"/>
-            <w:tcBorders>
-              <w:top w:val="single" w:sz="4" w:color="000000"/>
-              <w:left w:val="single" w:sz="4" w:color="000000"/>
-              <w:bottom w:val="single" w:sz="4" w:color="000000"/>
-              <w:right w:val="single" w:sz="4" w:color="000000"/>
-            </w:tcBorders>
-          </w:tcPr>
-          <w:p>
-            <w:pPr>
-              <w:spacing w:before="60" w:after="60" w:lineRule="auto" w:line="276"/>
-              <w:jc w:val="center"/>
-            </w:pPr>
-            <w:r/>
-            <w:r>
-              <w:rPr>
-                <w:rFonts w:ascii="Times New Roman" w:hAnsi="Times New Roman" w:eastAsia="宋体"/>
-                <w:b w:val="0"/>
-                <w:i w:val="0"/>
-                <w:sz w:val="18"/>
-              </w:rPr>
-              <w:t>PDCA closure</w:t>
-            </w:r>
-          </w:p>
-        </w:tc>
-        <w:tc>
-          <w:tcPr>
-            <w:tcW w:type="dxa" w:w="2209"/>
-            <w:vAlign w:val="center"/>
-            <w:tcBorders>
-              <w:top w:val="single" w:sz="4" w:color="000000"/>
-              <w:left w:val="single" w:sz="4" w:color="000000"/>
-              <w:bottom w:val="single" w:sz="4" w:color="000000"/>
-              <w:right w:val="single" w:sz="4" w:color="000000"/>
-            </w:tcBorders>
-          </w:tcPr>
-          <w:p>
-            <w:pPr>
-              <w:spacing w:before="60" w:after="60" w:lineRule="auto" w:line="276"/>
-              <w:jc w:val="center"/>
-            </w:pPr>
-            <w:r/>
-            <w:r>
-              <w:rPr>
-                <w:rFonts w:ascii="Times New Roman" w:hAnsi="Times New Roman" w:eastAsia="宋体"/>
-                <w:b w:val="0"/>
-                <w:i w:val="0"/>
-                <w:sz w:val="18"/>
-              </w:rPr>
-              <w:t>An explicit Plan–Do–Check–Act chain with execution records, effectiveness evaluation, non-conformity handling, and improvement</w:t>
-            </w:r>
-          </w:p>
-        </w:tc>
-        <w:tc>
-          <w:tcPr>
-            <w:tcW w:type="dxa" w:w="2209"/>
-            <w:vAlign w:val="center"/>
-            <w:tcBorders>
-              <w:top w:val="single" w:sz="4" w:color="000000"/>
-              <w:left w:val="single" w:sz="4" w:color="000000"/>
-              <w:bottom w:val="single" w:sz="4" w:color="000000"/>
-              <w:right w:val="single" w:sz="4" w:color="000000"/>
-            </w:tcBorders>
-          </w:tcPr>
-          <w:p>
-            <w:pPr>
-              <w:spacing w:before="60" w:after="60" w:lineRule="auto" w:line="276"/>
-              <w:jc w:val="center"/>
-            </w:pPr>
-            <w:r/>
-            <w:r>
-              <w:rPr>
-                <w:rFonts w:ascii="Times New Roman" w:hAnsi="Times New Roman" w:eastAsia="宋体"/>
-                <w:b w:val="0"/>
-                <w:i w:val="0"/>
-                <w:sz w:val="18"/>
-              </w:rPr>
-              <w:t>P–D–C are present but A (improvement/feedback) is missing</w:t>
-            </w:r>
-          </w:p>
-        </w:tc>
-        <w:tc>
-          <w:tcPr>
-            <w:tcW w:type="dxa" w:w="2209"/>
-            <w:vAlign w:val="center"/>
-            <w:tcBorders>
-              <w:top w:val="single" w:sz="4" w:color="000000"/>
-              <w:left w:val="single" w:sz="4" w:color="000000"/>
-              <w:bottom w:val="single" w:sz="4" w:color="000000"/>
-              <w:right w:val="single" w:sz="4" w:color="000000"/>
-            </w:tcBorders>
-          </w:tcPr>
-          <w:p>
-            <w:pPr>
-              <w:spacing w:before="60" w:after="60" w:lineRule="auto" w:line="276"/>
-              <w:jc w:val="center"/>
-            </w:pPr>
-            <w:r/>
-            <w:r>
-              <w:rPr>
-                <w:rFonts w:ascii="Times New Roman" w:hAnsi="Times New Roman" w:eastAsia="宋体"/>
-                <w:b w:val="0"/>
-                <w:i w:val="0"/>
-                <w:sz w:val="18"/>
-              </w:rPr>
-              <w:t>Execution steps only; no checking or improvement</w:t>
-            </w:r>
-          </w:p>
-        </w:tc>
-      </w:tr>
-      <w:tr>
-        <w:tc>
-          <w:tcPr>
-            <w:tcW w:type="dxa" w:w="2209"/>
-            <w:vAlign w:val="center"/>
-            <w:tcBorders>
-              <w:top w:val="single" w:sz="4" w:color="000000"/>
-              <w:left w:val="single" w:sz="4" w:color="000000"/>
-              <w:bottom w:val="single" w:sz="4" w:color="000000"/>
-              <w:right w:val="single" w:sz="4" w:color="000000"/>
-            </w:tcBorders>
-          </w:tcPr>
-          <w:p>
-            <w:pPr>
-              <w:spacing w:before="60" w:after="60" w:lineRule="auto" w:line="276"/>
-              <w:jc w:val="center"/>
-            </w:pPr>
-            <w:r/>
-            <w:r>
-              <w:rPr>
-                <w:rFonts w:ascii="Times New Roman" w:hAnsi="Times New Roman" w:eastAsia="宋体"/>
-                <w:b w:val="0"/>
-                <w:i w:val="0"/>
-                <w:sz w:val="18"/>
-              </w:rPr>
-              <w:t>Professional depth</w:t>
-            </w:r>
-          </w:p>
-        </w:tc>
-        <w:tc>
-          <w:tcPr>
-            <w:tcW w:type="dxa" w:w="2209"/>
-            <w:vAlign w:val="center"/>
-            <w:tcBorders>
-              <w:top w:val="single" w:sz="4" w:color="000000"/>
-              <w:left w:val="single" w:sz="4" w:color="000000"/>
-              <w:bottom w:val="single" w:sz="4" w:color="000000"/>
-              <w:right w:val="single" w:sz="4" w:color="000000"/>
-            </w:tcBorders>
-          </w:tcPr>
-          <w:p>
-            <w:pPr>
-              <w:spacing w:before="60" w:after="60" w:lineRule="auto" w:line="276"/>
-              <w:jc w:val="center"/>
-            </w:pPr>
-            <w:r/>
-            <w:r>
-              <w:rPr>
-                <w:rFonts w:ascii="Times New Roman" w:hAnsi="Times New Roman" w:eastAsia="宋体"/>
-                <w:b w:val="0"/>
-                <w:i w:val="0"/>
-                <w:sz w:val="18"/>
-              </w:rPr>
-              <w:t>Contains laboratory-specific detail (e.g., Westgard rules, measurement uncertainty, Sigma metrics, HIL indices, blind testing, PCR zoning, cold chain)</w:t>
-            </w:r>
-          </w:p>
-        </w:tc>
-        <w:tc>
-          <w:tcPr>
-            <w:tcW w:type="dxa" w:w="2209"/>
-            <w:vAlign w:val="center"/>
-            <w:tcBorders>
-              <w:top w:val="single" w:sz="4" w:color="000000"/>
-              <w:left w:val="single" w:sz="4" w:color="000000"/>
-              <w:bottom w:val="single" w:sz="4" w:color="000000"/>
-              <w:right w:val="single" w:sz="4" w:color="000000"/>
-            </w:tcBorders>
-          </w:tcPr>
-          <w:p>
-            <w:pPr>
-              <w:spacing w:before="60" w:after="60" w:lineRule="auto" w:line="276"/>
-              <w:jc w:val="center"/>
-            </w:pPr>
-            <w:r/>
-            <w:r>
-              <w:rPr>
-                <w:rFonts w:ascii="Times New Roman" w:hAnsi="Times New Roman" w:eastAsia="宋体"/>
-                <w:b w:val="0"/>
-                <w:i w:val="0"/>
-                <w:sz w:val="18"/>
-              </w:rPr>
-              <w:t>Some professional flavor, but largely generic</w:t>
-            </w:r>
-          </w:p>
-        </w:tc>
-        <w:tc>
-          <w:tcPr>
-            <w:tcW w:type="dxa" w:w="2209"/>
-            <w:vAlign w:val="center"/>
-            <w:tcBorders>
-              <w:top w:val="single" w:sz="4" w:color="000000"/>
-              <w:left w:val="single" w:sz="4" w:color="000000"/>
-              <w:bottom w:val="single" w:sz="4" w:color="000000"/>
-              <w:right w:val="single" w:sz="4" w:color="000000"/>
-            </w:tcBorders>
-          </w:tcPr>
-          <w:p>
-            <w:pPr>
-              <w:spacing w:before="60" w:after="60" w:lineRule="auto" w:line="276"/>
-              <w:jc w:val="center"/>
-            </w:pPr>
-            <w:r/>
-            <w:r>
-              <w:rPr>
-                <w:rFonts w:ascii="Times New Roman" w:hAnsi="Times New Roman" w:eastAsia="宋体"/>
-                <w:b w:val="0"/>
-                <w:i w:val="0"/>
-                <w:sz w:val="18"/>
-              </w:rPr>
-              <w:t>Generic content equally applicable to any laboratory</w:t>
-            </w:r>
-          </w:p>
-        </w:tc>
-      </w:tr>
-    </w:tbl>
-    <w:p/>
     <w:p>
       <w:pPr>
         <w:spacing w:before="160" w:after="40" w:lineRule="auto" w:line="360"/>
@@ -1522,7 +807,7 @@
           <w:i w:val="0"/>
           <w:sz w:val="24"/>
         </w:rPr>
-        <w:t>Pairwise comparisons between configurations used two-sided Mann–Whitney U tests on the GPT-judge scores for each document (n = 45 per configuration; 15 tasks × 3 replicates). Observations within a configuration share the 15 underlying tasks and are therefore not fully independent; the tests treat replicates as independent, a simplification. The task-class-stratified estimates (Table 3), in which the rules effect is consistent in direction across all three classes, argue against a task-driven artifact. Because the four component contrasts share configurations and are therefore not independent, multiplicity was controlled with the Benjamini–Hochberg FDR procedure (α = 0.05) rather than the more conservative Bonferroni, retaining more power while controlling the false-discovery rate. A 95% confidence interval for each effect estimate (Δ) was obtained by bootstrap (nonparametric percentile method, fixed seed, B = 10,000 resamples).</w:t>
+        <w:t>Pairwise comparisons between configurations used two-sided Mann–Whitney U tests on the GPT-judge scores for each document (n = 45 per configuration; 15 tasks × 3 replicates). Observations within a configuration share the 15 underlying tasks and are therefore not fully independent; the tests treat replicates as independent, a simplification. The task-class-stratified estimates (Table 2), in which the rules effect is consistent in direction across all three classes, argue against a task-driven artifact. Because the four component contrasts share configurations and are therefore not independent, multiplicity was controlled with the Benjamini–Hochberg FDR procedure (α = 0.05) rather than the more conservative Bonferroni, retaining more power while controlling the false-discovery rate. A 95% confidence interval for each effect estimate (Δ) was obtained by bootstrap (nonparametric percentile method, fixed seed, B = 10,000 resamples).</w:t>
       </w:r>
     </w:p>
     <w:p>
@@ -1625,7 +910,7 @@
           <w:i w:val="0"/>
           <w:sz w:val="24"/>
         </w:rPr>
-        <w:t xml:space="preserve"> (H2_keep_examples vs G_template_rules). The effect of each component (Δ) is the difference between the two configurations' mean scores, expressed on the raw 0–5 scale without standardization, with a bootstrap 95% CI (Table 3). We deliberately used this direct pairwise contrast rather than a more elaborate statistical model because it is the easiest to interpret. The nine configurations are not a Taguchi L9 orthogonal array but a structured subset of the four-dimensional configuration space, selected to isolate each dimension through these contrasts rather than to satisfy orthogonal-balance criteria; the Δ estimates therefore correspond only to those specific pairs.</w:t>
+        <w:t xml:space="preserve"> (H2_keep_examples vs G_template_rules). The effect of each component (Δ) is the difference between the two configurations' mean scores, expressed on the raw 0–5 scale without standardization, with a bootstrap 95% CI (Table 2). We deliberately used this direct pairwise contrast rather than a more elaborate statistical model because it is the easiest to interpret. The nine configurations are not a Taguchi L9 orthogonal array but a structured subset of the four-dimensional configuration space, selected to isolate each dimension through these contrasts rather than to satisfy orthogonal-balance criteria; the Δ estimates therefore correspond only to those specific pairs.</w:t>
       </w:r>
     </w:p>
     <w:p>
@@ -1765,7 +1050,7 @@
           <w:i w:val="0"/>
           <w:sz w:val="24"/>
         </w:rPr>
-        <w:t>We ranked the nine configurations across the 405 Claude-generated documents using a composite score (Table 2). The composite score combines the Tier 1 automated mean and the Tier 2 LLM-judge mean (averaged across the Claude and GPT judges), each min-max normalized to [0, 1] across the nine configurations and then averaged with equal weight. H4_sop_only achieved the highest composite score at only ~2,000 tokens, far below the template-anchored configurations and C_full (~56,000 tokens); as Section 3.5 shows, however, this ranking does not survive expert evaluation.</w:t>
+        <w:t>We ranked the nine configurations across the 405 Claude-generated documents using a composite score (Table 1). The composite score combines the Tier 1 automated mean and the Tier 2 LLM-judge mean (averaged across the Claude and GPT judges), each min-max normalized to [0, 1] across the nine configurations and then averaged with equal weight. H4_sop_only achieved the highest composite score at only ~2,000 tokens, far below the template-anchored configurations and C_full (~56,000 tokens); as Section 3.5 shows, however, this ranking does not survive expert evaluation.</w:t>
       </w:r>
     </w:p>
     <w:p>
@@ -1781,7 +1066,7 @@
           <w:i w:val="0"/>
           <w:sz w:val="24"/>
         </w:rPr>
-        <w:t>Table 2. Composite ranking of the nine configurations.</w:t>
+        <w:t>Table 1. Composite ranking of the nine configurations.</w:t>
       </w:r>
     </w:p>
     <w:tbl>
@@ -2686,7 +1971,7 @@
           <w:i w:val="0"/>
           <w:sz w:val="24"/>
         </w:rPr>
-        <w:t>The ablation effects of the four components are summarized in Table 3.</w:t>
+        <w:t>The ablation effects of the four components are summarized in Table 2.</w:t>
       </w:r>
     </w:p>
     <w:p>
@@ -2702,7 +1987,7 @@
           <w:i w:val="0"/>
           <w:sz w:val="24"/>
         </w:rPr>
-        <w:t>Table 3. Ablation effects of the four prompt components (Tier 2b GPT-judge ratings; the two configurations in each contrast are given in Section 2.4.2).</w:t>
+        <w:t>Table 2. Ablation effects of the four prompt components (Tier 2b GPT-judge ratings; the two configurations in each contrast are given in Section 2.4.2).</w:t>
       </w:r>
     </w:p>
     <w:tbl>
@@ -3742,7 +3027,7 @@
           <w:i w:val="0"/>
           <w:sz w:val="24"/>
         </w:rPr>
-        <w:t>Only rules remained significant after multiplicity correction [BH-adjusted p &lt; 0.001]. The document-skeleton effect was directionally positive with a bootstrap CI excluding zero, but the rank-based test was not significant [BH-adjusted p = 0.11], so we treat it as suggestive only; neither detailed content nor worked examples had a detectable effect. A supplementary contrast showed that H4_sop_only (a single SOP skeleton) and H3_skeleton (the full module skeleton) performed comparably [Δ = −0.009]. Stratified by task class (Table 3, right-hand columns), the rules effect was consistent in direction and magnitude across all three classes (+0.41 to +0.61) and did not reverse, whereas the other components fluctuated and were far smaller.</w:t>
+        <w:t>Only rules remained significant after multiplicity correction [BH-adjusted p &lt; 0.001]. The document-skeleton effect was directionally positive with a bootstrap CI excluding zero, but the rank-based test was not significant [BH-adjusted p = 0.11], so we treat it as suggestive only; neither detailed content nor worked examples had a detectable effect. A supplementary contrast showed that H4_sop_only (a single SOP skeleton) and H3_skeleton (the full module skeleton) performed comparably [Δ = −0.009]. Stratified by task class (Table 2, right-hand columns), the rules effect was consistent in direction and magnitude across all three classes (+0.41 to +0.61) and did not reverse, whereas the other components fluctuated and were far smaller.</w:t>
       </w:r>
     </w:p>
     <w:p>
@@ -3758,7 +3043,7 @@
           <w:i w:val="0"/>
           <w:sz w:val="24"/>
         </w:rPr>
-        <w:t>Decomposed by scoring dimension (GPT judge; n = 45 per configuration), the rules effect was largest for operability (+0.867) and professional depth (+0.644), and smaller for clause coverage (+0.400), PDCA closure (+0.333), and internal consistency (+0.311). The two largest gains thus fall on operability and professional depth rather than on the format- and structure-oriented dimensions, indicating that a rules constraint does not merely regularize a document's outward form but also increases the laboratory-specific technical detail written into it. This decomposition is by scoring dimension, not by document type: "professional depth" is only a proxy for technical specificity (Table 1), and a genuine stratification by document type cannot be performed here because the task set contains no technical documents (Section 4.6). These results apply only to the LLM-judge tier; the expert-tier comparisons appear in Section 3.5.</w:t>
+        <w:t>Decomposed by scoring dimension (GPT judge; n = 45 per configuration), the rules effect was largest for operability (+0.867) and professional depth (+0.644), and smaller for clause coverage (+0.400), PDCA closure (+0.333), and internal consistency (+0.311). The two largest gains thus fall on operability and professional depth rather than on the format- and structure-oriented dimensions, indicating that a rules constraint does not merely regularize a document's outward form but also increases the laboratory-specific technical detail written into it. This decomposition is by scoring dimension, not by document type: "professional depth" is only a proxy for technical specificity (Supplementary Table S2), and a genuine stratification by document type cannot be performed here because the task set contains no technical documents (Section 4.6). These results apply only to the LLM-judge tier; the expert-tier comparisons appear in Section 3.5.</w:t>
       </w:r>
     </w:p>
     <w:p>
@@ -3931,7 +3216,7 @@
           <w:i w:val="0"/>
           <w:sz w:val="24"/>
         </w:rPr>
-        <w:t>The ranking of the seven configurations is given in Table 4, and is almost the reverse of the LLM-judge tier (Figure 4b).</w:t>
+        <w:t>The ranking of the seven configurations is given in Table 3, and is almost the reverse of the LLM-judge tier (Figure 4b).</w:t>
       </w:r>
     </w:p>
     <w:p>
@@ -3947,7 +3232,7 @@
           <w:i w:val="0"/>
           <w:sz w:val="24"/>
         </w:rPr>
-        <w:t>Table 4. Scores for the seven sampled configurations (0–5 scale; sorted by expert mean; 1–2 documents per configuration).</w:t>
+        <w:t>Table 3. Scores for the seven sampled configurations (0–5 scale; sorted by expert mean; 1–2 documents per configuration).</w:t>
       </w:r>
     </w:p>
     <w:tbl>
@@ -5350,7 +4635,7 @@
           <w:i w:val="0"/>
           <w:sz w:val="24"/>
         </w:rPr>
-        <w:t>The practical guidance from these two biases is as follows. The Claude judge's moderate agreement with the expert ranking [ICC(3,1) = 0.548] suggests it could serve as a first-pass filter in large-scale generation, screening out clearly low-quality outputs before expert review; however, the 95% CI of this coefficient crosses zero (n = 10; see Section 3.5), so this use requires confirmation in a larger sample. The GPT judge's poorer and non-significant agreement [ICC(3,1) = 0.217, p = 0.26] makes it unsuitable as a substitute for expert scoring. For documents intended for accreditation submission, formal QMS adoption, or operational use, expert final review remains indispensable. The configuration-level implications of these biases are summarized in Section 4.4 (Table 5).</w:t>
+        <w:t>The practical guidance from these two biases is as follows. The Claude judge's moderate agreement with the expert ranking [ICC(3,1) = 0.548] suggests it could serve as a first-pass filter in large-scale generation, screening out clearly low-quality outputs before expert review; however, the 95% CI of this coefficient crosses zero (n = 10; see Section 3.5), so this use requires confirmation in a larger sample. The GPT judge's poorer and non-significant agreement [ICC(3,1) = 0.217, p = 0.26] makes it unsuitable as a substitute for expert scoring. For documents intended for accreditation submission, formal QMS adoption, or operational use, expert final review remains indispensable. The configuration-level implications of these biases are summarized in Section 4.4 (Table 4).</w:t>
       </w:r>
     </w:p>
     <w:p>
@@ -5381,7 +4666,7 @@
           <w:i w:val="0"/>
           <w:sz w:val="24"/>
         </w:rPr>
-        <w:t>Synthesizing the three tiers, we summarize provisional configuration guidance for the principal use scenarios in Table 5. The key trade-off (Section 3.5, Section 3.6) is that the most token-efficient configurations score highest at the LLM-judge tier but lack the clinically grounded detail needed for formal submission, whereas template-anchored configurations score lower there yet receive the highest expert ratings.</w:t>
+        <w:t>Synthesizing the three tiers, we summarize provisional configuration guidance for the principal use scenarios in Table 4. The key trade-off (Section 3.5, Section 3.6) is that the most token-efficient configurations score highest at the LLM-judge tier but lack the clinically grounded detail needed for formal submission, whereas template-anchored configurations score lower there yet receive the highest expert ratings.</w:t>
       </w:r>
     </w:p>
     <w:p>
@@ -5397,7 +4682,7 @@
           <w:i w:val="0"/>
           <w:sz w:val="24"/>
         </w:rPr>
-        <w:t>Table 5. Provisional configuration guidance by use scenario.</w:t>
+        <w:t>Table 4. Provisional configuration guidance by use scenario.</w:t>
       </w:r>
     </w:p>
     <w:tbl>
@@ -6423,7 +5708,7 @@
           <w:i w:val="0"/>
           <w:sz w:val="24"/>
         </w:rPr>
-        <w:t>A practical workflow emerging from these data is to: (i) generate a rapid first draft with H4_sop_only; (ii) supplement the practical clinical detail through manual review or targeted re-prompting; and (iii) regenerate or refine the final document for accreditation submission using G_template_rules. It should be emphasized that every configuration in Table 5 produces only a reference draft: all require revision by laboratory staff and final expert review before use for accreditation, and the configurations differ only in the completeness of that draft, not in whether expert review is needed. The amount of manual rework each configuration requires was not quantified in this study and is a direction for future work.</w:t>
+        <w:t>A practical workflow emerging from these data is to: (i) generate a rapid first draft with H4_sop_only; (ii) supplement the practical clinical detail through manual review or targeted re-prompting; and (iii) regenerate or refine the final document for accreditation submission using G_template_rules. It should be emphasized that every configuration in Table 4 produces only a reference draft: all require revision by laboratory staff and final expert review before use for accreditation, and the configurations differ only in the completeness of that draft, not in whether expert review is needed. The amount of manual rework each configuration requires was not quantified in this study and is a direction for future work.</w:t>
       </w:r>
     </w:p>
     <w:p>
@@ -6596,7 +5881,7 @@
           <w:i w:val="0"/>
           <w:sz w:val="24"/>
         </w:rPr>
-        <w:t>The optimal prompt configuration for LLM-assisted ISO 15189 QMS document generation varies with the evaluation tier: the LLM-judge favorite H4_sop_only fell to fifth under expert review, whereas the template-anchored F_template, H2_keep_examples, and G_template_rules ranked highest (Table 4). Either way, the output is only a reference draft and cannot be submitted directly. Minimal prompts give a quick-start outline; template-anchored configurations give a working draft closer to submission form, whose value lies in a reliable document skeleton – the content that actually determines accreditation readiness (the laboratory's own quality-control data, patient data distributions, and proficiency-testing history) must be entered and interpreted by competent personnel, because an LLM does not hold these data. Nor is more context safer: C_full (~56,000 tokens), which loads the full reference corpus, should instead be used with caution, particularly when generation is performed by GPT-5.4 (its failure modes were observed only at the automated and LLM-judge tiers). Evaluation, too, cannot be delegated: LLM-as-judge is suitable only for pre-screening large numbers of drafts before expert review – the Claude judge is tentatively adequate for this role [ICC(3,1) = 0.548, 95% CI crossing zero, n = 10], whereas the GPT-5.4 judge is not [ICC(3,1) = 0.217]. Ultimately, ISO 15189 documentation is the process by which laboratory staff learn processes and risks, take responsibility, and demonstrate competence; an LLM can take over only its routine textual work – expert final review remains indispensable.</w:t>
+        <w:t>The optimal prompt configuration for LLM-assisted ISO 15189 QMS document generation varies with the evaluation tier: the LLM-judge favorite H4_sop_only fell to fifth under expert review, whereas the template-anchored F_template, H2_keep_examples, and G_template_rules ranked highest (Table 3). Either way, the output is only a reference draft and cannot be submitted directly. Minimal prompts give a quick-start outline; template-anchored configurations give a working draft closer to submission form, whose value lies in a reliable document skeleton – the content that actually determines accreditation readiness (the laboratory's own quality-control data, patient data distributions, and proficiency-testing history) must be entered and interpreted by competent personnel, because an LLM does not hold these data. Nor is more context safer: C_full (~56,000 tokens), which loads the full reference corpus, should instead be used with caution, particularly when generation is performed by GPT-5.4 (its failure modes were observed only at the automated and LLM-judge tiers). Evaluation, too, cannot be delegated: LLM-as-judge is suitable only for pre-screening large numbers of drafts before expert review – the Claude judge is tentatively adequate for this role [ICC(3,1) = 0.548, 95% CI crossing zero, n = 10], whereas the GPT-5.4 judge is not [ICC(3,1) = 0.217]. Ultimately, ISO 15189 documentation is the process by which laboratory staff learn processes and risks, take responsibility, and demonstrate competence; an LLM can take over only its routine textual work – expert final review remains indispensable.</w:t>
       </w:r>
     </w:p>
     <w:p>
@@ -7114,7 +6399,7 @@
           <w:i w:val="0"/>
           <w:sz w:val="21"/>
         </w:rPr>
-        <w:t>(a) Mean quality score against system-prompt size (symlog scale) for the expert panel (green squares), the Claude judge (orange circles), and the GPT judge (blue triangles), computed on the n = 10 expert-reviewed subset; short codes identify configurations, and shaded bands mark the token-efficient (E/H4) and expert-optimal (F/G) regions. (b) Configuration ranking at the LLM-judge tier (composite score, Table 2) versus the expert panel (Table 4): the LLM favorite H4_sop_only falls from first to fifth, whereas F_template rises from sixth to first.</w:t>
+        <w:t>(a) Mean quality score against system-prompt size (symlog scale) for the expert panel (green squares), the Claude judge (orange circles), and the GPT judge (blue triangles), computed on the n = 10 expert-reviewed subset; short codes identify configurations, and shaded bands mark the token-efficient (E/H4) and expert-optimal (F/G) regions. (b) Configuration ranking at the LLM-judge tier (composite score, Table 1) versus the expert panel (Table 3): the LLM favorite H4_sop_only falls from first to fifth, whereas F_template rises from sixth to first.</w:t>
       </w:r>
     </w:p>
     <w:p>
@@ -7403,7 +6688,7 @@
           <w:i w:val="0"/>
           <w:sz w:val="24"/>
         </w:rPr>
-        <w:t>: 5</w:t>
+        <w:t>: 4</w:t>
       </w:r>
     </w:p>
     <w:p>

</xml_diff>

<commit_message>
docs(paper): report word count under the journal's counting rule and cite the expert score range in Results
Co-Authored-By: Claude Fable 5 <noreply@anthropic.com>
Claude-Session: https://claude.ai/code/session_01PXteLoEJ47ztdLQyNFxNJ9
</commit_message>
<xml_diff>
--- a/paper/manuscript_v2_en_CCLM.docx
+++ b/paper/manuscript_v2_en_CCLM.docx
@@ -4400,7 +4400,7 @@
           <w:i w:val="0"/>
           <w:sz w:val="24"/>
         </w:rPr>
-        <w:t>The top three are all template-anchored (F_template, H2_keep_examples, G_template_rules), whereas H4_sop_only – ranked first at the LLM-judge tier – fell to fifth, only 0.16 points above the no-prompt baseline A_bare. The most overestimated were C_full and H4_sop_only (about 1 point above the experts): both comply in structure and terminology but lack the clinically grounded operational detail that only experts detect. The token-efficient advantage of skeleton configurations at the LLM-judge tier is therefore not borne out under expert evaluation. With only 1–2 documents per configuration, this ranking is preliminary.</w:t>
+        <w:t>The top three are all template-anchored (F_template, H2_keep_examples, G_template_rules; expert means 4.06–4.24), whereas H4_sop_only – ranked first at the LLM-judge tier – fell to fifth, only 0.16 points above the no-prompt baseline A_bare. The most overestimated were C_full and H4_sop_only (about 1 point above the experts): both comply in structure and terminology but lack the clinically grounded operational detail that only experts detect. The token-efficient advantage of skeleton configurations at the LLM-judge tier is therefore not borne out under expert evaluation. With only 1–2 documents per configuration, this ranking is preliminary.</w:t>
       </w:r>
     </w:p>
     <w:p>
@@ -6654,7 +6654,7 @@
           <w:i w:val="0"/>
           <w:sz w:val="24"/>
         </w:rPr>
-        <w:t>Word count (main text including references)</w:t>
+        <w:t>Word count (main text, excluding title page, abstract, tables, figures, and references)</w:t>
       </w:r>
       <w:r>
         <w:rPr>
@@ -6663,7 +6663,7 @@
           <w:i w:val="0"/>
           <w:sz w:val="24"/>
         </w:rPr>
-        <w:t>: ~7900 words</w:t>
+        <w:t>: ~5,500 words</w:t>
       </w:r>
     </w:p>
     <w:p>

</xml_diff>

<commit_message>
docs(paper): reframe for JMIR Medical Informatics submission
New title (Input Specification), Background added to the abstract, input-specification
paragraph in Methods 2.1, Section 4.1 recast around the missing-input mechanism, a
direct response to the implementation-misreading concern in 4.5, AMA references with
DOIs, and an English-only Multimedia Appendix 1.

Co-Authored-By: Claude Fable 5 <noreply@anthropic.com>
Claude-Session: https://claude.ai/code/session_01PXteLoEJ47ztdLQyNFxNJ9
</commit_message>
<xml_diff>
--- a/paper/manuscript_v2_en_CCLM.docx
+++ b/paper/manuscript_v2_en_CCLM.docx
@@ -14,7 +14,7 @@
           <w:i w:val="0"/>
           <w:sz w:val="30"/>
         </w:rPr>
-        <w:t>Evaluating LLM-Assisted Drafting of ISO 15189 Quality Management Documents: Prompt Configuration, LLM-as-Judge Bias, and Exploratory Expert Validation</w:t>
+        <w:t>Evaluating LLM-Assisted Drafting of ISO 15189 Quality Management Documents: Input Specification, LLM-as-Judge Bias, and Exploratory Expert Validation</w:t>
       </w:r>
     </w:p>
     <w:p>
@@ -225,7 +225,7 @@
           <w:i w:val="0"/>
           <w:sz w:val="24"/>
         </w:rPr>
-        <w:t>: Prompt configuration and LLM-as-judge bias in ISO 15189 drafting</w:t>
+        <w:t>: Input specification and LLM-as-judge bias in ISO 15189 drafting</w:t>
       </w:r>
     </w:p>
     <w:p>
@@ -256,7 +256,7 @@
           <w:i w:val="0"/>
           <w:sz w:val="24"/>
         </w:rPr>
-        <w:t>Objectives</w:t>
+        <w:t>Background</w:t>
       </w:r>
       <w:r>
         <w:rPr>
@@ -265,7 +265,32 @@
           <w:i w:val="0"/>
           <w:sz w:val="24"/>
         </w:rPr>
-        <w:t>: To evaluate the ISO 15189:2022 compliance of quality management system (QMS) documents drafted with large language model (LLM) assistance.</w:t>
+        <w:t>: ISO 15189 quality management system (QMS) documents are what a laboratory builds and runs its system upon; producing them is not merely a writing task. When large language models (LLMs) are used to draft such documents, local requirements are usually not written into the prompt, and the output is often scored by another LLM. Each step carries a risk: with too little input, a model may produce generic text that is only superficially compliant, and whether LLM scoring agrees with expert judgement is unknown. Neither practice has been tested empirically.</w:t>
+      </w:r>
+    </w:p>
+    <w:p>
+      <w:pPr>
+        <w:spacing w:before="80" w:after="80" w:lineRule="auto" w:line="360"/>
+        <w:ind w:firstLine="0"/>
+        <w:jc w:val="both"/>
+      </w:pPr>
+      <w:r>
+        <w:rPr>
+          <w:rFonts w:ascii="Times New Roman" w:hAnsi="Times New Roman" w:eastAsia="宋体"/>
+          <w:b/>
+          <w:i w:val="0"/>
+          <w:sz w:val="24"/>
+        </w:rPr>
+        <w:t>Objective</w:t>
+      </w:r>
+      <w:r>
+        <w:rPr>
+          <w:rFonts w:ascii="Times New Roman" w:hAnsi="Times New Roman" w:eastAsia="宋体"/>
+          <w:b w:val="0"/>
+          <w:i w:val="0"/>
+          <w:sz w:val="24"/>
+        </w:rPr>
+        <w:t>: To evaluate the ISO 15189:2022 compliance of QMS documents drafted with LLM assistance, and to determine how much input the model must be given for such drafting.</w:t>
       </w:r>
     </w:p>
     <w:p>
@@ -290,7 +315,7 @@
           <w:i w:val="0"/>
           <w:sz w:val="24"/>
         </w:rPr>
-        <w:t>: We generated 486 QMS documents with Claude Opus 4.6 (405) and GPT-5.4 (81) across nine prompt configurations varying four components (rules, document skeleton, detailed content, worked examples; 0–56,000 tokens). Compliance was rated on a 0–5 scale at three tiers: an automated scorer, two LLM judges (864 ratings), and blinded review of 10 sampled documents by three ISO 15189 internal auditors. Ablation used Mann–Whitney U tests with BH correction and bootstrap 95% CIs; reliability used ICCs.</w:t>
+        <w:t>: We generated 486 QMS documents with Claude Opus 4.6 (405) and GPT-5.4 (81) across nine prompt configurations varying four components (rules, document skeleton, detailed content, worked examples; 0–56,000 tokens). The nine configurations broadly cover the input content laboratories commonly provide today, and none of them included laboratory-specific local information. Compliance was rated on a 0–5 scale at three tiers: an automated scorer, two LLM judges (864 ratings), and blinded review of 10 sampled documents by three ISO 15189 internal auditors. Ablation used Mann–Whitney U tests with BH correction and bootstrap 95% CIs; reliability used ICCs.</w:t>
       </w:r>
     </w:p>
     <w:p>
@@ -340,7 +365,7 @@
           <w:i w:val="0"/>
           <w:sz w:val="24"/>
         </w:rPr>
-        <w:t>: The optimal configuration varied with the evaluation tier: minimal prompts (~1,000–2,000 tokens) suit exploratory drafts requiring subsequent human review; template-anchored prompts (~15,000–16,000 tokens) tended to perform best for accreditation submission; and C_full performed markedly worse with GPT-5.4 and should be used with caution – a preliminary observation based on three tasks and not corroborated at the expert tier. LLM-as-judge can support first-pass screening, but expert final review remains indispensable.</w:t>
+        <w:t>: The optimal configuration varied with the evaluation tier, and output quality depended on whether the requirements were stated specifically, not on how long the prompt was: minimal prompts (~1,000–2,000 tokens) suit exploratory drafts requiring subsequent human review; template-anchored prompts (~15,000–16,000 tokens) tended to perform best for accreditation submission; and C_full performed markedly worse with GPT-5.4 and should be used with caution – a preliminary observation based on three tasks and not corroborated at the expert tier. LLM-as-judge can support first-pass screening, but expert final review remains indispensable. The natural next step is to have laboratory professionals formulate their local process requirements before generation begins; this approach is currently under evaluation.</w:t>
       </w:r>
     </w:p>
     <w:p>
@@ -414,7 +439,7 @@
           <w:i w:val="0"/>
           <w:sz w:val="24"/>
         </w:rPr>
-        <w:t xml:space="preserve"> [1] is the international standard for medical laboratory accreditation. In China, its adoption by medical laboratories continues to expand [2]. The corresponding national implementation document is CNAS-CL02:2023, issued by the China National Accreditation Service for Conformity Assessment (CNAS). These standards define what laboratories must achieve but do not prescribe in detail how each laboratory should implement the required processes. As a result, each laboratory must establish its own quality management system (QMS) documentation, including a quality manual, procedure documents, standard operating procedures, and associated records and forms. Based on the first author's experience as an ISO 15189 internal auditor, such a system in a tertiary hospital clinical laboratory contains on the order of 100–300 controlled documents and spans structural organization, clause-to-document mapping, form numbering, and responsibility assignment; drafting by an in-house quality team typically takes several months, followed by multiple rounds of internal audit before finalization. Laboratories pursuing CNAS accreditation typically engage external technical experts or trainers to guide this process.</w:t>
+        <w:t xml:space="preserve"> [1] is the international standard for medical laboratory accreditation. In China, its adoption by medical laboratories continues to expand [2]. The corresponding national implementation document is CNAS-CL02:2023, issued by the China National Accreditation Service for Conformity Assessment (CNAS). These standards define what laboratories must achieve but do not prescribe in detail how each laboratory should implement the required processes. As a result, each laboratory must establish its own quality management system (QMS) documentation, including a quality manual, procedure documents, standard operating procedures, and associated records and forms. This documentation is not merely text to be delivered. It records how the laboratory actually operates, and writing it is part of how staff build competence, responsibility, and risk awareness. Based on the first author's experience as an ISO 15189 internal auditor, such a system in a tertiary hospital clinical laboratory contains on the order of 100–300 controlled documents and spans structural organization, clause-to-document mapping, form numbering, and responsibility assignment; drafting by an in-house quality team typically takes several months, followed by multiple rounds of internal audit before finalization. Laboratories pursuing CNAS accreditation typically engage external technical experts or trainers to guide this process.</w:t>
       </w:r>
     </w:p>
     <w:p>
@@ -462,7 +487,7 @@
           <w:i w:val="0"/>
           <w:sz w:val="24"/>
         </w:rPr>
-        <w:t>To address these gaps, the present study generated 486 QMS documents, collected 864 LLM-judge ratings, and obtained 30 blinded expert ratings, addressing the following five questions: (i) Which of the four prompt components – rules, document skeleton, detailed content, and worked examples – contributes most to compliance? (ii) What is the minimum number of tokens needed? (iii) Is the optimal configuration consistent between Claude Opus 4.6 and GPT-5.4? (iv) How large is the LLM-judge self-preference bias in this domain? (v) Which configuration performs robustly across all three tiers – automated scoring, LLM judges, and expert ratings? This study treats LLMs as drafting and screening tools rather than autonomous authors of controlled quality management documents. ISO 15189 documentation must reflect the laboratory's validated processes, instruments, responsibilities, workflows, and records, and must be reviewed and approved by competent personnel. An LLM-generated document may provide a useful first draft, but it is not itself a controlled document. It has no institutional accountability, has not been verified against local practice, and cannot replace expert review. Accordingly, our analysis focuses not on whether LLMs can independently produce accreditation-ready documents, but on how different prompt configurations affect the quality of drafts and how reliably LLM-based evaluation reflects expert judgment.</w:t>
+        <w:t>To address these gaps, the present study generated 486 QMS documents, collected 864 LLM-judge ratings, and obtained 30 blinded expert ratings, addressing the following five questions: (i) Which of the four prompt components – rules, document skeleton, detailed content, and worked examples – contributes most to compliance? (ii) What is the minimum input that must be provided, in content and in token count? (iii) Is the optimal configuration consistent between Claude Opus 4.6 and GPT-5.4? (iv) How large is the LLM-judge self-preference bias in this domain? (v) Which configuration performs robustly across all three tiers – automated scoring, LLM judges, and expert ratings? This study treats LLMs as drafting and screening tools rather than autonomous authors of controlled quality management documents. ISO 15189 documentation must reflect the laboratory's validated processes, instruments, responsibilities, workflows, and records, and must be reviewed and approved by competent personnel. An LLM-generated document may provide a useful first draft, but it is not itself a controlled document. It has no institutional accountability, has not been verified against local practice, and cannot replace expert review. Accordingly, our analysis focuses not on whether LLMs can independently produce accreditation-ready documents, but on how different prompt configurations affect the quality of drafts and how reliably LLM-based evaluation reflects expert judgment.</w:t>
       </w:r>
     </w:p>
     <w:p>
@@ -547,6 +572,22 @@
     </w:p>
     <w:p>
       <w:pPr>
+        <w:spacing w:before="80" w:after="80" w:lineRule="auto" w:line="360"/>
+        <w:ind w:firstLine="0"/>
+        <w:jc w:val="both"/>
+      </w:pPr>
+      <w:r>
+        <w:rPr>
+          <w:rFonts w:ascii="Times New Roman" w:hAnsi="Times New Roman" w:eastAsia="宋体"/>
+          <w:b w:val="0"/>
+          <w:i w:val="0"/>
+          <w:sz w:val="24"/>
+        </w:rPr>
+        <w:t>The nine configurations supplied the models with requirement rules, document skeletons, detailed drafting guidance, and worked examples; C_full contained the full standard texts and an existing document library (Figure 1; all system prompts are openly released). None of this content included actual local information. C_full did have a basic laboratory-information template, with sections for staffing, floor plan, equipment, specimen logistics, and quality control, but every field was an empty placeholder; nor did any configuration state the laboratory's real process requirements, available resources, or risk-based acceptance criteria. This is the input the study examines.</w:t>
+      </w:r>
+    </w:p>
+    <w:p>
+      <w:pPr>
         <w:spacing w:before="200" w:after="80" w:lineRule="auto" w:line="360"/>
         <w:jc w:val="left"/>
       </w:pPr>
@@ -573,7 +614,7 @@
           <w:i w:val="0"/>
           <w:sz w:val="24"/>
         </w:rPr>
-        <w:t>The primary experiment used Claude Opus 4.6 (Anthropic, San Francisco, CA, USA) through the Claude Code Agent in text-only mode, with no tool calls during generation, although the framework's built-in tool definitions remain in the system prompt (Section 4.6). Nine configurations × 15 tasks × 3 replicates yielded 405 documents. The 15 tasks were grouped by CNAS audit scenario into three classes of five: Class A, document drafting; Class B, system operation; and Class C, audit simulation. The full task list with the corresponding ISO 15189:2022 clauses is given in Supplementary Table S1 and the original prompts in the GitHub repository. These tasks cover system-level documents concerned with document control, internal audit, and management review; they include no technical documents such as method validation reports or measurement-uncertainty procedures (Section 4.6).</w:t>
+        <w:t>The primary experiment used Claude Opus 4.6 (Anthropic, San Francisco, CA, USA) through the Claude Code Agent in text-only mode, with no tool calls during generation, although the framework's built-in tool definitions remain in the system prompt (Section 4.6). Nine configurations × 15 tasks × 3 replicates yielded 405 documents. The 15 tasks were grouped by CNAS audit scenario into three classes of five: Class A, document drafting; Class B, system operation; and Class C, audit simulation. The full task list with the corresponding ISO 15189:2022 clauses is given in Table S1 in Multimedia Appendix 1 and the original prompts in the GitHub repository. These tasks cover system-level documents concerned with document control, internal audit, and management review; they include no technical documents such as method validation reports or measurement-uncertainty procedures (Section 4.6).</w:t>
       </w:r>
     </w:p>
     <w:p>
@@ -636,7 +677,7 @@
           <w:i w:val="0"/>
           <w:sz w:val="24"/>
         </w:rPr>
-        <w:t>Compliance was evaluated with three complementary tiers, all scoring on a common 0–5 integer scale: an automated rule-based scorer (Tier 1), two LLM judges (Tiers 2a and 2b), and an independent blinded expert review (Tier 3). Tier 1 covered only structural features that code can detect objectively; Tiers 2 and 3 shared a five-dimensional rubric (Supplementary Table S2) – clause coverage, operability, internal consistency, PDCA closure, and professional depth.</w:t>
+        <w:t>Compliance was evaluated with three complementary tiers, all scoring on a common 0–5 integer scale: an automated rule-based scorer (Tier 1), two LLM judges (Tiers 2a and 2b), and an independent blinded expert review (Tier 3). Tier 1 covered only structural features that code can detect objectively; Tiers 2 and 3 shared a five-dimensional rubric (Table S2 in Multimedia Appendix 1) – clause coverage, operability, internal consistency, PDCA closure, and professional depth.</w:t>
       </w:r>
     </w:p>
     <w:p>
@@ -714,7 +755,7 @@
           <w:i w:val="0"/>
           <w:sz w:val="24"/>
         </w:rPr>
-        <w:t>The two judges (Claude and GPT) each scored documents from both models, forming a 2 × 2 cross design that separates a judge's self-preference from genuine differences in quality. Claude Opus 4.6, in the role of a "CNAS chief assessor", scored each covered document once on the five dimensions of the shared rubric, run through Claude Code Agent sub-agents with temperature and max_tokens not set explicitly. The Claude judging was run in successive batches as the configuration set expanded, and for some batches only group-level means rather than document-level files were retained (Section 4.6), leaving 378 document-level ratings covering 77.8% of the 486 documents. GPT-5.4 used the same prompt, rubric, and 0–5 scale to rate all 486 documents once each (405 Claude-generated + 81 GPT-generated), with temperature = 0 and max_completion_tokens = 2,000, which differ from Tier 2a (Section 4.6); no output was truncated by the max_tokens cap (all 486 JSON files parsed successfully), and the per-document raw JSON is openly released. Together the two judges produced 864 ratings; the counts are unequal for the reason above, but all four 2 × 2 cells contained data, so the self-preference decomposition could still be performed. Supplementary Table S2 defines the 5-, 3-, and 1-point anchors (fully, partially, and severely non-compliant); the intermediate scores 4 and 2 fall between adjacent anchors, and 0 means the dimension could not be evaluated. These anchor descriptions were identical for all judges and experts.</w:t>
+        <w:t>The two judges (Claude and GPT) each scored documents from both models, forming a 2 × 2 cross design that separates a judge's self-preference from genuine differences in quality. Claude Opus 4.6, in the role of a "CNAS chief assessor", scored each covered document once on the five dimensions of the shared rubric, run through Claude Code Agent sub-agents with temperature and max_tokens not set explicitly. The Claude judging was run in successive batches as the configuration set expanded, and for some batches only group-level means rather than document-level files were retained (Section 4.6), leaving 378 document-level ratings covering 77.8% of the 486 documents. GPT-5.4 used the same prompt, rubric, and 0–5 scale to rate all 486 documents once each (405 Claude-generated + 81 GPT-generated), with temperature = 0 and max_completion_tokens = 2,000, which differ from Tier 2a (Section 4.6); no output was truncated by the max_tokens cap (all 486 JSON files parsed successfully), and the per-document raw JSON is openly released. Together the two judges produced 864 ratings; the counts are unequal for the reason above, but all four 2 × 2 cells contained data, so the self-preference decomposition could still be performed. Table S2 in Multimedia Appendix 1 defines the 5-, 3-, and 1-point anchors (fully, partially, and severely non-compliant); the intermediate scores 4 and 2 fall between adjacent anchors, and 0 means the dimension could not be evaluated. These anchor descriptions were identical for all judges and experts.</w:t>
       </w:r>
     </w:p>
     <w:p>
@@ -3043,7 +3084,7 @@
           <w:i w:val="0"/>
           <w:sz w:val="24"/>
         </w:rPr>
-        <w:t>Decomposed by scoring dimension (GPT judge; n = 45 per configuration), the rules effect was largest for operability (+0.867) and professional depth (+0.644), and smaller for clause coverage (+0.400), PDCA closure (+0.333), and internal consistency (+0.311). The two largest gains thus fall on operability and professional depth rather than on the format- and structure-oriented dimensions, indicating that a rules constraint does not merely regularize a document's outward form but also increases the laboratory-specific technical detail written into it. This decomposition is by scoring dimension, not by document type: "professional depth" is only a proxy for technical specificity (Supplementary Table S2), and a genuine stratification by document type cannot be performed here because the task set contains no technical documents (Section 4.6). These results apply only to the LLM-judge tier; the expert-tier comparisons appear in Section 3.5.</w:t>
+        <w:t>Decomposed by scoring dimension (GPT judge; n = 45 per configuration), the rules effect was largest for operability (+0.867) and professional depth (+0.644), and smaller for clause coverage (+0.400), PDCA closure (+0.333), and internal consistency (+0.311). The two largest gains thus fall on operability and professional depth rather than on the format- and structure-oriented dimensions, indicating that a rules constraint does not merely regularize a document's outward form but also increases the laboratory-specific technical detail written into it. This decomposition is by scoring dimension, not by document type: "professional depth" is only a proxy for technical specificity (Table S2 in Multimedia Appendix 1), and a genuine stratification by document type cannot be performed here because the task set contains no technical documents (Section 4.6). These results apply only to the LLM-judge tier; the expert-tier comparisons appear in Section 3.5.</w:t>
       </w:r>
     </w:p>
     <w:p>
@@ -4541,7 +4582,7 @@
           <w:i w:val="0"/>
           <w:sz w:val="24"/>
         </w:rPr>
-        <w:t>The expert-tier results qualify this account (Section 3.5). The template-anchored F_template and G_template_rules earned markedly higher expert scores, whereas the skeleton-only H4_sop_only was about one point lower (per-configuration samples are very small and these are exploratory observations). A plausible explanation is that the model's own knowledge does not reliably cover the clinical-practice details required by ISO 15189:2022 and CNAS-CL02:2023 – in our task set, emergency-sample handling, acceptance of patient-self-collected specimens, qualification requirements for sample-courier personnel, and detailed sample-rejection criteria. When these are not stated explicitly in the system prompt, the model tends to fall back on generic procedural language: such language meets structural and terminological compliance (the two dimensions most readily detected by automated and LLM-based scoring, Section 3.6) but lacks the practical operability required of documents intended for accreditation submission. Prompt minimization is therefore appropriate for rapid drafting that is judged only by an LLM; but when a document must pass expert review for a formal accreditation submission, a template-anchored prompt is required.</w:t>
+        <w:t>The expert-tier results qualify this account (Section 3.5). The template-anchored F_template and G_template_rules earned markedly higher expert scores, whereas the skeleton-only H4_sop_only was about one point lower (per-configuration samples are very small and these are exploratory observations). This gap is expected rather than surprising: a model cannot write what it was never told. The clinical-practice details these documents need – emergency-sample handling, acceptance of patient-self-collected specimens, qualification requirements for sample-courier personnel, and detailed sample-rejection criteria – are each laboratory's own basic information, not something the model comes with, and none of our configurations included them (Section 2.1). Without that input the model falls back on generic procedural language: such language meets structural and terminological compliance (the two dimensions most readily detected by automated and LLM-based scoring, Section 3.6) but lacks the practical operability required of documents intended for accreditation submission. The gap in the expert scores comes precisely from this. Prompt minimization is therefore appropriate for rapid drafting that is judged only by an LLM; but when a document must pass expert review for a formal accreditation submission, a template-anchored prompt is required.</w:t>
       </w:r>
     </w:p>
     <w:p>
@@ -5744,6 +5785,22 @@
     </w:p>
     <w:p>
       <w:pPr>
+        <w:spacing w:before="80" w:after="80" w:lineRule="auto" w:line="360"/>
+        <w:ind w:firstLine="0"/>
+        <w:jc w:val="both"/>
+      </w:pPr>
+      <w:r>
+        <w:rPr>
+          <w:rFonts w:ascii="Times New Roman" w:hAnsi="Times New Roman" w:eastAsia="宋体"/>
+          <w:b w:val="0"/>
+          <w:i w:val="0"/>
+          <w:sz w:val="24"/>
+        </w:rPr>
+        <w:t>Implementing ISO 15189 does not mean turning the standard's "you shall do A" into a document that says "we do A"; a document earns its place in a QMS only when it describes a process the laboratory has actually built, resourced, and verified. LLM output that merely restates the standard in the first person is not implementation, and our expert-tier results show how far such documents fall short under qualified review.</w:t>
+      </w:r>
+    </w:p>
+    <w:p>
+      <w:pPr>
         <w:spacing w:before="200" w:after="80" w:lineRule="auto" w:line="360"/>
         <w:jc w:val="left"/>
       </w:pPr>
@@ -5850,7 +5907,7 @@
           <w:i w:val="0"/>
           <w:sz w:val="24"/>
         </w:rPr>
-        <w:t>Finally, the evaluation rubric did not directly assess patient-safety risk, local implementability by bench-level staff, or the risk of fabricated laboratory-specific parameters. Future work should use larger multi-center expert panels, include matched GPT-generated samples, cover technical and post-examination documents, harmonize model parameters, and assess revision burden and patient-safety implications.</w:t>
+        <w:t>Finally, the evaluation rubric did not directly assess patient-safety risk, local implementability by bench-level staff, or the risk of fabricated laboratory-specific parameters. Future work should use larger multi-center expert panels, include matched GPT-generated samples, cover technical and post-examination documents, harmonize model parameters, and assess revision burden and patient-safety implications. Above all, no configuration carried a formulated local requirements specification, so this study measures drafting without local input rather than the best that LLM assistance could achieve.</w:t>
       </w:r>
     </w:p>
     <w:p>
@@ -5881,7 +5938,7 @@
           <w:i w:val="0"/>
           <w:sz w:val="24"/>
         </w:rPr>
-        <w:t>The optimal prompt configuration for LLM-assisted ISO 15189 QMS document generation varies with the evaluation tier: the LLM-judge favorite H4_sop_only fell to fifth under expert review, whereas the template-anchored F_template, H2_keep_examples, and G_template_rules ranked highest (Table 3). Either way, the output is only a reference draft and cannot be submitted directly. Minimal prompts give a quick-start outline; template-anchored configurations give a working draft closer to submission form, whose value lies in a reliable document skeleton – the content that actually determines accreditation readiness (the laboratory's own quality-control data, patient data distributions, and proficiency-testing history) must be entered and interpreted by competent personnel, because an LLM does not hold these data. Nor is more context safer: C_full (~56,000 tokens), which loads the full reference corpus, should instead be used with caution, particularly when generation is performed by GPT-5.4 (its failure modes were observed only at the automated and LLM-judge tiers). Evaluation, too, cannot be delegated: LLM-as-judge is suitable only for pre-screening large numbers of drafts before expert review – the Claude judge is tentatively adequate for this role [ICC(3,1) = 0.548, 95% CI crossing zero, n = 10], whereas the GPT-5.4 judge is not [ICC(3,1) = 0.217]. Ultimately, ISO 15189 documentation is the process by which laboratory staff learn processes and risks, take responsibility, and demonstrate competence; an LLM can take over only its routine textual work – expert final review remains indispensable.</w:t>
+        <w:t>The optimal prompt configuration for LLM-assisted ISO 15189 QMS document generation varies with the evaluation tier, and output quality depends on whether the requirements are stated specifically, not on how long the prompt is: the LLM-judge favorite H4_sop_only fell to fifth under expert review, whereas the template-anchored F_template, H2_keep_examples, and G_template_rules ranked highest (Table 3). Either way, the output is only a reference draft and cannot be submitted directly. Minimal prompts give a quick-start outline; template-anchored configurations give a working draft closer to submission form, whose value lies in a reliable document skeleton – the content that actually determines accreditation readiness (the laboratory's own quality-control data, patient data distributions, and proficiency-testing history) must be entered and interpreted by competent personnel, because an LLM does not hold these data. Nor is more context safer: C_full (~56,000 tokens), which loads the full reference corpus, should instead be used with caution, particularly when generation is performed by GPT-5.4 (its failure modes were observed only at the automated and LLM-judge tiers). Evaluation, too, cannot be delegated: LLM-as-judge is suitable only for pre-screening large numbers of drafts before expert review – the Claude judge is tentatively adequate for this role [ICC(3,1) = 0.548, 95% CI crossing zero, n = 10], whereas the GPT-5.4 judge is not [ICC(3,1) = 0.217]. Ultimately, ISO 15189 documentation is the process by which laboratory staff learn processes and risks, take responsibility, and demonstrate competence; an LLM can take over only its routine textual work – expert final review remains indispensable. The natural next step is to have laboratory professionals formulate their local process requirements before generation begins; this approach is currently under evaluation.</w:t>
       </w:r>
     </w:p>
     <w:p>
@@ -6430,7 +6487,7 @@
           <w:i w:val="0"/>
           <w:sz w:val="24"/>
         </w:rPr>
-        <w:t>1. ISO 15189:2022. Medical laboratories — Requirements for quality and competence. Geneva: International Organization for Standardization; 2022.</w:t>
+        <w:t>1. International Organization for Standardization. ISO 15189:2022 Medical laboratories — requirements for quality and competence. International Organization for Standardization; 2022. Accessed August 5, 2026. https://www.iso.org/standard/76677.html</w:t>
       </w:r>
     </w:p>
     <w:p>
@@ -6446,7 +6503,25 @@
           <w:i w:val="0"/>
           <w:sz w:val="24"/>
         </w:rPr>
-        <w:t>2. Yang S, Zhou Y, Wang C, Luo M. The 'Double Helix' model of quality monitoring: risk mapping of quality management system during initial ISO 15189 implementation in a medical laboratory. PLoS One 2026;21:e0342129.</w:t>
+        <w:t xml:space="preserve">2. Yang S, Zhou Y, Wang C, Luo M. The 'Double Helix' model of quality monitoring: risk mapping of quality management system during initial ISO 15189 implementation in a medical laboratory. </w:t>
+      </w:r>
+      <w:r>
+        <w:rPr>
+          <w:rFonts w:ascii="Times New Roman" w:hAnsi="Times New Roman" w:eastAsia="宋体"/>
+          <w:b w:val="0"/>
+          <w:i/>
+          <w:sz w:val="24"/>
+        </w:rPr>
+        <w:t>PLoS One</w:t>
+      </w:r>
+      <w:r>
+        <w:rPr>
+          <w:rFonts w:ascii="Times New Roman" w:hAnsi="Times New Roman" w:eastAsia="宋体"/>
+          <w:b w:val="0"/>
+          <w:i w:val="0"/>
+          <w:sz w:val="24"/>
+        </w:rPr>
+        <w:t>. 2026;21:e0342129. doi:10.1371/journal.pone.0342129</w:t>
       </w:r>
     </w:p>
     <w:p>
@@ -6462,7 +6537,7 @@
           <w:i w:val="0"/>
           <w:sz w:val="24"/>
         </w:rPr>
-        <w:t>3. Anthropic. Claude Opus 4.6 System Card. San Francisco (CA): Anthropic; 2026. Available at: https://www.anthropic.com/claude-opus-4-6-system-card. [Accessed 9 May 2026].</w:t>
+        <w:t>3. Anthropic. Claude Opus 4.6 system card. Anthropic; 2026. Accessed May 9, 2026. https://www.anthropic.com/claude-opus-4-6-system-card</w:t>
       </w:r>
     </w:p>
     <w:p>
@@ -6478,7 +6553,7 @@
           <w:i w:val="0"/>
           <w:sz w:val="24"/>
         </w:rPr>
-        <w:t>4. OpenAI. GPT-5 System Card. San Francisco (CA): OpenAI; 2025. Available at: https://openai.com/index/gpt-5-system-card/. [Accessed 9 May 2026].</w:t>
+        <w:t>4. OpenAI. GPT-5 system card. OpenAI; 2025. Accessed May 9, 2026. https://openai.com/index/gpt-5-system-card/</w:t>
       </w:r>
     </w:p>
     <w:p>
@@ -6494,7 +6569,7 @@
           <w:i w:val="0"/>
           <w:sz w:val="24"/>
         </w:rPr>
-        <w:t>5. Zhao WX, Zhou K, Li J, Tang T, Wang X, Hou Y, et al. A survey of large language models. arXiv preprint 2023; arXiv:2303.18223.</w:t>
+        <w:t>5. Zhao WX, Zhou K, Li J, et al. A survey of large language models. arXiv. Preprint posted online 2023. doi:10.48550/arXiv.2303.18223</w:t>
       </w:r>
     </w:p>
     <w:p>
@@ -6510,7 +6585,7 @@
           <w:i w:val="0"/>
           <w:sz w:val="24"/>
         </w:rPr>
-        <w:t>6. Schulhoff S, Ilie M, Balepur N, Kahadze K, Liu A, Si C, et al. The prompt report: a systematic survey of prompting techniques. arXiv preprint 2024; arXiv:2406.06608.</w:t>
+        <w:t>6. Schulhoff S, Ilie M, Balepur N, et al. The prompt report: a systematic survey of prompting techniques. arXiv. Preprint posted online 2024. doi:10.48550/arXiv.2406.06608</w:t>
       </w:r>
     </w:p>
     <w:p>
@@ -6526,7 +6601,7 @@
           <w:i w:val="0"/>
           <w:sz w:val="24"/>
         </w:rPr>
-        <w:t>7. Zheng L, Chiang WL, Sheng Y, Zhuang S, Wu Z, Zhuang Y, et al. Judging LLM-as-a-judge with MT-Bench and Chatbot Arena. In: Advances in Neural Information Processing Systems 36 (NeurIPS 2023) Datasets and Benchmarks Track. 2023.</w:t>
+        <w:t>7. Zheng L, Chiang WL, Sheng Y, et al. Judging LLM-as-a-judge with MT-Bench and Chatbot Arena. In: Advances in Neural Information Processing Systems 36 (NeurIPS 2023), Datasets and Benchmarks Track; 2023. doi:10.48550/arXiv.2306.05685</w:t>
       </w:r>
     </w:p>
     <w:p>
@@ -6542,7 +6617,7 @@
           <w:i w:val="0"/>
           <w:sz w:val="24"/>
         </w:rPr>
-        <w:t>8. Tan H, Guo Z, Shi Z, Xu L, Liu Z, Feng Y, et al. ProxyQA: an alternative framework for evaluating long-form text generation with large language models. In: Proceedings of the 62nd Annual Meeting of the Association for Computational Linguistics (Volume 1: Long Papers); 2024 Aug 11–16; Bangkok, Thailand. Stroudsburg (PA): Association for Computational Linguistics; 2024. p. 6806–27.</w:t>
+        <w:t>8. Tan H, Guo Z, Shi Z, et al. ProxyQA: an alternative framework for evaluating long-form text generation with large language models. In: Proceedings of the 62nd Annual Meeting of the Association for Computational Linguistics (Volume 1: Long Papers). Association for Computational Linguistics; 2024:6806-6827. doi:10.18653/v1/2024.acl-long.368</w:t>
       </w:r>
     </w:p>
     <w:p>
@@ -6558,7 +6633,7 @@
           <w:i w:val="0"/>
           <w:sz w:val="24"/>
         </w:rPr>
-        <w:t>9. Chiang WL, Zheng L, Sheng Y, Angelopoulos AN, Li T, Li D, et al. Chatbot Arena: an open platform for evaluating LLMs by human preference. arXiv preprint 2024; arXiv:2403.04132.</w:t>
+        <w:t>9. Chiang WL, Zheng L, Sheng Y, et al. Chatbot Arena: an open platform for evaluating LLMs by human preference. arXiv. Preprint posted online 2024. doi:10.48550/arXiv.2403.04132</w:t>
       </w:r>
     </w:p>
     <w:p>
@@ -6574,7 +6649,7 @@
           <w:i w:val="0"/>
           <w:sz w:val="24"/>
         </w:rPr>
-        <w:t>10. Panickssery A, Bowman SR, Feng S. LLM evaluators recognize and favor their own generations. arXiv preprint 2024; arXiv:2404.13076.</w:t>
+        <w:t>10. Panickssery A, Bowman SR, Feng S. LLM evaluators recognize and favor their own generations. arXiv. Preprint posted online 2024. doi:10.48550/arXiv.2404.13076</w:t>
       </w:r>
     </w:p>
     <w:p>
@@ -6590,7 +6665,25 @@
           <w:i w:val="0"/>
           <w:sz w:val="24"/>
         </w:rPr>
-        <w:t>11. Shrout PE, Fleiss JL. Intraclass correlations: uses in assessing rater reliability. Psychol Bull 1979;86:420–8.</w:t>
+        <w:t xml:space="preserve">11. Shrout PE, Fleiss JL. Intraclass correlations: uses in assessing rater reliability. </w:t>
+      </w:r>
+      <w:r>
+        <w:rPr>
+          <w:rFonts w:ascii="Times New Roman" w:hAnsi="Times New Roman" w:eastAsia="宋体"/>
+          <w:b w:val="0"/>
+          <w:i/>
+          <w:sz w:val="24"/>
+        </w:rPr>
+        <w:t>Psychol Bull</w:t>
+      </w:r>
+      <w:r>
+        <w:rPr>
+          <w:rFonts w:ascii="Times New Roman" w:hAnsi="Times New Roman" w:eastAsia="宋体"/>
+          <w:b w:val="0"/>
+          <w:i w:val="0"/>
+          <w:sz w:val="24"/>
+        </w:rPr>
+        <w:t>. 1979;86(2):420-428. doi:10.1037//0033-2909.86.2.420</w:t>
       </w:r>
     </w:p>
     <w:p>
@@ -6606,7 +6699,25 @@
           <w:i w:val="0"/>
           <w:sz w:val="24"/>
         </w:rPr>
-        <w:t>12. Cicchetti DV. Guidelines, criteria, and rules of thumb for evaluating normed and standardized assessment instruments in psychology. Psychol Assess 1994;6:284–90.</w:t>
+        <w:t xml:space="preserve">12. Cicchetti DV. Guidelines, criteria, and rules of thumb for evaluating normed and standardized assessment instruments in psychology. </w:t>
+      </w:r>
+      <w:r>
+        <w:rPr>
+          <w:rFonts w:ascii="Times New Roman" w:hAnsi="Times New Roman" w:eastAsia="宋体"/>
+          <w:b w:val="0"/>
+          <w:i/>
+          <w:sz w:val="24"/>
+        </w:rPr>
+        <w:t>Psychol Assess</w:t>
+      </w:r>
+      <w:r>
+        <w:rPr>
+          <w:rFonts w:ascii="Times New Roman" w:hAnsi="Times New Roman" w:eastAsia="宋体"/>
+          <w:b w:val="0"/>
+          <w:i w:val="0"/>
+          <w:sz w:val="24"/>
+        </w:rPr>
+        <w:t>. 1994;6(4):284-290. doi:10.1037/1040-3590.6.4.284</w:t>
       </w:r>
     </w:p>
     <w:p>
@@ -6622,7 +6733,25 @@
           <w:i w:val="0"/>
           <w:sz w:val="24"/>
         </w:rPr>
-        <w:t>13. Liu NF, Lin K, Hewitt J, Paranjape A, Bevilacqua M, Petroni F, et al. Lost in the middle: how language models use long contexts. Trans Assoc Comput Linguist 2024;12:157–73.</w:t>
+        <w:t xml:space="preserve">13. Liu NF, Lin K, Hewitt J, et al. Lost in the middle: how language models use long contexts. </w:t>
+      </w:r>
+      <w:r>
+        <w:rPr>
+          <w:rFonts w:ascii="Times New Roman" w:hAnsi="Times New Roman" w:eastAsia="宋体"/>
+          <w:b w:val="0"/>
+          <w:i/>
+          <w:sz w:val="24"/>
+        </w:rPr>
+        <w:t>Trans Assoc Comput Linguist</w:t>
+      </w:r>
+      <w:r>
+        <w:rPr>
+          <w:rFonts w:ascii="Times New Roman" w:hAnsi="Times New Roman" w:eastAsia="宋体"/>
+          <w:b w:val="0"/>
+          <w:i w:val="0"/>
+          <w:sz w:val="24"/>
+        </w:rPr>
+        <w:t>. 2024;12:157-173. doi:10.1162/tacl_a_00638</w:t>
       </w:r>
     </w:p>
     <w:p>
@@ -6638,7 +6767,25 @@
           <w:i w:val="0"/>
           <w:sz w:val="24"/>
         </w:rPr>
-        <w:t>14. Knott M, Krebs M, Kerscher A. Large language models in healthcare quality management: a European perspective on process automation and compliance. Front Digit Health 2026;8:1761641.</w:t>
+        <w:t xml:space="preserve">14. Knott M, Krebs M, Kerscher A. Large language models in healthcare quality management: a European perspective on process automation and compliance. </w:t>
+      </w:r>
+      <w:r>
+        <w:rPr>
+          <w:rFonts w:ascii="Times New Roman" w:hAnsi="Times New Roman" w:eastAsia="宋体"/>
+          <w:b w:val="0"/>
+          <w:i/>
+          <w:sz w:val="24"/>
+        </w:rPr>
+        <w:t>Front Digit Health</w:t>
+      </w:r>
+      <w:r>
+        <w:rPr>
+          <w:rFonts w:ascii="Times New Roman" w:hAnsi="Times New Roman" w:eastAsia="宋体"/>
+          <w:b w:val="0"/>
+          <w:i w:val="0"/>
+          <w:sz w:val="24"/>
+        </w:rPr>
+        <w:t>. 2026;8:1761641. doi:10.3389/fdgth.2026.1761641</w:t>
       </w:r>
     </w:p>
     <w:p>
@@ -6663,7 +6810,7 @@
           <w:i w:val="0"/>
           <w:sz w:val="24"/>
         </w:rPr>
-        <w:t>: ~5,500 words</w:t>
+        <w:t>: ~5,800 words</w:t>
       </w:r>
     </w:p>
     <w:p>

</xml_diff>